<commit_message>
Updates to demand charge modeling
</commit_message>
<xml_diff>
--- a/thesis_paper.docx
+++ b/thesis_paper.docx
@@ -223,7 +223,7 @@
           <w:i w:val="0"/>
           <w:sz w:val="19"/>
         </w:rPr>
-        <w:t>Our synthetic batch generator descends directly from Da Costa, Grange &amp; De Courchelle [5], instantiated as the scipy-based Listing 1 of Grange et al. [4], in the Feitelson workload-modeling tradition [21]. We reproduce Listing 1 verbatim (scripts/grange_generator.py recovers their published lognormal s = 1.634, scale = 447), then extend it: distributions are re-fit to the 2019 trace under the no-SLO definition, selected by minimum Kolmogorov–Smirnov distance (the p-value saturates at n ≈ 10⁵), with discrete negative-binomial task counts. Grange's SLA-flexibility knob becomes our deadline model, Eq. (5). Critically, in the final environment the generator is demoted to sensitivity analysis: measured per-tier curves are the primary input, after we found single-timestep job pulses inflated batch burstiness by two orders of magnitude (Sec. VII).</w:t>
+        <w:t>Our synthetic batch generator descends directly from Da Costa, Grange &amp; De Courchelle [5], instantiated as the scipy-based Listing 1 of Grange et al. [4], in the Feitelson workload-modeling tradition [21]. We reproduce Listing 1 verbatim (scripts/grange_generator.py recovers their published lognormal s = 1.634, scale = 447), then extend it: distributions are re-fit to the 2019 trace under the no-SLO definition, selected by minimum Kolmogorov–Smirnov distance (the p-value saturates at n ≈ 10⁵), with discrete negative-binomial task counts. Grange's SLA-flexibility knob becomes our deadline model, Eq. (7). Critically, in the final environment the generator is demoted to sensitivity analysis: measured per-tier curves are the primary input, after we found single-timestep job pulses inflated batch burstiness by two orders of magnitude (Sec. VII).</w:t>
       </w:r>
     </w:p>
     <w:p>
@@ -471,7 +471,72 @@
           <w:i w:val="0"/>
           <w:sz w:val="19"/>
         </w:rPr>
-        <w:t>The quadratic form penalizes concentration; the d-weighting makes draw near the duck-curve neck expensive and slack-hour draw nearly free [13].</w:t>
+        <w:t>The quadratic form penalizes concentration; the d-weighting makes draw near the duck-curve neck expensive and slack-hour draw nearly free [13]. Φ is a grid-stress SHADOW PRICE, not a tariff: α is calibrated to a target share of total cost (Sec. V-A), not derived from a rate schedule, and Φ differs from a commercial demand charge in all three respects that matter — it is summed over every interval rather than taken as a maximum, it is quadratic rather than linear in kW, and it is weighted by grid net demand, which no tariff observes.</w:t>
+      </w:r>
+    </w:p>
+    <w:p>
+      <w:pPr>
+        <w:spacing w:after="60"/>
+      </w:pPr>
+      <w:r>
+        <w:rPr>
+          <w:b w:val="0"/>
+          <w:i w:val="0"/>
+          <w:sz w:val="19"/>
+        </w:rPr>
+        <w:t>Because that distinction is easy to lose, the operator's actual tariff term is modeled separately. Commercial and industrial customers are billed on the single highest demand interval of each billing period, per meter — routinely 30-50% of a large customer's bill [9], [13] — so the billed quantity is the sum of per-SITE maxima, not the fleet coincident peak:</w:t>
+      </w:r>
+    </w:p>
+    <w:p>
+      <w:pPr>
+        <w:spacing w:after="80"/>
+        <w:jc w:val="center"/>
+      </w:pPr>
+      <w:r>
+        <w:rPr>
+          <w:i/>
+          <w:sz w:val="19"/>
+        </w:rPr>
+        <w:t>Ψ = c · Σᵢ maxₜ gᵢ,ₜ · 1000,   c in $/kW-month        (5)</w:t>
+      </w:r>
+    </w:p>
+    <w:p>
+      <w:pPr>
+        <w:spacing w:after="60"/>
+      </w:pPr>
+      <w:r>
+        <w:rPr>
+          <w:b w:val="0"/>
+          <w:i w:val="0"/>
+          <w:sz w:val="19"/>
+        </w:rPr>
+        <w:t>A maximum over the period is not a per-step cost, so Ψ is charged in the telescoping form below, where Dᵢ,ₜ = maxₜ′≤ₜ gᵢ,ₜ′ is the running billed peak. Each step pays exactly the amount by which it raises the running maximum, and the sum over a period is exactly Ψ:</w:t>
+      </w:r>
+    </w:p>
+    <w:p>
+      <w:pPr>
+        <w:spacing w:after="80"/>
+        <w:jc w:val="center"/>
+      </w:pPr>
+      <w:r>
+        <w:rPr>
+          <w:i/>
+          <w:sz w:val="19"/>
+        </w:rPr>
+        <w:t>ψᵢ,ₜ = c · max(0, gᵢ,ₜ − Dᵢ,ₜ₋₁) · 1000,   Σₜ ψᵢ,ₜ = c · maxₜ gᵢ,ₜ · 1000        (6)</w:t>
+      </w:r>
+    </w:p>
+    <w:p>
+      <w:pPr>
+        <w:spacing w:after="60"/>
+      </w:pPr>
+      <w:r>
+        <w:rPr>
+          <w:b w:val="0"/>
+          <w:i w:val="0"/>
+          <w:sz w:val="19"/>
+        </w:rPr>
+        <w:t>This keeps the cost Markov provided Dᵢ,ₜ₋₁ is observable, which is why the running billed peak is added to the observation whenever the term is active; without it, identical (load, price, net-demand) states carry different marginal costs depending on unobserved history. Ψ is reported for every policy in Sec. VI-G but is DISABLED in the reward (c = 0) for all results in this paper, so the trained policies and the shaped objective they optimize are unchanged; Sec. VI-G quantifies what including it would and would not buy.</w:t>
       </w:r>
     </w:p>
     <w:p>
@@ -510,7 +575,7 @@
           <w:i/>
           <w:sz w:val="19"/>
         </w:rPr>
-        <w:t>Hᵢ = ⌈ μᵢ (1 + φ) / Δ ⌉        (5)</w:t>
+        <w:t>Hᵢ = ⌈ μᵢ (1 + φ) / Δ ⌉        (7)</w:t>
       </w:r>
     </w:p>
     <w:p>
@@ -523,7 +588,7 @@
           <w:i/>
           <w:sz w:val="19"/>
         </w:rPr>
-        <w:t>Qᵢ,ₜ₊₁ = Qᵢ,ₜ + aᵢ,ₜ − Sᵢ,ₜ − Xᵢ,ₜ        (6)</w:t>
+        <w:t>Qᵢ,ₜ₊₁ = Qᵢ,ₜ + aᵢ,ₜ − Sᵢ,ₜ − Xᵢ,ₜ        (8)</w:t>
       </w:r>
     </w:p>
     <w:p>
@@ -536,7 +601,7 @@
           <w:i w:val="0"/>
           <w:sz w:val="19"/>
         </w:rPr>
-        <w:t>where Sᵢ,ₜ is batch actually served (run) at i this step and Xᵢ,ₜ is batch that expired. Two semantics are essential and were validated by invariant (Sec. V-C): a drain is an intended *release to run* — the released work runs only insofar as it fits under capacity (Eq. 7), and the part that does not fit stays in the pool with its original deadline (it queues, as Borg's batch scheduler does [1], rather than expiring on a one-step fuse). Only served work Sᵢ,ₜ leaves the pool; only deadline-passed work expires as Xᵢ,ₜ.</w:t>
+        <w:t>where Sᵢ,ₜ is batch actually served (run) at i this step and Xᵢ,ₜ is batch that expired. Two semantics are essential and were validated by invariant (Sec. V-C): a drain is an intended *release to run* — the released work runs only insofar as it fits under capacity (Eq. 9), and the part that does not fit stays in the pool with its original deadline (it queues, as Borg's batch scheduler does [1], rather than expiring on a one-step fuse). Only served work Sᵢ,ₜ leaves the pool; only deadline-passed work expires as Xᵢ,ₜ.</w:t>
       </w:r>
     </w:p>
     <w:p>
@@ -575,7 +640,7 @@
           <w:i/>
           <w:sz w:val="19"/>
         </w:rPr>
-        <w:t>σᵢ,ₜ = min(fᵢ,ₜDₜ + Bᵢ,ₜ₋₁, κᵢ);   Sᵢ,ₜ = min(hᵢ,ₜΣⱼδⱼ,ₜQⱼ,ₜ, κᵢ−σᵢ,ₜ);   uᵢ,ₜ = σᵢ,ₜ + Sᵢ,ₜ        (7)</w:t>
+        <w:t>σᵢ,ₜ = min(fᵢ,ₜDₜ + Bᵢ,ₜ₋₁, κᵢ);   Sᵢ,ₜ = min(hᵢ,ₜΣⱼδⱼ,ₜQⱼ,ₜ, κᵢ−σᵢ,ₜ);   uᵢ,ₜ = σᵢ,ₜ + Sᵢ,ₜ        (9)</w:t>
       </w:r>
     </w:p>
     <w:p>
@@ -588,7 +653,7 @@
           <w:i w:val="0"/>
           <w:sz w:val="19"/>
         </w:rPr>
-        <w:t>Reading Eq. (7): service served = service routed in (fᵢ,ₜDₜ) plus carried backlog (Bᵢ,ₜ₋₁), capped at capacity κᵢ; the batch term hᵢ,ₜ Σⱼ δⱼ,ₜ Qⱼ,ₜ is site i's share (hᵢ,ₜ) of the fleet-wide drained pool — the sum over every site j of its released batch δⱼ,ₜ Qⱼ,ₜ — and runs only in the capacity service leaves free; total served CPU is uᵢ,ₜ = σᵢ,ₜ + Sᵢ,ₜ. The ±3 action bound (not the SB3 default ±1) matters: SB3 clips actions to the action box before the decode, so ±1 would cap every routing share to [4.3%, 71%] and every drain rate to [27%, 73%], making full concentration and multi-hour holding impossible by construction; ±3 restores parity with the discrete baselines (shares to ~98.5%). The reward is the negative per-step cost:</w:t>
+        <w:t>Reading Eq. (9): service served = service routed in (fᵢ,ₜDₜ) plus carried backlog (Bᵢ,ₜ₋₁), capped at capacity κᵢ; the batch term hᵢ,ₜ Σⱼ δⱼ,ₜ Qⱼ,ₜ is site i's share (hᵢ,ₜ) of the fleet-wide drained pool — the sum over every site j of its released batch δⱼ,ₜ Qⱼ,ₜ — and runs only in the capacity service leaves free; total served CPU is uᵢ,ₜ = σᵢ,ₜ + Sᵢ,ₜ. The ±3 action bound (not the SB3 default ±1) matters: SB3 clips actions to the action box before the decode, so ±1 would cap every routing share to [4.3%, 71%] and every drain rate to [27%, 73%], making full concentration and multi-hour holding impossible by construction; ±3 restores parity with the discrete baselines (shares to ~98.5%). The reward is the negative per-step cost:</w:t>
       </w:r>
     </w:p>
     <w:p>
@@ -601,7 +666,7 @@
           <w:i/>
           <w:sz w:val="19"/>
         </w:rPr>
-        <w:t>rₜ = −[ Eₜ + Φₜ + λ_b Σᵢ Bᵢ,ₜ + λ_κ Σᵢ max(0, uᵢ,ₜ−κᵢ) + λ_x Σᵢ Xᵢ,ₜ ]        (8)</w:t>
+        <w:t>rₜ = −[ Eₜ + Φₜ + λ_b Σᵢ Bᵢ,ₜ + λ_κ Σᵢ max(0, uᵢ,ₜ−κᵢ) + λ_x Σᵢ Xᵢ,ₜ ]        (10)</w:t>
       </w:r>
     </w:p>
     <w:p>
@@ -653,7 +718,7 @@
           <w:i/>
           <w:sz w:val="19"/>
         </w:rPr>
-        <w:t>minimize  J = Σₜ Σᵢ [ Eᵢ,ₜ + Φᵢ,ₜ + λ_b·Bᵢ,ₜ + λ_x·Xᵢ,ₜ ]        (9)</w:t>
+        <w:t>minimize  J = Σₜ Σᵢ [ Eᵢ,ₜ + Φᵢ,ₜ + λ_b·Bᵢ,ₜ + λ_x·Xᵢ,ₜ ]        (11)</w:t>
       </w:r>
     </w:p>
     <w:p>
@@ -666,7 +731,7 @@
           <w:i w:val="0"/>
           <w:sz w:val="19"/>
         </w:rPr>
-        <w:t>subject to, for all i, t: the power model (1)–(2); the serving rule (7) with capacity uᵢ,ₜ ≤ κᵢ; the routing simplex Σᵢ fᵢ,ₜ = 1, fᵢ,ₜ ≥ 0 and drain/placement δ, h ∈ [0,1]; service-backlog conservation Bᵢ,ₜ = Bᵢ,ₜ₋₁ + fᵢ,ₜDₜ − σᵢ,ₜ; the batch queue (6); and deadline feasibility Σ_{τ≤t} Sᵢ,τ ≥ Σ of arrivals at i due by t (an arrival at τ is due by τ + Hᵢ, Eq. 5) — i.e. cumulative batch completed must cover everything whose deadline has passed. Here Eᵢ,ₜ (Eq. 3) is energy cost and Φᵢ,ₜ (Eq. 4) the grid peak-contribution penalty. In words: route inflexible service and defer flexible batch to minimize electricity cost plus grid-peak contribution, while serving all demand within capacity and completing batch on time.</w:t>
+        <w:t>subject to, for all i, t: the power model (1)–(2); the serving rule (7) with capacity uᵢ,ₜ ≤ κᵢ; the routing simplex Σᵢ fᵢ,ₜ = 1, fᵢ,ₜ ≥ 0 and drain/placement δ, h ∈ [0,1]; service-backlog conservation Bᵢ,ₜ = Bᵢ,ₜ₋₁ + fᵢ,ₜDₜ − σᵢ,ₜ; the batch queue (8); and deadline feasibility Σ_{τ≤t} Sᵢ,τ ≥ Σ of arrivals at i due by t (an arrival at τ is due by τ + Hᵢ, Eq. 7) — i.e. cumulative batch completed must cover everything whose deadline has passed. Here Eᵢ,ₜ (Eq. 3) is energy cost and Φᵢ,ₜ (Eq. 4) the grid peak-contribution penalty. In words: route inflexible service and defer flexible batch to minimize electricity cost plus grid-peak contribution, while serving all demand within capacity and completing batch on time.</w:t>
       </w:r>
     </w:p>
     <w:p>
@@ -679,7 +744,7 @@
           <w:i w:val="0"/>
           <w:sz w:val="19"/>
         </w:rPr>
-        <w:t>Eq. (9) is an offline, full-information statement; the deployed controller is causal (it cannot observe future prices or demand). We therefore solve it with model-free RL — PPO maximizes 𝔼[Σₜ γᵗ rₜ] with rₜ the negative per-step cost (Eq. 8) — and bound it with the clairvoyant convex-QP relaxation of J (Sec. VI-F), whose optimum lower-bounds any policy.</w:t>
+        <w:t>Eq. (11) is an offline, full-information statement; the deployed controller is causal (it cannot observe future prices or demand). We therefore solve it with model-free RL — PPO maximizes 𝔼[Σₜ γᵗ rₜ] with rₜ the negative per-step cost (Eq. 10) — and bound it with the clairvoyant convex-QP relaxation of J (Sec. VI-F), whose optimum lower-bounds any policy.</w:t>
       </w:r>
     </w:p>
     <w:p>
@@ -692,7 +757,7 @@
           <w:i w:val="0"/>
           <w:sz w:val="19"/>
         </w:rPr>
-        <w:t>The formulation follows CICS's aggregate flexible/inflexible load-shaping problem [3], retargeted from carbon to grid net-demand and electricity cost, with the cost-minimization-over-distributed-DCs structure of geographic load balancing [23]–[25], a linear idle+slope power model [14], [17], a demand-charge-style peak term [9], [13], and aggregate batch-with-deadline dynamics [4], [9].</w:t>
+        <w:t>The formulation follows CICS's aggregate flexible/inflexible load-shaping problem [3], retargeted from carbon to grid net-demand and electricity cost, with the cost-minimization-over-distributed-DCs structure of geographic load balancing [23]–[25], a linear idle+slope power model [14], [17], a peak-contribution term in the peak-shaving and demand-response tradition [9], [13] — though Φ is a per-interval quadratic shadow price, not a demand charge in the tariff sense; the tariff term Ψ is modeled separately (Eq. 5) and reported in Sec. VI-G — and aggregate batch-with-deadline dynamics [4], [9].</w:t>
       </w:r>
     </w:p>
     <w:p>
@@ -1270,7 +1335,7 @@
           <w:i w:val="0"/>
           <w:sz w:val="19"/>
         </w:rPr>
-        <w:t>We state the price and net-demand provenance precisely, since it bounds the claims. NET DEMAND is real: hourly EIA-930 series (demand minus utility-scale wind+solar) for the assigned US balancing authorities, normalized to [0,1] by each region's window peak; the Global scenario's EU/Singapore net demand is synthesized where EIA-930 does not apply. PRICES, by contrast, are DOCUMENTED SYNTHETIC: a calibrated diurnal model anchored to plausible May-2019 regional wholesale averages, NOT real locational marginal prices. Real hourly LMP is not uniformly obtainable for this footprint — two US scenario regions (Southern Co./GA, Duke/SC) are vertically integrated utilities with no public wholesale market, and the EIA API exposes no hourly price route — so a fully-real price series is not currently available. This is a known limitation we intend to resolve (real CAISO/MISO LMP plus documented proxies for the non-ISO territories) in future work. Two points bound its impact. First, the relative comparison is unaffected: every policy is scored against the SAME price series, so any price bias cancels in the differences between policies, which are what we report. Second, the price DYNAMICS the agent exploits (diurnal spread, cross-region differences) are structurally realistic even if the absolute levels are modeled. The generalization study (Sec. VI-G) additionally shifts net demand to real EIA-930 May-2024 data, testing transfer on the one fully-real market signal.</w:t>
+        <w:t>We state the price and net-demand provenance precisely, since it bounds the claims. NET DEMAND is real: hourly EIA-930 series (demand minus utility-scale wind+solar) for the assigned US balancing authorities, normalized to [0,1] by each region's window peak; the Global scenario's EU/Singapore net demand is synthesized where EIA-930 does not apply. PRICES, by contrast, are DOCUMENTED SYNTHETIC: a calibrated diurnal model anchored to plausible May-2019 regional wholesale averages, NOT real locational marginal prices. Real hourly LMP is not uniformly obtainable for this footprint — two US scenario regions (Southern Co./GA, Duke/SC) are vertically integrated utilities with no public wholesale market, and the EIA API exposes no hourly price route — so a fully-real price series is not currently available. This is a known limitation we intend to resolve (real CAISO/MISO LMP plus documented proxies for the non-ISO territories) in future work. Two points bound its impact. First, the relative comparison is unaffected: every policy is scored against the SAME price series, so any price bias cancels in the differences between policies, which are what we report. Second, the price DYNAMICS the agent exploits (diurnal spread, cross-region differences) are structurally realistic even if the absolute levels are modeled. The generalization study (Sec. VI-H) additionally shifts net demand to real EIA-930 May-2024 data, testing transfer on the one fully-real market signal.</w:t>
       </w:r>
     </w:p>
     <w:p>
@@ -1310,7 +1375,7 @@
           <w:i w:val="0"/>
           <w:sz w:val="19"/>
         </w:rPr>
-        <w:t>PPO (Stable-Baselines3, MLP 128×128, lr 3e-4, 500k steps) acts in the continuous 3N-dimensional space. Its observation includes per-DC dynamic state (demand, price, net demand, pool/backlog) AND static site context (per-DC idle power, slope, capacity, deferrable fraction) — the latter added so that per-site heterogeneity is exploitable as a function of observed parameters rather than memorized by slot (Sec. VI-G). Two DQN variants share hyperparameters (MLP 256×256, replay 100k, target update 1k): a 759-action routing grid, and a 48-action CFWS-style flattened index decoding to (source DC, destination DC, drain level) [6]. Nine heuristics span the policy space, including Round Robin, price-chasing and slack-grid concentrators, defer-to-trough rules, a GreenSlot-style Trough-Slot Lookahead foresighted heuristic with privileged 3-hour net-demand foresight [10], and the no-optimization Status Quo (serve locally, immediately) — the counterfactual of a CICS-style layer switched off.</w:t>
+        <w:t>PPO (Stable-Baselines3, MLP 128×128, lr 3e-4, 500k steps) acts in the continuous 3N-dimensional space. Its observation includes per-DC dynamic state (demand, price, net demand, pool/backlog) AND static site context (per-DC idle power, slope, capacity, deferrable fraction) — the latter added so that per-site heterogeneity is exploitable as a function of observed parameters rather than memorized by slot (Sec. VI-H). Two DQN variants share hyperparameters (MLP 256×256, replay 100k, target update 1k): a 759-action routing grid, and a 48-action CFWS-style flattened index decoding to (source DC, destination DC, drain level) [6]. Nine heuristics span the policy space, including Round Robin, price-chasing and slack-grid concentrators, defer-to-trough rules, a GreenSlot-style Trough-Slot Lookahead foresighted heuristic with privileged 3-hour net-demand foresight [10], and the no-optimization Status Quo (serve locally, immediately) — the counterfactual of a CICS-style layer switched off.</w:t>
       </w:r>
     </w:p>
     <w:p>
@@ -2180,7 +2245,7 @@
           <w:i w:val="0"/>
           <w:sz w:val="19"/>
         </w:rPr>
-        <w:t>Because every policy is scored on the shaped objective (Eq. 8), we audit that PPO's savings are genuine scheduling, not penalty-dodging. Across all ten PPO batch-mode seeds: service served / demand = 1.0000, terminal backlog = 0, terminal batch pool ≤ 0.95 units, ZERO expired batch, peak transient backlog ≤ 3.9 units, and backlog penalty ≤ 1% of total cost. PPO is not parking interactive work to avoid price spikes (the λ_b = 25 calibration, Sec. III-C, makes that unprofitable) nor leaking work past the finite horizon — it serves everything, on time, more cheaply.</w:t>
+        <w:t>Because every policy is scored on the shaped objective (Eq. 10), we audit that PPO's savings are genuine scheduling, not penalty-dodging. Across all ten PPO batch-mode seeds: service served / demand = 1.0000, terminal backlog = 0, terminal batch pool ≤ 0.95 units, ZERO expired batch, peak transient backlog ≤ 3.9 units, and backlog penalty ≤ 1% of total cost. PPO is not parking interactive work to avoid price spikes (the λ_b = 25 calibration, Sec. III-C, makes that unprofitable) nor leaking work past the finite horizon — it serves everything, on time, more cheaply.</w:t>
       </w:r>
     </w:p>
     <w:p>
@@ -2219,7 +2284,72 @@
           <w:i/>
           <w:sz w:val="20"/>
         </w:rPr>
-        <w:t>G. Generalization: transfer tracks observability</w:t>
+        <w:t>G. The demand charge: a real cost the objective does not see</w:t>
+      </w:r>
+    </w:p>
+    <w:p>
+      <w:pPr>
+        <w:spacing w:after="60"/>
+      </w:pPr>
+      <w:r>
+        <w:rPr>
+          <w:b w:val="0"/>
+          <w:i w:val="0"/>
+          <w:sz w:val="19"/>
+        </w:rPr>
+        <w:t>Φ is a grid-stress shadow price, not the operator's tariff (Sec. III-A). Because a demand charge is the single largest line item that our objective omits, we quantify it for every policy from the grid-draw traces, at a reference c = $15/kW-month, WITHOUT putting it in the reward — so the policies compared are exactly those of Sec. VI-A. Billing is per meter, so the billed quantity is Σᵢ maxₜ gᵢ,ₜ, not the fleet coincident peak.</w:t>
+      </w:r>
+    </w:p>
+    <w:p>
+      <w:pPr>
+        <w:spacing w:after="60"/>
+      </w:pPr>
+      <w:r>
+        <w:rPr>
+          <w:b w:val="0"/>
+          <w:i w:val="0"/>
+          <w:sz w:val="19"/>
+        </w:rPr>
+        <w:t>The charge is large: $4.69M/month under the status quo, 39% of that scenario's $12.06M energy bill and 2.3× the Φ term already in the objective — in line with the 30–50% share demand charges hold in real commercial bills. PPO reduces it to $4.32M (−8.0%, Global batch) and $4.35M (−7.3%, US batch) as a SIDE EFFECT of routing for energy price, with the term absent from its reward.</w:t>
+      </w:r>
+    </w:p>
+    <w:p>
+      <w:pPr>
+        <w:spacing w:after="60"/>
+      </w:pPr>
+      <w:r>
+        <w:rPr>
+          <w:b w:val="0"/>
+          <w:i w:val="0"/>
+          <w:sz w:val="19"/>
+        </w:rPr>
+        <w:t>Two findings temper the obvious next step of adding it to the reward. First, the headroom is small, because most of the charge is not shapeable: sites never power off, so Σᵢ Pᵢⁱᵈˡᵉ·R = 189.8 MW = $2.85M is irreducible — 66% of the best charge any policy could achieve. Solving for the peak-minimizing feasible allocation (the clairvoyant LP collapses to a greedy lowest-sᵢ·R fill, since only the busiest step binds) gives a floor of 267.1 MW = $4.01M, so the entire prize is $0.69M and PPO already captures about half of it incidentally. What remains — roughly $0.31M, 2.5% of J — sits inside our seed-to-seed spread and would not survive as a headline result. Second, a demand charge would PENALIZE part of PPO's current strategy: concentrating load on the cheap, efficient sites raises their site peaks (Global batch: US-West +9%, US-Central +15%) even as EU and Asia fall, so a retrained policy would trade energy saving for peak relief rather than adding to it.</w:t>
+      </w:r>
+    </w:p>
+    <w:p>
+      <w:pPr>
+        <w:spacing w:after="60"/>
+      </w:pPr>
+      <w:r>
+        <w:rPr>
+          <w:b w:val="0"/>
+          <w:i w:val="0"/>
+          <w:sz w:val="19"/>
+        </w:rPr>
+        <w:t>The genuinely interesting consequence is for the temporal lever. Energy arbitrage pays only if timing is right CONTINUOUSLY for a month; clipping a demand charge pays if timing is right at ONE interval. At the busiest step, 17% of load is deferrable batch, and vacating it drops the floor from 289.4 to 267.1 MW — a larger single lever than all spatial reoptimization combined, and well within the Hᵢ = 8–26 step deadline horizons. A demand charge is thus the one cost term that would give deferral real value at these deferrable fractions, where the shaped objective values it at ~0.2% (Sec. VI-F). The obstacle is credit assignment: at γ = 0.99 the effective horizon is ~100 steps, while a monthly billing period is 8917 — 89× longer — so the once-a-period record-setting reward is invisible to the agent. Daily billing (288 steps), which real tariffs also use and which lower-bounds the monthly charge exactly, is the tractable form; the environment implements it (Eq. 6) and it is left disabled here. We flag this as the most promising extension rather than a completed result.</w:t>
+      </w:r>
+    </w:p>
+    <w:p>
+      <w:pPr>
+        <w:spacing w:after="40"/>
+      </w:pPr>
+      <w:r>
+        <w:rPr>
+          <w:b/>
+          <w:i/>
+          <w:sz w:val="20"/>
+        </w:rPr>
+        <w:t>H. Generalization: transfer tracks observability</w:t>
       </w:r>
     </w:p>
     <w:p>
@@ -2296,7 +2426,7 @@
           <w:i/>
           <w:sz w:val="20"/>
         </w:rPr>
-        <w:t>H. Robustness to movement cost</w:t>
+        <w:t>I. Robustness to movement cost</w:t>
       </w:r>
     </w:p>
     <w:p>
@@ -2439,7 +2569,7 @@
           <w:i w:val="0"/>
           <w:sz w:val="19"/>
         </w:rPr>
-        <w:t>Threats to validity. (i) PRICES are documented synthetic, not real LMP (Sec. IV-D) — the most significant limitation; relative comparisons are unaffected (shared series) and net demand is real, but absolute price levels are modeled, and resolving this with real ISO prices is primary future work. (ii) Cell locations are anonymized; the geographic assignment is a modeling choice justified by documented inter-cell heterogeneity [1]. (iii) The 100 MW magnitude bridges cell scale to grid relevance; results should be swept over R, and a 300 MW fleet would plausibly move LMPs (the price-taker assumption). (iv) The measured tier curves make episodes deterministic; Sec. VI-G addresses the resulting memorization concern directly and shows transfer along observed axes. (v) May is the deepest duck-curve month in CAISO; seasonal generalization is untested. (vi) Cooling and PUE are excluded by scope; a multiplicative PUE would scale, not reorder, results. (vii) The linear power model is calibrated on u ≈ 0.1–0.7 and omits memory/IO effects (+0.03 R² at most); a policy pushing utilization outside that range extrapolates. (viii) Five seeds and one hyperparameter set per algorithm; DQN's higher seed variance (std up to ±$0.9M vs. PPO's ≤$0.25M) is itself reported as a stability finding.</w:t>
+        <w:t>Threats to validity. (i) PRICES are documented synthetic, not real LMP (Sec. IV-D) — the most significant limitation; relative comparisons are unaffected (shared series) and net demand is real, but absolute price levels are modeled, and resolving this with real ISO prices is primary future work. (ii) Cell locations are anonymized; the geographic assignment is a modeling choice justified by documented inter-cell heterogeneity [1]. (iii) The 100 MW magnitude bridges cell scale to grid relevance; results should be swept over R, and a 300 MW fleet would plausibly move LMPs (the price-taker assumption). (iv) The measured tier curves make episodes deterministic; Sec. VI-H addresses the resulting memorization concern directly and shows transfer along observed axes. (v) May is the deepest duck-curve month in CAISO; seasonal generalization is untested. (vi) Cooling and PUE are excluded by scope; a multiplicative PUE would scale, not reorder, results. (vii) The linear power model is calibrated on u ≈ 0.1–0.7 and omits memory/IO effects (+0.03 R² at most); a policy pushing utilization outside that range extrapolates. (viii) Five seeds and one hyperparameter set per algorithm; DQN's higher seed variance (std up to ±$0.9M vs. PPO's ≤$0.25M) is itself reported as a stability finding.</w:t>
       </w:r>
     </w:p>
     <w:p>

</xml_diff>

<commit_message>
Correct demand charge modeling
</commit_message>
<xml_diff>
--- a/thesis_paper.docx
+++ b/thesis_paper.docx
@@ -55,7 +55,7 @@
           <w:i/>
           <w:sz w:val="16"/>
         </w:rPr>
-        <w:t>Master's Thesis Draft — generated working paper; numbers correspond to the multi-seed review campaign (5 seeds/config) on the corrected environment.</w:t>
+        <w:t>Master's Thesis Draft — generated working paper; numbers correspond to the multi-seed default-off campaign (5 seeds/config); the demand-charge extension is explicitly labeled single-seed.</w:t>
       </w:r>
     </w:p>
     <w:p>
@@ -68,7 +68,7 @@
           <w:i w:val="0"/>
           <w:sz w:val="18"/>
         </w:rPr>
-        <w:t>Abstract — Hyperscale data centers are now grid-scale electrical loads whose consumption coincides with regional net-demand peaks (the “duck curve”). We study whether a reinforcement-learning agent can route workload across geographically distributed data centers — spatially (where) and temporally (when, for deferrable batch work) — to minimize electricity cost while reducing the fleet's contribution to grid stress. Following the aggregate load-shaping paradigm of Google's production Carbon-Intelligent Computing System rather than job-level scheduling, we model four Borg cells from the Google ClusterData 2019 trace as proxy data centers: measured per-tier demand curves (service vs. no-SLO batch, extracted from instance-level usage by priority tier), per-cell power models calibrated on the companion PowerData2019 measurements (R² = 0.75–0.80 per cell vs. 0.43 pooled), real EIA-930 net-demand series, and documented synthetic regional price series (see provenance note, Sec. IV-D). Across five training seeds per configuration, a continuous-action PPO policy controlling routing fractions, batch drain rates, and batch placement beats the grid-unaware status quo by 2.7–12.9%, a foresighted lookahead heuristic by 5.0–14.8%, and the best discrete DQN variant by 2.5–9.9% (winning 19 of 20 seed-paired comparisons), and sits within 1.1–5.6% of a clairvoyant convex-QP lower bound — with zero deadline violations and 100% of service demand served. A three-stage generalization study shows transfer succeeds along the observed axis (a real 2019→2024 net-demand shift) but fails along an unobserved one (held-out cells), until domain randomization restores it; and the spatial advantage survives inter-site movement costs up to ~0.35–0.53× the energy cost of serving a unit. We additionally contribute three experimentally validated modeling lessons — deadline penalties must scale with the energy value of deferred work; capacity-blocked work must queue, not expire; and synthetic workload generators must conserve the demand-presentation process (requests ≠ usage) — each of which, while uncorrected, inverted the experimental ranking.</w:t>
+        <w:t>Abstract — Hyperscale data centers are now grid-scale electrical loads whose consumption coincides with regional net-demand peaks (the “duck curve”). We study whether a reinforcement-learning agent can route workload across geographically distributed data centers — spatially (where) and temporally (when, for deferrable batch work) — to minimize electricity cost while reducing the fleet's contribution to grid stress. Following the aggregate load-shaping paradigm of Google's production Carbon-Intelligent Computing System rather than job-level scheduling, we model four Borg cells from the Google ClusterData 2019 trace as proxy data centers: measured per-tier demand curves (service vs. no-SLO batch, extracted from instance-level usage by priority tier), per-cell power models calibrated on the companion PowerData2019 measurements (R² = 0.75–0.80 per cell vs. 0.43 pooled), regional net-demand series (EIA-930 for US regions; documented approximations outside the US), and documented synthetic regional price series (see provenance note, Sec. IV-D). Across five training seeds per configuration, a continuous-action PPO policy controlling routing fractions, batch drain rates, and batch placement beats the grid-unaware status quo by 2.7–12.9%, a foresighted lookahead heuristic by 5.0–14.8%, and the best discrete DQN variant by 2.5–9.9% (winning 19 of 20 seed-paired comparisons), and sits within 1.3–5.7% of a clairvoyant convex-QP lower bound — with zero deadline violations and 100% of service demand served. A three-stage generalization study shows transfer succeeds along an observed net-demand-year shift (real EIA-930 for US regions; updated approximations for non-US regions) but fails along an unobserved one (held-out cells), until domain randomization restores it; and the spatial advantage survives inter-site movement costs up to ~0.35–0.53× the energy cost of serving a unit. We additionally contribute three experimentally validated modeling lessons — deadline penalties must scale with the energy value of deferred work; capacity-blocked work must queue, not expire; and synthetic workload generators must conserve the demand-presentation process (requests ≠ usage) — each of which, while uncorrected, inverted the experimental ranking.</w:t>
       </w:r>
     </w:p>
     <w:p>
@@ -118,7 +118,7 @@
           <w:i w:val="0"/>
           <w:sz w:val="19"/>
         </w:rPr>
-        <w:t>Data centers consumed roughly 415 TWh of electricity in 2024, and the IEA projects consumption to more than double to ~950 TWh — about 3% of global electricity demand — by 2030 [28]; the geographic concentration of hyperscale campuses turns individual operators into grid-scale loads. Simultaneously, solar-heavy grids exhibit the duck curve: midday renewable generation depresses net demand, followed by a steep evening ramp during which prices spike and grid stress peaks. A data-center fleet that concentrates its draw during these ramps contributes directly to system peaks; a fleet that shifts flexible work across locations and hours can instead smooth them. Google's production Carbon-Intelligent Computing System (CICS) demonstrates that this lever is real at hyperscale [3]. Open RL environments for sustainable data-center scheduling now exist — SustainDC for within-DC multi-agent control [26] and SustainCluster for geo-distributed per-task dispatch [27] — but none provides measured per-tier (flexible vs. inflexible) demand decomposition of a hyperscale trace, power models calibrated on companion power measurements, or a grid net-demand (duck-curve) objective; those are the gaps this thesis fills.</w:t>
+        <w:t>Data centers consumed roughly 415 TWh of electricity in 2024, and the IEA projects consumption to more than double to ~950 TWh — about 3% of global electricity demand — by 2030 [28]; the geographic concentration of hyperscale campuses turns individual operators into grid-scale loads. Simultaneously, solar-heavy grids exhibit the duck curve: midday renewable generation depresses net demand, followed by a steep evening ramp during which prices spike and grid stress peaks. A data-center fleet that concentrates its draw during these ramps contributes directly to system peaks; a fleet that shifts flexible work across locations and hours can instead smooth them. Google's production Carbon-Intelligent Computing System (CICS) demonstrates temporal shifting at hyperscale [3]; geographic load-balancing work establishes the spatial lever [23]–[25]. Open RL environments for sustainable data-center scheduling now exist — SustainDC for within-DC multi-agent control [26] and SustainCluster for geo-distributed per-task dispatch [27] — but none provides measured per-tier (flexible vs. inflexible) demand decomposition of a hyperscale trace, power models calibrated on companion power measurements, or a grid net-demand (duck-curve) objective; those are the gaps this thesis fills.</w:t>
       </w:r>
     </w:p>
     <w:p>
@@ -131,7 +131,7 @@
           <w:i w:val="0"/>
           <w:sz w:val="19"/>
         </w:rPr>
-        <w:t>This thesis asks: can a model-free reinforcement-learning agent, observing only per-site demand, prices, and grid net demand, learn a joint spatial-temporal load-shaping policy that beats both the grid-unaware status quo and foresighted scheduling heuristics? We answer affirmatively, on an environment built end-to-end from measured data, and we document — unusually, as a first-class contribution — the modeling errors we made on the way, each of which inverted the experimental ranking until found and fixed.</w:t>
+        <w:t>This thesis asks: can a model-free reinforcement-learning agent, observing only per-site demand, prices, and grid net demand, learn a joint spatial-temporal load-shaping policy that beats both the grid-unaware status quo and foresighted scheduling heuristics? We answer affirmatively, on an environment combining measured traces with explicitly identified modeled market inputs, and we document — unusually, as a first-class contribution — the modeling errors we made on the way, each of which inverted the experimental ranking until found and fixed.</w:t>
       </w:r>
     </w:p>
     <w:p>
@@ -144,7 +144,7 @@
           <w:i w:val="0"/>
           <w:sz w:val="19"/>
         </w:rPr>
-        <w:t>Contributions. (C1) A reproducible Gymnasium environment for multi-data-center grid-aware load shaping at cell-aggregate granularity, grounded in Google ClusterData 2019 [1], PowerData2019 [2], EIA-930 net demand, and documented synthetic regional prices. (C2) Ground-truth measured per-tier demand decomposition (SLO service vs. no-SLO batch) of four trace cells, with the finding that resource requests overestimate the deferrable usage share by 3–5×. (C3) A continuous-action PPO formulation (routing + drain + batch placement) that, across five seeds per configuration, wins every evaluated configuration against heuristic, DQN, and status-quo baselines with zero deadline violations, and lands within 1.1–5.6% of a clairvoyant QP lower bound. (C4) Identification of marginal-power (slope) arbitrage as an emergent routing strategy enabled by per-cell power calibration. (C5) A three-stage generalization result establishing that transfer tracks observability, with domain randomization closing the unobserved axis. (C6) Three transferable modeling lessons for deferral-with-deadlines simulators, each validated by ranking inversion.</w:t>
+        <w:t>Contributions. (C1) A reproducible Gymnasium environment for multi-data-center grid-aware load shaping at cell-aggregate granularity, grounded in Google ClusterData 2019 [1], PowerData2019 [2], EIA-930 US net demand, documented non-US net-demand approximations, and synthetic regional prices. (C2) Ground-truth measured per-tier demand decomposition (SLO service vs. no-SLO batch) of four trace cells, with the finding that resource requests overestimate the deferrable usage share by 3–5×. (C3) A continuous-action PPO formulation (routing + drain + batch placement) that, across five seeds per configuration, wins every evaluated configuration against heuristic, DQN, and status-quo baselines with zero deadline violations, and lands within 1.3–5.7% of a clairvoyant QP lower bound. (C4) Identification of marginal-power (slope) arbitrage as an emergent routing strategy enabled by per-cell power calibration. (C5) A three-stage generalization result establishing that transfer tracks observability, with domain randomization closing the unobserved axis. (C6) Three transferable modeling lessons for deferral-with-deadlines simulators, each validated by ranking inversion.</w:t>
       </w:r>
     </w:p>
     <w:p>
@@ -197,7 +197,7 @@
           <w:i w:val="0"/>
           <w:sz w:val="19"/>
         </w:rPr>
-        <w:t>ClusterData 2019, documented by Tirmazi et al. [1], covers eight Borg cells for May 2019 (~96k machines). We adopt three of its definitions wholesale: the cell as the natural management unit (§2 of [1]); priority tiers, from which we define deferrable work as the union of the two no-SLO tiers — free (priority ≤ 99) and best-effort batch (100–115, per the trace documentation [22], which corrects the 110–115 range mistakenly reported in [1]) — production work (120–359) is explicitly protected by eviction of lower tiers and is never deferred; and Normalized Compute Units. The companion PowerData2019 [2] provides measured per-PDU power utilization, used here for calibration. Tirmazi's heavy-tail observation (top 1% of jobs consume &gt;99% of resources) informs our distribution fits; notably we find the tail does not survive aggregation (Sec. VII).</w:t>
+        <w:t>ClusterData 2019, documented by Tirmazi et al. [1], covers eight Borg cells for May 2019 (~96k machines). We adopt three of its definitions wholesale: the cell as the natural management unit (§2 of [1]); priority tiers, from which we define deferrable work as the union of the two no-SLO tiers — free (priority ≤ 99) and best-effort batch (100–115, per the normative trace documentation [22]; Tirmazi et al. [1] describe the range as 110–115) — production work (120–359) is explicitly protected by eviction of lower tiers and is never deferred; and Normalized Compute Units. The companion PowerData2019 trace provides measured per-PDU power utilization [2], used here for calibration. Tirmazi's heavy-tail observation (top 1% of jobs consume &gt;99% of resources) informs our distribution fits; notably we find the tail does not survive aggregation (Sec. VII).</w:t>
       </w:r>
     </w:p>
     <w:p>
@@ -223,7 +223,7 @@
           <w:i w:val="0"/>
           <w:sz w:val="19"/>
         </w:rPr>
-        <w:t>Our synthetic batch generator descends directly from Da Costa, Grange &amp; De Courchelle [5], instantiated as the scipy-based Listing 1 of Grange et al. [4], in the Feitelson workload-modeling tradition [21]. We reproduce Listing 1 verbatim (scripts/grange_generator.py recovers their published lognormal s = 1.634, scale = 447), then extend it: distributions are re-fit to the 2019 trace under the no-SLO definition, selected by minimum Kolmogorov–Smirnov distance (the p-value saturates at n ≈ 10⁵), with discrete negative-binomial task counts. Grange's SLA-flexibility knob becomes our deadline model, Eq. (7). Critically, in the final environment the generator is demoted to sensitivity analysis: measured per-tier curves are the primary input, after we found single-timestep job pulses inflated batch burstiness by two orders of magnitude (Sec. VII).</w:t>
+        <w:t>Our synthetic batch generator descends directly from Da Costa, Grange &amp; De Courchelle [5], instantiated as the scipy-based Listing 1 of Grange et al. [4], in the Feitelson workload-modeling tradition [21]. Those works use the 2011 Google trace; we retain the generator family but re-fit every distribution to ClusterData2019. We reproduce Listing 1 verbatim (scripts/grange_generator.py recovers their published lognormal s = 1.634, scale = 447), then extend it: distributions are re-fit to the 2019 trace under the no-SLO definition, selected by minimum Kolmogorov–Smirnov distance (the p-value saturates at n ≈ 10⁵), with discrete negative-binomial task counts. Grange's SLA-flexibility knob becomes our deadline model, Eq. (7). Critically, in the final environment the generator is demoted to sensitivity analysis: measured per-tier curves are the primary input, after we found single-timestep job pulses inflated batch burstiness by two orders of magnitude (Sec. VII).</w:t>
       </w:r>
     </w:p>
     <w:p>
@@ -275,7 +275,7 @@
           <w:i w:val="0"/>
           <w:sz w:val="19"/>
         </w:rPr>
-        <w:t>The deferral-with-deadlines pattern originates in single-DC work: GreenSlot [10] delays jobs toward predicted cheap/green slots; Grange et al. [4] add due-date constraints and an infrastructure-agnostic objective signal (49% brown-energy reduction); Xu et al. [7] split workloads into brownout-able interactive and deferrable batch; Haghshenas et al. [8] schedule heterogeneous workloads against rate structures; Liu et al. [9] forecast-then-plan. We benchmark against this lineage at the level of objectives and effects — cost, peak contribution, deferral value — not mechanism: our Trough-Slot baseline retargets GreenSlot's slot valuation from solar supply to grid net demand, and our service/batch split operationalizes Xu's taxonomy via measured tiers.</w:t>
+        <w:t>The deferral-with-deadlines pattern originates in single-DC work: GreenSlot [10] delays jobs toward predicted cheap/green slots; Grange et al. [4] add due-date constraints and an infrastructure-agnostic objective signal; Xu et al. [7] split workloads into brownout-able interactive and deferrable batch; Haghshenas et al. [8] schedule heterogeneous workloads against rate structures; Liu et al. [9] forecast-then-plan. We benchmark against this lineage at the level of objectives and effects — cost, peak contribution, deferral value — not mechanism: our Trough-Slot baseline retargets GreenSlot's slot valuation from solar supply to grid net demand, and our service/batch split operationalizes Xu's taxonomy via measured tiers.</w:t>
       </w:r>
     </w:p>
     <w:p>
@@ -301,7 +301,7 @@
           <w:i w:val="0"/>
           <w:sz w:val="19"/>
         </w:rPr>
-        <w:t>Radovanović et al. [3] describe CICS, which shapes aggregate cluster load via day-ahead Virtual Capacity Curves and explicitly supersedes job-level deadline optimization (“aggregate cluster-specific resource demand forecasts … rather than stylized models for job-level resource demand modeling”). Our environment is a CICS-shaped formulation made reproducible: aggregate flexible/inflexible demand curves per cluster, power models trained separately per cluster, and both spatial and temporal shifting — retargeted from carbon to grid demand smoothing, on public data.</w:t>
+        <w:t>Radovanović et al. [3] describe CICS, which shapes aggregate cluster load via day-ahead Virtual Capacity Curves and operates independently from real-time job-level scheduling, using cluster demand forecasts rather than a job-level workload model. Our environment is a CICS-shaped formulation made reproducible: aggregate flexible/inflexible demand curves per cluster, power models trained separately per cluster, and both spatial and temporal shifting — retargeted from carbon to grid demand smoothing, on public data.</w:t>
       </w:r>
     </w:p>
     <w:p>
@@ -327,7 +327,7 @@
           <w:i w:val="0"/>
           <w:sz w:val="19"/>
         </w:rPr>
-        <w:t>RL for DC energy management is surveyed in [15]; DeepEE [16] jointly schedules jobs and cooling with DRL (cooling is excluded from our scope). Closest to our setting, CFWS [6] applies DQN with a flattened-index action encoding to VM migration across four geo-distributed DCs. We do not reimplement CFWS (it operates per-VM/per-PM); instead we port its action-encoding philosophy to a 48-action variant and benchmark it, alongside a 759-action routing grid, against continuous-action PPO [18] (DQN [19]; implementations via Stable-Baselines3 [20]). Energy-model form follows the linear idle+slope server model surveyed in [14] and canonicalized by Fan et al. [17]; the demand-response framing follows [13]; broader green-DC context in [11], geo-distributed scheduling in [12].</w:t>
+        <w:t>RL for DC energy management is surveyed in [15]; DeepEE [16] jointly schedules jobs and cooling with DRL (cooling is excluded from our scope). At finer granularity, CFWS [6] applies DQN with a flattened-index action encoding to VM/PM migration. We do not benchmark or reimplement CFWS; we borrow only its compact index-decoding idea for a 48-action aggregate DQN sensitivity, alongside a 759-action routing grid, against continuous-action PPO [18] (DQN [19]; implementations via Stable-Baselines3 [20]). Energy-model form follows the linear idle+slope server model surveyed in [14] and canonicalized by Fan et al. [17]; the demand-response framing follows [13]; broader green-DC context in [11], geo-distributed scheduling in [12].</w:t>
       </w:r>
     </w:p>
     <w:p>
@@ -340,7 +340,7 @@
           <w:i w:val="0"/>
           <w:sz w:val="19"/>
         </w:rPr>
-        <w:t>Open benchmark environments for this problem class have recently emerged. SustainDC [26] provides multi-agent Gymnasium environments for control *within* a data center (workload shifting, cooling, battery). SustainCluster [27] is its geo-distributed successor: a centralized scheduler dispatches or defers *individual tasks* of the Alibaba 2020 GPU trace across 20+ global locations every 15 minutes, optimizing energy cost, carbon, SLA, and per-GB transmission overheads. Our environment is complementary on three axes: granularity (CICS-style measured aggregate per-tier curves rather than per-task dispatch), data grounding (Google ClusterData 2019 with PowerData2019-calibrated per-cell power, rather than Alibaba GPU jobs with carbon-intensity feeds), and objective (grid net-demand peak contribution rather than carbon). We deliberately do not run our experiments inside SustainCluster: answering our question there would require replacing both its objective (carbon → grid net demand) and its action model (per-task dispatch → aggregate tier control, the granularity Sec. II-E argues for), while abandoning the Google-trace data contributions — at which point the environment would no longer be SustainCluster. The two environments are complementary benchmarks; SustainCluster's transmission-cost model is the natural template for the movement-cost sensitivity analysis of Sec. VIII, and cross-validation of our policies inside it is listed as future work.</w:t>
+        <w:t>Open benchmark environments for this problem class have recently emerged. SustainDC [26] provides multi-agent Gymnasium environments for control *within* a data center (workload shifting, cooling, battery). SustainCluster [27] is a complementary geo-distributed environment: a centralized scheduler dispatches or defers *individual tasks* of the Alibaba 2020 GPU trace across 20+ global locations every 15 minutes, optimizing energy cost, carbon, SLA, and per-GB transmission overheads. Our environment is complementary on three axes: granularity (CICS-style measured aggregate per-tier curves rather than per-task dispatch), data grounding (Google ClusterData 2019 with PowerData2019-calibrated per-cell power, rather than Alibaba GPU jobs with carbon-intensity feeds), and objective (grid net-demand peak contribution rather than carbon). We deliberately do not run our experiments inside SustainCluster: answering our question there would require replacing both its objective (carbon → grid net demand) and its action model (per-task dispatch → aggregate tier control, the granularity Sec. II-E argues for), while abandoning the Google-trace data contributions — at which point the environment would no longer be SustainCluster. The two environments are complementary benchmarks; SustainCluster's transmission-cost model is the natural template for the movement-cost sensitivity analysis of Sec. VIII, and cross-validation of our policies inside it is listed as future work.</w:t>
       </w:r>
     </w:p>
     <w:p>
@@ -484,7 +484,7 @@
           <w:i w:val="0"/>
           <w:sz w:val="19"/>
         </w:rPr>
-        <w:t>Because that distinction is easy to lose, the operator's actual tariff term is modeled separately. Commercial and industrial customers are billed on the single highest demand interval of each billing period, per meter — routinely 30-50% of a large customer's bill [9], [13] — so the billed quantity is the sum of per-SITE maxima, not the fleet coincident peak:</w:t>
+        <w:t>Because that distinction is easy to lose, the operator's actual tariff term is modeled separately. Commercial and industrial customers are billed on the single highest demand interval of each billing period, per meter. Such charges can be a substantial C&amp;I bill component, but the share is tariff- and customer-specific; our reference sensitivity assumes no universal percentage. The billed quantity is the sum of per-SITE maxima, not the fleet coincident peak:</w:t>
       </w:r>
     </w:p>
     <w:p>
@@ -497,7 +497,7 @@
           <w:i/>
           <w:sz w:val="19"/>
         </w:rPr>
-        <w:t>Ψ = c · Σᵢ maxₜ gᵢ,ₜ · 1000,   c in $/kW-month        (5)</w:t>
+        <w:t>Ψ = c · Σᵢ maxₜ gᵢ,ₜ · 1000,   c in $/kW per billing period        (5)</w:t>
       </w:r>
     </w:p>
     <w:p>
@@ -536,7 +536,20 @@
           <w:i w:val="0"/>
           <w:sz w:val="19"/>
         </w:rPr>
-        <w:t>This keeps the cost Markov provided Dᵢ,ₜ₋₁ is observable, which is why the running billed peak is added to the observation whenever the term is active; without it, identical (load, price, net-demand) states carry different marginal costs depending on unobserved history. Ψ is reported for every policy in Sec. VI-G but is DISABLED in the reward (c = 0) for all results in this paper, so the trained policies and the shaped objective they optimize are unchanged; Sec. VI-G quantifies what including it would and would not buy.</w:t>
+        <w:t>The complete 8,917-step episode is one study billing cycle by default, so c is applied exactly once and the in-reward quantity matches the post-hoc metric. A shorter configured period is a different tariff with its own $/kW-period rate, not a monthly proxy. The telescoping identity is exact under the RL objective only when gamma = 1; the training entry points therefore select gamma = 1 whenever the term is enabled and reject a lower discount. The observation then includes Dᵢ,ₜ₋₁ for every site plus billing-period progress and the active-rate fraction, and a new period is reset before its first observation. Together these make the tariff state Markov and prevent actions from seeing a stale prior-period peak. Ψ is reported for every policy in Sec. VI-G but is DISABLED in the reward (c = 0) for all results in this paper, so the trained policies and their objective are unchanged.</w:t>
+      </w:r>
+    </w:p>
+    <w:p>
+      <w:pPr>
+        <w:spacing w:after="60"/>
+      </w:pPr>
+      <w:r>
+        <w:rPr>
+          <w:b w:val="0"/>
+          <w:i w:val="0"/>
+          <w:sz w:val="19"/>
+        </w:rPr>
+        <w:t>The $15/kW reference is a sensitivity analysis rather than a reconstruction of four utility bills. It is a mid-range US commercial/industrial reference within the broad tariff range catalogued by the NREL demand-charge survey [29]; it uses that one US rate across all geographies solely for comparison, treats each five-minute trace sample as a demand interval, aligns the cycle to the episode, and omits site-specific time-of-use demand tiers, ratchets, contract demand, and power-factor clauses.</w:t>
       </w:r>
     </w:p>
     <w:p>
@@ -562,7 +575,7 @@
           <w:i w:val="0"/>
           <w:sz w:val="19"/>
         </w:rPr>
-        <w:t>Each site maintains a pool Qᵢ,ₜ of batch work with per-entry deadlines. The per-cell deadline horizon (in steps) follows the fitted mean duration μᵢ and flexibility factor φ = 1 (after [4]); an arrival entering at step t is due by t + Hᵢ:</w:t>
+        <w:t>Each origin site maintains a batch pool with per-entry deadlines. Queue timing must be explicit: Q⁻ᵢ,ₜ is work carried into step t before the current arrival and deadline boundary; Q⁺ᵢ,ₜ is the work eligible for release after arrival aᵢ,ₜ is added and expired work Xᵢ,ₜ is removed. The per-cell deadline horizon follows fitted mean duration μᵢ and flexibility factor φ = 1 (after [4]). An arrival at t is eligible during steps t,…,t+Hᵢ−1 and expires at the start of t+Hᵢ if unfinished:</w:t>
       </w:r>
     </w:p>
     <w:p>
@@ -588,7 +601,7 @@
           <w:i/>
           <w:sz w:val="19"/>
         </w:rPr>
-        <w:t>Qᵢ,ₜ₊₁ = Qᵢ,ₜ + aᵢ,ₜ − Sᵢ,ₜ − Xᵢ,ₜ        (8)</w:t>
+        <w:t>Q⁺ᵢ,ₜ = Q⁻ᵢ,ₜ + aᵢ,ₜ − Xᵢ,ₜ;   rᵢ,ₜ = δᵢ,ₜQ⁺ᵢ,ₜ;   Q⁻ᵢ,ₜ₊₁ = Q⁺ᵢ,ₜ − qᵢ,ₜ        (8)</w:t>
       </w:r>
     </w:p>
     <w:p>
@@ -601,7 +614,7 @@
           <w:i w:val="0"/>
           <w:sz w:val="19"/>
         </w:rPr>
-        <w:t>where Sᵢ,ₜ is batch actually served (run) at i this step and Xᵢ,ₜ is batch that expired. Two semantics are essential and were validated by invariant (Sec. V-C): a drain is an intended *release to run* — the released work runs only insofar as it fits under capacity (Eq. 9), and the part that does not fit stays in the pool with its original deadline (it queues, as Borg's batch scheduler does [1], rather than expiring on a one-step fuse). Only served work Sᵢ,ₜ leaves the pool; only deadline-passed work expires as Xᵢ,ₜ.</w:t>
+        <w:t>Here rᵢ,ₜ is origin i's requested release and qᵢ,ₜ is the amount of that origin's work actually completed anywhere in the fleet. This two-phase notation resolves an indexing ambiguity in earlier drafts: if Q were instead defined as the post-arrival pool, its next-step recurrence would indeed use aᵢ,ₜ₊₁. With Q⁻ defined before the arrival, aᵢ,ₜ in Eq. (8) is correct. A release is only an intent to run; capacity-blocked work remains in Q with its original deadline. Only completed q leaves the pool and only work at its deadline boundary becomes X.</w:t>
       </w:r>
     </w:p>
     <w:p>
@@ -627,7 +640,7 @@
           <w:i w:val="0"/>
           <w:sz w:val="19"/>
         </w:rPr>
-        <w:t>The agent outputs a ∈ [−3,3]³ᴺ, decoded as service routing fractions f = softmax(a₁:ₙ), drain rates δ = sigmoid(aₙ₊₁:₂ₙ), and batch placement h = softmax(a₂ₙ₊₁:₃ₙ) — batch work, having no latency SLO, may execute anywhere. Service has first claim on capacity; batch runs only in the remainder. Writing σᵢ,ₜ for service served and Sᵢ,ₜ for batch served, the serving rule is</w:t>
+        <w:t>The agent outputs a ∈ [−3,3]³ᴺ, decoded as service routing fractions f = softmax(a₁:ₙ), drain rates δ = sigmoid(aₙ₊₁:₂ₙ), and batch placement h = softmax(a₂ₙ₊₁:₃ₙ) — batch work, having no latency SLO, may execute anywhere. Indices now distinguish origin i from execution site j. Service has first claim on destination capacity; batch runs in the remainder:</w:t>
       </w:r>
     </w:p>
     <w:p>
@@ -640,7 +653,7 @@
           <w:i/>
           <w:sz w:val="19"/>
         </w:rPr>
-        <w:t>σᵢ,ₜ = min(fᵢ,ₜDₜ + Bᵢ,ₜ₋₁, κᵢ);   Sᵢ,ₜ = min(hᵢ,ₜΣⱼδⱼ,ₜQⱼ,ₜ, κᵢ−σᵢ,ₜ);   uᵢ,ₜ = σᵢ,ₜ + Sᵢ,ₜ        (9)</w:t>
+        <w:t>σⱼ,ₜ=min(fⱼ,ₜDₜ+Bⱼ,ₜ₋₁,κⱼ);  yⱼ,ₜ=min(hⱼ,ₜΣᵢrᵢ,ₜ,κⱼ−σⱼ,ₜ);  ρₜ=Σⱼyⱼ,ₜ/Σᵢrᵢ,ₜ;  qᵢ,ₜ=ρₜrᵢ,ₜ;  uⱼ,ₜ=σⱼ,ₜ+yⱼ,ₜ        (9)</w:t>
       </w:r>
     </w:p>
     <w:p>
@@ -653,7 +666,7 @@
           <w:i w:val="0"/>
           <w:sz w:val="19"/>
         </w:rPr>
-        <w:t>Reading Eq. (9): service served = service routed in (fᵢ,ₜDₜ) plus carried backlog (Bᵢ,ₜ₋₁), capped at capacity κᵢ; the batch term hᵢ,ₜ Σⱼ δⱼ,ₜ Qⱼ,ₜ is site i's share (hᵢ,ₜ) of the fleet-wide drained pool — the sum over every site j of its released batch δⱼ,ₜ Qⱼ,ₜ — and runs only in the capacity service leaves free; total served CPU is uᵢ,ₜ = σᵢ,ₜ + Sᵢ,ₜ. The ±3 action bound (not the SB3 default ±1) matters: SB3 clips actions to the action box before the decode, so ±1 would cap every routing share to [4.3%, 71%] and every drain rate to [27%, 73%], making full concentration and multi-hour holding impossible by construction; ±3 restores parity with the discrete baselines (shares to ~98.5%). The reward is the negative per-step cost:</w:t>
+        <w:t>In Eq. (9), σ is service executed at destination j, y is batch executed there, and q is completed work removed from origin i's queue. The global serve ratio ρ allocates any capacity shortfall proportionally across origin release requests (ρ = 0 when no work is requested), so Σᵢqᵢ,ₜ = Σⱼyⱼ,ₜ. Within each origin, completed work is removed earliest-deadline-first. This origin/destination distinction is required once batch placement is spatial; earlier notation incorrectly used one Sᵢ,ₜ for both roles. The ±3 action bound (not the SB3 default ±1) matters: SB3 clips actions to the action box before the decode, so ±1 would cap every routing share to [4.3%, 71%] and every drain rate to [27%, 73%], making full concentration and multi-hour holding impossible by construction; ±3 restores parity with the discrete baselines (shares to ~98.5%). The reward is the negative per-step cost:</w:t>
       </w:r>
     </w:p>
     <w:p>
@@ -666,7 +679,7 @@
           <w:i/>
           <w:sz w:val="19"/>
         </w:rPr>
-        <w:t>rₜ = −[ Eₜ + Φₜ + λ_b Σᵢ Bᵢ,ₜ + λ_κ Σᵢ max(0, uᵢ,ₜ−κᵢ) + λ_x Σᵢ Xᵢ,ₜ ]        (10)</w:t>
+        <w:t>rₜ = −[ Eₜ + Φₜ + Σᵢ(ψᵢ,ₜ + λ_bBᵢ,ₜ) + χₜ ]        (10)</w:t>
       </w:r>
     </w:p>
     <w:p>
@@ -679,7 +692,7 @@
           <w:i w:val="0"/>
           <w:sz w:val="19"/>
         </w:rPr>
-        <w:t>with backlog weight λ_b = 25, capacity weight λ_κ = 5, and deadline (expiry) weight λ_x = 250 — the last renamed from a bare w to avoid clashing with the demand symbol wᵢ,ₜ. Both λ_x and λ_b are calibrated to the energy value of the work they protect (Sec. VII, L1): λ_x sits safely above both the ~$150 cost of serving a deferred unit and the analytic ranking-inversion point λ_x ≈ 183, and λ_b is set so that parking SLO service in the backlog to dodge a price spike is never profitable (at the SB3-typical λ_b = 1.5 a three-hour hold costs only ~$54 against ~$180 of arbitrage, an exploit the audit in Sec. VI confirms is closed). The demand-smoothing metric reported alongside cost is the fleet load factor LF = mean(g)/max(g).</w:t>
+        <w:t>With the tariff disabled, backlog weight λ_b = 25 and expiry weight λ_x = 250 preserve the historical objective. Enabling a demand charge also enables an economic guard: both weights are raised above a conservative bound on the largest one-step energy + grid-penalty + demand-charge saving obtainable by dropping one normalized CPU unit (with a 5% margin). This prevents the tariff from making unserved work economically optimal. Default-off χₜ=λ_xΣᵢXᵢ,ₜ. Demand-enabled runs use the exact dense potential χₜ=λ_xΣᵢ(aᵢ,ₜ−qᵢ,ₜ); with γ=1, Σₜχₜ=λ_x(expired+terminal-pool work). This credits completion immediately while preserving the finite-horizon objective. Raw dollar costs remain in logs and reports, while the RL reward is multiplied by 10⁻⁴ for numerical conditioning. Capacity is a hard serving constraint in Eq. (9), so no capacity-violation term belongs in the mathematical objective (the implementation retains a zero-valued diagnostic guard). The zero-expiry audit is an observed result, not a hard constraint. The demand-smoothing metric reported alongside cost is fleet load factor LF = mean(g)/max(g).</w:t>
       </w:r>
     </w:p>
     <w:p>
@@ -692,7 +705,620 @@
           <w:i/>
           <w:sz w:val="20"/>
         </w:rPr>
-        <w:t>D. Problem formulation</w:t>
+        <w:t>D. Worked three-step example</w:t>
+      </w:r>
+    </w:p>
+    <w:p>
+      <w:pPr>
+        <w:spacing w:after="60"/>
+      </w:pPr>
+      <w:r>
+        <w:rPr>
+          <w:b w:val="0"/>
+          <w:i w:val="0"/>
+          <w:sz w:val="19"/>
+        </w:rPr>
+        <w:t>A one-site slice makes the units concrete. Let κ=1, R=100 MW, P(u)=0.50+0.40u, α=0.015, c=$15/kW-cycle, and assume no backlog or expiry. The values below use Eq. (8)–(10); a multi-site step performs the same arithmetic after f and h divide service and batch across destinations.</w:t>
+      </w:r>
+    </w:p>
+    <w:p>
+      <w:pPr>
+        <w:jc w:val="center"/>
+      </w:pPr>
+      <w:r>
+        <w:rPr>
+          <w:b/>
+          <w:sz w:val="16"/>
+        </w:rPr>
+        <w:t>ILLUSTRATIVE THREE-STEP EQUATION WALKTHROUGH</w:t>
+      </w:r>
+    </w:p>
+    <w:tbl>
+      <w:tblPr>
+        <w:tblStyle w:val="LightGrid-Accent1"/>
+        <w:tblW w:type="auto" w:w="0"/>
+        <w:tblLook w:firstColumn="1" w:firstRow="1" w:lastColumn="0" w:lastRow="0" w:noHBand="0" w:noVBand="1" w:val="04A0"/>
+      </w:tblPr>
+      <w:tblGrid>
+        <w:gridCol w:w="2520"/>
+        <w:gridCol w:w="2520"/>
+        <w:gridCol w:w="2520"/>
+        <w:gridCol w:w="2520"/>
+      </w:tblGrid>
+      <w:tr>
+        <w:tc>
+          <w:tcPr>
+            <w:tcW w:type="dxa" w:w="1368"/>
+          </w:tcPr>
+          <w:p>
+            <w:r>
+              <w:rPr>
+                <w:b/>
+                <w:sz w:val="16"/>
+              </w:rPr>
+              <w:t>Quantity</w:t>
+            </w:r>
+          </w:p>
+        </w:tc>
+        <w:tc>
+          <w:tcPr>
+            <w:tcW w:type="dxa" w:w="1037"/>
+          </w:tcPr>
+          <w:p>
+            <w:r>
+              <w:rPr>
+                <w:b/>
+                <w:sz w:val="16"/>
+              </w:rPr>
+              <w:t>t=0</w:t>
+            </w:r>
+          </w:p>
+        </w:tc>
+        <w:tc>
+          <w:tcPr>
+            <w:tcW w:type="dxa" w:w="1037"/>
+          </w:tcPr>
+          <w:p>
+            <w:r>
+              <w:rPr>
+                <w:b/>
+                <w:sz w:val="16"/>
+              </w:rPr>
+              <w:t>t=1</w:t>
+            </w:r>
+          </w:p>
+        </w:tc>
+        <w:tc>
+          <w:tcPr>
+            <w:tcW w:type="dxa" w:w="1037"/>
+          </w:tcPr>
+          <w:p>
+            <w:r>
+              <w:rPr>
+                <w:b/>
+                <w:sz w:val="16"/>
+              </w:rPr>
+              <w:t>t=2</w:t>
+            </w:r>
+          </w:p>
+        </w:tc>
+      </w:tr>
+      <w:tr>
+        <w:tc>
+          <w:tcPr>
+            <w:tcW w:type="dxa" w:w="1368"/>
+          </w:tcPr>
+          <w:p>
+            <w:r>
+              <w:rPr>
+                <w:sz w:val="16"/>
+              </w:rPr>
+              <w:t>D; Q⁻; a</w:t>
+            </w:r>
+          </w:p>
+        </w:tc>
+        <w:tc>
+          <w:tcPr>
+            <w:tcW w:type="dxa" w:w="1037"/>
+          </w:tcPr>
+          <w:p>
+            <w:r>
+              <w:rPr>
+                <w:sz w:val="16"/>
+              </w:rPr>
+              <w:t>0.50; 0.10; 0.20</w:t>
+            </w:r>
+          </w:p>
+        </w:tc>
+        <w:tc>
+          <w:tcPr>
+            <w:tcW w:type="dxa" w:w="1037"/>
+          </w:tcPr>
+          <w:p>
+            <w:r>
+              <w:rPr>
+                <w:sz w:val="16"/>
+              </w:rPr>
+              <w:t>0.40; 0.15; 0.10</w:t>
+            </w:r>
+          </w:p>
+        </w:tc>
+        <w:tc>
+          <w:tcPr>
+            <w:tcW w:type="dxa" w:w="1037"/>
+          </w:tcPr>
+          <w:p>
+            <w:r>
+              <w:rPr>
+                <w:sz w:val="16"/>
+              </w:rPr>
+              <w:t>0.70; 0.15; 0</w:t>
+            </w:r>
+          </w:p>
+        </w:tc>
+      </w:tr>
+      <w:tr>
+        <w:tc>
+          <w:tcPr>
+            <w:tcW w:type="dxa" w:w="1368"/>
+          </w:tcPr>
+          <w:p>
+            <w:r>
+              <w:rPr>
+                <w:sz w:val="16"/>
+              </w:rPr>
+              <w:t>δ; Q⁺; q=y</w:t>
+            </w:r>
+          </w:p>
+        </w:tc>
+        <w:tc>
+          <w:tcPr>
+            <w:tcW w:type="dxa" w:w="1037"/>
+          </w:tcPr>
+          <w:p>
+            <w:r>
+              <w:rPr>
+                <w:sz w:val="16"/>
+              </w:rPr>
+              <w:t>0.50; 0.30; 0.15</w:t>
+            </w:r>
+          </w:p>
+        </w:tc>
+        <w:tc>
+          <w:tcPr>
+            <w:tcW w:type="dxa" w:w="1037"/>
+          </w:tcPr>
+          <w:p>
+            <w:r>
+              <w:rPr>
+                <w:sz w:val="16"/>
+              </w:rPr>
+              <w:t>0.40; 0.25; 0.10</w:t>
+            </w:r>
+          </w:p>
+        </w:tc>
+        <w:tc>
+          <w:tcPr>
+            <w:tcW w:type="dxa" w:w="1037"/>
+          </w:tcPr>
+          <w:p>
+            <w:r>
+              <w:rPr>
+                <w:sz w:val="16"/>
+              </w:rPr>
+              <w:t>1.00; 0.15; 0.15</w:t>
+            </w:r>
+          </w:p>
+        </w:tc>
+      </w:tr>
+      <w:tr>
+        <w:tc>
+          <w:tcPr>
+            <w:tcW w:type="dxa" w:w="1368"/>
+          </w:tcPr>
+          <w:p>
+            <w:r>
+              <w:rPr>
+                <w:sz w:val="16"/>
+              </w:rPr>
+              <w:t>u=σ+y</w:t>
+            </w:r>
+          </w:p>
+        </w:tc>
+        <w:tc>
+          <w:tcPr>
+            <w:tcW w:type="dxa" w:w="1037"/>
+          </w:tcPr>
+          <w:p>
+            <w:r>
+              <w:rPr>
+                <w:sz w:val="16"/>
+              </w:rPr>
+              <w:t>0.65</w:t>
+            </w:r>
+          </w:p>
+        </w:tc>
+        <w:tc>
+          <w:tcPr>
+            <w:tcW w:type="dxa" w:w="1037"/>
+          </w:tcPr>
+          <w:p>
+            <w:r>
+              <w:rPr>
+                <w:sz w:val="16"/>
+              </w:rPr>
+              <w:t>0.50</w:t>
+            </w:r>
+          </w:p>
+        </w:tc>
+        <w:tc>
+          <w:tcPr>
+            <w:tcW w:type="dxa" w:w="1037"/>
+          </w:tcPr>
+          <w:p>
+            <w:r>
+              <w:rPr>
+                <w:sz w:val="16"/>
+              </w:rPr>
+              <w:t>0.85</w:t>
+            </w:r>
+          </w:p>
+        </w:tc>
+      </w:tr>
+      <w:tr>
+        <w:tc>
+          <w:tcPr>
+            <w:tcW w:type="dxa" w:w="1368"/>
+          </w:tcPr>
+          <w:p>
+            <w:r>
+              <w:rPr>
+                <w:sz w:val="16"/>
+              </w:rPr>
+              <w:t>g=(.50+.40u)100</w:t>
+            </w:r>
+          </w:p>
+        </w:tc>
+        <w:tc>
+          <w:tcPr>
+            <w:tcW w:type="dxa" w:w="1037"/>
+          </w:tcPr>
+          <w:p>
+            <w:r>
+              <w:rPr>
+                <w:sz w:val="16"/>
+              </w:rPr>
+              <w:t>76 MW</w:t>
+            </w:r>
+          </w:p>
+        </w:tc>
+        <w:tc>
+          <w:tcPr>
+            <w:tcW w:type="dxa" w:w="1037"/>
+          </w:tcPr>
+          <w:p>
+            <w:r>
+              <w:rPr>
+                <w:sz w:val="16"/>
+              </w:rPr>
+              <w:t>70 MW</w:t>
+            </w:r>
+          </w:p>
+        </w:tc>
+        <w:tc>
+          <w:tcPr>
+            <w:tcW w:type="dxa" w:w="1037"/>
+          </w:tcPr>
+          <w:p>
+            <w:r>
+              <w:rPr>
+                <w:sz w:val="16"/>
+              </w:rPr>
+              <w:t>84 MW</w:t>
+            </w:r>
+          </w:p>
+        </w:tc>
+      </w:tr>
+      <w:tr>
+        <w:tc>
+          <w:tcPr>
+            <w:tcW w:type="dxa" w:w="1368"/>
+          </w:tcPr>
+          <w:p>
+            <w:r>
+              <w:rPr>
+                <w:sz w:val="16"/>
+              </w:rPr>
+              <w:t>π; d</w:t>
+            </w:r>
+          </w:p>
+        </w:tc>
+        <w:tc>
+          <w:tcPr>
+            <w:tcW w:type="dxa" w:w="1037"/>
+          </w:tcPr>
+          <w:p>
+            <w:r>
+              <w:rPr>
+                <w:sz w:val="16"/>
+              </w:rPr>
+              <w:t>$0.06; 0.80</w:t>
+            </w:r>
+          </w:p>
+        </w:tc>
+        <w:tc>
+          <w:tcPr>
+            <w:tcW w:type="dxa" w:w="1037"/>
+          </w:tcPr>
+          <w:p>
+            <w:r>
+              <w:rPr>
+                <w:sz w:val="16"/>
+              </w:rPr>
+              <w:t>$0.04; 0.50</w:t>
+            </w:r>
+          </w:p>
+        </w:tc>
+        <w:tc>
+          <w:tcPr>
+            <w:tcW w:type="dxa" w:w="1037"/>
+          </w:tcPr>
+          <w:p>
+            <w:r>
+              <w:rPr>
+                <w:sz w:val="16"/>
+              </w:rPr>
+              <w:t>$0.08; 0.90</w:t>
+            </w:r>
+          </w:p>
+        </w:tc>
+      </w:tr>
+      <w:tr>
+        <w:tc>
+          <w:tcPr>
+            <w:tcW w:type="dxa" w:w="1368"/>
+          </w:tcPr>
+          <w:p>
+            <w:r>
+              <w:rPr>
+                <w:sz w:val="16"/>
+              </w:rPr>
+              <w:t>Energy E</w:t>
+            </w:r>
+          </w:p>
+        </w:tc>
+        <w:tc>
+          <w:tcPr>
+            <w:tcW w:type="dxa" w:w="1037"/>
+          </w:tcPr>
+          <w:p>
+            <w:r>
+              <w:rPr>
+                <w:sz w:val="16"/>
+              </w:rPr>
+              <w:t>$380.00</w:t>
+            </w:r>
+          </w:p>
+        </w:tc>
+        <w:tc>
+          <w:tcPr>
+            <w:tcW w:type="dxa" w:w="1037"/>
+          </w:tcPr>
+          <w:p>
+            <w:r>
+              <w:rPr>
+                <w:sz w:val="16"/>
+              </w:rPr>
+              <w:t>$233.33</w:t>
+            </w:r>
+          </w:p>
+        </w:tc>
+        <w:tc>
+          <w:tcPr>
+            <w:tcW w:type="dxa" w:w="1037"/>
+          </w:tcPr>
+          <w:p>
+            <w:r>
+              <w:rPr>
+                <w:sz w:val="16"/>
+              </w:rPr>
+              <w:t>$560.00</w:t>
+            </w:r>
+          </w:p>
+        </w:tc>
+      </w:tr>
+      <w:tr>
+        <w:tc>
+          <w:tcPr>
+            <w:tcW w:type="dxa" w:w="1368"/>
+          </w:tcPr>
+          <w:p>
+            <w:r>
+              <w:rPr>
+                <w:sz w:val="16"/>
+              </w:rPr>
+              <w:t>Grid penalty Φ</w:t>
+            </w:r>
+          </w:p>
+        </w:tc>
+        <w:tc>
+          <w:tcPr>
+            <w:tcW w:type="dxa" w:w="1037"/>
+          </w:tcPr>
+          <w:p>
+            <w:r>
+              <w:rPr>
+                <w:sz w:val="16"/>
+              </w:rPr>
+              <w:t>$69.31</w:t>
+            </w:r>
+          </w:p>
+        </w:tc>
+        <w:tc>
+          <w:tcPr>
+            <w:tcW w:type="dxa" w:w="1037"/>
+          </w:tcPr>
+          <w:p>
+            <w:r>
+              <w:rPr>
+                <w:sz w:val="16"/>
+              </w:rPr>
+              <w:t>$36.75</w:t>
+            </w:r>
+          </w:p>
+        </w:tc>
+        <w:tc>
+          <w:tcPr>
+            <w:tcW w:type="dxa" w:w="1037"/>
+          </w:tcPr>
+          <w:p>
+            <w:r>
+              <w:rPr>
+                <w:sz w:val="16"/>
+              </w:rPr>
+              <w:t>$95.26</w:t>
+            </w:r>
+          </w:p>
+        </w:tc>
+      </w:tr>
+      <w:tr>
+        <w:tc>
+          <w:tcPr>
+            <w:tcW w:type="dxa" w:w="1368"/>
+          </w:tcPr>
+          <w:p>
+            <w:r>
+              <w:rPr>
+                <w:sz w:val="16"/>
+              </w:rPr>
+              <w:t>Demand increment ψ</w:t>
+            </w:r>
+          </w:p>
+        </w:tc>
+        <w:tc>
+          <w:tcPr>
+            <w:tcW w:type="dxa" w:w="1037"/>
+          </w:tcPr>
+          <w:p>
+            <w:r>
+              <w:rPr>
+                <w:sz w:val="16"/>
+              </w:rPr>
+              <w:t>$1.140M</w:t>
+            </w:r>
+          </w:p>
+        </w:tc>
+        <w:tc>
+          <w:tcPr>
+            <w:tcW w:type="dxa" w:w="1037"/>
+          </w:tcPr>
+          <w:p>
+            <w:r>
+              <w:rPr>
+                <w:sz w:val="16"/>
+              </w:rPr>
+              <w:t>$0</w:t>
+            </w:r>
+          </w:p>
+        </w:tc>
+        <w:tc>
+          <w:tcPr>
+            <w:tcW w:type="dxa" w:w="1037"/>
+          </w:tcPr>
+          <w:p>
+            <w:r>
+              <w:rPr>
+                <w:sz w:val="16"/>
+              </w:rPr>
+              <w:t>$0.120M</w:t>
+            </w:r>
+          </w:p>
+        </w:tc>
+      </w:tr>
+      <w:tr>
+        <w:tc>
+          <w:tcPr>
+            <w:tcW w:type="dxa" w:w="1368"/>
+          </w:tcPr>
+          <w:p>
+            <w:r>
+              <w:rPr>
+                <w:sz w:val="16"/>
+              </w:rPr>
+              <w:t>Next Q⁻</w:t>
+            </w:r>
+          </w:p>
+        </w:tc>
+        <w:tc>
+          <w:tcPr>
+            <w:tcW w:type="dxa" w:w="1037"/>
+          </w:tcPr>
+          <w:p>
+            <w:r>
+              <w:rPr>
+                <w:sz w:val="16"/>
+              </w:rPr>
+              <w:t>0.15</w:t>
+            </w:r>
+          </w:p>
+        </w:tc>
+        <w:tc>
+          <w:tcPr>
+            <w:tcW w:type="dxa" w:w="1037"/>
+          </w:tcPr>
+          <w:p>
+            <w:r>
+              <w:rPr>
+                <w:sz w:val="16"/>
+              </w:rPr>
+              <w:t>0.15</w:t>
+            </w:r>
+          </w:p>
+        </w:tc>
+        <w:tc>
+          <w:tcPr>
+            <w:tcW w:type="dxa" w:w="1037"/>
+          </w:tcPr>
+          <w:p>
+            <w:r>
+              <w:rPr>
+                <w:sz w:val="16"/>
+              </w:rPr>
+              <w:t>0</w:t>
+            </w:r>
+          </w:p>
+        </w:tc>
+      </w:tr>
+    </w:tbl>
+    <w:p>
+      <w:pPr>
+        <w:spacing w:after="40"/>
+      </w:pPr>
+    </w:p>
+    <w:p>
+      <w:pPr>
+        <w:spacing w:after="60"/>
+      </w:pPr>
+      <w:r>
+        <w:rPr>
+          <w:b w:val="0"/>
+          <w:i w:val="0"/>
+          <w:sz w:val="19"/>
+        </w:rPr>
+        <w:t>For example, at t=2 the queue closes as Q⁻₃=0.15+0−0−0.15=0. Grid draw rises from the prior 76 MW record to 84 MW, so the demand charge adds 15×(84−76)×1000=$120,000. Energy and grid penalty still accrue every step, whereas ψ is zero whenever the running peak does not increase.</w:t>
+      </w:r>
+    </w:p>
+    <w:p>
+      <w:pPr>
+        <w:spacing w:after="40"/>
+      </w:pPr>
+      <w:r>
+        <w:rPr>
+          <w:b/>
+          <w:i/>
+          <w:sz w:val="20"/>
+        </w:rPr>
+        <w:t>E. Problem formulation</w:t>
       </w:r>
     </w:p>
     <w:p>
@@ -718,7 +1344,7 @@
           <w:i/>
           <w:sz w:val="19"/>
         </w:rPr>
-        <w:t>minimize  J = Σₜ Σᵢ [ Eᵢ,ₜ + Φᵢ,ₜ + λ_b·Bᵢ,ₜ + λ_x·Xᵢ,ₜ ]        (11)</w:t>
+        <w:t>minimize  J = Σₜ [ Eₜ + Φₜ + Σᵢ(ψᵢ,ₜ + λ_bBᵢ,ₜ) + χₜ ]        (11)</w:t>
       </w:r>
     </w:p>
     <w:p>
@@ -731,7 +1357,7 @@
           <w:i w:val="0"/>
           <w:sz w:val="19"/>
         </w:rPr>
-        <w:t>subject to, for all i, t: the power model (1)–(2); the serving rule (7) with capacity uᵢ,ₜ ≤ κᵢ; the routing simplex Σᵢ fᵢ,ₜ = 1, fᵢ,ₜ ≥ 0 and drain/placement δ, h ∈ [0,1]; service-backlog conservation Bᵢ,ₜ = Bᵢ,ₜ₋₁ + fᵢ,ₜDₜ − σᵢ,ₜ; the batch queue (8); and deadline feasibility Σ_{τ≤t} Sᵢ,τ ≥ Σ of arrivals at i due by t (an arrival at τ is due by τ + Hᵢ, Eq. 7) — i.e. cumulative batch completed must cover everything whose deadline has passed. Here Eᵢ,ₜ (Eq. 3) is energy cost and Φᵢ,ₜ (Eq. 4) the grid peak-contribution penalty. In words: route inflexible service and defer flexible batch to minimize electricity cost plus grid-peak contribution, while serving all demand within capacity and completing batch on time.</w:t>
+        <w:t>subject to, for all i,j,t: the power model (1)–(2); the serving and origin-completion rules (9) with uⱼ,ₜ≤κⱼ; routing and placement simplexes Σⱼfⱼ,ₜ=Σⱼhⱼ,ₜ=1 with f,h≥0 and δ∈[0,1]; service conservation Bⱼ,ₜ=Bⱼ,ₜ₋₁+fⱼ,ₜDₜ−σⱼ,ₜ; and the two-phase batch conservation (8). At each deadline boundary, every due arrival is either represented in cumulative origin completion q or charged once as expiry X. Thus deadlines are soft penalties in the environment, not hard constraints; the reported policies happen to achieve X=0. In words: route service and schedule batch to minimize energy, grid contribution, the actual demand tariff, backlog, and expiry cost while respecting capacity.</w:t>
       </w:r>
     </w:p>
     <w:p>
@@ -744,7 +1370,7 @@
           <w:i w:val="0"/>
           <w:sz w:val="19"/>
         </w:rPr>
-        <w:t>Eq. (11) is an offline, full-information statement; the deployed controller is causal (it cannot observe future prices or demand). We therefore solve it with model-free RL — PPO maximizes 𝔼[Σₜ γᵗ rₜ] with rₜ the negative per-step cost (Eq. 10) — and bound it with the clairvoyant convex-QP relaxation of J (Sec. VI-F), whose optimum lower-bounds any policy.</w:t>
+        <w:t>Eq. (11) is an offline, full-information statement; the deployed controller is causal (it cannot observe future prices or demand). We therefore solve it with model-free RL. PPO maximizes 𝔼[Σₜγᵗrₜ]; when γ&lt;1 this is not identical to undiscounted J, so older default-off results are evaluated on J but were trained with γ=0.99. Demand-charge-enabled runs set γ=1, aligning training and evaluation. The clairvoyant convex QP uses the same backlog and soft-expiry accounting, with fluid actions and perfect foresight; these relaxations make its optimum a lower bound on the evaluated J (Sec. VI-F).</w:t>
       </w:r>
     </w:p>
     <w:p>
@@ -900,7 +1526,7 @@
           <w:i w:val="0"/>
           <w:sz w:val="19"/>
         </w:rPr>
-        <w:t>We adopt the standard linear idle+slope server model (Eq. 1) — the form used throughout the data-center power literature [14], [17] — and fix its two constants per cell from data rather than from a single textbook value. Joining hourly PowerData2019 measured power (whose ‘power utilization’ is defined exactly as our normalization: actual power over theoretical peak [2]) with aggregate CPU over 2,980 (cell, hour) samples, least-squares gives the per-cell idle and slope of Table II. The calibration is literature-consistent: the fitted idle draw is 0.40–0.61 of each cell's peak, squarely inside the published range for this model (≈0.38 [8], ≈0.60–0.75 [23]), so the constants are credible without appeal to goodness-of-fit. We keep PER-CELL constants (not one pooled value) because the cells span a meaningful proportionality range — cell d (idle 0.38, slope 0.57) is far more energy-proportional than cell a (0.53, 0.34) — and that BETWEEN-cell spread is precisely the routing signal the agent exploits (slope arbitrage, Sec. VI-B); a single literature constant would erase it. This mirrors CICS's choice of per-cluster power models [3]. (R² is reported in Table II as a diagnostic only — 0.43 pooled vs 0.75–0.80 per cell, confirming the pooled residual is between-cell heterogeneity rather than noise — but it is not the model's justification: every policy is scored by the SAME power model, so any residual error cancels in the relative comparisons we report.)</w:t>
+        <w:t>We adopt the standard linear idle+slope server model (Eq. 1) — the form used throughout the data-center power literature [14], [17] — and fix its two constants per cell from data rather than from a single textbook value. Joining hourly PowerData2019 measured power (whose ‘power utilization’ is defined exactly as our normalization: actual power over theoretical peak [2]) with aggregate CPU over 2,980 (cell, hour) samples, least-squares gives the per-cell idle and slope of Table II. The calibration is literature-consistent: the fitted idle draw is 0.40–0.61 of each cell's peak, consistent with the substantial idle fractions reported in server-power measurements and surveys [14], [17], so the constants are credible without appeal to goodness-of-fit. We keep PER-CELL constants (not one pooled value) because the cells span a meaningful proportionality range — cell d (idle 0.38, slope 0.57) is far more energy-proportional than cell a (0.53, 0.34) — and that BETWEEN-cell spread is precisely the routing signal the agent exploits (slope arbitrage, Sec. VI-B); a single literature constant would erase it. This mirrors CICS's choice of per-cluster power models [3]. (R² is reported in Table II as a diagnostic only — 0.43 pooled vs 0.75–0.80 per cell, confirming the pooled residual is between-cell heterogeneity rather than noise — but it is not the model's justification. Using one calibrated model gives a controlled comparison, but errors in marginal slopes could still change routing rankings; the held-out-cell and domain-randomization tests probe that sensitivity.)</w:t>
       </w:r>
     </w:p>
     <w:p>
@@ -1335,7 +1961,7 @@
           <w:i w:val="0"/>
           <w:sz w:val="19"/>
         </w:rPr>
-        <w:t>We state the price and net-demand provenance precisely, since it bounds the claims. NET DEMAND is real: hourly EIA-930 series (demand minus utility-scale wind+solar) for the assigned US balancing authorities, normalized to [0,1] by each region's window peak; the Global scenario's EU/Singapore net demand is synthesized where EIA-930 does not apply. PRICES, by contrast, are DOCUMENTED SYNTHETIC: a calibrated diurnal model anchored to plausible May-2019 regional wholesale averages, NOT real locational marginal prices. Real hourly LMP is not uniformly obtainable for this footprint — two US scenario regions (Southern Co./GA, Duke/SC) are vertically integrated utilities with no public wholesale market, and the EIA API exposes no hourly price route — so a fully-real price series is not currently available. This is a known limitation we intend to resolve (real CAISO/MISO LMP plus documented proxies for the non-ISO territories) in future work. Two points bound its impact. First, the relative comparison is unaffected: every policy is scored against the SAME price series, so any price bias cancels in the differences between policies, which are what we report. Second, the price DYNAMICS the agent exploits (diurnal spread, cross-region differences) are structurally realistic even if the absolute levels are modeled. The generalization study (Sec. VI-H) additionally shifts net demand to real EIA-930 May-2024 data, testing transfer on the one fully-real market signal.</w:t>
+        <w:t>We state the price and net-demand provenance precisely, since it bounds the claims. NET DEMAND is real: hourly EIA-930 series (demand minus utility-scale wind+solar) for the assigned US balancing authorities, normalized to [0,1] by each region's window peak; the Global scenario's EU/Singapore net demand is synthesized where EIA-930 does not apply. PRICES, by contrast, are DOCUMENTED SYNTHETIC: a calibrated diurnal model anchored to plausible May-2019 regional wholesale averages, NOT real locational marginal prices. Real hourly LMP is not uniformly obtainable for this footprint — two US scenario regions (Southern Co./GA, Duke/SC) are vertically integrated utilities with no public wholesale market, and the EIA API exposes no hourly price route — so a fully-real price series is not currently available. This is a known limitation we intend to resolve (real CAISO/MISO LMP plus documented proxies for the non-ISO territories) in future work. Two points bound its interpretation. Every policy sees the same series, which makes the experiment controlled, but bias does NOT algebraically cancel because policies respond differently; rankings may change under real prices. The modeled price DYNAMICS the agent exploits (diurnal spread, cross-region differences) are structurally realistic even if the absolute levels are modeled. The generalization study (Sec. VI-H) additionally shifts US net demand to EIA-930 May-2024 data while updating documented non-US approximations.</w:t>
       </w:r>
     </w:p>
     <w:p>
@@ -1375,7 +2001,7 @@
           <w:i w:val="0"/>
           <w:sz w:val="19"/>
         </w:rPr>
-        <w:t>PPO (Stable-Baselines3, MLP 128×128, lr 3e-4, 500k steps) acts in the continuous 3N-dimensional space. Its observation includes per-DC dynamic state (demand, price, net demand, pool/backlog) AND static site context (per-DC idle power, slope, capacity, deferrable fraction) — the latter added so that per-site heterogeneity is exploitable as a function of observed parameters rather than memorized by slot (Sec. VI-H). Two DQN variants share hyperparameters (MLP 256×256, replay 100k, target update 1k): a 759-action routing grid, and a 48-action CFWS-style flattened index decoding to (source DC, destination DC, drain level) [6]. Nine heuristics span the policy space, including Round Robin, price-chasing and slack-grid concentrators, defer-to-trough rules, a GreenSlot-style Trough-Slot Lookahead foresighted heuristic with privileged 3-hour net-demand foresight [10], and the no-optimization Status Quo (serve locally, immediately) — the counterfactual of a CICS-style layer switched off.</w:t>
+        <w:t>PPO (Stable-Baselines3, MLP 128×128, lr 3e-4, 500k steps) acts in the continuous 3N-dimensional space. Its observation includes per-DC dynamic state (demand, price, net demand, pool/backlog) AND static site context (per-DC idle power, slope, capacity, deferrable fraction) — the latter added so that per-site heterogeneity is exploitable as a function of observed parameters rather than memorized by slot (Sec. VI-H). Two DQN variants share hyperparameters (MLP 256×256, replay 100k, target update 1k): a 759-action routing grid, and a 48-action compact flattened index inspired by CFWS's encoding philosophy, decoding to (source DC, destination DC, drain level) [6]. It is not a CFWS reproduction. Nine heuristics span the policy space, including Round Robin, price-chasing and slack-grid concentrators, defer-to-trough rules, a GreenSlot-style Trough-Slot Lookahead foresighted heuristic with privileged 3-hour net-demand foresight [10], and the no-optimization Status Quo (serve locally, immediately) — the counterfactual of a CICS-style layer switched off.</w:t>
       </w:r>
     </w:p>
     <w:p>
@@ -1687,7 +2313,7 @@
               <w:rPr>
                 <w:sz w:val="16"/>
               </w:rPr>
-              <w:t>1.1%</w:t>
+              <w:t>1.6%</w:t>
             </w:r>
           </w:p>
         </w:tc>
@@ -1793,7 +2419,7 @@
               <w:rPr>
                 <w:sz w:val="16"/>
               </w:rPr>
-              <w:t>1.5%</w:t>
+              <w:t>1.3%</w:t>
             </w:r>
           </w:p>
         </w:tc>
@@ -1899,7 +2525,7 @@
               <w:rPr>
                 <w:sz w:val="16"/>
               </w:rPr>
-              <w:t>5.6%</w:t>
+              <w:t>5.7%</w:t>
             </w:r>
           </w:p>
         </w:tc>
@@ -1992,7 +2618,7 @@
               <w:rPr>
                 <w:sz w:val="16"/>
               </w:rPr>
-              <w:t>11.92</w:t>
+              <w:t>11.89</w:t>
             </w:r>
           </w:p>
         </w:tc>
@@ -2005,7 +2631,7 @@
               <w:rPr>
                 <w:sz w:val="16"/>
               </w:rPr>
-              <w:t>2.7%</w:t>
+              <w:t>3.1%</w:t>
             </w:r>
           </w:p>
         </w:tc>
@@ -2023,7 +2649,7 @@
       <w:r>
         <w:drawing>
           <wp:inline xmlns:a="http://schemas.openxmlformats.org/drawingml/2006/main" xmlns:pic="http://schemas.openxmlformats.org/drawingml/2006/picture">
-            <wp:extent cx="2926080" cy="2263071"/>
+            <wp:extent cx="2926080" cy="2266495"/>
             <wp:docPr id="3" name="Picture 3"/>
             <wp:cNvGraphicFramePr>
               <a:graphicFrameLocks noChangeAspect="1"/>
@@ -2044,7 +2670,7 @@
                   <pic:spPr>
                     <a:xfrm>
                       <a:off x="0" y="0"/>
-                      <a:ext cx="2926080" cy="2263071"/>
+                      <a:ext cx="2926080" cy="2266495"/>
                     </a:xfrm>
                     <a:prstGeom prst="rect"/>
                   </pic:spPr>
@@ -2090,7 +2716,7 @@
           <w:i w:val="0"/>
           <w:sz w:val="19"/>
         </w:rPr>
-        <w:t>Across five seeds per configuration, PPO is the best policy — learned or heuristic — in all four: 2.7–12.9% below the grid-unaware status quo, 5.0–14.8% below the foresighted Trough-Slot heuristic, and 2.5–9.9% below the best DQN variant. PPO beats the best DQN in 19 of 20 seed-paired comparisons (sign/Wilcoxon p = 0.031 in three of four configs; the exception is Global spatial-only, 4/5, p = 0.19). Crucially, PPO lands within 1.1–5.6% of a clairvoyant convex-QP lower bound (Sec. VI-F) — so little headroom remains to ANY policy, causal or not. Savings scale with exploitable structure: modest under US-only diversity, large under global price/timezone spread. PPO also serves 100% of service demand with zero deadline violations (Sec. VI-E) and the flattest, lowest fleet draw (Fig. 4).</w:t>
+        <w:t>Across five seeds per configuration, PPO is the best policy — learned or heuristic — in all four: 2.7–12.9% below the grid-unaware status quo, 5.0–14.8% below the foresighted Trough-Slot heuristic, and 2.5–9.9% below the best DQN variant. PPO beats the best DQN in 19 of 20 seed-paired comparisons (sign/Wilcoxon p = 0.031 in three of four configs; the exception is Global spatial-only, 4/5, p = 0.19). Crucially, PPO lands within 1.3–5.7% of a clairvoyant convex-QP lower bound (Sec. VI-F) — so little headroom remains to ANY policy, causal or not. Savings scale with exploitable structure: modest under US-only diversity, large under global price/timezone spread. PPO also serves 100% of service demand with zero deadline violations (Sec. VI-E) and the flattest, lowest fleet draw (Fig. 4).</w:t>
       </w:r>
     </w:p>
     <w:p>
@@ -2245,7 +2871,7 @@
           <w:i w:val="0"/>
           <w:sz w:val="19"/>
         </w:rPr>
-        <w:t>Because every policy is scored on the shaped objective (Eq. 10), we audit that PPO's savings are genuine scheduling, not penalty-dodging. Across all ten PPO batch-mode seeds: service served / demand = 1.0000, terminal backlog = 0, terminal batch pool ≤ 0.95 units, ZERO expired batch, peak transient backlog ≤ 3.9 units, and backlog penalty ≤ 1% of total cost. PPO is not parking interactive work to avoid price spikes (the λ_b = 25 calibration, Sec. III-C, makes that unprofitable) nor leaking work past the finite horizon — it serves everything, on time, more cheaply.</w:t>
+        <w:t>Because every policy is scored on the shaped objective (Eq. 10), we audit that PPO's savings are genuine scheduling, not penalty-dodging. Across all ten PPO batch-mode seeds: service served / demand = 1.0000, terminal backlog = 0, terminal batch pool ≤ 0.95 units (≤0.025% of arrivals), ZERO expired batch, peak transient backlog ≤ 3.9 units, and backlog penalty ≤1%. Default-off evaluation retains that finite-horizon convention for model compatibility and reports the tail explicitly. Demand-enabled runs observe full-episode progress and charge terminal pool like expiry, closing the economically material tariff loophole. The historical tail is &lt;$238 (&lt;0.003% of cost), so rankings do not change, but 'all batch completed' was too strong.</w:t>
       </w:r>
     </w:p>
     <w:p>
@@ -2271,7 +2897,7 @@
           <w:i w:val="0"/>
           <w:sz w:val="19"/>
         </w:rPr>
-        <w:t>The environment is convex in the serving decisions (linear power and energy cost, convex-quadratic peak penalty, linear queue/backlog dynamics), so a clairvoyant planner with full-episode foresight and fluid allocation solves a quadratic program whose optimum LOWER-BOUNDS any policy. We assemble it directly for the Clarabel solver (per-origin-stream cumulative deadline constraints are exact; validated against cvxpy at 10⁻⁹) and solve all four configs in 1–6 s. PPO's gap to this bound is 1.1% (US spatial), 1.5% (US batch), 5.6% (Global spatial), 2.7% (Global batch). The bound is generous — it has perfect foresight and no causality or action-parameterization constraints — so the true gap to the best ACHIEVABLE causal policy is smaller still. A useful by-product: the QP's spatial-only and batch optima differ by only ~0.2%, confirming the intrinsic value of temporal flexibility at these deferrable fractions is small (Sec. VI-D).</w:t>
+        <w:t>The environment is convex in the serving decisions (linear power and energy cost, convex-quadratic peak penalty, linear queue/backlog dynamics), so a clairvoyant planner with full-episode foresight and fluid allocation solves a quadratic program whose optimum LOWER-BOUNDS any policy. We assemble it directly for the Clarabel solver with the simulator's service backlog, cumulative soft-expiry accounting, and optional demand-charge epigraph. The manual sparse assembly matches CVXPY below 10⁻⁸ relative and solves the four default-off configs in 2–15 s. PPO's gap is 1.6% (US spatial), 1.3% (US batch), 5.7% (Global spatial), and 3.1% (Global batch). The bound is generous — it has perfect foresight and no causality or action-parameterization constraints — so the true gap to the best ACHIEVABLE causal policy is smaller still. A useful by-product: the QP's spatial-only and batch optima differ by only ~0.2–0.5%, confirming the intrinsic value of temporal flexibility at these deferrable fractions is small (Sec. VI-D).</w:t>
       </w:r>
     </w:p>
     <w:p>
@@ -2284,7 +2910,7 @@
           <w:i/>
           <w:sz w:val="20"/>
         </w:rPr>
-        <w:t>G. The demand charge: a real cost the objective does not see</w:t>
+        <w:t>G. The demand charge: post-hoc audit and trained extension</w:t>
       </w:r>
     </w:p>
     <w:p>
@@ -2297,7 +2923,7 @@
           <w:i w:val="0"/>
           <w:sz w:val="19"/>
         </w:rPr>
-        <w:t>Φ is a grid-stress shadow price, not the operator's tariff (Sec. III-A). Because a demand charge is the single largest line item that our objective omits, we quantify it for every policy from the grid-draw traces, at a reference c = $15/kW-month, WITHOUT putting it in the reward — so the policies compared are exactly those of Sec. VI-A. Billing is per meter, so the billed quantity is Σᵢ maxₜ gᵢ,ₜ, not the fleet coincident peak.</w:t>
+        <w:t>Φ is a grid-stress shadow price, not the operator's tariff (Sec. III-A). Because a demand charge is the single largest line item that our objective omits, we quantify it for every policy from the grid-draw traces, at a reference c = $15/kW for the complete 8,917-step study billing cycle, WITHOUT putting it in the reward — so the policies compared are exactly those of Sec. VI-A. Billing is per meter, so the billed quantity is Σᵢ maxₜ gᵢ,ₜ, not the fleet coincident peak.</w:t>
       </w:r>
     </w:p>
     <w:p>
@@ -2310,7 +2936,7 @@
           <w:i w:val="0"/>
           <w:sz w:val="19"/>
         </w:rPr>
-        <w:t>The charge is large: $4.69M/month under the status quo, 39% of that scenario's $12.06M energy bill and 2.3× the Φ term already in the objective — in line with the 30–50% share demand charges hold in real commercial bills. PPO reduces it to $4.32M (−8.0%, Global batch) and $4.35M (−7.3%, US batch) as a SIDE EFFECT of routing for energy price, with the term absent from its reward.</w:t>
+        <w:t>The charge is large: $4.69M per study cycle under the status quo, equal to 39% of that scenario's $12.06M energy charge, 28% of the combined energy-plus-demand bill, and 2.3× the Φ term already in the objective. PPO reduces it to $4.32M (−8.0%, Global spatial+temporal) and $4.35M (−7.3%, US spatial+temporal) as a SIDE EFFECT of routing for energy price, with the term absent from its reward. These are reference-rate sensitivity results, not bill reconstructions.</w:t>
       </w:r>
     </w:p>
     <w:p>
@@ -2336,7 +2962,458 @@
           <w:i w:val="0"/>
           <w:sz w:val="19"/>
         </w:rPr>
-        <w:t>The genuinely interesting consequence is for the temporal lever. Energy arbitrage pays only if timing is right CONTINUOUSLY for a month; clipping a demand charge pays if timing is right at ONE interval. At the busiest step, 17% of load is deferrable batch, and vacating it drops the floor from 289.4 to 267.1 MW — a larger single lever than all spatial reoptimization combined, and well within the Hᵢ = 8–26 step deadline horizons. A demand charge is thus the one cost term that would give deferral real value at these deferrable fractions, where the shaped objective values it at ~0.2% (Sec. VI-F). The obstacle is credit assignment: at γ = 0.99 the effective horizon is ~100 steps, while a monthly billing period is 8917 — 89× longer — so the once-a-period record-setting reward is invisible to the agent. Daily billing (288 steps), which real tariffs also use and which lower-bounds the monthly charge exactly, is the tractable form; the environment implements it (Eq. 6) and it is left disabled here. We flag this as the most promising extension rather than a completed result.</w:t>
+        <w:t>The genuinely interesting consequence is for the temporal lever. Energy arbitrage pays only if timing is right CONTINUOUSLY for a month; clipping a demand charge pays if timing is right at the binding interval. Under the default-off objective the corrected QP values temporal flexibility at only 0.19% (US) to 0.52% (Global). Adding the guarded $15/kW US-reference tariff raises the spatial-to-batch QP improvement to about 1.0–1.1% and lowers its optimal billed peak by about 9.6 MW in both scenarios, with numerical-zero expiry. The corrected environment uses the full episode as one billing cycle, resets period state before the next action, exposes the running peak and cycle context, and requires γ = 1 when the term is enabled so the incremental reward remains exactly the final billed maximum. Tariff-aware backlog/expiry floors prevent dropping work, reward scaling conditions RL, and dense arrival-minus-completion shaping preserves unfinished-work cost.</w:t>
+      </w:r>
+    </w:p>
+    <w:p>
+      <w:pPr>
+        <w:jc w:val="center"/>
+      </w:pPr>
+      <w:r>
+        <w:rPr>
+          <w:b/>
+          <w:sz w:val="16"/>
+        </w:rPr>
+        <w:t>DEMAND-AWARE SINGLE-SEED RESULTS (M$, PEAK IN MW)</w:t>
+      </w:r>
+    </w:p>
+    <w:tbl>
+      <w:tblPr>
+        <w:tblStyle w:val="LightGrid-Accent1"/>
+        <w:tblW w:type="auto" w:w="0"/>
+        <w:tblLook w:firstColumn="1" w:firstRow="1" w:lastColumn="0" w:lastRow="0" w:noHBand="0" w:noVBand="1" w:val="04A0"/>
+      </w:tblPr>
+      <w:tblGrid>
+        <w:gridCol w:w="1680"/>
+        <w:gridCol w:w="1680"/>
+        <w:gridCol w:w="1680"/>
+        <w:gridCol w:w="1680"/>
+        <w:gridCol w:w="1680"/>
+        <w:gridCol w:w="1680"/>
+      </w:tblGrid>
+      <w:tr>
+        <w:tc>
+          <w:tcPr>
+            <w:tcW w:type="dxa" w:w="1181"/>
+          </w:tcPr>
+          <w:p>
+            <w:r>
+              <w:rPr>
+                <w:b/>
+                <w:sz w:val="16"/>
+              </w:rPr>
+              <w:t>Config</w:t>
+            </w:r>
+          </w:p>
+        </w:tc>
+        <w:tc>
+          <w:tcPr>
+            <w:tcW w:type="dxa" w:w="691"/>
+          </w:tcPr>
+          <w:p>
+            <w:r>
+              <w:rPr>
+                <w:b/>
+                <w:sz w:val="16"/>
+              </w:rPr>
+              <w:t>QP</w:t>
+            </w:r>
+          </w:p>
+        </w:tc>
+        <w:tc>
+          <w:tcPr>
+            <w:tcW w:type="dxa" w:w="691"/>
+          </w:tcPr>
+          <w:p>
+            <w:r>
+              <w:rPr>
+                <w:b/>
+                <w:sz w:val="16"/>
+              </w:rPr>
+              <w:t>SQ</w:t>
+            </w:r>
+          </w:p>
+        </w:tc>
+        <w:tc>
+          <w:tcPr>
+            <w:tcW w:type="dxa" w:w="1066"/>
+          </w:tcPr>
+          <w:p>
+            <w:r>
+              <w:rPr>
+                <w:b/>
+                <w:sz w:val="16"/>
+              </w:rPr>
+              <w:t>Best feasible</w:t>
+            </w:r>
+          </w:p>
+        </w:tc>
+        <w:tc>
+          <w:tcPr>
+            <w:tcW w:type="dxa" w:w="720"/>
+          </w:tcPr>
+          <w:p>
+            <w:r>
+              <w:rPr>
+                <w:b/>
+                <w:sz w:val="16"/>
+              </w:rPr>
+              <w:t>PPO</w:t>
+            </w:r>
+          </w:p>
+        </w:tc>
+        <w:tc>
+          <w:tcPr>
+            <w:tcW w:type="dxa" w:w="749"/>
+          </w:tcPr>
+          <w:p>
+            <w:r>
+              <w:rPr>
+                <w:b/>
+                <w:sz w:val="16"/>
+              </w:rPr>
+              <w:t>PPO peak</w:t>
+            </w:r>
+          </w:p>
+        </w:tc>
+      </w:tr>
+      <w:tr>
+        <w:tc>
+          <w:tcPr>
+            <w:tcW w:type="dxa" w:w="1181"/>
+          </w:tcPr>
+          <w:p>
+            <w:r>
+              <w:rPr>
+                <w:sz w:val="16"/>
+              </w:rPr>
+              <w:t>US spatial</w:t>
+            </w:r>
+          </w:p>
+        </w:tc>
+        <w:tc>
+          <w:tcPr>
+            <w:tcW w:type="dxa" w:w="691"/>
+          </w:tcPr>
+          <w:p>
+            <w:r>
+              <w:rPr>
+                <w:sz w:val="16"/>
+              </w:rPr>
+              <w:t>13.820</w:t>
+            </w:r>
+          </w:p>
+        </w:tc>
+        <w:tc>
+          <w:tcPr>
+            <w:tcW w:type="dxa" w:w="691"/>
+          </w:tcPr>
+          <w:p>
+            <w:r>
+              <w:rPr>
+                <w:sz w:val="16"/>
+              </w:rPr>
+              <w:t>14.542</w:t>
+            </w:r>
+          </w:p>
+        </w:tc>
+        <w:tc>
+          <w:tcPr>
+            <w:tcW w:type="dxa" w:w="1066"/>
+          </w:tcPr>
+          <w:p>
+            <w:r>
+              <w:rPr>
+                <w:sz w:val="16"/>
+              </w:rPr>
+              <w:t>RR 14.388</w:t>
+            </w:r>
+          </w:p>
+        </w:tc>
+        <w:tc>
+          <w:tcPr>
+            <w:tcW w:type="dxa" w:w="720"/>
+          </w:tcPr>
+          <w:p>
+            <w:r>
+              <w:rPr>
+                <w:sz w:val="16"/>
+              </w:rPr>
+              <w:t>14.396</w:t>
+            </w:r>
+          </w:p>
+        </w:tc>
+        <w:tc>
+          <w:tcPr>
+            <w:tcW w:type="dxa" w:w="749"/>
+          </w:tcPr>
+          <w:p>
+            <w:r>
+              <w:rPr>
+                <w:sz w:val="16"/>
+              </w:rPr>
+              <w:t>304.1</w:t>
+            </w:r>
+          </w:p>
+        </w:tc>
+      </w:tr>
+      <w:tr>
+        <w:tc>
+          <w:tcPr>
+            <w:tcW w:type="dxa" w:w="1181"/>
+          </w:tcPr>
+          <w:p>
+            <w:r>
+              <w:rPr>
+                <w:sz w:val="16"/>
+              </w:rPr>
+              <w:t>US spatial+temp</w:t>
+            </w:r>
+          </w:p>
+        </w:tc>
+        <w:tc>
+          <w:tcPr>
+            <w:tcW w:type="dxa" w:w="691"/>
+          </w:tcPr>
+          <w:p>
+            <w:r>
+              <w:rPr>
+                <w:sz w:val="16"/>
+              </w:rPr>
+              <w:t>13.676</w:t>
+            </w:r>
+          </w:p>
+        </w:tc>
+        <w:tc>
+          <w:tcPr>
+            <w:tcW w:type="dxa" w:w="691"/>
+          </w:tcPr>
+          <w:p>
+            <w:r>
+              <w:rPr>
+                <w:sz w:val="16"/>
+              </w:rPr>
+              <w:t>14.545</w:t>
+            </w:r>
+          </w:p>
+        </w:tc>
+        <w:tc>
+          <w:tcPr>
+            <w:tcW w:type="dxa" w:w="1066"/>
+          </w:tcPr>
+          <w:p>
+            <w:r>
+              <w:rPr>
+                <w:sz w:val="16"/>
+              </w:rPr>
+              <w:t>Drain 14.391</w:t>
+            </w:r>
+          </w:p>
+        </w:tc>
+        <w:tc>
+          <w:tcPr>
+            <w:tcW w:type="dxa" w:w="720"/>
+          </w:tcPr>
+          <w:p>
+            <w:r>
+              <w:rPr>
+                <w:sz w:val="16"/>
+              </w:rPr>
+              <w:t>14.561</w:t>
+            </w:r>
+          </w:p>
+        </w:tc>
+        <w:tc>
+          <w:tcPr>
+            <w:tcW w:type="dxa" w:w="749"/>
+          </w:tcPr>
+          <w:p>
+            <w:r>
+              <w:rPr>
+                <w:sz w:val="16"/>
+              </w:rPr>
+              <w:t>312.1</w:t>
+            </w:r>
+          </w:p>
+        </w:tc>
+      </w:tr>
+      <w:tr>
+        <w:tc>
+          <w:tcPr>
+            <w:tcW w:type="dxa" w:w="1181"/>
+          </w:tcPr>
+          <w:p>
+            <w:r>
+              <w:rPr>
+                <w:sz w:val="16"/>
+              </w:rPr>
+              <w:t>Global spatial</w:t>
+            </w:r>
+          </w:p>
+        </w:tc>
+        <w:tc>
+          <w:tcPr>
+            <w:tcW w:type="dxa" w:w="691"/>
+          </w:tcPr>
+          <w:p>
+            <w:r>
+              <w:rPr>
+                <w:sz w:val="16"/>
+              </w:rPr>
+              <w:t>16.290</w:t>
+            </w:r>
+          </w:p>
+        </w:tc>
+        <w:tc>
+          <w:tcPr>
+            <w:tcW w:type="dxa" w:w="691"/>
+          </w:tcPr>
+          <w:p>
+            <w:r>
+              <w:rPr>
+                <w:sz w:val="16"/>
+              </w:rPr>
+              <w:t>18.756</w:t>
+            </w:r>
+          </w:p>
+        </w:tc>
+        <w:tc>
+          <w:tcPr>
+            <w:tcW w:type="dxa" w:w="1066"/>
+          </w:tcPr>
+          <w:p>
+            <w:r>
+              <w:rPr>
+                <w:sz w:val="16"/>
+              </w:rPr>
+              <w:t>PPO 18.283</w:t>
+            </w:r>
+          </w:p>
+        </w:tc>
+        <w:tc>
+          <w:tcPr>
+            <w:tcW w:type="dxa" w:w="720"/>
+          </w:tcPr>
+          <w:p>
+            <w:r>
+              <w:rPr>
+                <w:sz w:val="16"/>
+              </w:rPr>
+              <w:t>18.283</w:t>
+            </w:r>
+          </w:p>
+        </w:tc>
+        <w:tc>
+          <w:tcPr>
+            <w:tcW w:type="dxa" w:w="749"/>
+          </w:tcPr>
+          <w:p>
+            <w:r>
+              <w:rPr>
+                <w:sz w:val="16"/>
+              </w:rPr>
+              <w:t>304.3</w:t>
+            </w:r>
+          </w:p>
+        </w:tc>
+      </w:tr>
+      <w:tr>
+        <w:tc>
+          <w:tcPr>
+            <w:tcW w:type="dxa" w:w="1181"/>
+          </w:tcPr>
+          <w:p>
+            <w:r>
+              <w:rPr>
+                <w:sz w:val="16"/>
+              </w:rPr>
+              <w:t>Global spatial+temp</w:t>
+            </w:r>
+          </w:p>
+        </w:tc>
+        <w:tc>
+          <w:tcPr>
+            <w:tcW w:type="dxa" w:w="691"/>
+          </w:tcPr>
+          <w:p>
+            <w:r>
+              <w:rPr>
+                <w:sz w:val="16"/>
+              </w:rPr>
+              <w:t>16.139</w:t>
+            </w:r>
+          </w:p>
+        </w:tc>
+        <w:tc>
+          <w:tcPr>
+            <w:tcW w:type="dxa" w:w="691"/>
+          </w:tcPr>
+          <w:p>
+            <w:r>
+              <w:rPr>
+                <w:sz w:val="16"/>
+              </w:rPr>
+              <w:t>18.759</w:t>
+            </w:r>
+          </w:p>
+        </w:tc>
+        <w:tc>
+          <w:tcPr>
+            <w:tcW w:type="dxa" w:w="1066"/>
+          </w:tcPr>
+          <w:p>
+            <w:r>
+              <w:rPr>
+                <w:sz w:val="16"/>
+              </w:rPr>
+              <w:t>Drain 18.641</w:t>
+            </w:r>
+          </w:p>
+        </w:tc>
+        <w:tc>
+          <w:tcPr>
+            <w:tcW w:type="dxa" w:w="720"/>
+          </w:tcPr>
+          <w:p>
+            <w:r>
+              <w:rPr>
+                <w:sz w:val="16"/>
+              </w:rPr>
+              <w:t>18.798</w:t>
+            </w:r>
+          </w:p>
+        </w:tc>
+        <w:tc>
+          <w:tcPr>
+            <w:tcW w:type="dxa" w:w="749"/>
+          </w:tcPr>
+          <w:p>
+            <w:r>
+              <w:rPr>
+                <w:sz w:val="16"/>
+              </w:rPr>
+              <w:t>311.3</w:t>
+            </w:r>
+          </w:p>
+        </w:tc>
+      </w:tr>
+    </w:tbl>
+    <w:p>
+      <w:pPr>
+        <w:spacing w:after="40"/>
+      </w:pPr>
+    </w:p>
+    <w:p>
+      <w:pPr>
+        <w:spacing w:after="60"/>
+      </w:pPr>
+      <w:r>
+        <w:rPr>
+          <w:b w:val="0"/>
+          <w:i w:val="0"/>
+          <w:sz w:val="19"/>
+        </w:rPr>
+        <w:t>These seed-42 runs are a negative but informative result. Demand-aware PPO reduces cost 1.0% vs. status quo in US spatial and 2.5% in Global spatial, but Round Robin narrowly wins US spatial. Adding the temporal head does not capture the QP's ~1% temporal opportunity: Drain Immediately is best in both batch scenarios, while PPO is 0.1–0.2% above status quo and 6.5–16.5% above the clairvoyant bound. Both DQN encodings are less reliable; incomplete-work penalties dominate several batch runs. Thus the tariff matters and the QP shows shapeable value, but 500k-step single-seed PPO/DQN does not establish a successful temporal demand-charge optimizer. These results are reported separately from the five-seed default-off headline.</w:t>
       </w:r>
     </w:p>
     <w:p>
@@ -2362,7 +3439,7 @@
           <w:i w:val="0"/>
           <w:sz w:val="19"/>
         </w:rPr>
-        <w:t>We test the frozen policies (no retraining) on two distribution shifts (Fig. 6). On an UNOBSERVED shift — held-out cells e–h, with workload, tier mix, and per-cell power the policy never saw — context-aware PPO fails where its edge is purely spatial (US spatial −19%, Global spatial −27% vs. the held-out status quo): the policy had learned per-site routing keyed to static parameters that, although now in the observation, never VARIED during training and so carried no gradient signal. Training-time domain randomization (permuting compute bundles across market slots and resampling power parameters within the measured 8-cell range) fixes this, restoring positive transfer in three of four configs (+4.0–5.2%); Global spatial-only, whose price-concentration strategy has no deferral pool to absorb mistakes on unseen capacity, stays brittle — and its batch counterpart, which does, transfers at +5.2%. On an OBSERVED shift — net demand swapped to real EIA-930 May-2024 (a genuine 2019→2024 duck-curve change), prices held fixed — the SAME frozen policies transfer near-perfectly (+3.1–13.2%, within ~0.5 point of their on-training result). Generalization succeeds along the axis the policy can observe and fails along the one it cannot; this both answers the calendar-memorization concern for the demand signal and prescribes the fix (observe + randomize static context).</w:t>
+        <w:t>We test the frozen policies (no retraining) on two distribution shifts (Fig. 6). On an UNOBSERVED shift — held-out cells e–h, with workload, tier mix, and per-cell power the policy never saw — context-aware PPO fails where its edge is purely spatial (US spatial −19%, Global spatial −27% vs. the held-out status quo): the policy had learned per-site routing keyed to static parameters that, although now in the observation, never VARIED during training and so carried no gradient signal. Training-time domain randomization (permuting compute bundles across market slots and resampling power parameters within the measured 8-cell range) fixes this, restoring positive transfer in three of four configs (+4.0–5.2%); Global spatial-only, whose price-concentration strategy has no deferral pool to absorb mistakes on unseen capacity, stays brittle — and its batch counterpart, which does, transfers at +5.2%. On an OBSERVED shift — US net demand swapped to real EIA-930 May-2024 while non-US sites use matching-year documented approximations, with prices fixed — the SAME frozen policies transfer near-perfectly (+3.1–13.2%, within ~0.5 point of their on-training result). Generalization succeeds along the axis the policy can observe and fails along the one it cannot; this both answers the calendar-memorization concern for the demand signal and prescribes the fix (observe + randomize static context).</w:t>
       </w:r>
     </w:p>
     <w:p>
@@ -2569,7 +3646,7 @@
           <w:i w:val="0"/>
           <w:sz w:val="19"/>
         </w:rPr>
-        <w:t>Threats to validity. (i) PRICES are documented synthetic, not real LMP (Sec. IV-D) — the most significant limitation; relative comparisons are unaffected (shared series) and net demand is real, but absolute price levels are modeled, and resolving this with real ISO prices is primary future work. (ii) Cell locations are anonymized; the geographic assignment is a modeling choice justified by documented inter-cell heterogeneity [1]. (iii) The 100 MW magnitude bridges cell scale to grid relevance; results should be swept over R, and a 300 MW fleet would plausibly move LMPs (the price-taker assumption). (iv) The measured tier curves make episodes deterministic; Sec. VI-H addresses the resulting memorization concern directly and shows transfer along observed axes. (v) May is the deepest duck-curve month in CAISO; seasonal generalization is untested. (vi) Cooling and PUE are excluded by scope; a multiplicative PUE would scale, not reorder, results. (vii) The linear power model is calibrated on u ≈ 0.1–0.7 and omits memory/IO effects (+0.03 R² at most); a policy pushing utilization outside that range extrapolates. (viii) Five seeds and one hyperparameter set per algorithm; DQN's higher seed variance (std up to ±$0.9M vs. PPO's ≤$0.25M) is itself reported as a stability finding.</w:t>
+        <w:t>Threats to validity. (i) PRICES are documented synthetic, not real LMP (Sec. IV-D) — the most significant limitation; relative comparisons share the same series, but absolute price levels are modeled. US net demand uses EIA-930 while non-US series include documented approximations; replacing both with validated market data is primary future work. (ii) Cell locations are anonymized; the geographic assignment is a modeling choice justified by documented inter-cell heterogeneity [1]. (iii) The 100 MW magnitude bridges cell scale to grid relevance; results should be swept over R, and a 300 MW fleet would plausibly move LMPs (the price-taker assumption). (iv) The measured tier curves make episodes deterministic; Sec. VI-H addresses the resulting memorization concern directly and shows transfer along observed axes. (v) May is the deepest duck-curve month in CAISO; seasonal generalization is untested. (vi) Cooling and PUE are excluded by scope; a multiplicative PUE would scale, not reorder, results. (vii) The linear power model is calibrated on u ≈ 0.1–0.7 and omits memory/IO effects (+0.03 R² at most); a policy pushing utilization outside that range extrapolates. (viii) Five seeds and one hyperparameter set per algorithm; DQN's higher seed variance (std up to ±$0.9M vs. PPO's ≤$0.25M) is itself reported as a stability finding.</w:t>
       </w:r>
     </w:p>
     <w:p>
@@ -2596,7 +3673,7 @@
           <w:i w:val="0"/>
           <w:sz w:val="19"/>
         </w:rPr>
-        <w:t>(1) REAL PRICES: replace the synthetic price series with real CAISO/MISO LMP (and documented proxies for the non-ISO territories) — the highest-priority item, since it is the main provenance limitation (Sec. IV-D). (2) Sensitivity sweeps: deferrable fraction (via the retained generator), rated power R, flexibility factor φ, peak weight α; and seasonal generalization beyond May. (3) Carbon objective: swap or add marginal carbon-intensity signals to compare against CICS's objective directly [3]. (4) Forecast features: day-ahead price and net-demand forecasts as observations, quantifying the residual value of explicit foresight. (5) Constrained RL: enforce zero deadline violations as a hard constraint (e.g., Lagrangian PPO) rather than a penalty. (6) Hybrid granularity: a job-level inner scheduler below the aggregate outer policy, bridging to the CFWS setting [6]. (7) Storage and demand response: batteries and market participation extend the action space naturally [13]. (8) DQN stabilization: distributional/double variants and action-space curricula to separate encoding effects from optimizer fragility. (9) Multi-objective Pareto analysis of cost vs. peak contribution vs. completion latency. (10) Transfer to other public traces — e.g., the Alibaba 2020 GPU trace already packaged by SustainCluster [27] — to test trace dependence of the slope-arbitrage finding, and cross-validation of our policies inside the SustainCluster environment.</w:t>
+        <w:t>(1) REAL PRICES: replace the synthetic price series with real CAISO/MISO LMP (and documented proxies for the non-ISO territories) — the highest-priority item, since it is the main provenance limitation (Sec. IV-D). (2) Sensitivity sweeps: deferrable fraction (via the retained generator), rated power R, flexibility factor φ, peak weight α; and seasonal generalization beyond May. (3) Carbon objective: swap or add marginal carbon-intensity signals to compare against CICS's objective directly [3]. (4) Forecast features: day-ahead price and net-demand forecasts as observations, quantifying the residual value of explicit foresight. (5) Constrained RL: enforce zero deadline violations as a hard constraint (e.g., Lagrangian PPO) rather than a penalty. (6) Hybrid granularity: a job-level inner scheduler below the aggregate outer policy, bridging to the CFWS setting [6]. (7) Storage and demand response: batteries and market participation extend the action space naturally [13]. (8) DQN stabilization: distributional/double variants and action-space curricula to separate encoding effects from optimizer fragility. (9) Multi-objective Pareto analysis of cost vs. peak contribution vs. completion latency. (10) Transfer to other public traces — e.g., the Alibaba 2020 GPU trace already packaged by SustainCluster [27] — to test trace dependence of the slope-arbitrage finding, and cross-validation of our policies inside the SustainCluster environment. (11) Demand-charge optimization: multi-seed training, peak-aware curricula or constrained control, and policy designs that close the 6.5–16.5% PPO gap to the demand-aware QP in batch mode.</w:t>
       </w:r>
     </w:p>
     <w:p>
@@ -2623,7 +3700,7 @@
           <w:i w:val="0"/>
           <w:sz w:val="19"/>
         </w:rPr>
-        <w:t>On an environment assembled largely from measured public data — per-tier demand from ClusterData 2019, per-cell power from PowerData2019, real EIA-930 net demand, and documented synthetic prices — a continuous-action PPO agent learns grid-aware spatio-temporal load shaping that, across five seeds per configuration, beats the grid-unaware status quo by 2.7–12.9%, a foresighted heuristic by 5.0–14.8%, and discrete DQN variants by 2.5–9.9% (19 of 20 seed comparisons) in every configuration, landing within 1.1–5.6% of a clairvoyant QP bound with zero deadline violations and a flatter, lower fleet profile. The savings come from continuously exploitable structure — price spreads and per-cell marginal-power (slope) arbitrage — and they transfer to unseen market conditions along the axes the policy observes, with domain randomization extending transfer to unseen workloads. Equally important, the path to these numbers required finding and fixing several modeling errors that each inverted the ranking, and an honest accounting of what is measured (demand, power, net demand) versus modeled (prices); we offer the corrected environment, the validation invariant, the QP bound, and the lessons themselves as contributions to reproducible research in sustainable computing.</w:t>
+        <w:t>On an environment assembled from measured workload and power traces, EIA-930 US net demand, documented non-US net-demand approximations, and synthetic prices — a continuous-action PPO agent learns grid-aware spatio-temporal load shaping that, across five seeds per configuration, beats the grid-unaware status quo by 2.7–12.9%, a foresighted heuristic by 5.0–14.8%, and discrete DQN variants by 2.5–9.9% (19 of 20 seed comparisons) in every configuration, landing within 1.3–5.7% of a clairvoyant QP bound with zero deadline violations and a flatter, lower fleet profile. The savings come from continuously exploitable structure — price spreads and per-cell marginal-power (slope) arbitrage — and they transfer to unseen market conditions along the axes the policy observes, with domain randomization extending transfer to unseen workloads. Equally important, the path to these numbers required finding and fixing several modeling errors that each inverted the ranking, and an honest accounting of what is measured (demand, power, net demand) versus modeled (prices); we offer the corrected environment, the validation invariant, the QP bound, and the lessons themselves as contributions to reproducible research in sustainable computing. A separate single-seed US-reference demand-charge campaign shows spatial PPO can help, especially globally, but learned temporal policies do not beat immediate drain despite QP headroom; this negative result defines the next algorithmic problem rather than extending the headline claim.</w:t>
       </w:r>
     </w:p>
     <w:p>
@@ -2659,7 +3736,7 @@
         <w:rPr>
           <w:sz w:val="16"/>
         </w:rPr>
-        <w:t>[2] V. Sakalkar, V. Kontorinis, D. Landhuis, S. Li, D. De Ronde, T. Blooming, A. Ramesh, J. Kennedy, C. Malone, J. Clidaras, and P. Ranganathan, “Data Center Power Oversubscription with a Medium Voltage Power Plane and Priority-Aware Capping,” in Proc. ASPLOS, 2020.</w:t>
+        <w:t>[2] V. Sakalkar, V. Kontorinis, D. Landhuis, S. Li, D. De Ronde, T. Blooming, A. Ramesh, J. Kennedy, C. Malone, J. Clidaras, and P. Ranganathan, “Data Center Power Oversubscription with a Medium Voltage Power Plane and Priority-Aware Capping,” in Proc. ASPLOS, 2020; companion dataset documentation: https://github.com/google/cluster-data/blob/master/PowerData2019.md.</w:t>
       </w:r>
     </w:p>
     <w:p>
@@ -2670,7 +3747,7 @@
         <w:rPr>
           <w:sz w:val="16"/>
         </w:rPr>
-        <w:t>[3] A. Radovanović, R. Koningstein, I. Schneider, B. Chen, A. Duarte, B. Roy, D. Xiao, M. Haridasan, P. Hung, N. Care, S. Talukdar, E. Mullen, K. Smith, M. Cottman, and W. Cirne, “Carbon-Aware Computing for Datacenters,” IEEE Trans. Power Systems, vol. 38, no. 2, 2023 (arXiv:2106.11750, 2021).</w:t>
+        <w:t>[3] A. Radovanović, R. Koningstein, I. Schneider, B. Chen, A. Duarte, B. Roy, D. Xiao, M. Haridasan, P. Hung, N. Care, S. Talukdar, E. Mullen, K. Smith, M. Cottman, and W. Cirne, “Carbon-Aware Computing for Datacenters,” IEEE Trans. Power Systems, vol. 38, no. 2, pp. 1270–1280, Mar. 2023, doi: 10.1109/TPWRS.2022.3173250 (arXiv:2106.11750).</w:t>
       </w:r>
     </w:p>
     <w:p>
@@ -2703,7 +3780,7 @@
         <w:rPr>
           <w:sz w:val="16"/>
         </w:rPr>
-        <w:t>[6] D. Zhao, J.-t. Zhou, and K. Li, “CFWS: DRL-Based Framework for Energy Cost and Carbon Footprint Optimization in Cloud Data Centers,” IEEE Trans. Sustainable Computing, vol. 10, no. 1, pp. 95–107, Jan./Feb. 2025.</w:t>
+        <w:t>[6] D. Zhao, J.-t. Zhou, and K. Li, “CFWS: DRL-Based Framework for Energy Cost and Carbon Footprint Optimization in Cloud Data Centers,” IEEE Trans. Sustainable Computing, vol. 10, no. 1, pp. 95–107, Jan./Feb. 2025, doi: 10.1109/TSUSC.2024.3391791.</w:t>
       </w:r>
     </w:p>
     <w:p>
@@ -2912,7 +3989,7 @@
         <w:rPr>
           <w:sz w:val="16"/>
         </w:rPr>
-        <w:t>[25] Z. Liu, M. Lin, A. Wierman, S. H. Low, and L. L. H. Andrew, “Geographical Load Balancing with Renewables,” ACM SIGMETRICS Performance Evaluation Review, vol. 39, no. 3, 2011.</w:t>
+        <w:t>[25] Z. Liu, M. Lin, A. Wierman, S. H. Low, and L. L. H. Andrew, “Greening Geographical Load Balancing,” in Proc. ACM SIGMETRICS, pp. 233–244, 2011, doi: 10.1145/1993744.1993767.</w:t>
       </w:r>
     </w:p>
     <w:p>
@@ -2934,7 +4011,7 @@
         <w:rPr>
           <w:sz w:val="16"/>
         </w:rPr>
-        <w:t>[27] Hewlett Packard Enterprise, “SustainCluster: A high-fidelity, open-source Gymnasium environment for benchmarking multi-objective, sustainable workload scheduling across geo-distributed data centers,” software repository, https://github.com/HewlettPackard/sustain-cluster (MIT License).</w:t>
+        <w:t>[27] Hewlett Packard Enterprise, “SustainCluster: A high-fidelity, open-source Gymnasium environment for benchmarking multi-objective, sustainable workload scheduling across geo-distributed data centers,” GitHub repository, MIT License, https://github.com/HewlettPackard/sustain-cluster (accessed Aug. 2026).</w:t>
       </w:r>
     </w:p>
     <w:p>
@@ -2945,7 +4022,18 @@
         <w:rPr>
           <w:sz w:val="16"/>
         </w:rPr>
-        <w:t>[28] International Energy Agency, “Key Questions on Energy and AI,” World Energy Outlook Special Report, IEA, 2025.</w:t>
+        <w:t>[28] International Energy Agency, “Energy and AI,” IEA, Paris, Jan. 2025. [Online]. Available: https://www.iea.org/reports/energy-and-ai.</w:t>
+      </w:r>
+    </w:p>
+    <w:p>
+      <w:pPr>
+        <w:spacing w:after="40"/>
+      </w:pPr>
+      <w:r>
+        <w:rPr>
+          <w:sz w:val="16"/>
+        </w:rPr>
+        <w:t>[29] J. McLaren et al., “Identifying Potential Markets for Behind-the-Meter Battery Energy Storage: A Survey of U.S. Demand Charge Rates,” NREL/TP-6A20-64980, National Renewable Energy Laboratory, 2015.</w:t>
       </w:r>
     </w:p>
     <w:sectPr>

</xml_diff>

<commit_message>
Build CAISO energy model v2
</commit_message>
<xml_diff>
--- a/thesis_paper.docx
+++ b/thesis_paper.docx
@@ -55,7 +55,7 @@
           <w:i/>
           <w:sz w:val="16"/>
         </w:rPr>
-        <w:t>Master's Thesis Draft — generated working paper; numbers correspond to the multi-seed default-off campaign (5 seeds/config); the demand-charge extension is explicitly labeled single-seed.</w:t>
+        <w:t>Master's Thesis Draft — energy-model v2 design gate. The real May-2025 CAISO source and corrected QP gate are current. Prior learned-policy results are archived separately as energy-model v1 evidence and are not final v2 claims.</w:t>
       </w:r>
     </w:p>
     <w:p>
@@ -68,7 +68,7 @@
           <w:i w:val="0"/>
           <w:sz w:val="18"/>
         </w:rPr>
-        <w:t>Abstract — Hyperscale data centers are now grid-scale electrical loads whose consumption coincides with regional net-demand peaks (the “duck curve”). We study whether a reinforcement-learning agent can route workload across geographically distributed data centers — spatially (where) and temporally (when, for deferrable batch work) — to minimize electricity cost while reducing the fleet's contribution to grid stress. Following the aggregate load-shaping paradigm of Google's production Carbon-Intelligent Computing System rather than job-level scheduling, we model four Borg cells from the Google ClusterData 2019 trace as proxy data centers: measured per-tier demand curves (service vs. no-SLO batch, extracted from instance-level usage by priority tier), per-cell power models calibrated on the companion PowerData2019 measurements (R² = 0.75–0.80 per cell vs. 0.43 pooled), regional net-demand series (EIA-930 for US regions; documented approximations outside the US), and documented synthetic regional price series (see provenance note, Sec. IV-D). Across five training seeds per configuration, a continuous-action PPO policy controlling routing fractions, batch drain rates, and batch placement beats the grid-unaware status quo by 2.7–12.9%, a foresighted lookahead heuristic by 5.0–14.8%, and the best discrete DQN variant by 2.5–9.9% (winning 19 of 20 seed-paired comparisons), and sits within 1.3–5.7% of a clairvoyant convex-QP lower bound — with zero deadline violations and 100% of service demand served. A three-stage generalization study shows transfer succeeds along an observed net-demand-year shift (real EIA-930 for US regions; updated approximations for non-US regions) but fails along an unobserved one (held-out cells), until domain randomization restores it; and the spatial advantage survives inter-site movement costs up to ~0.35–0.53× the energy cost of serving a unit. We additionally contribute three experimentally validated modeling lessons — deadline penalties must scale with the energy value of deferred work; capacity-blocked work must queue, not expire; and synthetic workload generators must conserve the demand-presentation process (requests ≠ usage) — each of which, while uncorrected, inverted the experimental ranking.</w:t>
+        <w:t>Abstract — Hyperscale data centers are now grid-scale electrical loads whose consumption coincides with regional net-demand peaks (the “duck curve”). We study whether a reinforcement-learning agent can route workload across geographically distributed data centers — spatially (where) and temporally (when, for deferrable batch work) — to minimize electricity cost while reducing the fleet's contribution to grid stress. The active experiment combines Google ClusterData 2019 workload shapes and PowerData2019-calibrated power models with one co-timestamped, real May-2025 CAISO archetype: native five-minute net demand and solar plus NP15 day-ahead LMP. Price and net demand are shifted together by local wall time across four US slots and four global slots, preserving negative prices and signed net demand over a complete 8,928-step (744-hour) experiment. Measured workload shapes map to equal 100 MW/unit-capacity proxies, and current batch arrivals are observed before same-step release. Routing is unrestricted and therefore represents an optimistic upper bound, not a deployment claim. The corrected clairvoyant-QP gate finds 8.0–17.4% joint headroom, of which only 0.6–2.3% is incremental temporal value. An a–d-only coefficient sweep supports α=0.015 for the convex positive-grid-stress term; a standardized demand charge remains secondary. No v2 PPO training has begun.</w:t>
       </w:r>
     </w:p>
     <w:p>
@@ -131,7 +131,7 @@
           <w:i w:val="0"/>
           <w:sz w:val="19"/>
         </w:rPr>
-        <w:t>This thesis asks: can a model-free reinforcement-learning agent, observing only per-site demand, prices, and grid net demand, learn a joint spatial-temporal load-shaping policy that beats both the grid-unaware status quo and foresighted scheduling heuristics? We answer affirmatively, on an environment combining measured traces with explicitly identified modeled market inputs, and we document — unusually, as a first-class contribution — the modeling errors we made on the way, each of which inverted the experimental ranking until found and fixed.</w:t>
+        <w:t>This thesis asks: can a model-free reinforcement-learning agent, observing only per-site demand, prices, and grid net demand, learn a joint spatial-temporal load-shaping policy that beats the grid-unaware status quo? This revision deliberately does not answer that question with a learned v2 policy yet. It first freezes and audits the real energy surface on which the answer will depend, then uses a clairvoyant QP to verify that measurable headroom exists before spending another training campaign.</w:t>
       </w:r>
     </w:p>
     <w:p>
@@ -144,7 +144,7 @@
           <w:i w:val="0"/>
           <w:sz w:val="19"/>
         </w:rPr>
-        <w:t>Contributions. (C1) A reproducible Gymnasium environment for multi-data-center grid-aware load shaping at cell-aggregate granularity, grounded in Google ClusterData 2019 [1], PowerData2019 [2], EIA-930 US net demand, documented non-US net-demand approximations, and synthetic regional prices. (C2) Ground-truth measured per-tier demand decomposition (SLO service vs. no-SLO batch) of four trace cells, with the finding that resource requests overestimate the deferrable usage share by 3–5×. (C3) A continuous-action PPO formulation (routing + drain + batch placement) that, across five seeds per configuration, wins every evaluated configuration against heuristic, DQN, and status-quo baselines with zero deadline violations, and lands within 1.3–5.7% of a clairvoyant QP lower bound. (C4) Identification of marginal-power (slope) arbitrage as an emergent routing strategy enabled by per-cell power calibration. (C5) A three-stage generalization result establishing that transfer tracks observability, with domain randomization closing the unobserved axis. (C6) Three transferable modeling lessons for deferral-with-deadlines simulators, each validated by ranking inversion.</w:t>
+        <w:t>Contributions. (C1) A reproducible Gymnasium environment for multi-data-center grid-aware load shaping at cell-aggregate granularity, grounded in Google ClusterData 2019 [1] and PowerData2019 [2]. (C2) Ground-truth measured per-tier demand decomposition (SLO service vs. no-SLO batch) of four trace cells, with the finding that resource requests overestimate the deferrable usage share by 3–5×. (C3) A real, reproducible May-2025 CAISO duck-curve/price archetype whose paired signals are shifted by IANA local wall time across US and global slots. (C4) A no-training QP gate that sizes the opportunity before policy selection and shows that spatial diversity dominates temporal flexibility. (C5) A preserved audit trail of the retired mixed/synthetic model and the simulator corrections that prevented invalid results from being promoted.</w:t>
       </w:r>
     </w:p>
     <w:p>
@@ -171,7 +171,7 @@
           <w:i w:val="0"/>
           <w:sz w:val="19"/>
         </w:rPr>
-        <w:t>This work deliberately assembles its methodology from prior art; this section states precisely what is taken from where.</w:t>
+        <w:t>The current thesis combines four established ideas rather than claiming a new scheduling paradigm: measured aggregate workload shaping, geographic load balancing, deadline-constrained deferral, and model-free control. This section identifies only the lineage that remains active in energy-model v2.</w:t>
       </w:r>
     </w:p>
     <w:p>
@@ -184,7 +184,7 @@
           <w:i/>
           <w:sz w:val="20"/>
         </w:rPr>
-        <w:t>A. The trace and its semantics</w:t>
+        <w:t>A. Aggregate workload shaping and trace semantics</w:t>
       </w:r>
     </w:p>
     <w:p>
@@ -197,7 +197,20 @@
           <w:i w:val="0"/>
           <w:sz w:val="19"/>
         </w:rPr>
-        <w:t>ClusterData 2019, documented by Tirmazi et al. [1], covers eight Borg cells for May 2019 (~96k machines). We adopt three of its definitions wholesale: the cell as the natural management unit (§2 of [1]); priority tiers, from which we define deferrable work as the union of the two no-SLO tiers — free (priority ≤ 99) and best-effort batch (100–115, per the normative trace documentation [22]; Tirmazi et al. [1] describe the range as 110–115) — production work (120–359) is explicitly protected by eviction of lower tiers and is never deferred; and Normalized Compute Units. The companion PowerData2019 trace provides measured per-PDU power utilization [2], used here for calibration. Tirmazi's heavy-tail observation (top 1% of jobs consume &gt;99% of resources) informs our distribution fits; notably we find the tail does not survive aggregation (Sec. VII).</w:t>
+        <w:t>ClusterData 2019 [1] defines a Borg cell as one management unit and reports five-minute, normalized resource usage across eight heterogeneous cells. We use those measured cell aggregates directly. Collection priority separates the no-SLO free/best-effort tiers (priority ≤115 [22]) from SLO-bearing service; no synthetic arrival stream is used in the primary experiment. PowerData2019 [2] supplies the companion per-cell power calibration.</w:t>
+      </w:r>
+    </w:p>
+    <w:p>
+      <w:pPr>
+        <w:spacing w:after="60"/>
+      </w:pPr>
+      <w:r>
+        <w:rPr>
+          <w:b w:val="0"/>
+          <w:i w:val="0"/>
+          <w:sz w:val="19"/>
+        </w:rPr>
+        <w:t>Google's CICS [3] is the main production precedent for this granularity. It shapes aggregate flexible and inflexible cluster demand independently of the real-time job scheduler, using cluster-specific forecasts and power models. Our temporal abstraction follows that aggregate view, while the objective changes from carbon to electricity cost and grid net demand. CICS is a precedent, not a reproduced system, and it does not supply our spatial head.</w:t>
       </w:r>
     </w:p>
     <w:p>
@@ -210,33 +223,7 @@
           <w:i/>
           <w:sz w:val="20"/>
         </w:rPr>
-        <w:t>B. Workload-generation lineage</w:t>
-      </w:r>
-    </w:p>
-    <w:p>
-      <w:pPr>
-        <w:spacing w:after="60"/>
-      </w:pPr>
-      <w:r>
-        <w:rPr>
-          <w:b w:val="0"/>
-          <w:i w:val="0"/>
-          <w:sz w:val="19"/>
-        </w:rPr>
-        <w:t>Our synthetic batch generator descends directly from Da Costa, Grange &amp; De Courchelle [5], instantiated as the scipy-based Listing 1 of Grange et al. [4], in the Feitelson workload-modeling tradition [21]. Those works use the 2011 Google trace; we retain the generator family but re-fit every distribution to ClusterData2019. We reproduce Listing 1 verbatim (scripts/grange_generator.py recovers their published lognormal s = 1.634, scale = 447), then extend it: distributions are re-fit to the 2019 trace under the no-SLO definition, selected by minimum Kolmogorov–Smirnov distance (the p-value saturates at n ≈ 10⁵), with discrete negative-binomial task counts. Grange's SLA-flexibility knob becomes our deadline model, Eq. (7). Critically, in the final environment the generator is demoted to sensitivity analysis: measured per-tier curves are the primary input, after we found single-timestep job pulses inflated batch burstiness by two orders of magnitude (Sec. VII).</w:t>
-      </w:r>
-    </w:p>
-    <w:p>
-      <w:pPr>
-        <w:spacing w:after="40"/>
-      </w:pPr>
-      <w:r>
-        <w:rPr>
-          <w:b/>
-          <w:i/>
-          <w:sz w:val="20"/>
-        </w:rPr>
-        <w:t>C. Geographic load balancing for electricity cost</w:t>
+        <w:t>B. Geographic load balancing for electricity cost</w:t>
       </w:r>
     </w:p>
     <w:p>
@@ -262,7 +249,7 @@
           <w:i/>
           <w:sz w:val="20"/>
         </w:rPr>
-        <w:t>D. Single-DC renewable-aware scheduling</w:t>
+        <w:t>C. Deadline-constrained deferral</w:t>
       </w:r>
     </w:p>
     <w:p>
@@ -275,7 +262,7 @@
           <w:i w:val="0"/>
           <w:sz w:val="19"/>
         </w:rPr>
-        <w:t>The deferral-with-deadlines pattern originates in single-DC work: GreenSlot [10] delays jobs toward predicted cheap/green slots; Grange et al. [4] add due-date constraints and an infrastructure-agnostic objective signal; Xu et al. [7] split workloads into brownout-able interactive and deferrable batch; Haghshenas et al. [8] schedule heterogeneous workloads against rate structures; Liu et al. [9] forecast-then-plan. We benchmark against this lineage at the level of objectives and effects — cost, peak contribution, deferral value — not mechanism: our Trough-Slot baseline retargets GreenSlot's slot valuation from solar supply to grid net demand, and our service/batch split operationalizes Xu's taxonomy via measured tiers.</w:t>
+        <w:t>GreenSlot [10] and related single-DC work establish the basic temporal idea: delay flexible work toward predicted cheap or renewable-rich intervals. Grange et al. [4] add due-date constraints; Xu et al. [7] distinguish interactive from deferrable work; Haghshenas et al. [8] and Liu et al. [9] combine heterogeneous load with prices or forecasts. We borrow the pool-and-deadline abstraction, not their job-level placement mechanisms. In our aggregate model, measured no-SLO demand enters a queue and the controller selects its release rate and execution site.</w:t>
       </w:r>
     </w:p>
     <w:p>
@@ -288,7 +275,7 @@
           <w:i/>
           <w:sz w:val="20"/>
         </w:rPr>
-        <w:t>E. Aggregate load shaping at hyperscale</w:t>
+        <w:t>D. Reinforcement learning and open environments</w:t>
       </w:r>
     </w:p>
     <w:p>
@@ -301,7 +288,20 @@
           <w:i w:val="0"/>
           <w:sz w:val="19"/>
         </w:rPr>
-        <w:t>Radovanović et al. [3] describe CICS, which shapes aggregate cluster load via day-ahead Virtual Capacity Curves and operates independently from real-time job-level scheduling, using cluster demand forecasts rather than a job-level workload model. Our environment is a CICS-shaped formulation made reproducible: aggregate flexible/inflexible demand curves per cluster, power models trained separately per cluster, and both spatial and temporal shifting — retargeted from carbon to grid demand smoothing, on public data.</w:t>
+        <w:t>Model-free RL is established for data-center control [15], with DeepEE [16] as one example of joint scheduling and infrastructure control. We use PPO [18] because the current action is continuous: routing fractions, release rates, and batch-placement fractions. The paper does not claim a new RL algorithm; its contribution is the measured workload/energy formulation and the controlled evaluation around it.</w:t>
+      </w:r>
+    </w:p>
+    <w:p>
+      <w:pPr>
+        <w:spacing w:after="60"/>
+      </w:pPr>
+      <w:r>
+        <w:rPr>
+          <w:b w:val="0"/>
+          <w:i w:val="0"/>
+          <w:sz w:val="19"/>
+        </w:rPr>
+        <w:t>SustainDC [26] addresses multi-agent control within a data center, while SustainCluster [27] dispatches individual Alibaba GPU tasks across many locations with carbon, cost, SLA, and transmission objectives. They are complementary rather than drop-in baselines: this thesis controls divisible aggregate Google-cell demand and explicitly targets CAISO net-demand shape. Reproducing the same question in either benchmark would require changing its workload granularity or objective.</w:t>
       </w:r>
     </w:p>
     <w:p>
@@ -314,7 +314,7 @@
           <w:i/>
           <w:sz w:val="20"/>
         </w:rPr>
-        <w:t>F. Reinforcement learning and open environments</w:t>
+        <w:t>E. Current positioning</w:t>
       </w:r>
     </w:p>
     <w:p>
@@ -327,20 +327,7 @@
           <w:i w:val="0"/>
           <w:sz w:val="19"/>
         </w:rPr>
-        <w:t>RL for DC energy management is surveyed in [15]; DeepEE [16] jointly schedules jobs and cooling with DRL (cooling is excluded from our scope). At finer granularity, CFWS [6] applies DQN with a flattened-index action encoding to VM/PM migration. We do not benchmark or reimplement CFWS; we borrow only its compact index-decoding idea for a 48-action aggregate DQN sensitivity, alongside a 759-action routing grid, against continuous-action PPO [18] (DQN [19]; implementations via Stable-Baselines3 [20]). Energy-model form follows the linear idle+slope server model surveyed in [14] and canonicalized by Fan et al. [17]; the demand-response framing follows [13]; broader green-DC context in [11], geo-distributed scheduling in [12].</w:t>
-      </w:r>
-    </w:p>
-    <w:p>
-      <w:pPr>
-        <w:spacing w:after="60"/>
-      </w:pPr>
-      <w:r>
-        <w:rPr>
-          <w:b w:val="0"/>
-          <w:i w:val="0"/>
-          <w:sz w:val="19"/>
-        </w:rPr>
-        <w:t>Open benchmark environments for this problem class have recently emerged. SustainDC [26] provides multi-agent Gymnasium environments for control *within* a data center (workload shifting, cooling, battery). SustainCluster [27] is a complementary geo-distributed environment: a centralized scheduler dispatches or defers *individual tasks* of the Alibaba 2020 GPU trace across 20+ global locations every 15 minutes, optimizing energy cost, carbon, SLA, and per-GB transmission overheads. Our environment is complementary on three axes: granularity (CICS-style measured aggregate per-tier curves rather than per-task dispatch), data grounding (Google ClusterData 2019 with PowerData2019-calibrated per-cell power, rather than Alibaba GPU jobs with carbon-intensity feeds), and objective (grid net-demand peak contribution rather than carbon). We deliberately do not run our experiments inside SustainCluster: answering our question there would require replacing both its objective (carbon → grid net demand) and its action model (per-task dispatch → aggregate tier control, the granularity Sec. II-E argues for), while abandoning the Google-trace data contributions — at which point the environment would no longer be SustainCluster. The two environments are complementary benchmarks; SustainCluster's transmission-cost model is the natural template for the movement-cost sensitivity analysis of Sec. VIII, and cross-validation of our policies inside it is listed as future work.</w:t>
+        <w:t>The active contribution is a controlled geo-distributed workload-shaping experiment that combines measured aggregate service/batch curves, per-cell power models, and one real May-2025 CAISO net-demand/price archetype shifted across US and global local-time slots. A clairvoyant QP sizes spatial and temporal headroom before PPO is trained. This is not a real multi-market replay, a CICS reproduction, or a VM/job scheduler, and no archived v1 learned-policy result is promoted as v2 evidence.</w:t>
       </w:r>
     </w:p>
     <w:p>
@@ -367,7 +354,7 @@
           <w:i w:val="0"/>
           <w:sz w:val="19"/>
         </w:rPr>
-        <w:t>N = 4 data centers, indexed by i, j ∈ {1,…,N} (i is the site under consideration; j is a running index used in fleet-wide sums), operate over T = 8,917 five-minute steps, indexed by t, τ ∈ {1,…,T} (t is the current step; τ is a running index over earlier steps), with Δ = 300 s and Δh = 1/12 h. Site i has measured aggregate demand curve wᵢ,ₜ ∈ [0,1] (fraction of cell capacity), decomposed by measured priority tier into non-deferrable service demand vᵢ,ₜ and deferrable batch arrivals aᵢ,ₜ with wᵢ,ₜ = vᵢ,ₜ + aᵢ,ₜ exactly. The total service demand pooled across the fleet at step t is Dₜ = Σᵢ vᵢ,ₜ — the quantity the routing fractions redistribute. Site inputs further include electricity price πᵢ,ₜ ($/kWh), normalized grid net demand dᵢ,ₜ ∈ [0,1] (0 = grid slack; 1 = grid peak, the duck-curve neck), and capacity κᵢ from fleet machine data.</w:t>
+        <w:t>N = 4 data centers, indexed by i, j ∈ {1,…,N} (i is the site under consideration; j is a running index used in fleet-wide sums), operate over T = 8,928 five-minute steps, indexed by t, τ ∈ {1,…,T} (t is the current step; τ is a running index over earlier steps), with Δ = 300 s and Δh = 1/12 h. Site i has measured aggregate demand curve wᵢ,ₜ ∈ [0,1] (fraction of cell capacity), decomposed by measured priority tier into non-deferrable service demand vᵢ,ₜ and deferrable batch arrivals aᵢ,ₜ with wᵢ,ₜ = vᵢ,ₜ + aᵢ,ₜ exactly. The total service demand pooled across the fleet at step t is Dₜ = Σᵢ vᵢ,ₜ — the quantity the routing fractions redistribute. Site inputs further include electricity price πᵢ,ₜ ($/kWh), signed grid net demand dᵢ,ₜ ∈ [−1,1] (negative = renewable oversupply, positive = residual grid load), and normalized proxy capacity κᵢ = 1.</w:t>
       </w:r>
     </w:p>
     <w:p>
@@ -380,7 +367,20 @@
           <w:i/>
           <w:sz w:val="20"/>
         </w:rPr>
-        <w:t>A. Power and cost</w:t>
+        <w:t>A. Equal-capacity proxy, power, and cost</w:t>
+      </w:r>
+    </w:p>
+    <w:p>
+      <w:pPr>
+        <w:spacing w:after="60"/>
+      </w:pPr>
+      <w:r>
+        <w:rPr>
+          <w:b w:val="0"/>
+          <w:i w:val="0"/>
+          <w:sz w:val="19"/>
+        </w:rPr>
+        <w:t>Each wᵢ,ₜ is already measured CPU usage divided by its SOURCE cell's CPU capacity. We use that real curve as a utilization shape and map it onto an equal 100 MW proxy DC. Therefore every destination has κᵢ = 1: w = 0.70 means 70% of that proxy's capacity. Raw machine totals remain provenance metadata and support calibration; they do not shrink destination capacity again. This avoids mixing own-cell utilization units with capacity expressed relative to the largest source fleet.</w:t>
       </w:r>
     </w:p>
     <w:p>
@@ -432,7 +432,7 @@
           <w:i w:val="0"/>
           <w:sz w:val="19"/>
         </w:rPr>
-        <w:t>where uᵢ,ₜ is served CPU, Pᵢⁱᵈˡᵉ is cell i's idle power (its draw at zero CPU, as a fraction of theoretical peak), sᵢ is its marginal power slope (the extra power per unit of CPU — the per-cell quantity the agent arbitrages, Sec. VI-B), R is rated power per site, and g is the grid draw (sites are pure grid loads; no on-site generation). Energy cost and the quadratic, net-demand-weighted peak-contribution penalty are</w:t>
+        <w:t>where uᵢ,ₜ∈[0,1] is served utilization of the equal 100 MW proxy, Pᵢⁱᵈˡᵉ is cell i's idle power (its draw at zero CPU, as a fraction of theoretical peak), sᵢ is its marginal power slope (the extra power per unit of CPU and an observable routing context), R is rated power per site, and g is the grid draw (sites are pure grid loads; no on-site generation). Energy cost and the quadratic, net-demand-weighted peak-contribution penalty are</w:t>
       </w:r>
     </w:p>
     <w:p>
@@ -458,7 +458,7 @@
           <w:i/>
           <w:sz w:val="19"/>
         </w:rPr>
-        <w:t>Φₜ = α · Σᵢ gᵢ,ₜ² · dᵢ,ₜ,   α = 0.015        (4)</w:t>
+        <w:t>Φₜ = α · Σᵢ gᵢ,ₜ² · max(dᵢ,ₜ,0)        (4)</w:t>
       </w:r>
     </w:p>
     <w:p>
@@ -471,7 +471,59 @@
           <w:i w:val="0"/>
           <w:sz w:val="19"/>
         </w:rPr>
-        <w:t>The quadratic form penalizes concentration; the d-weighting makes draw near the duck-curve neck expensive and slack-hour draw nearly free [13]. Φ is a grid-stress SHADOW PRICE, not a tariff: α is calibrated to a target share of total cost (Sec. V-A), not derived from a rate schedule, and Φ differs from a commercial demand charge in all three respects that matter — it is summed over every interval rather than taken as a maximum, it is quadratic rather than linear in kW, and it is weighted by grid net demand, which no tariff observes.</w:t>
+        <w:t>The quadratic form penalizes concentration; the d-weighting makes draw near the duck-curve neck expensive. Signed d remains observable, while max(d,0) keeps the QP convex. At negative net demand Φ is zero; the real low or negative LMP provides the economic reward for moving work into the duck-curve belly. Φ is a grid-stress SHADOW PRICE, not a tariff: α must be selected by a documented v2 component/sensitivity study, not inherited from v1 or derived from a rate schedule, and Φ differs from a commercial demand charge in all three respects that matter — it is summed over every interval rather than taken as a maximum, it is quadratic rather than linear in kW, and it is weighted by grid net demand, which no tariff observes.</w:t>
+      </w:r>
+    </w:p>
+    <w:p>
+      <w:pPr>
+        <w:spacing w:after="60"/>
+      </w:pPr>
+      <w:r>
+        <w:rPr>
+          <w:b w:val="0"/>
+          <w:i w:val="0"/>
+          <w:sz w:val="19"/>
+        </w:rPr>
+        <w:t>All slots use the same CAISO archetype and signed MW denominator, so d is comparable by construction inside this controlled experiment. This is not a claim that real California, Amsterdam, and Singapore systems have equal physical scarcity.</w:t>
+      </w:r>
+    </w:p>
+    <w:p>
+      <w:pPr>
+        <w:spacing w:after="60"/>
+      </w:pPr>
+      <w:r>
+        <w:rPr>
+          <w:b/>
+          <w:i w:val="0"/>
+          <w:sz w:val="19"/>
+        </w:rPr>
+        <w:t>Ramp-rate treatment — evaluated, not optimized.</w:t>
+      </w:r>
+    </w:p>
+    <w:p>
+      <w:pPr>
+        <w:spacing w:after="60"/>
+      </w:pPr>
+      <w:r>
+        <w:rPr>
+          <w:b w:val="0"/>
+          <w:i w:val="0"/>
+          <w:sz w:val="19"/>
+        </w:rPr>
+        <w:t>The duck curve combines a deep midday trough with a steep upward evening ramp. The primary objective addresses trough economics and HIGH net-demand EXPOSURE, but contains no derivative dₜ−dₜ₋H; it does not directly optimize ramp rate. Price is an incomplete proxy: its correlation is 0.895 with net-demand level but only 0.206 with the one-hour ramp and 0.429 with the three-hour ramp.</w:t>
+      </w:r>
+    </w:p>
+    <w:p>
+      <w:pPr>
+        <w:spacing w:after="60"/>
+      </w:pPr>
+      <w:r>
+        <w:rPr>
+          <w:b w:val="0"/>
+          <w:i w:val="0"/>
+          <w:sz w:val="19"/>
+        </w:rPr>
+        <w:t>This omission is deliberate for the first v2 campaign. Concentrating work during negative-demand, very-low-price intervals is acceptable within proxy capacity, and Φ is zero there. Evaluation reports per-region maximum and 95th-percentile upward ramps for H=1 hour and H=3 hours, comparing max(0,Nₜ−Nₜ₋H) with max(0,(Nₜ+gₜ)−(Nₜ₋H+gₜ₋H)). Regions are not summed into a fictitious global grid. A ramp-aware reward is future work and will be introduced only if the first v2 policies worsen these physical KPIs. Status Quo changes the maximum one-hour regional ramp by only −0.4 to +1.7 MW across scenarios against an 11,465 MW raw CAISO maximum; trained-policy effects remain unknown.</w:t>
       </w:r>
     </w:p>
     <w:p>
@@ -536,7 +588,7 @@
           <w:i w:val="0"/>
           <w:sz w:val="19"/>
         </w:rPr>
-        <w:t>The complete 8,917-step episode is one study billing cycle by default, so c is applied exactly once and the in-reward quantity matches the post-hoc metric. A shorter configured period is a different tariff with its own $/kW-period rate, not a monthly proxy. The telescoping identity is exact under the RL objective only when gamma = 1; the training entry points therefore select gamma = 1 whenever the term is enabled and reject a lower discount. The observation then includes Dᵢ,ₜ₋₁ for every site plus billing-period progress and the active-rate fraction, and a new period is reset before its first observation. Together these make the tariff state Markov and prevent actions from seeing a stale prior-period peak. Ψ is reported for every policy in Sec. VI-G but is DISABLED in the reward (c = 0) for all results in this paper, so the trained policies and their objective are unchanged.</w:t>
+        <w:t>The complete 8,928-step episode is one study billing cycle by default, so c is applied exactly once and the in-reward quantity matches the post-hoc metric. A shorter configured period is a different tariff with its own $/kW-period rate, not a monthly proxy. The telescoping identity is exact under the RL objective only when gamma = 1; the training entry points therefore select gamma = 1 whenever the term is enabled and reject a lower discount. The observation then includes Dᵢ,ₜ₋₁ for every site plus billing-period progress and the active-rate fraction, and a new period is reset before its first observation. Together these make the tariff state Markov and prevent actions from seeing a stale prior-period peak. The v2 primary protocol fixes c=0 in the reward and reports the standardized $15/kW-cycle charge as a secondary sensitivity for every policy. Demand-aware training is a separate extension.</w:t>
       </w:r>
     </w:p>
     <w:p>
@@ -554,6 +606,19 @@
     </w:p>
     <w:p>
       <w:pPr>
+        <w:spacing w:after="60"/>
+      </w:pPr>
+      <w:r>
+        <w:rPr>
+          <w:b w:val="0"/>
+          <w:i w:val="0"/>
+          <w:sz w:val="19"/>
+        </w:rPr>
+        <w:t>The reference charge is about $4.694M for Status Quo, large enough to dominate the controlled objective, and it is not a real Dutch or Singapore tariff. These are the reasons it is not primary.</w:t>
+      </w:r>
+    </w:p>
+    <w:p>
+      <w:pPr>
         <w:spacing w:after="40"/>
       </w:pPr>
       <w:r>
@@ -580,6 +645,32 @@
     </w:p>
     <w:p>
       <w:pPr>
+        <w:spacing w:after="60"/>
+      </w:pPr>
+      <w:r>
+        <w:rPr>
+          <w:b w:val="0"/>
+          <w:i w:val="0"/>
+          <w:sz w:val="19"/>
+        </w:rPr>
+        <w:t>Because the current action may release part of aᵢ,ₜ in the same step, aᵢ,ₜ is included explicitly in the pre-action observation alongside Q⁻, service demand, urgency, price, net demand, and site context. The decision process therefore observes every state variable that determines its same-step transition.</w:t>
+      </w:r>
+    </w:p>
+    <w:p>
+      <w:pPr>
+        <w:spacing w:after="60"/>
+      </w:pPr>
+      <w:r>
+        <w:rPr>
+          <w:b w:val="0"/>
+          <w:i w:val="0"/>
+          <w:sz w:val="19"/>
+        </w:rPr>
+        <w:t>The trace contains no job deadlines. Hᵢ is therefore an experimental control semantic, not a recovered SLO: μᵢ is fitted from observed duration and φ sets counterfactual slack. The primary model freezes φ=1 (H=2μ); robustness uses φ∈{0,2}, corresponding to H∈{μ,3μ}.</w:t>
+      </w:r>
+    </w:p>
+    <w:p>
+      <w:pPr>
         <w:spacing w:after="80"/>
         <w:jc w:val="center"/>
       </w:pPr>
@@ -640,7 +731,20 @@
           <w:i w:val="0"/>
           <w:sz w:val="19"/>
         </w:rPr>
-        <w:t>The agent outputs a ∈ [−3,3]³ᴺ, decoded as service routing fractions f = softmax(a₁:ₙ), drain rates δ = sigmoid(aₙ₊₁:₂ₙ), and batch placement h = softmax(a₂ₙ₊₁:₃ₙ) — batch work, having no latency SLO, may execute anywhere. Indices now distinguish origin i from execution site j. Service has first claim on destination capacity; batch runs in the remainder:</w:t>
+        <w:t>The agent outputs a ∈ [−3,3]³ᴺ, decoded as service routing fractions f = softmax(a₁:ₙ), drain rates δ = sigmoid(aₙ₊₁:₂ₙ), and batch placement h = softmax(a₂ₙ₊₁:₃ₙ) — batch work, having no latency SLO, may execute anywhere. Indices now distinguish origin i from execution site j. Service has first claim on each unit-capacity proxy; batch runs in the remainder:</w:t>
+      </w:r>
+    </w:p>
+    <w:p>
+      <w:pPr>
+        <w:spacing w:after="60"/>
+      </w:pPr>
+      <w:r>
+        <w:rPr>
+          <w:b w:val="0"/>
+          <w:i w:val="0"/>
+          <w:sz w:val="19"/>
+        </w:rPr>
+        <w:t>The primary controlled experiment assumes both service and batch are freely routable among all four slots, including intercontinental Global routing. Latency, data residency, and movement cost are not modeled. This is an explicit optimistic assumption, not an operational deployment claim.</w:t>
       </w:r>
     </w:p>
     <w:p>
@@ -692,7 +796,7 @@
           <w:i w:val="0"/>
           <w:sz w:val="19"/>
         </w:rPr>
-        <w:t>With the tariff disabled, backlog weight λ_b = 25 and expiry weight λ_x = 250 preserve the historical objective. Enabling a demand charge also enables an economic guard: both weights are raised above a conservative bound on the largest one-step energy + grid-penalty + demand-charge saving obtainable by dropping one normalized CPU unit (with a 5% margin). This prevents the tariff from making unserved work economically optimal. Default-off χₜ=λ_xΣᵢXᵢ,ₜ. Demand-enabled runs use the exact dense potential χₜ=λ_xΣᵢ(aᵢ,ₜ−qᵢ,ₜ); with γ=1, Σₜχₜ=λ_x(expired+terminal-pool work). This credits completion immediately while preserving the finite-horizon objective. Raw dollar costs remain in logs and reports, while the RL reward is multiplied by 10⁻⁴ for numerical conditioning. Capacity is a hard serving constraint in Eq. (9), so no capacity-violation term belongs in the mathematical objective (the implementation retains a zero-valued diagnostic guard). The zero-expiry audit is an observed result, not a hard constraint. The demand-smoothing metric reported alongside cost is fleet load factor LF = mean(g)/max(g).</w:t>
+        <w:t>With the tariff disabled, backlog weight λ_b = 25 and expiry weight λ_x = 250 preserve the historical objective. Enabling a demand charge also enables an economic guard: both weights are raised above a conservative bound on the largest one-step energy + grid-penalty + demand-charge saving obtainable by dropping one normalized CPU unit (with a 5% margin). This prevents the tariff from making unserved work economically optimal. Default-off χₜ=λ_xΣᵢXᵢ,ₜ. Demand-enabled runs use the exact dense potential χₜ=λ_xΣᵢ(aᵢ,ₜ−qᵢ,ₜ); with γ=1, Σₜχₜ=λ_x(expired+terminal-pool work). This credits completion immediately while preserving the finite-horizon objective. Raw dollar costs remain in logs and reports, while the RL reward is multiplied by 10⁻⁴ for numerical conditioning. Capacity is a hard serving constraint in Eq. (9), so no capacity-violation term belongs in the mathematical objective (the implementation retains a zero-valued diagnostic guard). The zero-expiry audit is an observed result, not a hard constraint. The demand-smoothing metric reported alongside cost is fleet load factor LF = mean(g)/max(g); independent physical ramp KPIs are reported separately and are not reward terms.</w:t>
       </w:r>
     </w:p>
     <w:p>
@@ -1357,7 +1461,7 @@
           <w:i w:val="0"/>
           <w:sz w:val="19"/>
         </w:rPr>
-        <w:t>subject to, for all i,j,t: the power model (1)–(2); the serving and origin-completion rules (9) with uⱼ,ₜ≤κⱼ; routing and placement simplexes Σⱼfⱼ,ₜ=Σⱼhⱼ,ₜ=1 with f,h≥0 and δ∈[0,1]; service conservation Bⱼ,ₜ=Bⱼ,ₜ₋₁+fⱼ,ₜDₜ−σⱼ,ₜ; and the two-phase batch conservation (8). At each deadline boundary, every due arrival is either represented in cumulative origin completion q or charged once as expiry X. Thus deadlines are soft penalties in the environment, not hard constraints; the reported policies happen to achieve X=0. In words: route service and schedule batch to minimize energy, grid contribution, the actual demand tariff, backlog, and expiry cost while respecting capacity.</w:t>
+        <w:t>J contains no direct ramp-rate penalty. Any ramp improvement is therefore an independently measured outcome rather than a consequence built into the training objective.</w:t>
       </w:r>
     </w:p>
     <w:p>
@@ -1370,7 +1474,7 @@
           <w:i w:val="0"/>
           <w:sz w:val="19"/>
         </w:rPr>
-        <w:t>Eq. (11) is an offline, full-information statement; the deployed controller is causal (it cannot observe future prices or demand). We therefore solve it with model-free RL. PPO maximizes 𝔼[Σₜγᵗrₜ]; when γ&lt;1 this is not identical to undiscounted J, so older default-off results are evaluated on J but were trained with γ=0.99. Demand-charge-enabled runs set γ=1, aligning training and evaluation. The clairvoyant convex QP uses the same backlog and soft-expiry accounting, with fluid actions and perfect foresight; these relaxations make its optimum a lower bound on the evaluated J (Sec. VI-F).</w:t>
+        <w:t>subject to, for all i,j,t: the power model (1)–(2); the serving and origin-completion rules (9) with uⱼ,ₜ≤κⱼ; routing and placement simplexes Σⱼfⱼ,ₜ=Σⱼhⱼ,ₜ=1 with f,h≥0 and δ∈[0,1]; service conservation Bⱼ,ₜ=Bⱼ,ₜ₋₁+fⱼ,ₜDₜ−σⱼ,ₜ; and the two-phase batch conservation (8). At each deadline boundary, every due arrival is either represented in cumulative origin completion q or charged once as expiry X. Thus deadlines are soft penalties in the environment, not hard constraints; the reported policies happen to achieve X=0. In words: route service and schedule batch to minimize energy, grid contribution, the actual demand tariff, backlog, and expiry cost while respecting capacity.</w:t>
       </w:r>
     </w:p>
     <w:p>
@@ -1383,7 +1487,20 @@
           <w:i w:val="0"/>
           <w:sz w:val="19"/>
         </w:rPr>
-        <w:t>The formulation follows CICS's aggregate flexible/inflexible load-shaping problem [3], retargeted from carbon to grid net-demand and electricity cost, with the cost-minimization-over-distributed-DCs structure of geographic load balancing [23]–[25], a linear idle+slope power model [14], [17], a peak-contribution term in the peak-shaving and demand-response tradition [9], [13] — though Φ is a per-interval quadratic shadow price, not a demand charge in the tariff sense; the tariff term Ψ is modeled separately (Eq. 5) and reported in Sec. VI-G — and aggregate batch-with-deadline dynamics [4], [9].</w:t>
+        <w:t>Eq. (11) is an offline, full-information statement; the deployed controller is causal (it cannot observe future prices or demand). We therefore solve it with model-free RL. PPO maximizes 𝔼[Σₜγᵗrₜ]; when γ&lt;1 this is not identical to undiscounted J, so older default-off results are evaluated on J but were trained with γ=0.99. Demand-charge-enabled runs set γ=1, aligning training and evaluation. The clairvoyant convex QP uses the same backlog and soft-expiry accounting, with fluid actions and perfect foresight; these relaxations make its optimum a lower bound on the evaluated J (Sec. IV-D).</w:t>
+      </w:r>
+    </w:p>
+    <w:p>
+      <w:pPr>
+        <w:spacing w:after="60"/>
+      </w:pPr>
+      <w:r>
+        <w:rPr>
+          <w:b w:val="0"/>
+          <w:i w:val="0"/>
+          <w:sz w:val="19"/>
+        </w:rPr>
+        <w:t>The formulation follows CICS's aggregate flexible/inflexible load-shaping problem [3], retargeted from carbon to grid net-demand and electricity cost, with the cost-minimization-over-distributed-DCs structure of geographic load balancing [23]–[25], a linear idle+slope power model [14], [17], a peak-contribution term in the peak-shaving and demand-response tradition [9], [13] — though Φ is a per-interval quadratic shadow price, not a demand charge in the tariff sense; the tariff term Ψ is modeled and reported separately (Eq. 5) — and aggregate batch-with-deadline dynamics [4], [9].</w:t>
       </w:r>
     </w:p>
     <w:p>
@@ -1423,7 +1540,7 @@
           <w:i w:val="0"/>
           <w:sz w:val="19"/>
         </w:rPr>
-        <w:t>Cells a–d serve as four proxy DCs. Cell locations in the trace are anonymized; the geographic assignment is a modeling choice (US scenario: a CAISO-exposed Western DC + MISO/Southern/Duke territories; Global scenario: US-West/US-Central/NL/Singapore). Tirmazi documents considerable inter-cell workload variation but no geography. The normalized curve provides the demand shape; R = 100 MW sets hyperscale magnitude (a real cell is ~3–5 MW, invisible to a regional grid). Sensitivity to R is future work.</w:t>
+        <w:t>Cells a–d serve as four proxy DCs. Cell locations in the trace are anonymized; assigning them to market slots is a modeling choice. Energy-model v2 uses Pacific/Mountain/Central/Eastern slots for the US experiment and Pacific/Central/Amsterdam/Singapore slots for the Global experiment, all driven by the same shifted CAISO archetype. Tirmazi documents considerable inter-cell workload variation but no geography. The normalized curve provides the own-cell utilization shape; κ = 1 maps every shape to an equal proxy destination; and R = 100 MW sets hyperscale magnitude (a real cell is ~3–5 MW, invisible to a regional grid). Raw machine totals are metadata, not a second capacity normalization. Sensitivity to R is future work.</w:t>
       </w:r>
     </w:p>
     <w:p>
@@ -1449,7 +1566,376 @@
           <w:i w:val="0"/>
           <w:sz w:val="19"/>
         </w:rPr>
-        <w:t>The service/batch split is measured, not modeled: instance_usage is joined to collection priority and aggregated per 5-minute bucket into service (SLO tiers) and batch (no-SLO tiers, priority ≤ 115) curves with v + a = w to machine precision (Fig. 2). Measured deferrable usage shares are 16.6% (a), 15.7% (b), 22.3% (c), 26.4% (d) — consistent with the ~20%-of-capacity best-effort average reported for the trace [1]. Request-weighted proxies (job counts × requested CPU) suggest 63–85%, an overestimate of 3–5×, consistent with Borg's over-allocation of best-effort tiers. Requests measure intent; usage measures schedulable reality.</w:t>
+        <w:t>The primary demand path starts in instance_usage, not the job table and not a generator. For each cell, we join collection priority, keep top-level instances with at least a five-minute usage record, group average CPU usage into 300-second buckets, and divide by measured cell CPU capacity. Priority ≤115 is no-SLO batch; all higher priorities are service. We then define w = normalized total usage, a = normalized batch usage, and v = w − a. Consequently v + a = w at every interval to machine precision (Fig. 2).</w:t>
+      </w:r>
+    </w:p>
+    <w:p>
+      <w:pPr>
+        <w:spacing w:after="60"/>
+      </w:pPr>
+      <w:r>
+        <w:rPr>
+          <w:b w:val="0"/>
+          <w:i w:val="0"/>
+          <w:sz w:val="19"/>
+        </w:rPr>
+        <w:t>Each cell produces 8,929 ordinal workload rows. The v2 energy calendar has 8,928 rows, so the loader removes the one extra workload boundary row and uses a complete 744-hour control episode. The source's discarded absolute timestamp is not reconstructed: workload timestep zero is explicitly anchored to May 1, 2025 00:00 PDT as a cross-year counterfactual.</w:t>
+      </w:r>
+    </w:p>
+    <w:p>
+      <w:pPr>
+        <w:spacing w:after="60"/>
+      </w:pPr>
+      <w:r>
+        <w:rPr>
+          <w:b w:val="0"/>
+          <w:i w:val="0"/>
+          <w:sz w:val="19"/>
+        </w:rPr>
+        <w:t>The source curves already equal measured usage divided by each cell's own CPU capacity. Because the modeled sites are equal 100 MW proxies, the loader sets destination capacity to 1.0 for every cell. Thus a source value of 0.70 remains 70% utilization after mapping; machine-count differences do not double-normalize it.</w:t>
+      </w:r>
+    </w:p>
+    <w:p>
+      <w:pPr>
+        <w:jc w:val="center"/>
+      </w:pPr>
+      <w:r>
+        <w:rPr>
+          <w:b/>
+          <w:sz w:val="16"/>
+        </w:rPr>
+        <w:t>MEASURED NO-SLO SHARE OF AGGREGATE CPU USAGE</w:t>
+      </w:r>
+    </w:p>
+    <w:tbl>
+      <w:tblPr>
+        <w:tblStyle w:val="LightGrid-Accent1"/>
+        <w:tblW w:type="auto" w:w="0"/>
+        <w:tblLook w:firstColumn="1" w:firstRow="1" w:lastColumn="0" w:lastRow="0" w:noHBand="0" w:noVBand="1" w:val="04A0"/>
+      </w:tblPr>
+      <w:tblGrid>
+        <w:gridCol w:w="2520"/>
+        <w:gridCol w:w="2520"/>
+        <w:gridCol w:w="2520"/>
+        <w:gridCol w:w="2520"/>
+      </w:tblGrid>
+      <w:tr>
+        <w:tc>
+          <w:tcPr>
+            <w:tcW w:type="dxa" w:w="792"/>
+          </w:tcPr>
+          <w:p>
+            <w:r>
+              <w:rPr>
+                <w:b/>
+                <w:sz w:val="16"/>
+              </w:rPr>
+              <w:t>Cell</w:t>
+            </w:r>
+          </w:p>
+        </w:tc>
+        <w:tc>
+          <w:tcPr>
+            <w:tcW w:type="dxa" w:w="1368"/>
+          </w:tcPr>
+          <w:p>
+            <w:r>
+              <w:rPr>
+                <w:b/>
+                <w:sz w:val="16"/>
+              </w:rPr>
+              <w:t>Batch share</w:t>
+            </w:r>
+          </w:p>
+        </w:tc>
+        <w:tc>
+          <w:tcPr>
+            <w:tcW w:type="dxa" w:w="792"/>
+          </w:tcPr>
+          <w:p>
+            <w:r>
+              <w:rPr>
+                <w:b/>
+                <w:sz w:val="16"/>
+              </w:rPr>
+              <w:t>Cell</w:t>
+            </w:r>
+          </w:p>
+        </w:tc>
+        <w:tc>
+          <w:tcPr>
+            <w:tcW w:type="dxa" w:w="1368"/>
+          </w:tcPr>
+          <w:p>
+            <w:r>
+              <w:rPr>
+                <w:b/>
+                <w:sz w:val="16"/>
+              </w:rPr>
+              <w:t>Batch share</w:t>
+            </w:r>
+          </w:p>
+        </w:tc>
+      </w:tr>
+      <w:tr>
+        <w:tc>
+          <w:tcPr>
+            <w:tcW w:type="dxa" w:w="792"/>
+          </w:tcPr>
+          <w:p>
+            <w:r>
+              <w:rPr>
+                <w:sz w:val="16"/>
+              </w:rPr>
+              <w:t>a</w:t>
+            </w:r>
+          </w:p>
+        </w:tc>
+        <w:tc>
+          <w:tcPr>
+            <w:tcW w:type="dxa" w:w="1368"/>
+          </w:tcPr>
+          <w:p>
+            <w:r>
+              <w:rPr>
+                <w:sz w:val="16"/>
+              </w:rPr>
+              <w:t>16.6%</w:t>
+            </w:r>
+          </w:p>
+        </w:tc>
+        <w:tc>
+          <w:tcPr>
+            <w:tcW w:type="dxa" w:w="792"/>
+          </w:tcPr>
+          <w:p>
+            <w:r>
+              <w:rPr>
+                <w:sz w:val="16"/>
+              </w:rPr>
+              <w:t>e</w:t>
+            </w:r>
+          </w:p>
+        </w:tc>
+        <w:tc>
+          <w:tcPr>
+            <w:tcW w:type="dxa" w:w="1368"/>
+          </w:tcPr>
+          <w:p>
+            <w:r>
+              <w:rPr>
+                <w:sz w:val="16"/>
+              </w:rPr>
+              <w:t>23.5%</w:t>
+            </w:r>
+          </w:p>
+        </w:tc>
+      </w:tr>
+      <w:tr>
+        <w:tc>
+          <w:tcPr>
+            <w:tcW w:type="dxa" w:w="792"/>
+          </w:tcPr>
+          <w:p>
+            <w:r>
+              <w:rPr>
+                <w:sz w:val="16"/>
+              </w:rPr>
+              <w:t>b</w:t>
+            </w:r>
+          </w:p>
+        </w:tc>
+        <w:tc>
+          <w:tcPr>
+            <w:tcW w:type="dxa" w:w="1368"/>
+          </w:tcPr>
+          <w:p>
+            <w:r>
+              <w:rPr>
+                <w:sz w:val="16"/>
+              </w:rPr>
+              <w:t>15.7%</w:t>
+            </w:r>
+          </w:p>
+        </w:tc>
+        <w:tc>
+          <w:tcPr>
+            <w:tcW w:type="dxa" w:w="792"/>
+          </w:tcPr>
+          <w:p>
+            <w:r>
+              <w:rPr>
+                <w:sz w:val="16"/>
+              </w:rPr>
+              <w:t>f</w:t>
+            </w:r>
+          </w:p>
+        </w:tc>
+        <w:tc>
+          <w:tcPr>
+            <w:tcW w:type="dxa" w:w="1368"/>
+          </w:tcPr>
+          <w:p>
+            <w:r>
+              <w:rPr>
+                <w:sz w:val="16"/>
+              </w:rPr>
+              <w:t>8.4%</w:t>
+            </w:r>
+          </w:p>
+        </w:tc>
+      </w:tr>
+      <w:tr>
+        <w:tc>
+          <w:tcPr>
+            <w:tcW w:type="dxa" w:w="792"/>
+          </w:tcPr>
+          <w:p>
+            <w:r>
+              <w:rPr>
+                <w:sz w:val="16"/>
+              </w:rPr>
+              <w:t>c</w:t>
+            </w:r>
+          </w:p>
+        </w:tc>
+        <w:tc>
+          <w:tcPr>
+            <w:tcW w:type="dxa" w:w="1368"/>
+          </w:tcPr>
+          <w:p>
+            <w:r>
+              <w:rPr>
+                <w:sz w:val="16"/>
+              </w:rPr>
+              <w:t>22.3%</w:t>
+            </w:r>
+          </w:p>
+        </w:tc>
+        <w:tc>
+          <w:tcPr>
+            <w:tcW w:type="dxa" w:w="792"/>
+          </w:tcPr>
+          <w:p>
+            <w:r>
+              <w:rPr>
+                <w:sz w:val="16"/>
+              </w:rPr>
+              <w:t>g</w:t>
+            </w:r>
+          </w:p>
+        </w:tc>
+        <w:tc>
+          <w:tcPr>
+            <w:tcW w:type="dxa" w:w="1368"/>
+          </w:tcPr>
+          <w:p>
+            <w:r>
+              <w:rPr>
+                <w:sz w:val="16"/>
+              </w:rPr>
+              <w:t>37.7%</w:t>
+            </w:r>
+          </w:p>
+        </w:tc>
+      </w:tr>
+      <w:tr>
+        <w:tc>
+          <w:tcPr>
+            <w:tcW w:type="dxa" w:w="792"/>
+          </w:tcPr>
+          <w:p>
+            <w:r>
+              <w:rPr>
+                <w:sz w:val="16"/>
+              </w:rPr>
+              <w:t>d</w:t>
+            </w:r>
+          </w:p>
+        </w:tc>
+        <w:tc>
+          <w:tcPr>
+            <w:tcW w:type="dxa" w:w="1368"/>
+          </w:tcPr>
+          <w:p>
+            <w:r>
+              <w:rPr>
+                <w:sz w:val="16"/>
+              </w:rPr>
+              <w:t>26.4%</w:t>
+            </w:r>
+          </w:p>
+        </w:tc>
+        <w:tc>
+          <w:tcPr>
+            <w:tcW w:type="dxa" w:w="792"/>
+          </w:tcPr>
+          <w:p>
+            <w:r>
+              <w:rPr>
+                <w:sz w:val="16"/>
+              </w:rPr>
+              <w:t>h</w:t>
+            </w:r>
+          </w:p>
+        </w:tc>
+        <w:tc>
+          <w:tcPr>
+            <w:tcW w:type="dxa" w:w="1368"/>
+          </w:tcPr>
+          <w:p>
+            <w:r>
+              <w:rPr>
+                <w:sz w:val="16"/>
+              </w:rPr>
+              <w:t>29.1%</w:t>
+            </w:r>
+          </w:p>
+        </w:tc>
+      </w:tr>
+    </w:tbl>
+    <w:p>
+      <w:pPr>
+        <w:spacing w:after="40"/>
+      </w:pPr>
+    </w:p>
+    <w:p>
+      <w:pPr>
+        <w:spacing w:after="60"/>
+      </w:pPr>
+      <w:r>
+        <w:rPr>
+          <w:b w:val="0"/>
+          <w:i w:val="0"/>
+          <w:sz w:val="19"/>
+        </w:rPr>
+        <w:t>At runtime, v(t) is the must-serve input and a(t) is the measured arrival placed into its origin queue. The four-site PPO action routes pooled service, chooses each origin's release fraction, and places released batch across destinations. Service consumes capacity first; only completed batch is removed earliest-deadline-first, while capacity-blocked work keeps its original deadline. The full-month batch_fraction reported to the policy is context only; it never replaces the measured time-varying a(t) curve.</w:t>
+      </w:r>
+    </w:p>
+    <w:p>
+      <w:pPr>
+        <w:spacing w:after="60"/>
+      </w:pPr>
+      <w:r>
+        <w:rPr>
+          <w:b w:val="0"/>
+          <w:i w:val="0"/>
+          <w:sz w:val="19"/>
+        </w:rPr>
+        <w:t>The fitted job-distribution JSON supplies mean duration for the experimental deadline (and a memory ratio when memory modeling is enabled), but the BatchArrivalGenerator is not constructed when tier_curves is present. It therefore has no role in primary v2 training or scoring. Its only remaining purpose is optional counterfactual sensitivity to batch volume or arrival shape; it does not validate the measured trace.</w:t>
+      </w:r>
+    </w:p>
+    <w:p>
+      <w:pPr>
+        <w:spacing w:after="60"/>
+      </w:pPr>
+      <w:r>
+        <w:rPr>
+          <w:b w:val="0"/>
+          <w:i w:val="0"/>
+          <w:sz w:val="19"/>
+        </w:rPr>
+        <w:t>The frozen v2 evaluation will be symmetric and out of fold: train on a–d and score deterministic policies on e–h, then train on e–h and score on a–d, with ten seeds per fold/configuration. Training-only randomization may permute compute bundles and interpolate measured power parameters using only the training fold. Scoring uses the untouched held-out curves, the same v2 energy slots, Status Quo/Round Robin/Drain Immediately baselines, and the clairvoyant QP diagnostic. Reports include objective components, service completion, batch completion, expiry, and terminal backlog/pool so savings cannot be obtained by dropping work.</w:t>
       </w:r>
     </w:p>
     <w:p>
@@ -1526,7 +2012,7 @@
           <w:i w:val="0"/>
           <w:sz w:val="19"/>
         </w:rPr>
-        <w:t>We adopt the standard linear idle+slope server model (Eq. 1) — the form used throughout the data-center power literature [14], [17] — and fix its two constants per cell from data rather than from a single textbook value. Joining hourly PowerData2019 measured power (whose ‘power utilization’ is defined exactly as our normalization: actual power over theoretical peak [2]) with aggregate CPU over 2,980 (cell, hour) samples, least-squares gives the per-cell idle and slope of Table II. The calibration is literature-consistent: the fitted idle draw is 0.40–0.61 of each cell's peak, consistent with the substantial idle fractions reported in server-power measurements and surveys [14], [17], so the constants are credible without appeal to goodness-of-fit. We keep PER-CELL constants (not one pooled value) because the cells span a meaningful proportionality range — cell d (idle 0.38, slope 0.57) is far more energy-proportional than cell a (0.53, 0.34) — and that BETWEEN-cell spread is precisely the routing signal the agent exploits (slope arbitrage, Sec. VI-B); a single literature constant would erase it. This mirrors CICS's choice of per-cluster power models [3]. (R² is reported in Table II as a diagnostic only — 0.43 pooled vs 0.75–0.80 per cell, confirming the pooled residual is between-cell heterogeneity rather than noise — but it is not the model's justification. Using one calibrated model gives a controlled comparison, but errors in marginal slopes could still change routing rankings; the held-out-cell and domain-randomization tests probe that sensitivity.)</w:t>
+        <w:t>We adopt the standard linear idle+slope server model (Eq. 1) — the form used throughout the data-center power literature [14], [17] — and fix its two constants per cell from data rather than from a single textbook value. Joining hourly PowerData2019 measured power (whose ‘power utilization’ is defined exactly as our normalization: actual power over theoretical peak [2]) with aggregate CPU over 2,980 (cell, hour) samples, least-squares gives the per-cell idle and slope of Table II. The calibration is literature-consistent: the fitted idle draw is 0.40–0.61 of each cell's peak, consistent with the substantial idle fractions reported in server-power measurements and surveys [14], [17], so the constants are credible without appeal to goodness-of-fit. We keep PER-CELL constants (not one pooled value) because the cells span a meaningful proportionality range — cell d (idle 0.38, slope 0.57) is far more energy-proportional than cell a (0.53, 0.34) — and that BETWEEN-cell spread is a routing signal available to the agent. Preferring lower marginal slope when idle power is sunk is a direct consequence of this model, not a novel RL mechanism; a single literature constant would erase it. This mirrors CICS's choice of per-cluster power models [3]. (R² is reported in Table II as a diagnostic only — 0.43 pooled vs 0.75–0.80 per cell, confirming the pooled residual is between-cell heterogeneity rather than noise — but it is not the model's justification. Using one calibrated model gives a controlled comparison, but errors in marginal slopes could still change routing rankings; the held-out-cell and domain-randomization tests probe that sensitivity.)</w:t>
       </w:r>
     </w:p>
     <w:p>
@@ -1940,6 +2426,17 @@
     </w:p>
     <w:p>
       <w:pPr>
+        <w:sectPr>
+          <w:type w:val="continuous"/>
+          <w:pgSz w:w="12240" w:h="15840"/>
+          <w:pgMar w:top="1080" w:right="1080" w:bottom="1080" w:left="1080" w:header="720" w:footer="720" w:gutter="0"/>
+          <w:cols w:space="240" w:num="2"/>
+          <w:docGrid w:linePitch="360"/>
+        </w:sectPr>
+      </w:pPr>
+    </w:p>
+    <w:p>
+      <w:pPr>
         <w:spacing w:after="40"/>
       </w:pPr>
       <w:r>
@@ -1948,7 +2445,33 @@
           <w:i/>
           <w:sz w:val="20"/>
         </w:rPr>
-        <w:t>D. Market-data provenance (prices and net demand)</w:t>
+        <w:t>D. Energy Model v2 Review Gate — May 2025</w:t>
+      </w:r>
+    </w:p>
+    <w:p>
+      <w:pPr>
+        <w:spacing w:after="60"/>
+      </w:pPr>
+      <w:r>
+        <w:rPr>
+          <w:b/>
+          <w:i w:val="0"/>
+          <w:sz w:val="19"/>
+        </w:rPr>
+        <w:t>No PPO retraining has been launched. This section validates the energy system and theoretical headroom first.</w:t>
+      </w:r>
+    </w:p>
+    <w:p>
+      <w:pPr>
+        <w:spacing w:after="40"/>
+      </w:pPr>
+      <w:r>
+        <w:rPr>
+          <w:b/>
+          <w:i/>
+          <w:sz w:val="20"/>
+        </w:rPr>
+        <w:t>Experimental energy model</w:t>
       </w:r>
     </w:p>
     <w:p>
@@ -1961,21 +2484,20 @@
           <w:i w:val="0"/>
           <w:sz w:val="19"/>
         </w:rPr>
-        <w:t>We state the price and net-demand provenance precisely, since it bounds the claims. NET DEMAND is real: hourly EIA-930 series (demand minus utility-scale wind+solar) for the assigned US balancing authorities, normalized to [0,1] by each region's window peak; the Global scenario's EU/Singapore net demand is synthesized where EIA-930 does not apply. PRICES, by contrast, are DOCUMENTED SYNTHETIC: a calibrated diurnal model anchored to plausible May-2019 regional wholesale averages, NOT real locational marginal prices. Real hourly LMP is not uniformly obtainable for this footprint — two US scenario regions (Southern Co./GA, Duke/SC) are vertically integrated utilities with no public wholesale market, and the EIA API exposes no hourly price route — so a fully-real price series is not currently available. This is a known limitation we intend to resolve (real CAISO/MISO LMP plus documented proxies for the non-ISO territories) in future work. Two points bound its interpretation. Every policy sees the same series, which makes the experiment controlled, but bias does NOT algebraically cancel because policies respond differently; rankings may change under real prices. The modeled price DYNAMICS the agent exploits (diurnal spread, cross-region differences) are structurally realistic even if the absolute levels are modeled. The generalization study (Sec. VI-H) additionally shifts US net demand to EIA-930 May-2024 data while updating documented non-US approximations.</w:t>
+        <w:t>The primary model is one co-timestamped, real CAISO archetype: CAISO Today's Outlook native five-minute net demand; CAISO OASIS NP15 hourly day-ahead total LMP expanded stepwise to five minutes; negative prices preserved; one Pacific civil-time calendar with IANA/DST conversion; price and net demand shifted together across market slots; and no regional price re-averaging.</w:t>
       </w:r>
     </w:p>
     <w:p>
       <w:pPr>
-        <w:spacing w:after="80"/>
-        <w:jc w:val="center"/>
+        <w:spacing w:after="60"/>
       </w:pPr>
       <w:r>
         <w:rPr>
-          <w:b/>
+          <w:b w:val="0"/>
           <w:i w:val="0"/>
-          <w:sz w:val="21"/>
+          <w:sz w:val="19"/>
         </w:rPr>
-        <w:t>V. EXPERIMENTAL SETUP</w:t>
+        <w:t>US slots are Pacific, Mountain, Central, and Eastern. Global slots are Pacific, Central, Amsterdam, and Singapore. Google's May-2019 workload shapes are anchored to the May-2025 energy calendar as an explicit cross-year counterfactual.</w:t>
       </w:r>
     </w:p>
     <w:p>
@@ -1988,7 +2510,7 @@
           <w:i/>
           <w:sz w:val="20"/>
         </w:rPr>
-        <w:t>A. Agents and baselines</w:t>
+        <w:t>Finite-window boundary handling</w:t>
       </w:r>
     </w:p>
     <w:p>
@@ -2001,7 +2523,20 @@
           <w:i w:val="0"/>
           <w:sz w:val="19"/>
         </w:rPr>
-        <w:t>PPO (Stable-Baselines3, MLP 128×128, lr 3e-4, 500k steps) acts in the continuous 3N-dimensional space. Its observation includes per-DC dynamic state (demand, price, net demand, pool/backlog) AND static site context (per-DC idle power, slope, capacity, deferrable fraction) — the latter added so that per-site heterogeneity is exploitable as a function of observed parameters rather than memorized by slot (Sec. VI-H). Two DQN variants share hyperparameters (MLP 256×256, replay 100k, target update 1k): a 759-action routing grid, and a 48-action compact flattened index inspired by CFWS's encoding philosophy, decoding to (source DC, destination DC, drain level) [6]. It is not a CFWS reproduction. Nine heuristics span the policy space, including Round Robin, price-chasing and slack-grid concentrators, defer-to-trough rules, a GreenSlot-style Trough-Slot Lookahead foresighted heuristic with privileged 3-hour net-demand foresight [10], and the no-optimization Status Quo (serve locally, immediately) — the counterfactual of a CICS-style layer switched off.</w:t>
+        <w:t>The time-zone transformation is continuous rather than circular. Every slot contains exactly 8,928 five-minute intervals (744 hours), but shifted slots can use adjacent real CAISO hours at the month boundary instead of wrapping May 31 back to May 1. Singapore is 15 hours ahead of Pacific time, so its reference window replaces CAISO's first 15 hours of May (mean $21.54/MWh) with the first 15 hours of June (mean $29.16/MWh). Its monthly mean is therefore $26.09/MWh instead of Pacific's $25.93/MWh: a $0.154/MWh (0.59%) boundary effect, not extra simulated time or a Singapore price premium.</w:t>
+      </w:r>
+    </w:p>
+    <w:p>
+      <w:pPr>
+        <w:spacing w:after="60"/>
+      </w:pPr>
+      <w:r>
+        <w:rPr>
+          <w:b w:val="0"/>
+          <w:i w:val="0"/>
+          <w:sz w:val="19"/>
+        </w:rPr>
+        <w:t>The continuous shift is retained because a circular within-May shift would create an artificial May 31-to-May 1 discontinuity. Baselines, QP, and future learned policies are compared on the same slot data within each scenario; regional monthly means are not forced to match.</w:t>
       </w:r>
     </w:p>
     <w:p>
@@ -2014,60 +2549,7 @@
           <w:i/>
           <w:sz w:val="20"/>
         </w:rPr>
-        <w:t>B. Configurations and protocol</w:t>
-      </w:r>
-    </w:p>
-    <w:p>
-      <w:pPr>
-        <w:spacing w:after="60"/>
-      </w:pPr>
-      <w:r>
-        <w:rPr>
-          <w:b w:val="0"/>
-          <w:i w:val="0"/>
-          <w:sz w:val="19"/>
-        </w:rPr>
-        <w:t>{US, Global} × {spatial-only, batch = spatial + temporal}. Each (algorithm, configuration) is trained with FIVE seeds; we report mean ± std and paired PPO-vs-best-DQN statistics (sign test, Wilcoxon, bootstrap CI). All policies are then evaluated deterministically on the identical full-trace episode.</w:t>
-      </w:r>
-    </w:p>
-    <w:p>
-      <w:pPr>
-        <w:spacing w:after="40"/>
-      </w:pPr>
-      <w:r>
-        <w:rPr>
-          <w:b/>
-          <w:i/>
-          <w:sz w:val="20"/>
-        </w:rPr>
-        <w:t>C. Validation invariant</w:t>
-      </w:r>
-    </w:p>
-    <w:p>
-      <w:pPr>
-        <w:spacing w:after="60"/>
-      </w:pPr>
-      <w:r>
-        <w:rPr>
-          <w:b w:val="0"/>
-          <w:i w:val="0"/>
-          <w:sz w:val="19"/>
-        </w:rPr>
-        <w:t>By construction service + batch = measured demand, so a serve-everything-now policy must reproduce the spatial-only run exactly. This holds to the dollar: Status Quo scores $9,847,536 in both US modes with zero expiry — the batch machinery is demand-neutral, and any batch-mode difference between policies is scheduling, not artifact. This invariant caught two of the three modeling errors of Sec. VII.</w:t>
-      </w:r>
-    </w:p>
-    <w:p>
-      <w:pPr>
-        <w:spacing w:after="80"/>
-        <w:jc w:val="center"/>
-      </w:pPr>
-      <w:r>
-        <w:rPr>
-          <w:b/>
-          <w:i w:val="0"/>
-          <w:sz w:val="21"/>
-        </w:rPr>
-        <w:t>VI. RESULTS</w:t>
+        <w:t>Reference diagnostics</w:t>
       </w:r>
     </w:p>
     <w:p>
@@ -2079,902 +2561,7 @@
           <w:b/>
           <w:sz w:val="16"/>
         </w:rPr>
-        <w:t>TABLE I. EPISODE COST (M$), 5-SEED MEAN. ΔSQ = PPO SAVINGS VS STATUS QUO; QP = CLAIRVOYANT OPTIMUM; gap = PPO ABOVE QP.</w:t>
-      </w:r>
-    </w:p>
-    <w:tbl>
-      <w:tblPr>
-        <w:tblStyle w:val="LightGrid-Accent1"/>
-        <w:tblW w:type="auto" w:w="0"/>
-        <w:tblLook w:firstColumn="1" w:firstRow="1" w:lastColumn="0" w:lastRow="0" w:noHBand="0" w:noVBand="1" w:val="04A0"/>
-      </w:tblPr>
-      <w:tblGrid>
-        <w:gridCol w:w="1260"/>
-        <w:gridCol w:w="1260"/>
-        <w:gridCol w:w="1260"/>
-        <w:gridCol w:w="1260"/>
-        <w:gridCol w:w="1260"/>
-        <w:gridCol w:w="1260"/>
-        <w:gridCol w:w="1260"/>
-        <w:gridCol w:w="1260"/>
-      </w:tblGrid>
-      <w:tr>
-        <w:tc>
-          <w:tcPr>
-            <w:tcW w:type="dxa" w:w="1325"/>
-          </w:tcPr>
-          <w:p>
-            <w:r>
-              <w:rPr>
-                <w:b/>
-                <w:sz w:val="16"/>
-              </w:rPr>
-              <w:t>Config</w:t>
-            </w:r>
-          </w:p>
-        </w:tc>
-        <w:tc>
-          <w:tcPr>
-            <w:tcW w:type="dxa" w:w="720"/>
-          </w:tcPr>
-          <w:p>
-            <w:r>
-              <w:rPr>
-                <w:b/>
-                <w:sz w:val="16"/>
-              </w:rPr>
-              <w:t>SQ</w:t>
-            </w:r>
-          </w:p>
-        </w:tc>
-        <w:tc>
-          <w:tcPr>
-            <w:tcW w:type="dxa" w:w="792"/>
-          </w:tcPr>
-          <w:p>
-            <w:r>
-              <w:rPr>
-                <w:b/>
-                <w:sz w:val="16"/>
-              </w:rPr>
-              <w:t>Trough</w:t>
-            </w:r>
-          </w:p>
-        </w:tc>
-        <w:tc>
-          <w:tcPr>
-            <w:tcW w:type="dxa" w:w="720"/>
-          </w:tcPr>
-          <w:p>
-            <w:r>
-              <w:rPr>
-                <w:b/>
-                <w:sz w:val="16"/>
-              </w:rPr>
-              <w:t>DQN</w:t>
-            </w:r>
-          </w:p>
-        </w:tc>
-        <w:tc>
-          <w:tcPr>
-            <w:tcW w:type="dxa" w:w="1037"/>
-          </w:tcPr>
-          <w:p>
-            <w:r>
-              <w:rPr>
-                <w:b/>
-                <w:sz w:val="16"/>
-              </w:rPr>
-              <w:t>PPO (±sd)</w:t>
-            </w:r>
-          </w:p>
-        </w:tc>
-        <w:tc>
-          <w:tcPr>
-            <w:tcW w:type="dxa" w:w="720"/>
-          </w:tcPr>
-          <w:p>
-            <w:r>
-              <w:rPr>
-                <w:b/>
-                <w:sz w:val="16"/>
-              </w:rPr>
-              <w:t>ΔSQ</w:t>
-            </w:r>
-          </w:p>
-        </w:tc>
-        <w:tc>
-          <w:tcPr>
-            <w:tcW w:type="dxa" w:w="720"/>
-          </w:tcPr>
-          <w:p>
-            <w:r>
-              <w:rPr>
-                <w:b/>
-                <w:sz w:val="16"/>
-              </w:rPr>
-              <w:t>QP</w:t>
-            </w:r>
-          </w:p>
-        </w:tc>
-        <w:tc>
-          <w:tcPr>
-            <w:tcW w:type="dxa" w:w="662"/>
-          </w:tcPr>
-          <w:p>
-            <w:r>
-              <w:rPr>
-                <w:b/>
-                <w:sz w:val="16"/>
-              </w:rPr>
-              <w:t>gap</w:t>
-            </w:r>
-          </w:p>
-        </w:tc>
-      </w:tr>
-      <w:tr>
-        <w:tc>
-          <w:tcPr>
-            <w:tcW w:type="dxa" w:w="1325"/>
-          </w:tcPr>
-          <w:p>
-            <w:r>
-              <w:rPr>
-                <w:sz w:val="16"/>
-              </w:rPr>
-              <w:t>US spatial</w:t>
-            </w:r>
-          </w:p>
-        </w:tc>
-        <w:tc>
-          <w:tcPr>
-            <w:tcW w:type="dxa" w:w="720"/>
-          </w:tcPr>
-          <w:p>
-            <w:r>
-              <w:rPr>
-                <w:sz w:val="16"/>
-              </w:rPr>
-              <w:t>9.85</w:t>
-            </w:r>
-          </w:p>
-        </w:tc>
-        <w:tc>
-          <w:tcPr>
-            <w:tcW w:type="dxa" w:w="792"/>
-          </w:tcPr>
-          <w:p>
-            <w:r>
-              <w:rPr>
-                <w:sz w:val="16"/>
-              </w:rPr>
-              <w:t>11.23</w:t>
-            </w:r>
-          </w:p>
-        </w:tc>
-        <w:tc>
-          <w:tcPr>
-            <w:tcW w:type="dxa" w:w="720"/>
-          </w:tcPr>
-          <w:p>
-            <w:r>
-              <w:rPr>
-                <w:sz w:val="16"/>
-              </w:rPr>
-              <w:t>9.81</w:t>
-            </w:r>
-          </w:p>
-        </w:tc>
-        <w:tc>
-          <w:tcPr>
-            <w:tcW w:type="dxa" w:w="1037"/>
-          </w:tcPr>
-          <w:p>
-            <w:r>
-              <w:rPr>
-                <w:sz w:val="16"/>
-              </w:rPr>
-              <w:t>9.57±.03</w:t>
-            </w:r>
-          </w:p>
-        </w:tc>
-        <w:tc>
-          <w:tcPr>
-            <w:tcW w:type="dxa" w:w="720"/>
-          </w:tcPr>
-          <w:p>
-            <w:r>
-              <w:rPr>
-                <w:sz w:val="16"/>
-              </w:rPr>
-              <w:t>2.8%</w:t>
-            </w:r>
-          </w:p>
-        </w:tc>
-        <w:tc>
-          <w:tcPr>
-            <w:tcW w:type="dxa" w:w="720"/>
-          </w:tcPr>
-          <w:p>
-            <w:r>
-              <w:rPr>
-                <w:sz w:val="16"/>
-              </w:rPr>
-              <w:t>9.46</w:t>
-            </w:r>
-          </w:p>
-        </w:tc>
-        <w:tc>
-          <w:tcPr>
-            <w:tcW w:type="dxa" w:w="662"/>
-          </w:tcPr>
-          <w:p>
-            <w:r>
-              <w:rPr>
-                <w:sz w:val="16"/>
-              </w:rPr>
-              <w:t>1.6%</w:t>
-            </w:r>
-          </w:p>
-        </w:tc>
-      </w:tr>
-      <w:tr>
-        <w:tc>
-          <w:tcPr>
-            <w:tcW w:type="dxa" w:w="1325"/>
-          </w:tcPr>
-          <w:p>
-            <w:r>
-              <w:rPr>
-                <w:sz w:val="16"/>
-              </w:rPr>
-              <w:t>US batch</w:t>
-            </w:r>
-          </w:p>
-        </w:tc>
-        <w:tc>
-          <w:tcPr>
-            <w:tcW w:type="dxa" w:w="720"/>
-          </w:tcPr>
-          <w:p>
-            <w:r>
-              <w:rPr>
-                <w:sz w:val="16"/>
-              </w:rPr>
-              <w:t>9.85</w:t>
-            </w:r>
-          </w:p>
-        </w:tc>
-        <w:tc>
-          <w:tcPr>
-            <w:tcW w:type="dxa" w:w="792"/>
-          </w:tcPr>
-          <w:p>
-            <w:r>
-              <w:rPr>
-                <w:sz w:val="16"/>
-              </w:rPr>
-              <w:t>10.09</w:t>
-            </w:r>
-          </w:p>
-        </w:tc>
-        <w:tc>
-          <w:tcPr>
-            <w:tcW w:type="dxa" w:w="720"/>
-          </w:tcPr>
-          <w:p>
-            <w:r>
-              <w:rPr>
-                <w:sz w:val="16"/>
-              </w:rPr>
-              <w:t>9.89</w:t>
-            </w:r>
-          </w:p>
-        </w:tc>
-        <w:tc>
-          <w:tcPr>
-            <w:tcW w:type="dxa" w:w="1037"/>
-          </w:tcPr>
-          <w:p>
-            <w:r>
-              <w:rPr>
-                <w:sz w:val="16"/>
-              </w:rPr>
-              <w:t>9.59±.08</w:t>
-            </w:r>
-          </w:p>
-        </w:tc>
-        <w:tc>
-          <w:tcPr>
-            <w:tcW w:type="dxa" w:w="720"/>
-          </w:tcPr>
-          <w:p>
-            <w:r>
-              <w:rPr>
-                <w:sz w:val="16"/>
-              </w:rPr>
-              <w:t>2.7%</w:t>
-            </w:r>
-          </w:p>
-        </w:tc>
-        <w:tc>
-          <w:tcPr>
-            <w:tcW w:type="dxa" w:w="720"/>
-          </w:tcPr>
-          <w:p>
-            <w:r>
-              <w:rPr>
-                <w:sz w:val="16"/>
-              </w:rPr>
-              <w:t>9.44</w:t>
-            </w:r>
-          </w:p>
-        </w:tc>
-        <w:tc>
-          <w:tcPr>
-            <w:tcW w:type="dxa" w:w="662"/>
-          </w:tcPr>
-          <w:p>
-            <w:r>
-              <w:rPr>
-                <w:sz w:val="16"/>
-              </w:rPr>
-              <w:t>1.3%</w:t>
-            </w:r>
-          </w:p>
-        </w:tc>
-      </w:tr>
-      <w:tr>
-        <w:tc>
-          <w:tcPr>
-            <w:tcW w:type="dxa" w:w="1325"/>
-          </w:tcPr>
-          <w:p>
-            <w:r>
-              <w:rPr>
-                <w:sz w:val="16"/>
-              </w:rPr>
-              <w:t>Glob spatial</w:t>
-            </w:r>
-          </w:p>
-        </w:tc>
-        <w:tc>
-          <w:tcPr>
-            <w:tcW w:type="dxa" w:w="720"/>
-          </w:tcPr>
-          <w:p>
-            <w:r>
-              <w:rPr>
-                <w:sz w:val="16"/>
-              </w:rPr>
-              <w:t>14.06</w:t>
-            </w:r>
-          </w:p>
-        </w:tc>
-        <w:tc>
-          <w:tcPr>
-            <w:tcW w:type="dxa" w:w="792"/>
-          </w:tcPr>
-          <w:p>
-            <w:r>
-              <w:rPr>
-                <w:sz w:val="16"/>
-              </w:rPr>
-              <w:t>14.32</w:t>
-            </w:r>
-          </w:p>
-        </w:tc>
-        <w:tc>
-          <w:tcPr>
-            <w:tcW w:type="dxa" w:w="720"/>
-          </w:tcPr>
-          <w:p>
-            <w:r>
-              <w:rPr>
-                <w:sz w:val="16"/>
-              </w:rPr>
-              <w:t>13.35</w:t>
-            </w:r>
-          </w:p>
-        </w:tc>
-        <w:tc>
-          <w:tcPr>
-            <w:tcW w:type="dxa" w:w="1037"/>
-          </w:tcPr>
-          <w:p>
-            <w:r>
-              <w:rPr>
-                <w:sz w:val="16"/>
-              </w:rPr>
-              <w:t>12.62±.25</w:t>
-            </w:r>
-          </w:p>
-        </w:tc>
-        <w:tc>
-          <w:tcPr>
-            <w:tcW w:type="dxa" w:w="720"/>
-          </w:tcPr>
-          <w:p>
-            <w:r>
-              <w:rPr>
-                <w:sz w:val="16"/>
-              </w:rPr>
-              <w:t>10.3%</w:t>
-            </w:r>
-          </w:p>
-        </w:tc>
-        <w:tc>
-          <w:tcPr>
-            <w:tcW w:type="dxa" w:w="720"/>
-          </w:tcPr>
-          <w:p>
-            <w:r>
-              <w:rPr>
-                <w:sz w:val="16"/>
-              </w:rPr>
-              <w:t>11.95</w:t>
-            </w:r>
-          </w:p>
-        </w:tc>
-        <w:tc>
-          <w:tcPr>
-            <w:tcW w:type="dxa" w:w="662"/>
-          </w:tcPr>
-          <w:p>
-            <w:r>
-              <w:rPr>
-                <w:sz w:val="16"/>
-              </w:rPr>
-              <w:t>5.7%</w:t>
-            </w:r>
-          </w:p>
-        </w:tc>
-      </w:tr>
-      <w:tr>
-        <w:tc>
-          <w:tcPr>
-            <w:tcW w:type="dxa" w:w="1325"/>
-          </w:tcPr>
-          <w:p>
-            <w:r>
-              <w:rPr>
-                <w:sz w:val="16"/>
-              </w:rPr>
-              <w:t>Glob batch</w:t>
-            </w:r>
-          </w:p>
-        </w:tc>
-        <w:tc>
-          <w:tcPr>
-            <w:tcW w:type="dxa" w:w="720"/>
-          </w:tcPr>
-          <w:p>
-            <w:r>
-              <w:rPr>
-                <w:sz w:val="16"/>
-              </w:rPr>
-              <w:t>14.06</w:t>
-            </w:r>
-          </w:p>
-        </w:tc>
-        <w:tc>
-          <w:tcPr>
-            <w:tcW w:type="dxa" w:w="792"/>
-          </w:tcPr>
-          <w:p>
-            <w:r>
-              <w:rPr>
-                <w:sz w:val="16"/>
-              </w:rPr>
-              <w:t>13.76</w:t>
-            </w:r>
-          </w:p>
-        </w:tc>
-        <w:tc>
-          <w:tcPr>
-            <w:tcW w:type="dxa" w:w="720"/>
-          </w:tcPr>
-          <w:p>
-            <w:r>
-              <w:rPr>
-                <w:sz w:val="16"/>
-              </w:rPr>
-              <w:t>13.46</w:t>
-            </w:r>
-          </w:p>
-        </w:tc>
-        <w:tc>
-          <w:tcPr>
-            <w:tcW w:type="dxa" w:w="1037"/>
-          </w:tcPr>
-          <w:p>
-            <w:r>
-              <w:rPr>
-                <w:sz w:val="16"/>
-              </w:rPr>
-              <w:t>12.25±.14</w:t>
-            </w:r>
-          </w:p>
-        </w:tc>
-        <w:tc>
-          <w:tcPr>
-            <w:tcW w:type="dxa" w:w="720"/>
-          </w:tcPr>
-          <w:p>
-            <w:r>
-              <w:rPr>
-                <w:sz w:val="16"/>
-              </w:rPr>
-              <w:t>12.9%</w:t>
-            </w:r>
-          </w:p>
-        </w:tc>
-        <w:tc>
-          <w:tcPr>
-            <w:tcW w:type="dxa" w:w="720"/>
-          </w:tcPr>
-          <w:p>
-            <w:r>
-              <w:rPr>
-                <w:sz w:val="16"/>
-              </w:rPr>
-              <w:t>11.89</w:t>
-            </w:r>
-          </w:p>
-        </w:tc>
-        <w:tc>
-          <w:tcPr>
-            <w:tcW w:type="dxa" w:w="662"/>
-          </w:tcPr>
-          <w:p>
-            <w:r>
-              <w:rPr>
-                <w:sz w:val="16"/>
-              </w:rPr>
-              <w:t>3.1%</w:t>
-            </w:r>
-          </w:p>
-        </w:tc>
-      </w:tr>
-    </w:tbl>
-    <w:p>
-      <w:pPr>
-        <w:spacing w:after="40"/>
-      </w:pPr>
-    </w:p>
-    <w:p>
-      <w:pPr>
-        <w:jc w:val="center"/>
-      </w:pPr>
-      <w:r>
-        <w:drawing>
-          <wp:inline xmlns:a="http://schemas.openxmlformats.org/drawingml/2006/main" xmlns:pic="http://schemas.openxmlformats.org/drawingml/2006/picture">
-            <wp:extent cx="2926080" cy="2266495"/>
-            <wp:docPr id="3" name="Picture 3"/>
-            <wp:cNvGraphicFramePr>
-              <a:graphicFrameLocks noChangeAspect="1"/>
-            </wp:cNvGraphicFramePr>
-            <a:graphic>
-              <a:graphicData uri="http://schemas.openxmlformats.org/drawingml/2006/picture">
-                <pic:pic>
-                  <pic:nvPicPr>
-                    <pic:cNvPr id="0" name="fig1_results.png"/>
-                    <pic:cNvPicPr/>
-                  </pic:nvPicPr>
-                  <pic:blipFill>
-                    <a:blip r:embed="rId11"/>
-                    <a:stretch>
-                      <a:fillRect/>
-                    </a:stretch>
-                  </pic:blipFill>
-                  <pic:spPr>
-                    <a:xfrm>
-                      <a:off x="0" y="0"/>
-                      <a:ext cx="2926080" cy="2266495"/>
-                    </a:xfrm>
-                    <a:prstGeom prst="rect"/>
-                  </pic:spPr>
-                </pic:pic>
-              </a:graphicData>
-            </a:graphic>
-          </wp:inline>
-        </w:drawing>
-      </w:r>
-    </w:p>
-    <w:p>
-      <w:pPr>
-        <w:spacing w:after="120"/>
-        <w:jc w:val="center"/>
-      </w:pPr>
-      <w:r>
-        <w:rPr>
-          <w:sz w:val="16"/>
-        </w:rPr>
-        <w:t>Fig. 1. Five-seed mean episode cost (PPO error bars = ±1 sd); red dashed line is the clairvoyant QP lower bound. PPO savings vs. status quo annotated.</w:t>
-      </w:r>
-    </w:p>
-    <w:p>
-      <w:pPr>
-        <w:spacing w:after="40"/>
-      </w:pPr>
-      <w:r>
-        <w:rPr>
-          <w:b/>
-          <w:i/>
-          <w:sz w:val="20"/>
-        </w:rPr>
-        <w:t>A. Headline</w:t>
-      </w:r>
-    </w:p>
-    <w:p>
-      <w:pPr>
-        <w:spacing w:after="60"/>
-      </w:pPr>
-      <w:r>
-        <w:rPr>
-          <w:b w:val="0"/>
-          <w:i w:val="0"/>
-          <w:sz w:val="19"/>
-        </w:rPr>
-        <w:t>Across five seeds per configuration, PPO is the best policy — learned or heuristic — in all four: 2.7–12.9% below the grid-unaware status quo, 5.0–14.8% below the foresighted Trough-Slot heuristic, and 2.5–9.9% below the best DQN variant. PPO beats the best DQN in 19 of 20 seed-paired comparisons (sign/Wilcoxon p = 0.031 in three of four configs; the exception is Global spatial-only, 4/5, p = 0.19). Crucially, PPO lands within 1.3–5.7% of a clairvoyant convex-QP lower bound (Sec. VI-F) — so little headroom remains to ANY policy, causal or not. Savings scale with exploitable structure: modest under US-only diversity, large under global price/timezone spread. PPO also serves 100% of service demand with zero deadline violations (Sec. VI-E) and the flattest, lowest fleet draw (Fig. 4).</w:t>
-      </w:r>
-    </w:p>
-    <w:p>
-      <w:pPr>
-        <w:jc w:val="center"/>
-      </w:pPr>
-      <w:r>
-        <w:drawing>
-          <wp:inline xmlns:a="http://schemas.openxmlformats.org/drawingml/2006/main" xmlns:pic="http://schemas.openxmlformats.org/drawingml/2006/picture">
-            <wp:extent cx="2926080" cy="1993447"/>
-            <wp:docPr id="4" name="Picture 4"/>
-            <wp:cNvGraphicFramePr>
-              <a:graphicFrameLocks noChangeAspect="1"/>
-            </wp:cNvGraphicFramePr>
-            <a:graphic>
-              <a:graphicData uri="http://schemas.openxmlformats.org/drawingml/2006/picture">
-                <pic:pic>
-                  <pic:nvPicPr>
-                    <pic:cNvPr id="0" name="fig4_profile.png"/>
-                    <pic:cNvPicPr/>
-                  </pic:nvPicPr>
-                  <pic:blipFill>
-                    <a:blip r:embed="rId12"/>
-                    <a:stretch>
-                      <a:fillRect/>
-                    </a:stretch>
-                  </pic:blipFill>
-                  <pic:spPr>
-                    <a:xfrm>
-                      <a:off x="0" y="0"/>
-                      <a:ext cx="2926080" cy="1993447"/>
-                    </a:xfrm>
-                    <a:prstGeom prst="rect"/>
-                  </pic:spPr>
-                </pic:pic>
-              </a:graphicData>
-            </a:graphic>
-          </wp:inline>
-        </w:drawing>
-      </w:r>
-    </w:p>
-    <w:p>
-      <w:pPr>
-        <w:spacing w:after="120"/>
-        <w:jc w:val="center"/>
-      </w:pPr>
-      <w:r>
-        <w:rPr>
-          <w:sz w:val="16"/>
-        </w:rPr>
-        <w:t>Fig. 4. Fleet power profile, US batch (first 4 days): PPO serves the same work at lower, flatter draw.</w:t>
-      </w:r>
-    </w:p>
-    <w:p>
-      <w:pPr>
-        <w:spacing w:after="40"/>
-      </w:pPr>
-      <w:r>
-        <w:rPr>
-          <w:b/>
-          <w:i/>
-          <w:sz w:val="20"/>
-        </w:rPr>
-        <w:t>B. Emergent slope arbitrage</w:t>
-      </w:r>
-    </w:p>
-    <w:p>
-      <w:pPr>
-        <w:spacing w:after="60"/>
-      </w:pPr>
-      <w:r>
-        <w:rPr>
-          <w:b w:val="0"/>
-          <w:i w:val="0"/>
-          <w:sz w:val="19"/>
-        </w:rPr>
-        <w:t>Per-cell power calibration converts the low-diversity US scenario from “nothing to learn” (under pooled power, all DCs are energetically identical and near-uniform routing is optimal) into a real optimization: idle power is sunk, so each marginal unit of CPU is cheapest where the slope is lowest. PPO inverts the load distribution relative to the do-nothing policies — toward low-slope cells a/b, away from high-slope c/d — worth +2.8% over the status quo with no spatial price diversity at all. No baseline encodes this strategy. In the Global scenario, slope arbitrage compounds with price arbitrage: PPO routes aggressively away from high-priced Singapore toward cheap, low-slope US capacity.</w:t>
-      </w:r>
-    </w:p>
-    <w:p>
-      <w:pPr>
-        <w:spacing w:after="40"/>
-      </w:pPr>
-      <w:r>
-        <w:rPr>
-          <w:b/>
-          <w:i/>
-          <w:sz w:val="20"/>
-        </w:rPr>
-        <w:t>C. The foresighted heuristic loses everywhere</w:t>
-      </w:r>
-    </w:p>
-    <w:p>
-      <w:pPr>
-        <w:spacing w:after="60"/>
-      </w:pPr>
-      <w:r>
-        <w:rPr>
-          <w:b w:val="0"/>
-          <w:i w:val="0"/>
-          <w:sz w:val="19"/>
-        </w:rPr>
-        <w:t>Trough-Slot Lookahead holds privileged 3-hour future net-demand information yet loses every configuration by 5.0–14.8% vs. PPO — and in the US it is the single most expensive policy, worse even than the do-nothing status quo. Two structural flaws cost it: its slack-grid routing rule CONCENTRATES load, raising the fleet peak that the quadratic penalty punishes (LF ≈ 0.86 vs. PPO's ≈ 0.96), and it is blind to per-cell power (it optimizes against net demand only, while PPO additionally arbitrages each cell's slope). Foresight does not compensate for optimizing the wrong surface.</w:t>
-      </w:r>
-    </w:p>
-    <w:p>
-      <w:pPr>
-        <w:spacing w:after="40"/>
-      </w:pPr>
-      <w:r>
-        <w:rPr>
-          <w:b/>
-          <w:i/>
-          <w:sz w:val="20"/>
-        </w:rPr>
-        <w:t>D. The temporal lever, honestly sized</w:t>
-      </w:r>
-    </w:p>
-    <w:p>
-      <w:pPr>
-        <w:spacing w:after="60"/>
-      </w:pPr>
-      <w:r>
-        <w:rPr>
-          <w:b w:val="0"/>
-          <w:i w:val="0"/>
-          <w:sz w:val="19"/>
-        </w:rPr>
-        <w:t>At the measured deferrable fractions (16–26% of usage), batch deferral adds +2.7 points over the spatial-only result in the Global scenario (+10.3% → +12.9% vs. status quo) but is essentially neutral in the US (+2.8% → +2.7%), where there is little price or timezone diversity for temporal shifting to exploit. The temporal lever is real but secondary to spatial routing, and it is scenario-dependent. (Earlier drafts' inflated +6% estimates were artifacts L1–L3, Sec. VII.)</w:t>
-      </w:r>
-    </w:p>
-    <w:p>
-      <w:pPr>
-        <w:spacing w:after="40"/>
-      </w:pPr>
-      <w:r>
-        <w:rPr>
-          <w:b/>
-          <w:i/>
-          <w:sz w:val="20"/>
-        </w:rPr>
-        <w:t>E. Deadline and backlog audit</w:t>
-      </w:r>
-    </w:p>
-    <w:p>
-      <w:pPr>
-        <w:spacing w:after="60"/>
-      </w:pPr>
-      <w:r>
-        <w:rPr>
-          <w:b w:val="0"/>
-          <w:i w:val="0"/>
-          <w:sz w:val="19"/>
-        </w:rPr>
-        <w:t>Because every policy is scored on the shaped objective (Eq. 10), we audit that PPO's savings are genuine scheduling, not penalty-dodging. Across all ten PPO batch-mode seeds: service served / demand = 1.0000, terminal backlog = 0, terminal batch pool ≤ 0.95 units (≤0.025% of arrivals), ZERO expired batch, peak transient backlog ≤ 3.9 units, and backlog penalty ≤1%. Default-off evaluation retains that finite-horizon convention for model compatibility and reports the tail explicitly. Demand-enabled runs observe full-episode progress and charge terminal pool like expiry, closing the economically material tariff loophole. The historical tail is &lt;$238 (&lt;0.003% of cost), so rankings do not change, but 'all batch completed' was too strong.</w:t>
-      </w:r>
-    </w:p>
-    <w:p>
-      <w:pPr>
-        <w:spacing w:after="40"/>
-      </w:pPr>
-      <w:r>
-        <w:rPr>
-          <w:b/>
-          <w:i/>
-          <w:sz w:val="20"/>
-        </w:rPr>
-        <w:t>F. Optimality gap</w:t>
-      </w:r>
-    </w:p>
-    <w:p>
-      <w:pPr>
-        <w:spacing w:after="60"/>
-      </w:pPr>
-      <w:r>
-        <w:rPr>
-          <w:b w:val="0"/>
-          <w:i w:val="0"/>
-          <w:sz w:val="19"/>
-        </w:rPr>
-        <w:t>The environment is convex in the serving decisions (linear power and energy cost, convex-quadratic peak penalty, linear queue/backlog dynamics), so a clairvoyant planner with full-episode foresight and fluid allocation solves a quadratic program whose optimum LOWER-BOUNDS any policy. We assemble it directly for the Clarabel solver with the simulator's service backlog, cumulative soft-expiry accounting, and optional demand-charge epigraph. The manual sparse assembly matches CVXPY below 10⁻⁸ relative and solves the four default-off configs in 2–15 s. PPO's gap is 1.6% (US spatial), 1.3% (US batch), 5.7% (Global spatial), and 3.1% (Global batch). The bound is generous — it has perfect foresight and no causality or action-parameterization constraints — so the true gap to the best ACHIEVABLE causal policy is smaller still. A useful by-product: the QP's spatial-only and batch optima differ by only ~0.2–0.5%, confirming the intrinsic value of temporal flexibility at these deferrable fractions is small (Sec. VI-D).</w:t>
-      </w:r>
-    </w:p>
-    <w:p>
-      <w:pPr>
-        <w:spacing w:after="40"/>
-      </w:pPr>
-      <w:r>
-        <w:rPr>
-          <w:b/>
-          <w:i/>
-          <w:sz w:val="20"/>
-        </w:rPr>
-        <w:t>G. The demand charge: post-hoc audit and trained extension</w:t>
-      </w:r>
-    </w:p>
-    <w:p>
-      <w:pPr>
-        <w:spacing w:after="60"/>
-      </w:pPr>
-      <w:r>
-        <w:rPr>
-          <w:b w:val="0"/>
-          <w:i w:val="0"/>
-          <w:sz w:val="19"/>
-        </w:rPr>
-        <w:t>Φ is a grid-stress shadow price, not the operator's tariff (Sec. III-A). Because a demand charge is the single largest line item that our objective omits, we quantify it for every policy from the grid-draw traces, at a reference c = $15/kW for the complete 8,917-step study billing cycle, WITHOUT putting it in the reward — so the policies compared are exactly those of Sec. VI-A. Billing is per meter, so the billed quantity is Σᵢ maxₜ gᵢ,ₜ, not the fleet coincident peak.</w:t>
-      </w:r>
-    </w:p>
-    <w:p>
-      <w:pPr>
-        <w:spacing w:after="60"/>
-      </w:pPr>
-      <w:r>
-        <w:rPr>
-          <w:b w:val="0"/>
-          <w:i w:val="0"/>
-          <w:sz w:val="19"/>
-        </w:rPr>
-        <w:t>The charge is large: $4.69M per study cycle under the status quo, equal to 39% of that scenario's $12.06M energy charge, 28% of the combined energy-plus-demand bill, and 2.3× the Φ term already in the objective. PPO reduces it to $4.32M (−8.0%, Global spatial+temporal) and $4.35M (−7.3%, US spatial+temporal) as a SIDE EFFECT of routing for energy price, with the term absent from its reward. These are reference-rate sensitivity results, not bill reconstructions.</w:t>
-      </w:r>
-    </w:p>
-    <w:p>
-      <w:pPr>
-        <w:spacing w:after="60"/>
-      </w:pPr>
-      <w:r>
-        <w:rPr>
-          <w:b w:val="0"/>
-          <w:i w:val="0"/>
-          <w:sz w:val="19"/>
-        </w:rPr>
-        <w:t>Two findings temper the obvious next step of adding it to the reward. First, the headroom is small, because most of the charge is not shapeable: sites never power off, so Σᵢ Pᵢⁱᵈˡᵉ·R = 189.8 MW = $2.85M is irreducible — 66% of the best charge any policy could achieve. Solving for the peak-minimizing feasible allocation (the clairvoyant LP collapses to a greedy lowest-sᵢ·R fill, since only the busiest step binds) gives a floor of 267.1 MW = $4.01M, so the entire prize is $0.69M and PPO already captures about half of it incidentally. What remains — roughly $0.31M, 2.5% of J — sits inside our seed-to-seed spread and would not survive as a headline result. Second, a demand charge would PENALIZE part of PPO's current strategy: concentrating load on the cheap, efficient sites raises their site peaks (Global batch: US-West +9%, US-Central +15%) even as EU and Asia fall, so a retrained policy would trade energy saving for peak relief rather than adding to it.</w:t>
-      </w:r>
-    </w:p>
-    <w:p>
-      <w:pPr>
-        <w:spacing w:after="60"/>
-      </w:pPr>
-      <w:r>
-        <w:rPr>
-          <w:b w:val="0"/>
-          <w:i w:val="0"/>
-          <w:sz w:val="19"/>
-        </w:rPr>
-        <w:t>The genuinely interesting consequence is for the temporal lever. Energy arbitrage pays only if timing is right CONTINUOUSLY for a month; clipping a demand charge pays if timing is right at the binding interval. Under the default-off objective the corrected QP values temporal flexibility at only 0.19% (US) to 0.52% (Global). Adding the guarded $15/kW US-reference tariff raises the spatial-to-batch QP improvement to about 1.0–1.1% and lowers its optimal billed peak by about 9.6 MW in both scenarios, with numerical-zero expiry. The corrected environment uses the full episode as one billing cycle, resets period state before the next action, exposes the running peak and cycle context, and requires γ = 1 when the term is enabled so the incremental reward remains exactly the final billed maximum. Tariff-aware backlog/expiry floors prevent dropping work, reward scaling conditions RL, and dense arrival-minus-completion shaping preserves unfinished-work cost.</w:t>
-      </w:r>
-    </w:p>
-    <w:p>
-      <w:pPr>
-        <w:jc w:val="center"/>
-      </w:pPr>
-      <w:r>
-        <w:rPr>
-          <w:b/>
-          <w:sz w:val="16"/>
-        </w:rPr>
-        <w:t>DEMAND-AWARE SINGLE-SEED RESULTS (M$, PEAK IN MW)</w:t>
+        <w:t>ENERGY MODEL V2 REFERENCE DIAGNOSTICS (PRICE IN USD/MWh)</w:t>
       </w:r>
     </w:p>
     <w:tbl>
@@ -2994,7 +2581,7 @@
       <w:tr>
         <w:tc>
           <w:tcPr>
-            <w:tcW w:type="dxa" w:w="1181"/>
+            <w:tcW w:type="dxa" w:w="1656"/>
           </w:tcPr>
           <w:p>
             <w:r>
@@ -3002,13 +2589,13 @@
                 <w:b/>
                 <w:sz w:val="16"/>
               </w:rPr>
-              <w:t>Config</w:t>
+              <w:t>Slot</w:t>
             </w:r>
           </w:p>
         </w:tc>
         <w:tc>
           <w:tcPr>
-            <w:tcW w:type="dxa" w:w="691"/>
+            <w:tcW w:type="dxa" w:w="1080"/>
           </w:tcPr>
           <w:p>
             <w:r>
@@ -3016,13 +2603,13 @@
                 <w:b/>
                 <w:sz w:val="16"/>
               </w:rPr>
-              <w:t>QP</w:t>
+              <w:t>Mean</w:t>
             </w:r>
           </w:p>
         </w:tc>
         <w:tc>
           <w:tcPr>
-            <w:tcW w:type="dxa" w:w="691"/>
+            <w:tcW w:type="dxa" w:w="1080"/>
           </w:tcPr>
           <w:p>
             <w:r>
@@ -3030,13 +2617,13 @@
                 <w:b/>
                 <w:sz w:val="16"/>
               </w:rPr>
-              <w:t>SQ</w:t>
+              <w:t>Std</w:t>
             </w:r>
           </w:p>
         </w:tc>
         <w:tc>
           <w:tcPr>
-            <w:tcW w:type="dxa" w:w="1066"/>
+            <w:tcW w:type="dxa" w:w="1224"/>
           </w:tcPr>
           <w:p>
             <w:r>
@@ -3044,13 +2631,13 @@
                 <w:b/>
                 <w:sz w:val="16"/>
               </w:rPr>
-              <w:t>Best feasible</w:t>
+              <w:t>r(price, net)</w:t>
             </w:r>
           </w:p>
         </w:tc>
         <w:tc>
           <w:tcPr>
-            <w:tcW w:type="dxa" w:w="720"/>
+            <w:tcW w:type="dxa" w:w="1512"/>
           </w:tcPr>
           <w:p>
             <w:r>
@@ -3058,13 +2645,13 @@
                 <w:b/>
                 <w:sz w:val="16"/>
               </w:rPr>
-              <w:t>PPO</w:t>
+              <w:t>Price peak UTC</w:t>
             </w:r>
           </w:p>
         </w:tc>
         <w:tc>
           <w:tcPr>
-            <w:tcW w:type="dxa" w:w="749"/>
+            <w:tcW w:type="dxa" w:w="1512"/>
           </w:tcPr>
           <w:p>
             <w:r>
@@ -3072,7 +2659,7 @@
                 <w:b/>
                 <w:sz w:val="16"/>
               </w:rPr>
-              <w:t>PPO peak</w:t>
+              <w:t>Net peak UTC</w:t>
             </w:r>
           </w:p>
         </w:tc>
@@ -3080,79 +2667,79 @@
       <w:tr>
         <w:tc>
           <w:tcPr>
-            <w:tcW w:type="dxa" w:w="1181"/>
+            <w:tcW w:type="dxa" w:w="1656"/>
           </w:tcPr>
           <w:p>
             <w:r>
               <w:rPr>
                 <w:sz w:val="16"/>
               </w:rPr>
-              <w:t>US spatial</w:t>
+              <w:t>US Pacific</w:t>
             </w:r>
           </w:p>
         </w:tc>
         <w:tc>
           <w:tcPr>
-            <w:tcW w:type="dxa" w:w="691"/>
+            <w:tcW w:type="dxa" w:w="1080"/>
           </w:tcPr>
           <w:p>
             <w:r>
               <w:rPr>
                 <w:sz w:val="16"/>
               </w:rPr>
-              <w:t>13.820</w:t>
+              <w:t>$25.93</w:t>
             </w:r>
           </w:p>
         </w:tc>
         <w:tc>
           <w:tcPr>
-            <w:tcW w:type="dxa" w:w="691"/>
+            <w:tcW w:type="dxa" w:w="1080"/>
           </w:tcPr>
           <w:p>
             <w:r>
               <w:rPr>
                 <w:sz w:val="16"/>
               </w:rPr>
-              <w:t>14.542</w:t>
+              <w:t>$16.48</w:t>
             </w:r>
           </w:p>
         </w:tc>
         <w:tc>
           <w:tcPr>
-            <w:tcW w:type="dxa" w:w="1066"/>
+            <w:tcW w:type="dxa" w:w="1224"/>
           </w:tcPr>
           <w:p>
             <w:r>
               <w:rPr>
                 <w:sz w:val="16"/>
               </w:rPr>
-              <w:t>RR 14.388</w:t>
+              <w:t>0.895</w:t>
             </w:r>
           </w:p>
         </w:tc>
         <w:tc>
           <w:tcPr>
-            <w:tcW w:type="dxa" w:w="720"/>
+            <w:tcW w:type="dxa" w:w="1512"/>
           </w:tcPr>
           <w:p>
             <w:r>
               <w:rPr>
                 <w:sz w:val="16"/>
               </w:rPr>
-              <w:t>14.396</w:t>
+              <w:t>03:00</w:t>
             </w:r>
           </w:p>
         </w:tc>
         <w:tc>
           <w:tcPr>
-            <w:tcW w:type="dxa" w:w="749"/>
+            <w:tcW w:type="dxa" w:w="1512"/>
           </w:tcPr>
           <w:p>
             <w:r>
               <w:rPr>
                 <w:sz w:val="16"/>
               </w:rPr>
-              <w:t>304.1</w:t>
+              <w:t>03:00</w:t>
             </w:r>
           </w:p>
         </w:tc>
@@ -3160,79 +2747,79 @@
       <w:tr>
         <w:tc>
           <w:tcPr>
-            <w:tcW w:type="dxa" w:w="1181"/>
+            <w:tcW w:type="dxa" w:w="1656"/>
           </w:tcPr>
           <w:p>
             <w:r>
               <w:rPr>
                 <w:sz w:val="16"/>
               </w:rPr>
-              <w:t>US spatial+temp</w:t>
+              <w:t>US Mountain</w:t>
             </w:r>
           </w:p>
         </w:tc>
         <w:tc>
           <w:tcPr>
-            <w:tcW w:type="dxa" w:w="691"/>
+            <w:tcW w:type="dxa" w:w="1080"/>
           </w:tcPr>
           <w:p>
             <w:r>
               <w:rPr>
                 <w:sz w:val="16"/>
               </w:rPr>
-              <w:t>13.676</w:t>
+              <w:t>$25.93</w:t>
             </w:r>
           </w:p>
         </w:tc>
         <w:tc>
           <w:tcPr>
-            <w:tcW w:type="dxa" w:w="691"/>
+            <w:tcW w:type="dxa" w:w="1080"/>
           </w:tcPr>
           <w:p>
             <w:r>
               <w:rPr>
                 <w:sz w:val="16"/>
               </w:rPr>
-              <w:t>14.545</w:t>
+              <w:t>$16.48</w:t>
             </w:r>
           </w:p>
         </w:tc>
         <w:tc>
           <w:tcPr>
-            <w:tcW w:type="dxa" w:w="1066"/>
+            <w:tcW w:type="dxa" w:w="1224"/>
           </w:tcPr>
           <w:p>
             <w:r>
               <w:rPr>
                 <w:sz w:val="16"/>
               </w:rPr>
-              <w:t>Drain 14.391</w:t>
+              <w:t>0.895</w:t>
             </w:r>
           </w:p>
         </w:tc>
         <w:tc>
           <w:tcPr>
-            <w:tcW w:type="dxa" w:w="720"/>
+            <w:tcW w:type="dxa" w:w="1512"/>
           </w:tcPr>
           <w:p>
             <w:r>
               <w:rPr>
                 <w:sz w:val="16"/>
               </w:rPr>
-              <w:t>14.561</w:t>
+              <w:t>02:00</w:t>
             </w:r>
           </w:p>
         </w:tc>
         <w:tc>
           <w:tcPr>
-            <w:tcW w:type="dxa" w:w="749"/>
+            <w:tcW w:type="dxa" w:w="1512"/>
           </w:tcPr>
           <w:p>
             <w:r>
               <w:rPr>
                 <w:sz w:val="16"/>
               </w:rPr>
-              <w:t>312.1</w:t>
+              <w:t>02:00</w:t>
             </w:r>
           </w:p>
         </w:tc>
@@ -3240,79 +2827,79 @@
       <w:tr>
         <w:tc>
           <w:tcPr>
-            <w:tcW w:type="dxa" w:w="1181"/>
+            <w:tcW w:type="dxa" w:w="1656"/>
           </w:tcPr>
           <w:p>
             <w:r>
               <w:rPr>
                 <w:sz w:val="16"/>
               </w:rPr>
-              <w:t>Global spatial</w:t>
+              <w:t>US Central</w:t>
             </w:r>
           </w:p>
         </w:tc>
         <w:tc>
           <w:tcPr>
-            <w:tcW w:type="dxa" w:w="691"/>
+            <w:tcW w:type="dxa" w:w="1080"/>
           </w:tcPr>
           <w:p>
             <w:r>
               <w:rPr>
                 <w:sz w:val="16"/>
               </w:rPr>
-              <w:t>16.290</w:t>
+              <w:t>$25.94</w:t>
             </w:r>
           </w:p>
         </w:tc>
         <w:tc>
           <w:tcPr>
-            <w:tcW w:type="dxa" w:w="691"/>
+            <w:tcW w:type="dxa" w:w="1080"/>
           </w:tcPr>
           <w:p>
             <w:r>
               <w:rPr>
                 <w:sz w:val="16"/>
               </w:rPr>
-              <w:t>18.756</w:t>
+              <w:t>$16.48</w:t>
             </w:r>
           </w:p>
         </w:tc>
         <w:tc>
           <w:tcPr>
-            <w:tcW w:type="dxa" w:w="1066"/>
+            <w:tcW w:type="dxa" w:w="1224"/>
           </w:tcPr>
           <w:p>
             <w:r>
               <w:rPr>
                 <w:sz w:val="16"/>
               </w:rPr>
-              <w:t>PPO 18.283</w:t>
+              <w:t>0.895</w:t>
             </w:r>
           </w:p>
         </w:tc>
         <w:tc>
           <w:tcPr>
-            <w:tcW w:type="dxa" w:w="720"/>
+            <w:tcW w:type="dxa" w:w="1512"/>
           </w:tcPr>
           <w:p>
             <w:r>
               <w:rPr>
                 <w:sz w:val="16"/>
               </w:rPr>
-              <w:t>18.283</w:t>
+              <w:t>01:00</w:t>
             </w:r>
           </w:p>
         </w:tc>
         <w:tc>
           <w:tcPr>
-            <w:tcW w:type="dxa" w:w="749"/>
+            <w:tcW w:type="dxa" w:w="1512"/>
           </w:tcPr>
           <w:p>
             <w:r>
               <w:rPr>
                 <w:sz w:val="16"/>
               </w:rPr>
-              <w:t>304.3</w:t>
+              <w:t>01:00</w:t>
             </w:r>
           </w:p>
         </w:tc>
@@ -3320,79 +2907,399 @@
       <w:tr>
         <w:tc>
           <w:tcPr>
-            <w:tcW w:type="dxa" w:w="1181"/>
+            <w:tcW w:type="dxa" w:w="1656"/>
           </w:tcPr>
           <w:p>
             <w:r>
               <w:rPr>
                 <w:sz w:val="16"/>
               </w:rPr>
-              <w:t>Global spatial+temp</w:t>
+              <w:t>US Eastern</w:t>
             </w:r>
           </w:p>
         </w:tc>
         <w:tc>
           <w:tcPr>
-            <w:tcW w:type="dxa" w:w="691"/>
+            <w:tcW w:type="dxa" w:w="1080"/>
           </w:tcPr>
           <w:p>
             <w:r>
               <w:rPr>
                 <w:sz w:val="16"/>
               </w:rPr>
-              <w:t>16.139</w:t>
+              <w:t>$25.94</w:t>
             </w:r>
           </w:p>
         </w:tc>
         <w:tc>
           <w:tcPr>
-            <w:tcW w:type="dxa" w:w="691"/>
+            <w:tcW w:type="dxa" w:w="1080"/>
           </w:tcPr>
           <w:p>
             <w:r>
               <w:rPr>
                 <w:sz w:val="16"/>
               </w:rPr>
-              <w:t>18.759</w:t>
+              <w:t>$16.48</w:t>
             </w:r>
           </w:p>
         </w:tc>
         <w:tc>
           <w:tcPr>
-            <w:tcW w:type="dxa" w:w="1066"/>
+            <w:tcW w:type="dxa" w:w="1224"/>
           </w:tcPr>
           <w:p>
             <w:r>
               <w:rPr>
                 <w:sz w:val="16"/>
               </w:rPr>
-              <w:t>Drain 18.641</w:t>
+              <w:t>0.895</w:t>
             </w:r>
           </w:p>
         </w:tc>
         <w:tc>
           <w:tcPr>
-            <w:tcW w:type="dxa" w:w="720"/>
+            <w:tcW w:type="dxa" w:w="1512"/>
           </w:tcPr>
           <w:p>
             <w:r>
               <w:rPr>
                 <w:sz w:val="16"/>
               </w:rPr>
-              <w:t>18.798</w:t>
+              <w:t>00:00</w:t>
             </w:r>
           </w:p>
         </w:tc>
         <w:tc>
           <w:tcPr>
-            <w:tcW w:type="dxa" w:w="749"/>
+            <w:tcW w:type="dxa" w:w="1512"/>
           </w:tcPr>
           <w:p>
             <w:r>
               <w:rPr>
                 <w:sz w:val="16"/>
               </w:rPr>
-              <w:t>311.3</w:t>
+              <w:t>00:00</w:t>
+            </w:r>
+          </w:p>
+        </w:tc>
+      </w:tr>
+      <w:tr>
+        <w:tc>
+          <w:tcPr>
+            <w:tcW w:type="dxa" w:w="1656"/>
+          </w:tcPr>
+          <w:p>
+            <w:r>
+              <w:rPr>
+                <w:sz w:val="16"/>
+              </w:rPr>
+              <w:t>Global Pacific</w:t>
+            </w:r>
+          </w:p>
+        </w:tc>
+        <w:tc>
+          <w:tcPr>
+            <w:tcW w:type="dxa" w:w="1080"/>
+          </w:tcPr>
+          <w:p>
+            <w:r>
+              <w:rPr>
+                <w:sz w:val="16"/>
+              </w:rPr>
+              <w:t>$25.93</w:t>
+            </w:r>
+          </w:p>
+        </w:tc>
+        <w:tc>
+          <w:tcPr>
+            <w:tcW w:type="dxa" w:w="1080"/>
+          </w:tcPr>
+          <w:p>
+            <w:r>
+              <w:rPr>
+                <w:sz w:val="16"/>
+              </w:rPr>
+              <w:t>$16.48</w:t>
+            </w:r>
+          </w:p>
+        </w:tc>
+        <w:tc>
+          <w:tcPr>
+            <w:tcW w:type="dxa" w:w="1224"/>
+          </w:tcPr>
+          <w:p>
+            <w:r>
+              <w:rPr>
+                <w:sz w:val="16"/>
+              </w:rPr>
+              <w:t>0.895</w:t>
+            </w:r>
+          </w:p>
+        </w:tc>
+        <w:tc>
+          <w:tcPr>
+            <w:tcW w:type="dxa" w:w="1512"/>
+          </w:tcPr>
+          <w:p>
+            <w:r>
+              <w:rPr>
+                <w:sz w:val="16"/>
+              </w:rPr>
+              <w:t>03:00</w:t>
+            </w:r>
+          </w:p>
+        </w:tc>
+        <w:tc>
+          <w:tcPr>
+            <w:tcW w:type="dxa" w:w="1512"/>
+          </w:tcPr>
+          <w:p>
+            <w:r>
+              <w:rPr>
+                <w:sz w:val="16"/>
+              </w:rPr>
+              <w:t>03:00</w:t>
+            </w:r>
+          </w:p>
+        </w:tc>
+      </w:tr>
+      <w:tr>
+        <w:tc>
+          <w:tcPr>
+            <w:tcW w:type="dxa" w:w="1656"/>
+          </w:tcPr>
+          <w:p>
+            <w:r>
+              <w:rPr>
+                <w:sz w:val="16"/>
+              </w:rPr>
+              <w:t>Global Central</w:t>
+            </w:r>
+          </w:p>
+        </w:tc>
+        <w:tc>
+          <w:tcPr>
+            <w:tcW w:type="dxa" w:w="1080"/>
+          </w:tcPr>
+          <w:p>
+            <w:r>
+              <w:rPr>
+                <w:sz w:val="16"/>
+              </w:rPr>
+              <w:t>$25.94</w:t>
+            </w:r>
+          </w:p>
+        </w:tc>
+        <w:tc>
+          <w:tcPr>
+            <w:tcW w:type="dxa" w:w="1080"/>
+          </w:tcPr>
+          <w:p>
+            <w:r>
+              <w:rPr>
+                <w:sz w:val="16"/>
+              </w:rPr>
+              <w:t>$16.48</w:t>
+            </w:r>
+          </w:p>
+        </w:tc>
+        <w:tc>
+          <w:tcPr>
+            <w:tcW w:type="dxa" w:w="1224"/>
+          </w:tcPr>
+          <w:p>
+            <w:r>
+              <w:rPr>
+                <w:sz w:val="16"/>
+              </w:rPr>
+              <w:t>0.895</w:t>
+            </w:r>
+          </w:p>
+        </w:tc>
+        <w:tc>
+          <w:tcPr>
+            <w:tcW w:type="dxa" w:w="1512"/>
+          </w:tcPr>
+          <w:p>
+            <w:r>
+              <w:rPr>
+                <w:sz w:val="16"/>
+              </w:rPr>
+              <w:t>01:00</w:t>
+            </w:r>
+          </w:p>
+        </w:tc>
+        <w:tc>
+          <w:tcPr>
+            <w:tcW w:type="dxa" w:w="1512"/>
+          </w:tcPr>
+          <w:p>
+            <w:r>
+              <w:rPr>
+                <w:sz w:val="16"/>
+              </w:rPr>
+              <w:t>01:00</w:t>
+            </w:r>
+          </w:p>
+        </w:tc>
+      </w:tr>
+      <w:tr>
+        <w:tc>
+          <w:tcPr>
+            <w:tcW w:type="dxa" w:w="1656"/>
+          </w:tcPr>
+          <w:p>
+            <w:r>
+              <w:rPr>
+                <w:sz w:val="16"/>
+              </w:rPr>
+              <w:t>Global Amsterdam</w:t>
+            </w:r>
+          </w:p>
+        </w:tc>
+        <w:tc>
+          <w:tcPr>
+            <w:tcW w:type="dxa" w:w="1080"/>
+          </w:tcPr>
+          <w:p>
+            <w:r>
+              <w:rPr>
+                <w:sz w:val="16"/>
+              </w:rPr>
+              <w:t>$25.94</w:t>
+            </w:r>
+          </w:p>
+        </w:tc>
+        <w:tc>
+          <w:tcPr>
+            <w:tcW w:type="dxa" w:w="1080"/>
+          </w:tcPr>
+          <w:p>
+            <w:r>
+              <w:rPr>
+                <w:sz w:val="16"/>
+              </w:rPr>
+              <w:t>$16.47</w:t>
+            </w:r>
+          </w:p>
+        </w:tc>
+        <w:tc>
+          <w:tcPr>
+            <w:tcW w:type="dxa" w:w="1224"/>
+          </w:tcPr>
+          <w:p>
+            <w:r>
+              <w:rPr>
+                <w:sz w:val="16"/>
+              </w:rPr>
+              <w:t>0.894</w:t>
+            </w:r>
+          </w:p>
+        </w:tc>
+        <w:tc>
+          <w:tcPr>
+            <w:tcW w:type="dxa" w:w="1512"/>
+          </w:tcPr>
+          <w:p>
+            <w:r>
+              <w:rPr>
+                <w:sz w:val="16"/>
+              </w:rPr>
+              <w:t>18:00</w:t>
+            </w:r>
+          </w:p>
+        </w:tc>
+        <w:tc>
+          <w:tcPr>
+            <w:tcW w:type="dxa" w:w="1512"/>
+          </w:tcPr>
+          <w:p>
+            <w:r>
+              <w:rPr>
+                <w:sz w:val="16"/>
+              </w:rPr>
+              <w:t>18:00</w:t>
+            </w:r>
+          </w:p>
+        </w:tc>
+      </w:tr>
+      <w:tr>
+        <w:tc>
+          <w:tcPr>
+            <w:tcW w:type="dxa" w:w="1656"/>
+          </w:tcPr>
+          <w:p>
+            <w:r>
+              <w:rPr>
+                <w:sz w:val="16"/>
+              </w:rPr>
+              <w:t>Global Singapore</w:t>
+            </w:r>
+          </w:p>
+        </w:tc>
+        <w:tc>
+          <w:tcPr>
+            <w:tcW w:type="dxa" w:w="1080"/>
+          </w:tcPr>
+          <w:p>
+            <w:r>
+              <w:rPr>
+                <w:sz w:val="16"/>
+              </w:rPr>
+              <w:t>$26.09</w:t>
+            </w:r>
+          </w:p>
+        </w:tc>
+        <w:tc>
+          <w:tcPr>
+            <w:tcW w:type="dxa" w:w="1080"/>
+          </w:tcPr>
+          <w:p>
+            <w:r>
+              <w:rPr>
+                <w:sz w:val="16"/>
+              </w:rPr>
+              <w:t>$16.39</w:t>
+            </w:r>
+          </w:p>
+        </w:tc>
+        <w:tc>
+          <w:tcPr>
+            <w:tcW w:type="dxa" w:w="1224"/>
+          </w:tcPr>
+          <w:p>
+            <w:r>
+              <w:rPr>
+                <w:sz w:val="16"/>
+              </w:rPr>
+              <w:t>0.892</w:t>
+            </w:r>
+          </w:p>
+        </w:tc>
+        <w:tc>
+          <w:tcPr>
+            <w:tcW w:type="dxa" w:w="1512"/>
+          </w:tcPr>
+          <w:p>
+            <w:r>
+              <w:rPr>
+                <w:sz w:val="16"/>
+              </w:rPr>
+              <w:t>12:00</w:t>
+            </w:r>
+          </w:p>
+        </w:tc>
+        <w:tc>
+          <w:tcPr>
+            <w:tcW w:type="dxa" w:w="1512"/>
+          </w:tcPr>
+          <w:p>
+            <w:r>
+              <w:rPr>
+                <w:sz w:val="16"/>
+              </w:rPr>
+              <w:t>12:00</w:t>
             </w:r>
           </w:p>
         </w:tc>
@@ -3413,7 +3320,20 @@
           <w:i w:val="0"/>
           <w:sz w:val="19"/>
         </w:rPr>
-        <w:t>These seed-42 runs are a negative but informative result. Demand-aware PPO reduces cost 1.0% vs. status quo in US spatial and 2.5% in Global spatial, but Round Robin narrowly wins US spatial. Adding the temporal head does not capture the QP's ~1% temporal opportunity: Drain Immediately is best in both batch scenarios, while PPO is 0.1–0.2% above status quo and 6.5–16.5% above the clairvoyant bound. Both DQN encodings are less reliable; incomplete-work penalties dominate several batch runs. Thus the tariff matters and the QP shows shapeable value, but 500k-step single-seed PPO/DQN does not establish a successful temporal demand-charge optimizer. These results are reported separately from the five-seed default-off headline.</w:t>
+        <w:t>Reference CAISO facts: mean DAM price is about $25.93/MWh; negative-price intervals are retained; the average local price and net-demand trough is approximately 12:00 PDT; the average local price and net-demand peak is approximately 20:00 PDT; and price/net-demand correlation is approximately 0.895.</w:t>
+      </w:r>
+    </w:p>
+    <w:p>
+      <w:pPr>
+        <w:spacing w:after="60"/>
+      </w:pPr>
+      <w:r>
+        <w:rPr>
+          <w:b w:val="0"/>
+          <w:i w:val="0"/>
+          <w:sz w:val="19"/>
+        </w:rPr>
+        <w:t>Negative-net-demand intervals average $2.86/MWh versus $29.88/MWh otherwise. The deepest 5% of net-demand intervals average $0.11/MWh and have negative prices 56% of the time. Real energy cost therefore already strongly favors execution in the duck-curve belly.</w:t>
       </w:r>
     </w:p>
     <w:p>
@@ -3426,7 +3346,525 @@
           <w:i/>
           <w:sz w:val="20"/>
         </w:rPr>
-        <w:t>H. Generalization: transfer tracks observability</w:t>
+        <w:t>QP headroom gate</w:t>
+      </w:r>
+    </w:p>
+    <w:p>
+      <w:pPr>
+        <w:jc w:val="center"/>
+      </w:pPr>
+      <w:r>
+        <w:rPr>
+          <w:b/>
+          <w:sz w:val="16"/>
+        </w:rPr>
+        <w:t>NO-TRAINING CLAIRVOYANT-QP HEADROOM (UNRESTRICTED-ROUTING UPPER BOUND)</w:t>
+      </w:r>
+    </w:p>
+    <w:tbl>
+      <w:tblPr>
+        <w:tblStyle w:val="LightGrid-Accent1"/>
+        <w:tblW w:type="auto" w:w="0"/>
+        <w:tblLook w:firstColumn="1" w:firstRow="1" w:lastColumn="0" w:lastRow="0" w:noHBand="0" w:noVBand="1" w:val="04A0"/>
+      </w:tblPr>
+      <w:tblGrid>
+        <w:gridCol w:w="1440"/>
+        <w:gridCol w:w="1440"/>
+        <w:gridCol w:w="1440"/>
+        <w:gridCol w:w="1440"/>
+        <w:gridCol w:w="1440"/>
+        <w:gridCol w:w="1440"/>
+        <w:gridCol w:w="1440"/>
+      </w:tblGrid>
+      <w:tr>
+        <w:tc>
+          <w:tcPr>
+            <w:tcW w:type="dxa" w:w="1512"/>
+          </w:tcPr>
+          <w:p>
+            <w:r>
+              <w:rPr>
+                <w:b/>
+                <w:sz w:val="16"/>
+              </w:rPr>
+              <w:t>Scenario</w:t>
+            </w:r>
+          </w:p>
+        </w:tc>
+        <w:tc>
+          <w:tcPr>
+            <w:tcW w:type="dxa" w:w="1224"/>
+          </w:tcPr>
+          <w:p>
+            <w:r>
+              <w:rPr>
+                <w:b/>
+                <w:sz w:val="16"/>
+              </w:rPr>
+              <w:t>Status quo</w:t>
+            </w:r>
+          </w:p>
+        </w:tc>
+        <w:tc>
+          <w:tcPr>
+            <w:tcW w:type="dxa" w:w="1224"/>
+          </w:tcPr>
+          <w:p>
+            <w:r>
+              <w:rPr>
+                <w:b/>
+                <w:sz w:val="16"/>
+              </w:rPr>
+              <w:t>Spatial QP</w:t>
+            </w:r>
+          </w:p>
+        </w:tc>
+        <w:tc>
+          <w:tcPr>
+            <w:tcW w:type="dxa" w:w="1224"/>
+          </w:tcPr>
+          <w:p>
+            <w:r>
+              <w:rPr>
+                <w:b/>
+                <w:sz w:val="16"/>
+              </w:rPr>
+              <w:t>Joint QP</w:t>
+            </w:r>
+          </w:p>
+        </w:tc>
+        <w:tc>
+          <w:tcPr>
+            <w:tcW w:type="dxa" w:w="1080"/>
+          </w:tcPr>
+          <w:p>
+            <w:r>
+              <w:rPr>
+                <w:b/>
+                <w:sz w:val="16"/>
+              </w:rPr>
+              <w:t>Spatial</w:t>
+            </w:r>
+          </w:p>
+        </w:tc>
+        <w:tc>
+          <w:tcPr>
+            <w:tcW w:type="dxa" w:w="1080"/>
+          </w:tcPr>
+          <w:p>
+            <w:r>
+              <w:rPr>
+                <w:b/>
+                <w:sz w:val="16"/>
+              </w:rPr>
+              <w:t>Joint</w:t>
+            </w:r>
+          </w:p>
+        </w:tc>
+        <w:tc>
+          <w:tcPr>
+            <w:tcW w:type="dxa" w:w="1080"/>
+          </w:tcPr>
+          <w:p>
+            <w:r>
+              <w:rPr>
+                <w:b/>
+                <w:sz w:val="16"/>
+              </w:rPr>
+              <w:t>Temporal</w:t>
+            </w:r>
+          </w:p>
+        </w:tc>
+      </w:tr>
+      <w:tr>
+        <w:tc>
+          <w:tcPr>
+            <w:tcW w:type="dxa" w:w="1512"/>
+          </w:tcPr>
+          <w:p>
+            <w:r>
+              <w:rPr>
+                <w:sz w:val="16"/>
+              </w:rPr>
+              <w:t>US a–d</w:t>
+            </w:r>
+          </w:p>
+        </w:tc>
+        <w:tc>
+          <w:tcPr>
+            <w:tcW w:type="dxa" w:w="1224"/>
+          </w:tcPr>
+          <w:p>
+            <w:r>
+              <w:rPr>
+                <w:sz w:val="16"/>
+              </w:rPr>
+              <w:t>$6.568M</w:t>
+            </w:r>
+          </w:p>
+        </w:tc>
+        <w:tc>
+          <w:tcPr>
+            <w:tcW w:type="dxa" w:w="1224"/>
+          </w:tcPr>
+          <w:p>
+            <w:r>
+              <w:rPr>
+                <w:sz w:val="16"/>
+              </w:rPr>
+              <w:t>$6.092M</w:t>
+            </w:r>
+          </w:p>
+        </w:tc>
+        <w:tc>
+          <w:tcPr>
+            <w:tcW w:type="dxa" w:w="1224"/>
+          </w:tcPr>
+          <w:p>
+            <w:r>
+              <w:rPr>
+                <w:sz w:val="16"/>
+              </w:rPr>
+              <w:t>$6.045M</w:t>
+            </w:r>
+          </w:p>
+        </w:tc>
+        <w:tc>
+          <w:tcPr>
+            <w:tcW w:type="dxa" w:w="1080"/>
+          </w:tcPr>
+          <w:p>
+            <w:r>
+              <w:rPr>
+                <w:sz w:val="16"/>
+              </w:rPr>
+              <w:t>7.24%</w:t>
+            </w:r>
+          </w:p>
+        </w:tc>
+        <w:tc>
+          <w:tcPr>
+            <w:tcW w:type="dxa" w:w="1080"/>
+          </w:tcPr>
+          <w:p>
+            <w:r>
+              <w:rPr>
+                <w:sz w:val="16"/>
+              </w:rPr>
+              <w:t>7.95%</w:t>
+            </w:r>
+          </w:p>
+        </w:tc>
+        <w:tc>
+          <w:tcPr>
+            <w:tcW w:type="dxa" w:w="1080"/>
+          </w:tcPr>
+          <w:p>
+            <w:r>
+              <w:rPr>
+                <w:sz w:val="16"/>
+              </w:rPr>
+              <w:t>0.77%</w:t>
+            </w:r>
+          </w:p>
+        </w:tc>
+      </w:tr>
+      <w:tr>
+        <w:tc>
+          <w:tcPr>
+            <w:tcW w:type="dxa" w:w="1512"/>
+          </w:tcPr>
+          <w:p>
+            <w:r>
+              <w:rPr>
+                <w:sz w:val="16"/>
+              </w:rPr>
+              <w:t>US e–h</w:t>
+            </w:r>
+          </w:p>
+        </w:tc>
+        <w:tc>
+          <w:tcPr>
+            <w:tcW w:type="dxa" w:w="1224"/>
+          </w:tcPr>
+          <w:p>
+            <w:r>
+              <w:rPr>
+                <w:sz w:val="16"/>
+              </w:rPr>
+              <w:t>$6.219M</w:t>
+            </w:r>
+          </w:p>
+        </w:tc>
+        <w:tc>
+          <w:tcPr>
+            <w:tcW w:type="dxa" w:w="1224"/>
+          </w:tcPr>
+          <w:p>
+            <w:r>
+              <w:rPr>
+                <w:sz w:val="16"/>
+              </w:rPr>
+              <w:t>$5.768M</w:t>
+            </w:r>
+          </w:p>
+        </w:tc>
+        <w:tc>
+          <w:tcPr>
+            <w:tcW w:type="dxa" w:w="1224"/>
+          </w:tcPr>
+          <w:p>
+            <w:r>
+              <w:rPr>
+                <w:sz w:val="16"/>
+              </w:rPr>
+              <w:t>$5.637M</w:t>
+            </w:r>
+          </w:p>
+        </w:tc>
+        <w:tc>
+          <w:tcPr>
+            <w:tcW w:type="dxa" w:w="1080"/>
+          </w:tcPr>
+          <w:p>
+            <w:r>
+              <w:rPr>
+                <w:sz w:val="16"/>
+              </w:rPr>
+              <w:t>7.26%</w:t>
+            </w:r>
+          </w:p>
+        </w:tc>
+        <w:tc>
+          <w:tcPr>
+            <w:tcW w:type="dxa" w:w="1080"/>
+          </w:tcPr>
+          <w:p>
+            <w:r>
+              <w:rPr>
+                <w:sz w:val="16"/>
+              </w:rPr>
+              <w:t>9.36%</w:t>
+            </w:r>
+          </w:p>
+        </w:tc>
+        <w:tc>
+          <w:tcPr>
+            <w:tcW w:type="dxa" w:w="1080"/>
+          </w:tcPr>
+          <w:p>
+            <w:r>
+              <w:rPr>
+                <w:sz w:val="16"/>
+              </w:rPr>
+              <w:t>2.27%</w:t>
+            </w:r>
+          </w:p>
+        </w:tc>
+      </w:tr>
+      <w:tr>
+        <w:tc>
+          <w:tcPr>
+            <w:tcW w:type="dxa" w:w="1512"/>
+          </w:tcPr>
+          <w:p>
+            <w:r>
+              <w:rPr>
+                <w:sz w:val="16"/>
+              </w:rPr>
+              <w:t>Global a–d</w:t>
+            </w:r>
+          </w:p>
+        </w:tc>
+        <w:tc>
+          <w:tcPr>
+            <w:tcW w:type="dxa" w:w="1224"/>
+          </w:tcPr>
+          <w:p>
+            <w:r>
+              <w:rPr>
+                <w:sz w:val="16"/>
+              </w:rPr>
+              <w:t>$6.598M</w:t>
+            </w:r>
+          </w:p>
+        </w:tc>
+        <w:tc>
+          <w:tcPr>
+            <w:tcW w:type="dxa" w:w="1224"/>
+          </w:tcPr>
+          <w:p>
+            <w:r>
+              <w:rPr>
+                <w:sz w:val="16"/>
+              </w:rPr>
+              <w:t>$5.559M</w:t>
+            </w:r>
+          </w:p>
+        </w:tc>
+        <w:tc>
+          <w:tcPr>
+            <w:tcW w:type="dxa" w:w="1224"/>
+          </w:tcPr>
+          <w:p>
+            <w:r>
+              <w:rPr>
+                <w:sz w:val="16"/>
+              </w:rPr>
+              <w:t>$5.525M</w:t>
+            </w:r>
+          </w:p>
+        </w:tc>
+        <w:tc>
+          <w:tcPr>
+            <w:tcW w:type="dxa" w:w="1080"/>
+          </w:tcPr>
+          <w:p>
+            <w:r>
+              <w:rPr>
+                <w:sz w:val="16"/>
+              </w:rPr>
+              <w:t>15.75%</w:t>
+            </w:r>
+          </w:p>
+        </w:tc>
+        <w:tc>
+          <w:tcPr>
+            <w:tcW w:type="dxa" w:w="1080"/>
+          </w:tcPr>
+          <w:p>
+            <w:r>
+              <w:rPr>
+                <w:sz w:val="16"/>
+              </w:rPr>
+              <w:t>16.26%</w:t>
+            </w:r>
+          </w:p>
+        </w:tc>
+        <w:tc>
+          <w:tcPr>
+            <w:tcW w:type="dxa" w:w="1080"/>
+          </w:tcPr>
+          <w:p>
+            <w:r>
+              <w:rPr>
+                <w:sz w:val="16"/>
+              </w:rPr>
+              <w:t>0.60%</w:t>
+            </w:r>
+          </w:p>
+        </w:tc>
+      </w:tr>
+      <w:tr>
+        <w:tc>
+          <w:tcPr>
+            <w:tcW w:type="dxa" w:w="1512"/>
+          </w:tcPr>
+          <w:p>
+            <w:r>
+              <w:rPr>
+                <w:sz w:val="16"/>
+              </w:rPr>
+              <w:t>Global e–h</w:t>
+            </w:r>
+          </w:p>
+        </w:tc>
+        <w:tc>
+          <w:tcPr>
+            <w:tcW w:type="dxa" w:w="1224"/>
+          </w:tcPr>
+          <w:p>
+            <w:r>
+              <w:rPr>
+                <w:sz w:val="16"/>
+              </w:rPr>
+              <w:t>$6.276M</w:t>
+            </w:r>
+          </w:p>
+        </w:tc>
+        <w:tc>
+          <w:tcPr>
+            <w:tcW w:type="dxa" w:w="1224"/>
+          </w:tcPr>
+          <w:p>
+            <w:r>
+              <w:rPr>
+                <w:sz w:val="16"/>
+              </w:rPr>
+              <w:t>$5.246M</w:t>
+            </w:r>
+          </w:p>
+        </w:tc>
+        <w:tc>
+          <w:tcPr>
+            <w:tcW w:type="dxa" w:w="1224"/>
+          </w:tcPr>
+          <w:p>
+            <w:r>
+              <w:rPr>
+                <w:sz w:val="16"/>
+              </w:rPr>
+              <w:t>$5.185M</w:t>
+            </w:r>
+          </w:p>
+        </w:tc>
+        <w:tc>
+          <w:tcPr>
+            <w:tcW w:type="dxa" w:w="1080"/>
+          </w:tcPr>
+          <w:p>
+            <w:r>
+              <w:rPr>
+                <w:sz w:val="16"/>
+              </w:rPr>
+              <w:t>16.42%</w:t>
+            </w:r>
+          </w:p>
+        </w:tc>
+        <w:tc>
+          <w:tcPr>
+            <w:tcW w:type="dxa" w:w="1080"/>
+          </w:tcPr>
+          <w:p>
+            <w:r>
+              <w:rPr>
+                <w:sz w:val="16"/>
+              </w:rPr>
+              <w:t>17.38%</w:t>
+            </w:r>
+          </w:p>
+        </w:tc>
+        <w:tc>
+          <w:tcPr>
+            <w:tcW w:type="dxa" w:w="1080"/>
+          </w:tcPr>
+          <w:p>
+            <w:r>
+              <w:rPr>
+                <w:sz w:val="16"/>
+              </w:rPr>
+              <w:t>1.16%</w:t>
+            </w:r>
+          </w:p>
+        </w:tc>
+      </w:tr>
+    </w:tbl>
+    <w:p>
+      <w:pPr>
+        <w:spacing w:after="40"/>
+      </w:pPr>
+    </w:p>
+    <w:p>
+      <w:pPr>
+        <w:spacing w:after="40"/>
+      </w:pPr>
+      <w:r>
+        <w:rPr>
+          <w:b/>
+          <w:i/>
+          <w:sz w:val="20"/>
+        </w:rPr>
+        <w:t>Objective coefficient and demand-charge treatment</w:t>
       </w:r>
     </w:p>
     <w:p>
@@ -3439,17 +3877,570 @@
           <w:i w:val="0"/>
           <w:sz w:val="19"/>
         </w:rPr>
-        <w:t>We test the frozen policies (no retraining) on two distribution shifts (Fig. 6). On an UNOBSERVED shift — held-out cells e–h, with workload, tier mix, and per-cell power the policy never saw — context-aware PPO fails where its edge is purely spatial (US spatial −19%, Global spatial −27% vs. the held-out status quo): the policy had learned per-site routing keyed to static parameters that, although now in the observation, never VARIED during training and so carried no gradient signal. Training-time domain randomization (permuting compute bundles across market slots and resampling power parameters within the measured 8-cell range) fixes this, restoring positive transfer in three of four configs (+4.0–5.2%); Global spatial-only, whose price-concentration strategy has no deferral pool to absorb mistakes on unseen capacity, stays brittle — and its batch counterpart, which does, transfers at +5.2%. On an OBSERVED shift — US net demand swapped to real EIA-930 May-2024 while non-US sites use matching-year documented approximations, with prices fixed — the SAME frozen policies transfer near-perfectly (+3.1–13.2%, within ~0.5 point of their on-training result). Generalization succeeds along the axis the policy can observe and fails along the one it cannot; this both answers the calendar-memorization concern for the demand signal and prescribes the fix (observe + randomize static context).</w:t>
+        <w:t>The frozen primary coefficient is α=0.015. Calibrated only on a–d, the Status Quo grid-stress component is 18.2% of real energy cost in US and 18.3% in Global: material but not dominant. Headroom conclusions remain stable for α∈{0,0.005,0.015,0.03}.</w:t>
       </w:r>
     </w:p>
     <w:p>
       <w:pPr>
+        <w:spacing w:after="60"/>
+      </w:pPr>
+      <w:r>
+        <w:rPr>
+          <w:b w:val="0"/>
+          <w:i w:val="0"/>
+          <w:sz w:val="19"/>
+        </w:rPr>
+        <w:t>The standardized $15/kW-cycle demand charge is excluded from the primary reward and reported as a secondary sensitivity. It is about $4.694M for Status Quo—large enough to dominate—and is not a real Dutch or Singapore tariff. Demand-aware training remains a separate extension.</w:t>
+      </w:r>
+    </w:p>
+    <w:p>
+      <w:pPr>
         <w:jc w:val="center"/>
       </w:pPr>
       <w:r>
         <w:drawing>
           <wp:inline xmlns:a="http://schemas.openxmlformats.org/drawingml/2006/main" xmlns:pic="http://schemas.openxmlformats.org/drawingml/2006/picture">
-            <wp:extent cx="2926080" cy="2033378"/>
+            <wp:extent cx="6035040" cy="2262787"/>
+            <wp:docPr id="3" name="Picture 3"/>
+            <wp:cNvGraphicFramePr>
+              <a:graphicFrameLocks noChangeAspect="1"/>
+            </wp:cNvGraphicFramePr>
+            <a:graphic>
+              <a:graphicData uri="http://schemas.openxmlformats.org/drawingml/2006/picture">
+                <pic:pic>
+                  <pic:nvPicPr>
+                    <pic:cNvPr id="0" name="objective_sensitivity.png"/>
+                    <pic:cNvPicPr/>
+                  </pic:nvPicPr>
+                  <pic:blipFill>
+                    <a:blip r:embed="rId11"/>
+                    <a:stretch>
+                      <a:fillRect/>
+                    </a:stretch>
+                  </pic:blipFill>
+                  <pic:spPr>
+                    <a:xfrm>
+                      <a:off x="0" y="0"/>
+                      <a:ext cx="6035040" cy="2262787"/>
+                    </a:xfrm>
+                    <a:prstGeom prst="rect"/>
+                  </pic:spPr>
+                </pic:pic>
+              </a:graphicData>
+            </a:graphic>
+          </wp:inline>
+        </w:drawing>
+      </w:r>
+    </w:p>
+    <w:p>
+      <w:pPr>
+        <w:spacing w:after="120"/>
+        <w:jc w:val="center"/>
+      </w:pPr>
+      <w:r>
+        <w:rPr>
+          <w:sz w:val="16"/>
+        </w:rPr>
+        <w:t>Objective sensitivity on a–d calibration cells only: component share and clairvoyant headroom across α.</w:t>
+      </w:r>
+    </w:p>
+    <w:p>
+      <w:pPr>
+        <w:spacing w:after="40"/>
+      </w:pPr>
+      <w:r>
+        <w:rPr>
+          <w:b/>
+          <w:i/>
+          <w:sz w:val="20"/>
+        </w:rPr>
+        <w:t>Structural attribution and rated-power sensitivity</w:t>
+      </w:r>
+    </w:p>
+    <w:p>
+      <w:pPr>
+        <w:spacing w:after="60"/>
+      </w:pPr>
+      <w:r>
+        <w:rPr>
+          <w:b w:val="0"/>
+          <w:i w:val="0"/>
+          <w:sz w:val="19"/>
+        </w:rPr>
+        <w:t>V2 uses one CAISO price level shifted in local time, so the v1 unequal-mean synthetic-price criticism no longer applies. The a–d-only ablations below diagnose interacting sources of spatial headroom; they are not an additive causal decomposition.</w:t>
+      </w:r>
+    </w:p>
+    <w:p>
+      <w:pPr>
+        <w:jc w:val="center"/>
+      </w:pPr>
+      <w:r>
+        <w:rPr>
+          <w:b/>
+          <w:sz w:val="16"/>
+        </w:rPr>
+        <w:t>SPATIAL-QP STRUCTURAL ABLATIONS (A–D CALIBRATION CELLS)</w:t>
+      </w:r>
+    </w:p>
+    <w:tbl>
+      <w:tblPr>
+        <w:tblStyle w:val="LightGrid-Accent1"/>
+        <w:tblW w:type="auto" w:w="0"/>
+        <w:tblLook w:firstColumn="1" w:firstRow="1" w:lastColumn="0" w:lastRow="0" w:noHBand="0" w:noVBand="1" w:val="04A0"/>
+      </w:tblPr>
+      <w:tblGrid>
+        <w:gridCol w:w="3360"/>
+        <w:gridCol w:w="3360"/>
+        <w:gridCol w:w="3360"/>
+      </w:tblGrid>
+      <w:tr>
+        <w:tc>
+          <w:tcPr>
+            <w:tcW w:type="dxa" w:w="3168"/>
+          </w:tcPr>
+          <w:p>
+            <w:r>
+              <w:rPr>
+                <w:b/>
+                <w:sz w:val="16"/>
+              </w:rPr>
+              <w:t>Condition</w:t>
+            </w:r>
+          </w:p>
+        </w:tc>
+        <w:tc>
+          <w:tcPr>
+            <w:tcW w:type="dxa" w:w="1440"/>
+          </w:tcPr>
+          <w:p>
+            <w:r>
+              <w:rPr>
+                <w:b/>
+                <w:sz w:val="16"/>
+              </w:rPr>
+              <w:t>US</w:t>
+            </w:r>
+          </w:p>
+        </w:tc>
+        <w:tc>
+          <w:tcPr>
+            <w:tcW w:type="dxa" w:w="1440"/>
+          </w:tcPr>
+          <w:p>
+            <w:r>
+              <w:rPr>
+                <w:b/>
+                <w:sz w:val="16"/>
+              </w:rPr>
+              <w:t>Global</w:t>
+            </w:r>
+          </w:p>
+        </w:tc>
+      </w:tr>
+      <w:tr>
+        <w:tc>
+          <w:tcPr>
+            <w:tcW w:type="dxa" w:w="3168"/>
+          </w:tcPr>
+          <w:p>
+            <w:r>
+              <w:rPr>
+                <w:sz w:val="16"/>
+              </w:rPr>
+              <w:t>Primary</w:t>
+            </w:r>
+          </w:p>
+        </w:tc>
+        <w:tc>
+          <w:tcPr>
+            <w:tcW w:type="dxa" w:w="1440"/>
+          </w:tcPr>
+          <w:p>
+            <w:r>
+              <w:rPr>
+                <w:sz w:val="16"/>
+              </w:rPr>
+              <w:t>7.24%</w:t>
+            </w:r>
+          </w:p>
+        </w:tc>
+        <w:tc>
+          <w:tcPr>
+            <w:tcW w:type="dxa" w:w="1440"/>
+          </w:tcPr>
+          <w:p>
+            <w:r>
+              <w:rPr>
+                <w:sz w:val="16"/>
+              </w:rPr>
+              <w:t>15.75%</w:t>
+            </w:r>
+          </w:p>
+        </w:tc>
+      </w:tr>
+      <w:tr>
+        <w:tc>
+          <w:tcPr>
+            <w:tcW w:type="dxa" w:w="3168"/>
+          </w:tcPr>
+          <w:p>
+            <w:r>
+              <w:rPr>
+                <w:sz w:val="16"/>
+              </w:rPr>
+              <w:t>Energy only</w:t>
+            </w:r>
+          </w:p>
+        </w:tc>
+        <w:tc>
+          <w:tcPr>
+            <w:tcW w:type="dxa" w:w="1440"/>
+          </w:tcPr>
+          <w:p>
+            <w:r>
+              <w:rPr>
+                <w:sz w:val="16"/>
+              </w:rPr>
+              <w:t>7.52%</w:t>
+            </w:r>
+          </w:p>
+        </w:tc>
+        <w:tc>
+          <w:tcPr>
+            <w:tcW w:type="dxa" w:w="1440"/>
+          </w:tcPr>
+          <w:p>
+            <w:r>
+              <w:rPr>
+                <w:sz w:val="16"/>
+              </w:rPr>
+              <w:t>13.77%</w:t>
+            </w:r>
+          </w:p>
+        </w:tc>
+      </w:tr>
+      <w:tr>
+        <w:tc>
+          <w:tcPr>
+            <w:tcW w:type="dxa" w:w="3168"/>
+          </w:tcPr>
+          <w:p>
+            <w:r>
+              <w:rPr>
+                <w:sz w:val="16"/>
+              </w:rPr>
+              <w:t>Pooled power</w:t>
+            </w:r>
+          </w:p>
+        </w:tc>
+        <w:tc>
+          <w:tcPr>
+            <w:tcW w:type="dxa" w:w="1440"/>
+          </w:tcPr>
+          <w:p>
+            <w:r>
+              <w:rPr>
+                <w:sz w:val="16"/>
+              </w:rPr>
+              <w:t>4.14%</w:t>
+            </w:r>
+          </w:p>
+        </w:tc>
+        <w:tc>
+          <w:tcPr>
+            <w:tcW w:type="dxa" w:w="1440"/>
+          </w:tcPr>
+          <w:p>
+            <w:r>
+              <w:rPr>
+                <w:sz w:val="16"/>
+              </w:rPr>
+              <w:t>14.64%</w:t>
+            </w:r>
+          </w:p>
+        </w:tc>
+      </w:tr>
+      <w:tr>
+        <w:tc>
+          <w:tcPr>
+            <w:tcW w:type="dxa" w:w="3168"/>
+          </w:tcPr>
+          <w:p>
+            <w:r>
+              <w:rPr>
+                <w:sz w:val="16"/>
+              </w:rPr>
+              <w:t>Synchronous market</w:t>
+            </w:r>
+          </w:p>
+        </w:tc>
+        <w:tc>
+          <w:tcPr>
+            <w:tcW w:type="dxa" w:w="1440"/>
+          </w:tcPr>
+          <w:p>
+            <w:r>
+              <w:rPr>
+                <w:sz w:val="16"/>
+              </w:rPr>
+              <w:t>5.67%</w:t>
+            </w:r>
+          </w:p>
+        </w:tc>
+        <w:tc>
+          <w:tcPr>
+            <w:tcW w:type="dxa" w:w="1440"/>
+          </w:tcPr>
+          <w:p>
+            <w:r>
+              <w:rPr>
+                <w:sz w:val="16"/>
+              </w:rPr>
+              <w:t>5.67%</w:t>
+            </w:r>
+          </w:p>
+        </w:tc>
+      </w:tr>
+      <w:tr>
+        <w:tc>
+          <w:tcPr>
+            <w:tcW w:type="dxa" w:w="3168"/>
+          </w:tcPr>
+          <w:p>
+            <w:r>
+              <w:rPr>
+                <w:sz w:val="16"/>
+              </w:rPr>
+              <w:t>Shifted market only</w:t>
+            </w:r>
+          </w:p>
+        </w:tc>
+        <w:tc>
+          <w:tcPr>
+            <w:tcW w:type="dxa" w:w="1440"/>
+          </w:tcPr>
+          <w:p>
+            <w:r>
+              <w:rPr>
+                <w:sz w:val="16"/>
+              </w:rPr>
+              <w:t>4.36%</w:t>
+            </w:r>
+          </w:p>
+        </w:tc>
+        <w:tc>
+          <w:tcPr>
+            <w:tcW w:type="dxa" w:w="1440"/>
+          </w:tcPr>
+          <w:p>
+            <w:r>
+              <w:rPr>
+                <w:sz w:val="16"/>
+              </w:rPr>
+              <w:t>12.58%</w:t>
+            </w:r>
+          </w:p>
+        </w:tc>
+      </w:tr>
+      <w:tr>
+        <w:tc>
+          <w:tcPr>
+            <w:tcW w:type="dxa" w:w="3168"/>
+          </w:tcPr>
+          <w:p>
+            <w:r>
+              <w:rPr>
+                <w:sz w:val="16"/>
+              </w:rPr>
+              <w:t>Power heterogeneity only</w:t>
+            </w:r>
+          </w:p>
+        </w:tc>
+        <w:tc>
+          <w:tcPr>
+            <w:tcW w:type="dxa" w:w="1440"/>
+          </w:tcPr>
+          <w:p>
+            <w:r>
+              <w:rPr>
+                <w:sz w:val="16"/>
+              </w:rPr>
+              <w:t>6.33%</w:t>
+            </w:r>
+          </w:p>
+        </w:tc>
+        <w:tc>
+          <w:tcPr>
+            <w:tcW w:type="dxa" w:w="1440"/>
+          </w:tcPr>
+          <w:p>
+            <w:r>
+              <w:rPr>
+                <w:sz w:val="16"/>
+              </w:rPr>
+              <w:t>6.33%</w:t>
+            </w:r>
+          </w:p>
+        </w:tc>
+      </w:tr>
+      <w:tr>
+        <w:tc>
+          <w:tcPr>
+            <w:tcW w:type="dxa" w:w="3168"/>
+          </w:tcPr>
+          <w:p>
+            <w:r>
+              <w:rPr>
+                <w:sz w:val="16"/>
+              </w:rPr>
+              <w:t>Fully equal control</w:t>
+            </w:r>
+          </w:p>
+        </w:tc>
+        <w:tc>
+          <w:tcPr>
+            <w:tcW w:type="dxa" w:w="1440"/>
+          </w:tcPr>
+          <w:p>
+            <w:r>
+              <w:rPr>
+                <w:sz w:val="16"/>
+              </w:rPr>
+              <w:t>0.05%</w:t>
+            </w:r>
+          </w:p>
+        </w:tc>
+        <w:tc>
+          <w:tcPr>
+            <w:tcW w:type="dxa" w:w="1440"/>
+          </w:tcPr>
+          <w:p>
+            <w:r>
+              <w:rPr>
+                <w:sz w:val="16"/>
+              </w:rPr>
+              <w:t>0.05%</w:t>
+            </w:r>
+          </w:p>
+        </w:tc>
+      </w:tr>
+    </w:tbl>
+    <w:p>
+      <w:pPr>
+        <w:spacing w:after="40"/>
+      </w:pPr>
+    </w:p>
+    <w:p>
+      <w:pPr>
+        <w:spacing w:after="60"/>
+      </w:pPr>
+      <w:r>
+        <w:rPr>
+          <w:b w:val="0"/>
+          <w:i w:val="0"/>
+          <w:sz w:val="19"/>
+        </w:rPr>
+        <w:t>Shifted market phase is the dominant Global lever; calibrated per-cell power heterogeneity materially increases US headroom. The latter makes the optimization non-degenerate but is a direct linear-model consequence, not a novel RL discovery. With fixed α, R=50–200 MW yields 7.18–7.34% US and 14.81–17.35% Global headroom.</w:t>
+      </w:r>
+    </w:p>
+    <w:p>
+      <w:pPr>
+        <w:jc w:val="center"/>
+      </w:pPr>
+      <w:r>
+        <w:drawing>
+          <wp:inline xmlns:a="http://schemas.openxmlformats.org/drawingml/2006/main" xmlns:pic="http://schemas.openxmlformats.org/drawingml/2006/picture">
+            <wp:extent cx="6035040" cy="2138818"/>
+            <wp:docPr id="4" name="Picture 4"/>
+            <wp:cNvGraphicFramePr>
+              <a:graphicFrameLocks noChangeAspect="1"/>
+            </wp:cNvGraphicFramePr>
+            <a:graphic>
+              <a:graphicData uri="http://schemas.openxmlformats.org/drawingml/2006/picture">
+                <pic:pic>
+                  <pic:nvPicPr>
+                    <pic:cNvPr id="0" name="structure_ablation.png"/>
+                    <pic:cNvPicPr/>
+                  </pic:nvPicPr>
+                  <pic:blipFill>
+                    <a:blip r:embed="rId12"/>
+                    <a:stretch>
+                      <a:fillRect/>
+                    </a:stretch>
+                  </pic:blipFill>
+                  <pic:spPr>
+                    <a:xfrm>
+                      <a:off x="0" y="0"/>
+                      <a:ext cx="6035040" cy="2138818"/>
+                    </a:xfrm>
+                    <a:prstGeom prst="rect"/>
+                  </pic:spPr>
+                </pic:pic>
+              </a:graphicData>
+            </a:graphic>
+          </wp:inline>
+        </w:drawing>
+      </w:r>
+    </w:p>
+    <w:p>
+      <w:pPr>
+        <w:spacing w:after="120"/>
+        <w:jc w:val="center"/>
+      </w:pPr>
+      <w:r>
+        <w:rPr>
+          <w:sz w:val="16"/>
+        </w:rPr>
+        <w:t>No-training structural and rated-power sensitivity on a–d calibration cells. Mechanisms interact; bars are not additive attributions.</w:t>
+      </w:r>
+    </w:p>
+    <w:p>
+      <w:pPr>
+        <w:spacing w:after="40"/>
+      </w:pPr>
+      <w:r>
+        <w:rPr>
+          <w:b/>
+          <w:i/>
+          <w:sz w:val="20"/>
+        </w:rPr>
+        <w:t>Experimental deadline sensitivity</w:t>
+      </w:r>
+    </w:p>
+    <w:p>
+      <w:pPr>
+        <w:spacing w:after="60"/>
+      </w:pPr>
+      <w:r>
+        <w:rPr>
+          <w:b w:val="0"/>
+          <w:i w:val="0"/>
+          <w:sz w:val="19"/>
+        </w:rPr>
+        <w:t>ClusterData 2019 supplies no deadlines. The primary φ=1 gives H=2μ. Clairvoyant robustness at φ=0 (H=μ) yields 0.3–1.2% incremental temporal headroom; primary φ=1 yields 0.6–2.3%; loose φ=2 (H=3μ) yields 0.8–3.2%. Temporal value remains secondary across the sweep.</w:t>
+      </w:r>
+    </w:p>
+    <w:p>
+      <w:pPr>
+        <w:spacing w:after="40"/>
+      </w:pPr>
+      <w:r>
+        <w:rPr>
+          <w:b/>
+          <w:i/>
+          <w:sz w:val="20"/>
+        </w:rPr>
+        <w:t>Figures</w:t>
+      </w:r>
+    </w:p>
+    <w:p>
+      <w:pPr>
+        <w:jc w:val="center"/>
+      </w:pPr>
+      <w:r>
+        <w:drawing>
+          <wp:inline xmlns:a="http://schemas.openxmlformats.org/drawingml/2006/main" xmlns:pic="http://schemas.openxmlformats.org/drawingml/2006/picture">
+            <wp:extent cx="6035040" cy="3017520"/>
             <wp:docPr id="5" name="Picture 5"/>
             <wp:cNvGraphicFramePr>
               <a:graphicFrameLocks noChangeAspect="1"/>
@@ -3458,7 +4449,7 @@
               <a:graphicData uri="http://schemas.openxmlformats.org/drawingml/2006/picture">
                 <pic:pic>
                   <pic:nvPicPr>
-                    <pic:cNvPr id="0" name="fig6_generalization.png"/>
+                    <pic:cNvPr id="0" name="reference_month.png"/>
                     <pic:cNvPicPr/>
                   </pic:nvPicPr>
                   <pic:blipFill>
@@ -3470,7 +4461,7 @@
                   <pic:spPr>
                     <a:xfrm>
                       <a:off x="0" y="0"/>
-                      <a:ext cx="2926080" cy="2033378"/>
+                      <a:ext cx="6035040" cy="3017520"/>
                     </a:xfrm>
                     <a:prstGeom prst="rect"/>
                   </pic:spPr>
@@ -3490,43 +4481,17 @@
         <w:rPr>
           <w:sz w:val="16"/>
         </w:rPr>
-        <w:t>Fig. 6. Held-out transfer. Red: unobserved cell shift breaks context-only policies. Green: domain randomization restores it. Blue: the observed net-demand-year shift transfers without any special treatment.</w:t>
+        <w:t>Energy model v2 reference month: real May-2025 CAISO day-ahead price, net demand, and solar.</w:t>
       </w:r>
     </w:p>
     <w:p>
       <w:pPr>
-        <w:spacing w:after="40"/>
-      </w:pPr>
-      <w:r>
-        <w:rPr>
-          <w:b/>
-          <w:i/>
-          <w:sz w:val="20"/>
-        </w:rPr>
-        <w:t>I. Robustness to movement cost</w:t>
-      </w:r>
-    </w:p>
-    <w:p>
-      <w:pPr>
-        <w:spacing w:after="60"/>
-      </w:pPr>
-      <w:r>
-        <w:rPr>
-          <w:b w:val="0"/>
-          <w:i w:val="0"/>
-          <w:sz w:val="19"/>
-        </w:rPr>
-        <w:t>The spatial lever assumes free inter-site movement; we test how much survives a per-unit cost on work routed away from its home cell (the SustainCluster transmission-cost idea [27]). Charging existing policies post-hoc — a conservative bound, since a movement-aware policy would route less and recover more — the Global advantage is robust: it survives until movement costs reach $219/unit (Global spatial) and $331/unit (Global batch), i.e. 0.35× and 0.53× the energy cost of serving a unit, still returning +7.9% and +11.0% at a substantial $50/unit (Fig. 7). The US margin is thinner (break-even ~0.14× unit energy), honestly reflecting its smaller spatial diversity. The 10–13% Global savings are thus not an artifact of free fungibility.</w:t>
-      </w:r>
-    </w:p>
-    <w:p>
-      <w:pPr>
         <w:jc w:val="center"/>
       </w:pPr>
       <w:r>
         <w:drawing>
           <wp:inline xmlns:a="http://schemas.openxmlformats.org/drawingml/2006/main" xmlns:pic="http://schemas.openxmlformats.org/drawingml/2006/picture">
-            <wp:extent cx="2926080" cy="2086269"/>
+            <wp:extent cx="6035040" cy="3840480"/>
             <wp:docPr id="6" name="Picture 6"/>
             <wp:cNvGraphicFramePr>
               <a:graphicFrameLocks noChangeAspect="1"/>
@@ -3535,7 +4500,7 @@
               <a:graphicData uri="http://schemas.openxmlformats.org/drawingml/2006/picture">
                 <pic:pic>
                   <pic:nvPicPr>
-                    <pic:cNvPr id="0" name="fig7_movement_cost.png"/>
+                    <pic:cNvPr id="0" name="us_shifted_daily_profiles.png"/>
                     <pic:cNvPicPr/>
                   </pic:nvPicPr>
                   <pic:blipFill>
@@ -3547,7 +4512,7 @@
                   <pic:spPr>
                     <a:xfrm>
                       <a:off x="0" y="0"/>
-                      <a:ext cx="2926080" cy="2086269"/>
+                      <a:ext cx="6035040" cy="3840480"/>
                     </a:xfrm>
                     <a:prstGeom prst="rect"/>
                   </pic:spPr>
@@ -3567,8 +4532,148 @@
         <w:rPr>
           <w:sz w:val="16"/>
         </w:rPr>
-        <w:t>Fig. 7. PPO savings vs. per-unit inter-site movement cost (symlog x). Global routing keeps paying well past realistic egress prices.</w:t>
+        <w:t>Energy model v2 average daily profiles shifted across Pacific, Mountain, Central, and Eastern slots.</w:t>
       </w:r>
+    </w:p>
+    <w:p>
+      <w:pPr>
+        <w:jc w:val="center"/>
+      </w:pPr>
+      <w:r>
+        <w:drawing>
+          <wp:inline xmlns:a="http://schemas.openxmlformats.org/drawingml/2006/main" xmlns:pic="http://schemas.openxmlformats.org/drawingml/2006/picture">
+            <wp:extent cx="6035040" cy="3840480"/>
+            <wp:docPr id="7" name="Picture 7"/>
+            <wp:cNvGraphicFramePr>
+              <a:graphicFrameLocks noChangeAspect="1"/>
+            </wp:cNvGraphicFramePr>
+            <a:graphic>
+              <a:graphicData uri="http://schemas.openxmlformats.org/drawingml/2006/picture">
+                <pic:pic>
+                  <pic:nvPicPr>
+                    <pic:cNvPr id="0" name="global_shifted_daily_profiles.png"/>
+                    <pic:cNvPicPr/>
+                  </pic:nvPicPr>
+                  <pic:blipFill>
+                    <a:blip r:embed="rId15"/>
+                    <a:stretch>
+                      <a:fillRect/>
+                    </a:stretch>
+                  </pic:blipFill>
+                  <pic:spPr>
+                    <a:xfrm>
+                      <a:off x="0" y="0"/>
+                      <a:ext cx="6035040" cy="3840480"/>
+                    </a:xfrm>
+                    <a:prstGeom prst="rect"/>
+                  </pic:spPr>
+                </pic:pic>
+              </a:graphicData>
+            </a:graphic>
+          </wp:inline>
+        </w:drawing>
+      </w:r>
+    </w:p>
+    <w:p>
+      <w:pPr>
+        <w:spacing w:after="120"/>
+        <w:jc w:val="center"/>
+      </w:pPr>
+      <w:r>
+        <w:rPr>
+          <w:sz w:val="16"/>
+        </w:rPr>
+        <w:t>Energy model v2 average daily profiles shifted across Pacific, Central, Amsterdam, and Singapore slots.</w:t>
+      </w:r>
+    </w:p>
+    <w:p>
+      <w:pPr>
+        <w:spacing w:after="40"/>
+      </w:pPr>
+      <w:r>
+        <w:rPr>
+          <w:b/>
+          <w:i/>
+          <w:sz w:val="20"/>
+        </w:rPr>
+        <w:t>Review interpretation</w:t>
+      </w:r>
+    </w:p>
+    <w:p>
+      <w:pPr>
+        <w:spacing w:after="60"/>
+      </w:pPr>
+      <w:r>
+        <w:rPr>
+          <w:b w:val="0"/>
+          <w:i w:val="0"/>
+          <w:sz w:val="19"/>
+        </w:rPr>
+        <w:t>The corrected signed-demand/equal-capacity model creates 8.0–17.4% optimistic unrestricted-routing joint headroom depending on scenario. Spatial diversity remains dominant. Incremental temporal headroom is positive but modest at 0.6–2.3%.</w:t>
+      </w:r>
+    </w:p>
+    <w:p>
+      <w:pPr>
+        <w:spacing w:after="40"/>
+      </w:pPr>
+      <w:r>
+        <w:rPr>
+          <w:b/>
+          <w:i/>
+          <w:sz w:val="20"/>
+        </w:rPr>
+        <w:t>Explicit limitations and future work</w:t>
+      </w:r>
+    </w:p>
+    <w:p>
+      <w:pPr>
+        <w:spacing w:after="60"/>
+      </w:pPr>
+      <w:r>
+        <w:rPr>
+          <w:b w:val="0"/>
+          <w:i w:val="0"/>
+          <w:sz w:val="19"/>
+        </w:rPr>
+        <w:t>The primary experiment is a controlled CAISO archetype, not a real multi-market replay. Regional price levels are intentionally not re-averaged. Time-zone shifts use adjacent real boundary hours rather than a circular within-May wrap, so shifted monthly means can differ slightly. Five-minute RTM price is future robustness work. Historical 2019/2024 duck-curve comparison and extrapolation are future work, not additional training scenarios. Workload shapes are from May 2019 while the energy calendar is May 2025; this is an explicit counterfactual. OOF holds out workload cells, not the shared energy month. Routing is unrestricted across all slots; latency, residency, and movement are future work. MPC is future work; the QP is a clairvoyant diagnostic only.</w:t>
+      </w:r>
+    </w:p>
+    <w:p>
+      <w:pPr>
+        <w:spacing w:after="40"/>
+      </w:pPr>
+      <w:r>
+        <w:rPr>
+          <w:b/>
+          <w:i/>
+          <w:sz w:val="20"/>
+        </w:rPr>
+        <w:t>Gate status</w:t>
+      </w:r>
+    </w:p>
+    <w:p>
+      <w:pPr>
+        <w:spacing w:after="60"/>
+      </w:pPr>
+      <w:r>
+        <w:rPr>
+          <w:b/>
+          <w:i w:val="0"/>
+          <w:sz w:val="19"/>
+        </w:rPr>
+        <w:t>The α=0.015 primary objective and secondary demand-charge treatment are frozen with a 501,760-step, 10-seed, two-fold runner. No PPO training has begun; the committed checkpoint must pass the runner's clean-tree preflight before launch.</w:t>
+      </w:r>
+    </w:p>
+    <w:p>
+      <w:pPr>
+        <w:sectPr>
+          <w:type w:val="continuous"/>
+          <w:pgSz w:w="12240" w:h="15840"/>
+          <w:pgMar w:top="1080" w:right="1080" w:bottom="1080" w:left="1080" w:header="720" w:footer="720" w:gutter="0"/>
+          <w:cols w:space="240" w:num="1"/>
+          <w:docGrid w:linePitch="360"/>
+        </w:sectPr>
+      </w:pPr>
     </w:p>
     <w:p>
       <w:pPr>
@@ -3581,7 +4686,7 @@
           <w:i w:val="0"/>
           <w:sz w:val="21"/>
         </w:rPr>
-        <w:t>VII. LESSONS LEARNED AND THREATS TO VALIDITY</w:t>
+        <w:t>V. FURTHER TOPICS OF CONSIDERATION</w:t>
       </w:r>
     </w:p>
     <w:p>
@@ -3594,7 +4699,21 @@
           <w:i w:val="0"/>
           <w:sz w:val="19"/>
         </w:rPr>
-        <w:t>Three modeling errors each inverted the experimental ranking while present; we report them as first-class results because any deferral-with-deadlines simulator can reproduce them.</w:t>
+        <w:t>(1) Market robustness: compare the primary NP15 DAM archetype with CAISO five-minute RTM and, later, a documented real multi-market replay with regional price levels and demand shapes. (2) Historical comparison: quantify how the 2025 duck curve deepened from 2019/2024 and test extrapolated future curves. (3) Sensitivity sweeps: deferrable fraction, rated power R, flexibility factor φ, peak weight α, and workload seasonality. (4) Bound global routing with latency, residency, and movement-cost constraints. (5) Add marginal carbon intensity to compare directly with CICS [3]. (6) Add a causal receding-horizon MPC comparator with day-ahead price and net-demand forecasts. (7) Explore constrained RL for completion guarantees. (8) Add a job-level inner scheduler below the aggregate controller. (9) Extend the action space to storage and demand response. (10) Transfer to other public workload traces. (11) Test peak-aware policy designs against the demand-charge QP. (12) Add a ramp-aware objective only if the first v2 policies worsen the reported one-hour/three-hour physical ramp KPIs.</w:t>
+      </w:r>
+    </w:p>
+    <w:p>
+      <w:pPr>
+        <w:spacing w:after="80"/>
+        <w:jc w:val="center"/>
+      </w:pPr>
+      <w:r>
+        <w:rPr>
+          <w:b/>
+          <w:i w:val="0"/>
+          <w:sz w:val="21"/>
+        </w:rPr>
+        <w:t>VI. CONCLUSION</w:t>
       </w:r>
     </w:p>
     <w:p>
@@ -3607,100 +4726,7 @@
           <w:i w:val="0"/>
           <w:sz w:val="19"/>
         </w:rPr>
-        <w:t>L1 — Deadline penalties must scale with the value of deferred work. A fixed expiry weight λ_x = 2 made expiring a unit ~75× cheaper than serving it (~$150 of energy); the cost-optimal policy was to discard batch, and aggressive-expiry heuristics beat PPO. Because the penalty is linear in expiry, any rollout can be re-ranked analytically as cost(λ_x) = (cost − λ₀·x) + λ_x·x (exact for a fixed rollout; retrained agents change behavior with λ_x); the ranking inverts at λ_x ≈ 183. We set λ_x = 250, safely above both the ~$150 serving cost and that inversion point.</w:t>
-      </w:r>
-    </w:p>
-    <w:p>
-      <w:pPr>
-        <w:spacing w:after="60"/>
-      </w:pPr>
-      <w:r>
-        <w:rPr>
-          <w:b w:val="0"/>
-          <w:i w:val="0"/>
-          <w:sz w:val="19"/>
-        </w:rPr>
-        <w:t>L2 — Capacity-blocked work must queue, not expire. Re-queueing blocked batch with a one-step deadline manufactured a policy-independent expiry floor (~5,059 units, identical across scenarios — the tell), contradicting Borg's queued batch semantics [1]. Preserving original deadlines collapsed Status Quo expiry by 85% immediately and to zero in the final environment, and eliminated a spurious “concentrators win by dumping” effect.</w:t>
-      </w:r>
-    </w:p>
-    <w:p>
-      <w:pPr>
-        <w:spacing w:after="60"/>
-      </w:pPr>
-      <w:r>
-        <w:rPr>
-          <w:b w:val="0"/>
-          <w:i w:val="0"/>
-          <w:sz w:val="19"/>
-        </w:rPr>
-        <w:t>L3 — Synthetic generators must conserve the demand-presentation process. Injecting each sampled job's whole demand at its arrival timestep produced batch curves with peak/mean ≈ 195 vs. ≈ 1.24 in the measured trace: jobs present rate over duration, and concurrency smooths the aggregate. Corollary (L3b): requests ≠ usage — request-weighted tier shares overestimated the deferrable fraction 3–5×. A one-line shape check (generated vs. source peak/mean) catches both.</w:t>
-      </w:r>
-    </w:p>
-    <w:p>
-      <w:pPr>
-        <w:spacing w:after="60"/>
-      </w:pPr>
-      <w:r>
-        <w:rPr>
-          <w:b w:val="0"/>
-          <w:i w:val="0"/>
-          <w:sz w:val="19"/>
-        </w:rPr>
-        <w:t>Threats to validity. (i) PRICES are documented synthetic, not real LMP (Sec. IV-D) — the most significant limitation; relative comparisons share the same series, but absolute price levels are modeled. US net demand uses EIA-930 while non-US series include documented approximations; replacing both with validated market data is primary future work. (ii) Cell locations are anonymized; the geographic assignment is a modeling choice justified by documented inter-cell heterogeneity [1]. (iii) The 100 MW magnitude bridges cell scale to grid relevance; results should be swept over R, and a 300 MW fleet would plausibly move LMPs (the price-taker assumption). (iv) The measured tier curves make episodes deterministic; Sec. VI-H addresses the resulting memorization concern directly and shows transfer along observed axes. (v) May is the deepest duck-curve month in CAISO; seasonal generalization is untested. (vi) Cooling and PUE are excluded by scope; a multiplicative PUE would scale, not reorder, results. (vii) The linear power model is calibrated on u ≈ 0.1–0.7 and omits memory/IO effects (+0.03 R² at most); a policy pushing utilization outside that range extrapolates. (viii) Five seeds and one hyperparameter set per algorithm; DQN's higher seed variance (std up to ±$0.9M vs. PPO's ≤$0.25M) is itself reported as a stability finding.</w:t>
-      </w:r>
-    </w:p>
-    <w:p>
-      <w:pPr>
-        <w:spacing w:after="80"/>
-        <w:jc w:val="center"/>
-      </w:pPr>
-      <w:r>
-        <w:rPr>
-          <w:b/>
-          <w:i w:val="0"/>
-          <w:sz w:val="21"/>
-        </w:rPr>
-        <w:t>VIII. FURTHER TOPICS OF CONSIDERATION</w:t>
-      </w:r>
-    </w:p>
-    <w:p>
-      <w:pPr>
-        <w:spacing w:after="60"/>
-      </w:pPr>
-      <w:r>
-        <w:rPr>
-          <w:b w:val="0"/>
-          <w:i w:val="0"/>
-          <w:sz w:val="19"/>
-        </w:rPr>
-        <w:t>(1) REAL PRICES: replace the synthetic price series with real CAISO/MISO LMP (and documented proxies for the non-ISO territories) — the highest-priority item, since it is the main provenance limitation (Sec. IV-D). (2) Sensitivity sweeps: deferrable fraction (via the retained generator), rated power R, flexibility factor φ, peak weight α; and seasonal generalization beyond May. (3) Carbon objective: swap or add marginal carbon-intensity signals to compare against CICS's objective directly [3]. (4) Forecast features: day-ahead price and net-demand forecasts as observations, quantifying the residual value of explicit foresight. (5) Constrained RL: enforce zero deadline violations as a hard constraint (e.g., Lagrangian PPO) rather than a penalty. (6) Hybrid granularity: a job-level inner scheduler below the aggregate outer policy, bridging to the CFWS setting [6]. (7) Storage and demand response: batteries and market participation extend the action space naturally [13]. (8) DQN stabilization: distributional/double variants and action-space curricula to separate encoding effects from optimizer fragility. (9) Multi-objective Pareto analysis of cost vs. peak contribution vs. completion latency. (10) Transfer to other public traces — e.g., the Alibaba 2020 GPU trace already packaged by SustainCluster [27] — to test trace dependence of the slope-arbitrage finding, and cross-validation of our policies inside the SustainCluster environment. (11) Demand-charge optimization: multi-seed training, peak-aware curricula or constrained control, and policy designs that close the 6.5–16.5% PPO gap to the demand-aware QP in batch mode.</w:t>
-      </w:r>
-    </w:p>
-    <w:p>
-      <w:pPr>
-        <w:spacing w:after="80"/>
-        <w:jc w:val="center"/>
-      </w:pPr>
-      <w:r>
-        <w:rPr>
-          <w:b/>
-          <w:i w:val="0"/>
-          <w:sz w:val="21"/>
-        </w:rPr>
-        <w:t>IX. CONCLUSION</w:t>
-      </w:r>
-    </w:p>
-    <w:p>
-      <w:pPr>
-        <w:spacing w:after="60"/>
-      </w:pPr>
-      <w:r>
-        <w:rPr>
-          <w:b w:val="0"/>
-          <w:i w:val="0"/>
-          <w:sz w:val="19"/>
-        </w:rPr>
-        <w:t>On an environment assembled from measured workload and power traces, EIA-930 US net demand, documented non-US net-demand approximations, and synthetic prices — a continuous-action PPO agent learns grid-aware spatio-temporal load shaping that, across five seeds per configuration, beats the grid-unaware status quo by 2.7–12.9%, a foresighted heuristic by 5.0–14.8%, and discrete DQN variants by 2.5–9.9% (19 of 20 seed comparisons) in every configuration, landing within 1.3–5.7% of a clairvoyant QP bound with zero deadline violations and a flatter, lower fleet profile. The savings come from continuously exploitable structure — price spreads and per-cell marginal-power (slope) arbitrage — and they transfer to unseen market conditions along the axes the policy observes, with domain randomization extending transfer to unseen workloads. Equally important, the path to these numbers required finding and fixing several modeling errors that each inverted the ranking, and an honest accounting of what is measured (demand, power, net demand) versus modeled (prices); we offer the corrected environment, the validation invariant, the QP bound, and the lessons themselves as contributions to reproducible research in sustainable computing. A separate single-seed US-reference demand-charge campaign shows spatial PPO can help, especially globally, but learned temporal policies do not beat immediate drain despite QP headroom; this negative result defines the next algorithmic problem rather than extending the headline claim.</w:t>
+        <w:t>The active thesis experiment now begins with a reproducible real energy model rather than a mixture of synthetic regional inputs. One May-2025 CAISO net-demand/solar series and one NP15 day-ahead price series are shifted together across four US and four global local-time slots. The 8,928-step calendar preserves negative prices, aligns the average trough near noon and the average peak near 20:00 PDT, and yields price/net-demand correlation of approximately 0.895. Continuous boundary handling keeps real chronology: Singapore's slightly higher monthly mean comes from substituting 15 real June boundary hours, not extra duration or a regional premium. Equal 100 MW unit-capacity proxies and observed current batch arrivals now pass the preflight. The corrected QP gate shows 8.0–17.4% joint headroom but only 0.6–2.3% incremental temporal value. α=0.015 makes grid stress about 18% of energy cost; the standardized demand charge remains secondary. The mixed/synthetic v1 campaigns remain archived; no learned-policy claim will be promoted until the frozen v2 out-of-fold campaign is trained and evaluated.</w:t>
       </w:r>
     </w:p>
     <w:p>

</xml_diff>

<commit_message>
Add frozen v2 PPO results and thesis update
</commit_message>
<xml_diff>
--- a/thesis_paper.docx
+++ b/thesis_paper.docx
@@ -55,7 +55,7 @@
           <w:i/>
           <w:sz w:val="16"/>
         </w:rPr>
-        <w:t>Master's Thesis Draft — energy-model v2 design gate. The real May-2025 CAISO source and corrected QP gate are current. Prior learned-policy results are archived separately as energy-model v1 evidence and are not final v2 claims.</w:t>
+        <w:t>Master's Thesis Draft — frozen energy-model v2 campaign: 80 PPO models, two symmetric held-out workload folds, and 10 optimizer seeds/configuration. The broad joint-shaping headline criterion failed; v1 remains historical.</w:t>
       </w:r>
     </w:p>
     <w:p>
@@ -68,7 +68,7 @@
           <w:i w:val="0"/>
           <w:sz w:val="18"/>
         </w:rPr>
-        <w:t>Abstract — Hyperscale data centers are now grid-scale electrical loads whose consumption coincides with regional net-demand peaks (the “duck curve”). We study whether a reinforcement-learning agent can route workload across geographically distributed data centers — spatially (where) and temporally (when, for deferrable batch work) — to minimize electricity cost while reducing the fleet's contribution to grid stress. The active experiment combines Google ClusterData 2019 workload shapes and PowerData2019-calibrated power models with one co-timestamped, real May-2025 CAISO archetype: native five-minute net demand and solar plus NP15 day-ahead LMP. Price and net demand are shifted together by local wall time across four US slots and four global slots, preserving negative prices and signed net demand over a complete 8,928-step (744-hour) experiment. Measured workload shapes map to equal 100 MW/unit-capacity proxies, and current batch arrivals are observed before same-step release. Routing is unrestricted and therefore represents an optimistic upper bound, not a deployment claim. The corrected clairvoyant-QP gate finds 8.0–17.4% joint headroom, of which only 0.6–2.3% is incremental temporal value. An a–d-only coefficient sweep supports α=0.015 for the convex positive-grid-stress term; a standardized demand charge remains secondary. No v2 PPO training has begun.</w:t>
+        <w:t>Abstract — Hyperscale data centers are now grid-scale electrical loads whose consumption coincides with regional net-demand peaks (the “duck curve”). We study whether a reinforcement-learning agent can route workload across geographically distributed data centers — spatially (where) and temporally (when, for deferrable batch work) — to minimize electricity cost while reducing the fleet's contribution to grid stress. The active experiment combines Google ClusterData 2019 workload shapes and PowerData2019-calibrated power models with one co-timestamped, real May-2025 CAISO archetype: native five-minute net demand and solar plus NP15 day-ahead LMP. Price and net demand are shifted together by local wall time across four US slots and four global slots, preserving negative prices and signed net demand over a complete 8,928-step (744-hour) experiment. Measured workload shapes map to equal 100 MW/unit-capacity proxies, and current batch arrivals are observed before same-step release. Routing is unrestricted and therefore represents an optimistic upper bound, not a deployment claim. The corrected clairvoyant-QP gate finds 8.0–17.4% joint headroom, of which only 0.6–2.3% is incremental temporal value. We then train 80 PPO models under a frozen two-fold a–d/e–h protocol with 10 seeds/configuration and no test-fold selection. Global spatial PPO is the only robust learned success, saving 0.90% and 1.19% on the two held-out folds; both optimizer-bootstrap CIs and wider t-interval sensitivities remain positive. US spatial savings are not established (−0.29% and +0.07%). Joint batch control fails the frozen headline: only 9/40 batch seeds meet the 99.99% completion floor, and joint PPO does not reliably improve over separately trained spatial PPO. Spatial PPO lowers the secondary demand-charge reference, whereas joint PPO raises it and worsens rare maximum three-hour ramps. Thus the evidence supports a small optimistic Global spatial effect, not reliable joint spatio-temporal optimization.</w:t>
       </w:r>
     </w:p>
     <w:p>
@@ -131,7 +131,7 @@
           <w:i w:val="0"/>
           <w:sz w:val="19"/>
         </w:rPr>
-        <w:t>This thesis asks: can a model-free reinforcement-learning agent, observing only per-site demand, prices, and grid net demand, learn a joint spatial-temporal load-shaping policy that beats the grid-unaware status quo? This revision deliberately does not answer that question with a learned v2 policy yet. It first freezes and audits the real energy surface on which the answer will depend, then uses a clairvoyant QP to verify that measurable headroom exists before spending another training campaign.</w:t>
+        <w:t>This thesis asks: can a model-free reinforcement-learning agent, observing only per-site demand, prices, and grid net demand, learn a joint spatial-temporal load-shaping policy that beats the grid-unaware status quo? The frozen evidence gives a qualified answer: Global spatial routing transfers with a small positive effect, US spatial savings are not established, and joint batch control is unstable and fails the completion criterion. The energy/system construction succeeds as a reproducible test bed; the broad learned joint-optimization claim does not.</w:t>
       </w:r>
     </w:p>
     <w:p>
@@ -144,7 +144,7 @@
           <w:i w:val="0"/>
           <w:sz w:val="19"/>
         </w:rPr>
-        <w:t>Contributions. (C1) A reproducible Gymnasium environment for multi-data-center grid-aware load shaping at cell-aggregate granularity, grounded in Google ClusterData 2019 [1] and PowerData2019 [2]. (C2) Ground-truth measured per-tier demand decomposition (SLO service vs. no-SLO batch) of four trace cells, with the finding that resource requests overestimate the deferrable usage share by 3–5×. (C3) A real, reproducible May-2025 CAISO duck-curve/price archetype whose paired signals are shifted by IANA local wall time across US and global slots. (C4) A no-training QP gate that sizes the opportunity before policy selection and shows that spatial diversity dominates temporal flexibility. (C5) A preserved audit trail of the retired mixed/synthetic model and the simulator corrections that prevented invalid results from being promoted.</w:t>
+        <w:t>Contributions. (C1) A reproducible Gymnasium environment for multi-data-center grid-aware load shaping at cell-aggregate granularity, grounded in Google ClusterData 2019 [1] and PowerData2019 [2]. (C2) Ground-truth measured per-tier demand decomposition (SLO service vs. no-SLO batch) of four trace cells, with the finding that resource requests overestimate the deferrable usage share by 3–5×. (C3) A real, reproducible May-2025 CAISO duck-curve/price archetype whose paired signals are shifted by IANA local wall time across US and global slots. (C4) A no-training QP gate that sizes the opportunity before policy selection and shows that spatial diversity dominates temporal flexibility. (C5) A provenance-locked 80-model held-out campaign showing a robust but small Global spatial effect and a negative result for reliable joint batch control. (C6) A preserved audit trail of the retired mixed/synthetic model and the simulator corrections that prevented invalid results from being promoted.</w:t>
       </w:r>
     </w:p>
     <w:p>
@@ -1566,7 +1566,7 @@
           <w:i w:val="0"/>
           <w:sz w:val="19"/>
         </w:rPr>
-        <w:t>The primary demand path starts in instance_usage, not the job table and not a generator. For each cell, we join collection priority, keep top-level instances with at least a five-minute usage record, group average CPU usage into 300-second buckets, and divide by measured cell CPU capacity. Priority ≤115 is no-SLO batch; all higher priorities are service. We then define w = normalized total usage, a = normalized batch usage, and v = w − a. Consequently v + a = w at every interval to machine precision (Fig. 2).</w:t>
+        <w:t>The primary demand path starts in instance_usage, not the job table and not a generator. For each cell, we join collection priority, keep top-level instances with at least a five-minute usage record, group average CPU usage into 300-second buckets, and divide by measured cell CPU capacity. Priority ≤115 is no-SLO batch; all higher priorities are service. We then define w = normalized total usage, a = normalized batch usage, and v = w − a. Consequently v + a = w at every interval to machine precision (Fig. 1).</w:t>
       </w:r>
     </w:p>
     <w:p>
@@ -1986,7 +1986,7 @@
         <w:rPr>
           <w:sz w:val="16"/>
         </w:rPr>
-        <w:t>Fig. 2. Measured per-tier decomposition of cell b (3 of 31 days): service + batch equals the measured aggregate at every step.</w:t>
+        <w:t>Fig. 1. Measured per-tier decomposition of cell b (3 of 31 days): service + batch equals the measured aggregate at every step.</w:t>
       </w:r>
     </w:p>
     <w:p>
@@ -2421,7 +2421,7 @@
         <w:rPr>
           <w:sz w:val="16"/>
         </w:rPr>
-        <w:t>Fig. 3. Per-cell power calibration: four distinct idle/slope lines; the pooled fit (dashed) blurs them into R² = 0.43.</w:t>
+        <w:t>Fig. 2. Per-cell power calibration: four distinct idle/slope lines; the pooled fit (dashed) blurs them into R² = 0.43.</w:t>
       </w:r>
     </w:p>
     <w:p>
@@ -3941,7 +3941,7 @@
         <w:rPr>
           <w:sz w:val="16"/>
         </w:rPr>
-        <w:t>Objective sensitivity on a–d calibration cells only: component share and clairvoyant headroom across α.</w:t>
+        <w:t>Fig. 3. Objective sensitivity on a–d calibration cells only: component share and clairvoyant headroom across α.</w:t>
       </w:r>
     </w:p>
     <w:p>
@@ -4391,7 +4391,7 @@
         <w:rPr>
           <w:sz w:val="16"/>
         </w:rPr>
-        <w:t>No-training structural and rated-power sensitivity on a–d calibration cells. Mechanisms interact; bars are not additive attributions.</w:t>
+        <w:t>Fig. 4. No-training structural and rated-power sensitivity on a–d calibration cells. Mechanisms interact; bars are not additive attributions.</w:t>
       </w:r>
     </w:p>
     <w:p>
@@ -4481,7 +4481,7 @@
         <w:rPr>
           <w:sz w:val="16"/>
         </w:rPr>
-        <w:t>Energy model v2 reference month: real May-2025 CAISO day-ahead price, net demand, and solar.</w:t>
+        <w:t>Fig. 5. Energy model v2 reference month: real May-2025 CAISO day-ahead price, net demand, and solar.</w:t>
       </w:r>
     </w:p>
     <w:p>
@@ -4532,7 +4532,7 @@
         <w:rPr>
           <w:sz w:val="16"/>
         </w:rPr>
-        <w:t>Energy model v2 average daily profiles shifted across Pacific, Mountain, Central, and Eastern slots.</w:t>
+        <w:t>Fig. 6. Energy model v2 average daily profiles shifted across Pacific, Mountain, Central, and Eastern slots.</w:t>
       </w:r>
     </w:p>
     <w:p>
@@ -4583,7 +4583,7 @@
         <w:rPr>
           <w:sz w:val="16"/>
         </w:rPr>
-        <w:t>Energy model v2 average daily profiles shifted across Pacific, Central, Amsterdam, and Singapore slots.</w:t>
+        <w:t>Fig. 7. Energy model v2 average daily profiles shifted across Pacific, Central, Amsterdam, and Singapore slots.</w:t>
       </w:r>
     </w:p>
     <w:p>
@@ -4661,7 +4661,7 @@
           <w:i w:val="0"/>
           <w:sz w:val="19"/>
         </w:rPr>
-        <w:t>The α=0.015 primary objective and secondary demand-charge treatment are frozen with a 501,760-step, 10-seed, two-fold runner. No PPO training has begun; the committed checkpoint must pass the runner's clean-tree preflight before launch.</w:t>
+        <w:t>The energy gate was consumed by the completed 80-model frozen OOF campaign. The joint-shaping headline criterion failed; only Global spatial PPO produced positive held-out optimizer CIs in both folds.</w:t>
       </w:r>
     </w:p>
     <w:p>
@@ -4686,7 +4686,7 @@
           <w:i w:val="0"/>
           <w:sz w:val="21"/>
         </w:rPr>
-        <w:t>V. FURTHER TOPICS OF CONSIDERATION</w:t>
+        <w:t>V. END-TO-END FROZEN V2 EXPERIMENTAL PROTOCOL</w:t>
       </w:r>
     </w:p>
     <w:p>
@@ -4699,7 +4699,526 @@
           <w:i w:val="0"/>
           <w:sz w:val="19"/>
         </w:rPr>
-        <w:t>(1) Market robustness: compare the primary NP15 DAM archetype with CAISO five-minute RTM and, later, a documented real multi-market replay with regional price levels and demand shapes. (2) Historical comparison: quantify how the 2025 duck curve deepened from 2019/2024 and test extrapolated future curves. (3) Sensitivity sweeps: deferrable fraction, rated power R, flexibility factor φ, peak weight α, and workload seasonality. (4) Bound global routing with latency, residency, and movement-cost constraints. (5) Add marginal carbon intensity to compare directly with CICS [3]. (6) Add a causal receding-horizon MPC comparator with day-ahead price and net-demand forecasts. (7) Explore constrained RL for completion guarantees. (8) Add a job-level inner scheduler below the aggregate controller. (9) Extend the action space to storage and demand response. (10) Transfer to other public workload traces. (11) Test peak-aware policy designs against the demand-charge QP. (12) Add a ramp-aware objective only if the first v2 policies worsen the reported one-hour/three-hour physical ramp KPIs.</w:t>
+        <w:t>Figure 5 materializes the complete research chain for a reader unfamiliar with PPO training. Every arrow corresponds to a persisted, hashed source, transformation, scenario, model, or result artifact; no v2 result is selected on the held-out fold.</w:t>
+      </w:r>
+    </w:p>
+    <w:p>
+      <w:pPr>
+        <w:jc w:val="center"/>
+      </w:pPr>
+      <w:r>
+        <w:drawing>
+          <wp:inline xmlns:a="http://schemas.openxmlformats.org/drawingml/2006/main" xmlns:pic="http://schemas.openxmlformats.org/drawingml/2006/picture">
+            <wp:extent cx="6035040" cy="2875757"/>
+            <wp:docPr id="8" name="Picture 8"/>
+            <wp:cNvGraphicFramePr>
+              <a:graphicFrameLocks noChangeAspect="1"/>
+            </wp:cNvGraphicFramePr>
+            <a:graphic>
+              <a:graphicData uri="http://schemas.openxmlformats.org/drawingml/2006/picture">
+                <pic:pic>
+                  <pic:nvPicPr>
+                    <pic:cNvPr id="0" name="end_to_end_pipeline.png"/>
+                    <pic:cNvPicPr/>
+                  </pic:nvPicPr>
+                  <pic:blipFill>
+                    <a:blip r:embed="rId16"/>
+                    <a:stretch>
+                      <a:fillRect/>
+                    </a:stretch>
+                  </pic:blipFill>
+                  <pic:spPr>
+                    <a:xfrm>
+                      <a:off x="0" y="0"/>
+                      <a:ext cx="6035040" cy="2875757"/>
+                    </a:xfrm>
+                    <a:prstGeom prst="rect"/>
+                  </pic:spPr>
+                </pic:pic>
+              </a:graphicData>
+            </a:graphic>
+          </wp:inline>
+        </w:drawing>
+      </w:r>
+    </w:p>
+    <w:p>
+      <w:pPr>
+        <w:spacing w:after="120"/>
+        <w:jc w:val="center"/>
+      </w:pPr>
+      <w:r>
+        <w:rPr>
+          <w:sz w:val="16"/>
+        </w:rPr>
+        <w:t>Fig. 8. End-to-end v2 pipeline: public workload/power/market traces are transformed into an equal-proxy Gymnasium system, frozen PPO training, opposite-cell evaluation, and canonical thesis evidence.</w:t>
+      </w:r>
+    </w:p>
+    <w:p>
+      <w:pPr>
+        <w:spacing w:after="40"/>
+      </w:pPr>
+      <w:r>
+        <w:rPr>
+          <w:b/>
+          <w:i/>
+          <w:sz w:val="20"/>
+        </w:rPr>
+        <w:t>A. Workload materialization</w:t>
+      </w:r>
+    </w:p>
+    <w:p>
+      <w:pPr>
+        <w:spacing w:after="60"/>
+      </w:pPr>
+      <w:r>
+        <w:rPr>
+          <w:b w:val="0"/>
+          <w:i w:val="0"/>
+          <w:sz w:val="19"/>
+        </w:rPr>
+        <w:t>ClusterData2019 instance_usage is joined to collection priority and aggregated into five-minute curves. Priority ≤115 supplies measured no-SLO batch; the remainder supplies service, with service+batch=aggregate exactly. Each own-cell-normalized shape maps to a unit-capacity 100 MW proxy. The synthetic generator is bypassed; fitted mean duration only parameterizes the experimental deadline.</w:t>
+      </w:r>
+    </w:p>
+    <w:p>
+      <w:pPr>
+        <w:spacing w:after="40"/>
+      </w:pPr>
+      <w:r>
+        <w:rPr>
+          <w:b/>
+          <w:i/>
+          <w:sz w:val="20"/>
+        </w:rPr>
+        <w:t>B. Physical and market materialization</w:t>
+      </w:r>
+    </w:p>
+    <w:p>
+      <w:pPr>
+        <w:spacing w:after="60"/>
+      </w:pPr>
+      <w:r>
+        <w:rPr>
+          <w:b w:val="0"/>
+          <w:i w:val="0"/>
+          <w:sz w:val="19"/>
+        </w:rPr>
+        <w:t>PowerData2019 supplies per-cell idle/slope models. CAISO Today's Outlook supplies May-2025 five-minute signed net demand/solar, and OASIS NP15 supplies real hourly DAM price. The price/demand pair is shifted together across US and Global local clocks, retaining one controlled price level. Routing is unrestricted and therefore represents an optimistic upper bound.</w:t>
+      </w:r>
+    </w:p>
+    <w:p>
+      <w:pPr>
+        <w:spacing w:after="40"/>
+      </w:pPr>
+      <w:r>
+        <w:rPr>
+          <w:b/>
+          <w:i/>
+          <w:sz w:val="20"/>
+        </w:rPr>
+        <w:t>C. State, action, and objective</w:t>
+      </w:r>
+    </w:p>
+    <w:p>
+      <w:pPr>
+        <w:spacing w:after="60"/>
+      </w:pPr>
+      <w:r>
+        <w:rPr>
+          <w:b w:val="0"/>
+          <w:i w:val="0"/>
+          <w:sz w:val="19"/>
+        </w:rPr>
+        <w:t>At each step PPO observes measured service, the current measured batch arrival, carried EDF pool/urgency, backlog, real price, signed net demand, solar, current load, and site context. It outputs service-routing fractions, batch-release rates, and batch-placement fractions. Service receives first capacity; only completed batch leaves its origin queue. The primary objective is real energy + α=0.015 positive-grid-stress cost + service/completion safeguards. Demand charge and 1h/3h ramp rate are independent outcomes.</w:t>
+      </w:r>
+    </w:p>
+    <w:p>
+      <w:pPr>
+        <w:spacing w:after="40"/>
+      </w:pPr>
+      <w:r>
+        <w:rPr>
+          <w:b/>
+          <w:i/>
+          <w:sz w:val="20"/>
+        </w:rPr>
+        <w:t>D. Frozen training protocol</w:t>
+      </w:r>
+    </w:p>
+    <w:p>
+      <w:pPr>
+        <w:jc w:val="center"/>
+      </w:pPr>
+      <w:r>
+        <w:rPr>
+          <w:b/>
+          <w:sz w:val="16"/>
+        </w:rPr>
+        <w:t>TABLE III. FROZEN ENERGY-MODEL V2 PPO PROTOCOL</w:t>
+      </w:r>
+    </w:p>
+    <w:tbl>
+      <w:tblPr>
+        <w:tblStyle w:val="LightGrid-Accent1"/>
+        <w:tblW w:type="auto" w:w="0"/>
+        <w:tblLook w:firstColumn="1" w:firstRow="1" w:lastColumn="0" w:lastRow="0" w:noHBand="0" w:noVBand="1" w:val="04A0"/>
+      </w:tblPr>
+      <w:tblGrid>
+        <w:gridCol w:w="5040"/>
+        <w:gridCol w:w="5040"/>
+      </w:tblGrid>
+      <w:tr>
+        <w:tc>
+          <w:tcPr>
+            <w:tcW w:type="dxa" w:w="2592"/>
+          </w:tcPr>
+          <w:p>
+            <w:r>
+              <w:rPr>
+                <w:b/>
+                <w:sz w:val="16"/>
+              </w:rPr>
+              <w:t>Element</w:t>
+            </w:r>
+          </w:p>
+        </w:tc>
+        <w:tc>
+          <w:tcPr>
+            <w:tcW w:type="dxa" w:w="6768"/>
+          </w:tcPr>
+          <w:p>
+            <w:r>
+              <w:rPr>
+                <w:b/>
+                <w:sz w:val="16"/>
+              </w:rPr>
+              <w:t>Frozen value</w:t>
+            </w:r>
+          </w:p>
+        </w:tc>
+      </w:tr>
+      <w:tr>
+        <w:tc>
+          <w:tcPr>
+            <w:tcW w:type="dxa" w:w="2592"/>
+          </w:tcPr>
+          <w:p>
+            <w:r>
+              <w:rPr>
+                <w:sz w:val="16"/>
+              </w:rPr>
+              <w:t>Algorithm</w:t>
+            </w:r>
+          </w:p>
+        </w:tc>
+        <w:tc>
+          <w:tcPr>
+            <w:tcW w:type="dxa" w:w="6768"/>
+          </w:tcPr>
+          <w:p>
+            <w:r>
+              <w:rPr>
+                <w:sz w:val="16"/>
+              </w:rPr>
+              <w:t>PPO; MLP [128,128]; lr=3e-4</w:t>
+            </w:r>
+          </w:p>
+        </w:tc>
+      </w:tr>
+      <w:tr>
+        <w:tc>
+          <w:tcPr>
+            <w:tcW w:type="dxa" w:w="2592"/>
+          </w:tcPr>
+          <w:p>
+            <w:r>
+              <w:rPr>
+                <w:sz w:val="16"/>
+              </w:rPr>
+              <w:t>Rollout / minibatch</w:t>
+            </w:r>
+          </w:p>
+        </w:tc>
+        <w:tc>
+          <w:tcPr>
+            <w:tcW w:type="dxa" w:w="6768"/>
+          </w:tcPr>
+          <w:p>
+            <w:r>
+              <w:rPr>
+                <w:sz w:val="16"/>
+              </w:rPr>
+              <w:t>2,048 / 64</w:t>
+            </w:r>
+          </w:p>
+        </w:tc>
+      </w:tr>
+      <w:tr>
+        <w:tc>
+          <w:tcPr>
+            <w:tcW w:type="dxa" w:w="2592"/>
+          </w:tcPr>
+          <w:p>
+            <w:r>
+              <w:rPr>
+                <w:sz w:val="16"/>
+              </w:rPr>
+              <w:t>Budget</w:t>
+            </w:r>
+          </w:p>
+        </w:tc>
+        <w:tc>
+          <w:tcPr>
+            <w:tcW w:type="dxa" w:w="6768"/>
+          </w:tcPr>
+          <w:p>
+            <w:r>
+              <w:rPr>
+                <w:sz w:val="16"/>
+              </w:rPr>
+              <w:t>501,760 steps = 245 rollouts/model</w:t>
+            </w:r>
+          </w:p>
+        </w:tc>
+      </w:tr>
+      <w:tr>
+        <w:tc>
+          <w:tcPr>
+            <w:tcW w:type="dxa" w:w="2592"/>
+          </w:tcPr>
+          <w:p>
+            <w:r>
+              <w:rPr>
+                <w:sz w:val="16"/>
+              </w:rPr>
+              <w:t>Discount</w:t>
+            </w:r>
+          </w:p>
+        </w:tc>
+        <w:tc>
+          <w:tcPr>
+            <w:tcW w:type="dxa" w:w="6768"/>
+          </w:tcPr>
+          <w:p>
+            <w:r>
+              <w:rPr>
+                <w:sz w:val="16"/>
+              </w:rPr>
+              <w:t>γ=1</w:t>
+            </w:r>
+          </w:p>
+        </w:tc>
+      </w:tr>
+      <w:tr>
+        <w:tc>
+          <w:tcPr>
+            <w:tcW w:type="dxa" w:w="2592"/>
+          </w:tcPr>
+          <w:p>
+            <w:r>
+              <w:rPr>
+                <w:sz w:val="16"/>
+              </w:rPr>
+              <w:t>Seeds</w:t>
+            </w:r>
+          </w:p>
+        </w:tc>
+        <w:tc>
+          <w:tcPr>
+            <w:tcW w:type="dxa" w:w="6768"/>
+          </w:tcPr>
+          <w:p>
+            <w:r>
+              <w:rPr>
+                <w:sz w:val="16"/>
+              </w:rPr>
+              <w:t>101–110</w:t>
+            </w:r>
+          </w:p>
+        </w:tc>
+      </w:tr>
+      <w:tr>
+        <w:tc>
+          <w:tcPr>
+            <w:tcW w:type="dxa" w:w="2592"/>
+          </w:tcPr>
+          <w:p>
+            <w:r>
+              <w:rPr>
+                <w:sz w:val="16"/>
+              </w:rPr>
+              <w:t>Fold A</w:t>
+            </w:r>
+          </w:p>
+        </w:tc>
+        <w:tc>
+          <w:tcPr>
+            <w:tcW w:type="dxa" w:w="6768"/>
+          </w:tcPr>
+          <w:p>
+            <w:r>
+              <w:rPr>
+                <w:sz w:val="16"/>
+              </w:rPr>
+              <w:t>train a–d; test frozen policy on e–h</w:t>
+            </w:r>
+          </w:p>
+        </w:tc>
+      </w:tr>
+      <w:tr>
+        <w:tc>
+          <w:tcPr>
+            <w:tcW w:type="dxa" w:w="2592"/>
+          </w:tcPr>
+          <w:p>
+            <w:r>
+              <w:rPr>
+                <w:sz w:val="16"/>
+              </w:rPr>
+              <w:t>Fold B</w:t>
+            </w:r>
+          </w:p>
+        </w:tc>
+        <w:tc>
+          <w:tcPr>
+            <w:tcW w:type="dxa" w:w="6768"/>
+          </w:tcPr>
+          <w:p>
+            <w:r>
+              <w:rPr>
+                <w:sz w:val="16"/>
+              </w:rPr>
+              <w:t>train e–h; test frozen policy on a–d</w:t>
+            </w:r>
+          </w:p>
+        </w:tc>
+      </w:tr>
+      <w:tr>
+        <w:tc>
+          <w:tcPr>
+            <w:tcW w:type="dxa" w:w="2592"/>
+          </w:tcPr>
+          <w:p>
+            <w:r>
+              <w:rPr>
+                <w:sz w:val="16"/>
+              </w:rPr>
+              <w:t>Configs</w:t>
+            </w:r>
+          </w:p>
+        </w:tc>
+        <w:tc>
+          <w:tcPr>
+            <w:tcW w:type="dxa" w:w="6768"/>
+          </w:tcPr>
+          <w:p>
+            <w:r>
+              <w:rPr>
+                <w:sz w:val="16"/>
+              </w:rPr>
+              <w:t>US/Global × spatial-only/joint batch</w:t>
+            </w:r>
+          </w:p>
+        </w:tc>
+      </w:tr>
+      <w:tr>
+        <w:tc>
+          <w:tcPr>
+            <w:tcW w:type="dxa" w:w="2592"/>
+          </w:tcPr>
+          <w:p>
+            <w:r>
+              <w:rPr>
+                <w:sz w:val="16"/>
+              </w:rPr>
+              <w:t>Total</w:t>
+            </w:r>
+          </w:p>
+        </w:tc>
+        <w:tc>
+          <w:tcPr>
+            <w:tcW w:type="dxa" w:w="6768"/>
+          </w:tcPr>
+          <w:p>
+            <w:r>
+              <w:rPr>
+                <w:sz w:val="16"/>
+              </w:rPr>
+              <w:t>2 × 4 × 10 = 80 models</w:t>
+            </w:r>
+          </w:p>
+        </w:tc>
+      </w:tr>
+      <w:tr>
+        <w:tc>
+          <w:tcPr>
+            <w:tcW w:type="dxa" w:w="2592"/>
+          </w:tcPr>
+          <w:p>
+            <w:r>
+              <w:rPr>
+                <w:sz w:val="16"/>
+              </w:rPr>
+              <w:t>Selection</w:t>
+            </w:r>
+          </w:p>
+        </w:tc>
+        <w:tc>
+          <w:tcPr>
+            <w:tcW w:type="dxa" w:w="6768"/>
+          </w:tcPr>
+          <w:p>
+            <w:r>
+              <w:rPr>
+                <w:sz w:val="16"/>
+              </w:rPr>
+              <w:t>none; no validation/test-fold tuning</w:t>
+            </w:r>
+          </w:p>
+        </w:tc>
+      </w:tr>
+    </w:tbl>
+    <w:p>
+      <w:pPr>
+        <w:spacing w:after="40"/>
+      </w:pPr>
+    </w:p>
+    <w:p>
+      <w:pPr>
+        <w:spacing w:after="60"/>
+      </w:pPr>
+      <w:r>
+        <w:rPr>
+          <w:b w:val="0"/>
+          <w:i w:val="0"/>
+          <w:sz w:val="19"/>
+        </w:rPr>
+        <w:t>The runner enforces a clean committed tree; hashes source, data, package versions, protocol, models, and logs; publishes each model atomically; and requires all 80 completion records before evaluation.</w:t>
+      </w:r>
+    </w:p>
+    <w:p>
+      <w:pPr>
+        <w:spacing w:after="40"/>
+      </w:pPr>
+      <w:r>
+        <w:rPr>
+          <w:b/>
+          <w:i/>
+          <w:sz w:val="20"/>
+        </w:rPr>
+        <w:t>E. Held-out evaluation and statistics</w:t>
+      </w:r>
+    </w:p>
+    <w:p>
+      <w:pPr>
+        <w:spacing w:after="60"/>
+      </w:pPr>
+      <w:r>
+        <w:rPr>
+          <w:b w:val="0"/>
+          <w:i w:val="0"/>
+          <w:sz w:val="19"/>
+        </w:rPr>
+        <w:t>Every policy executes one deterministic complete held-out month. References are Status Quo, Round Robin, Drain Immediately (joint mode), and the clairvoyant QP diagnostic. The frozen 95% interval is a 20,000-resample percentile bootstrap over n=10 optimizer seeds. This interval describes optimizer variability, not workload- or market-population uncertainty; a Student-t sensitivity is also reported.</w:t>
       </w:r>
     </w:p>
     <w:p>
@@ -4713,7 +5232,961 @@
           <w:i w:val="0"/>
           <w:sz w:val="21"/>
         </w:rPr>
-        <w:t>VI. CONCLUSION</w:t>
+        <w:t>VI. FROZEN ENERGY-MODEL V2 HELD-OUT RESULTS</w:t>
+      </w:r>
+    </w:p>
+    <w:p>
+      <w:pPr>
+        <w:spacing w:after="60"/>
+      </w:pPr>
+      <w:r>
+        <w:rPr>
+          <w:b/>
+          <w:i w:val="0"/>
+          <w:sz w:val="19"/>
+        </w:rPr>
+        <w:t>Frozen verdict — JOINT-SHAPING HEADLINE NOT SUPPORTED.</w:t>
+      </w:r>
+    </w:p>
+    <w:p>
+      <w:pPr>
+        <w:jc w:val="center"/>
+      </w:pPr>
+      <w:r>
+        <w:rPr>
+          <w:b/>
+          <w:sz w:val="16"/>
+        </w:rPr>
+        <w:t>TABLE IV. HELD-OUT PPO SAVINGS VS STATUS QUO (10 SEEDS/FOLD)</w:t>
+      </w:r>
+    </w:p>
+    <w:tbl>
+      <w:tblPr>
+        <w:tblStyle w:val="LightGrid-Accent1"/>
+        <w:tblW w:type="auto" w:w="0"/>
+        <w:tblLook w:firstColumn="1" w:firstRow="1" w:lastColumn="0" w:lastRow="0" w:noHBand="0" w:noVBand="1" w:val="04A0"/>
+      </w:tblPr>
+      <w:tblGrid>
+        <w:gridCol w:w="1440"/>
+        <w:gridCol w:w="1440"/>
+        <w:gridCol w:w="1440"/>
+        <w:gridCol w:w="1440"/>
+        <w:gridCol w:w="1440"/>
+        <w:gridCol w:w="1440"/>
+        <w:gridCol w:w="1440"/>
+      </w:tblGrid>
+      <w:tr>
+        <w:tc>
+          <w:tcPr>
+            <w:tcW w:type="dxa" w:w="1224"/>
+          </w:tcPr>
+          <w:p>
+            <w:r>
+              <w:rPr>
+                <w:b/>
+                <w:sz w:val="16"/>
+              </w:rPr>
+              <w:t>Fold</w:t>
+            </w:r>
+          </w:p>
+        </w:tc>
+        <w:tc>
+          <w:tcPr>
+            <w:tcW w:type="dxa" w:w="1224"/>
+          </w:tcPr>
+          <w:p>
+            <w:r>
+              <w:rPr>
+                <w:b/>
+                <w:sz w:val="16"/>
+              </w:rPr>
+              <w:t>Config</w:t>
+            </w:r>
+          </w:p>
+        </w:tc>
+        <w:tc>
+          <w:tcPr>
+            <w:tcW w:type="dxa" w:w="2664"/>
+          </w:tcPr>
+          <w:p>
+            <w:r>
+              <w:rPr>
+                <w:b/>
+                <w:sz w:val="16"/>
+              </w:rPr>
+              <w:t>Savings [95% CI]</w:t>
+            </w:r>
+          </w:p>
+        </w:tc>
+        <w:tc>
+          <w:tcPr>
+            <w:tcW w:type="dxa" w:w="792"/>
+          </w:tcPr>
+          <w:p>
+            <w:r>
+              <w:rPr>
+                <w:b/>
+                <w:sz w:val="16"/>
+              </w:rPr>
+              <w:t>+ seeds</w:t>
+            </w:r>
+          </w:p>
+        </w:tc>
+        <w:tc>
+          <w:tcPr>
+            <w:tcW w:type="dxa" w:w="936"/>
+          </w:tcPr>
+          <w:p>
+            <w:r>
+              <w:rPr>
+                <w:b/>
+                <w:sz w:val="16"/>
+              </w:rPr>
+              <w:t>Feasible</w:t>
+            </w:r>
+          </w:p>
+        </w:tc>
+        <w:tc>
+          <w:tcPr>
+            <w:tcW w:type="dxa" w:w="936"/>
+          </w:tcPr>
+          <w:p>
+            <w:r>
+              <w:rPr>
+                <w:b/>
+                <w:sz w:val="16"/>
+              </w:rPr>
+              <w:t>QP head</w:t>
+            </w:r>
+          </w:p>
+        </w:tc>
+        <w:tc>
+          <w:tcPr>
+            <w:tcW w:type="dxa" w:w="936"/>
+          </w:tcPr>
+          <w:p>
+            <w:r>
+              <w:rPr>
+                <w:b/>
+                <w:sz w:val="16"/>
+              </w:rPr>
+              <w:t>PPO gap</w:t>
+            </w:r>
+          </w:p>
+        </w:tc>
+      </w:tr>
+      <w:tr>
+        <w:tc>
+          <w:tcPr>
+            <w:tcW w:type="dxa" w:w="1224"/>
+          </w:tcPr>
+          <w:p>
+            <w:r>
+              <w:rPr>
+                <w:sz w:val="16"/>
+              </w:rPr>
+              <w:t>a–d→e–h</w:t>
+            </w:r>
+          </w:p>
+        </w:tc>
+        <w:tc>
+          <w:tcPr>
+            <w:tcW w:type="dxa" w:w="1224"/>
+          </w:tcPr>
+          <w:p>
+            <w:r>
+              <w:rPr>
+                <w:sz w:val="16"/>
+              </w:rPr>
+              <w:t>US spatial</w:t>
+            </w:r>
+          </w:p>
+        </w:tc>
+        <w:tc>
+          <w:tcPr>
+            <w:tcW w:type="dxa" w:w="2664"/>
+          </w:tcPr>
+          <w:p>
+            <w:r>
+              <w:rPr>
+                <w:sz w:val="16"/>
+              </w:rPr>
+              <w:t>−0.29% [−0.76,+0.15]</w:t>
+            </w:r>
+          </w:p>
+        </w:tc>
+        <w:tc>
+          <w:tcPr>
+            <w:tcW w:type="dxa" w:w="792"/>
+          </w:tcPr>
+          <w:p>
+            <w:r>
+              <w:rPr>
+                <w:sz w:val="16"/>
+              </w:rPr>
+              <w:t>4/10</w:t>
+            </w:r>
+          </w:p>
+        </w:tc>
+        <w:tc>
+          <w:tcPr>
+            <w:tcW w:type="dxa" w:w="936"/>
+          </w:tcPr>
+          <w:p>
+            <w:r>
+              <w:rPr>
+                <w:sz w:val="16"/>
+              </w:rPr>
+              <w:t>10/10</w:t>
+            </w:r>
+          </w:p>
+        </w:tc>
+        <w:tc>
+          <w:tcPr>
+            <w:tcW w:type="dxa" w:w="936"/>
+          </w:tcPr>
+          <w:p>
+            <w:r>
+              <w:rPr>
+                <w:sz w:val="16"/>
+              </w:rPr>
+              <w:t>7.26%</w:t>
+            </w:r>
+          </w:p>
+        </w:tc>
+        <w:tc>
+          <w:tcPr>
+            <w:tcW w:type="dxa" w:w="936"/>
+          </w:tcPr>
+          <w:p>
+            <w:r>
+              <w:rPr>
+                <w:sz w:val="16"/>
+              </w:rPr>
+              <w:t>8.13%</w:t>
+            </w:r>
+          </w:p>
+        </w:tc>
+      </w:tr>
+      <w:tr>
+        <w:tc>
+          <w:tcPr>
+            <w:tcW w:type="dxa" w:w="1224"/>
+          </w:tcPr>
+          <w:p>
+            <w:r>
+              <w:rPr>
+                <w:sz w:val="16"/>
+              </w:rPr>
+              <w:t>a–d→e–h</w:t>
+            </w:r>
+          </w:p>
+        </w:tc>
+        <w:tc>
+          <w:tcPr>
+            <w:tcW w:type="dxa" w:w="1224"/>
+          </w:tcPr>
+          <w:p>
+            <w:r>
+              <w:rPr>
+                <w:sz w:val="16"/>
+              </w:rPr>
+              <w:t>US joint</w:t>
+            </w:r>
+          </w:p>
+        </w:tc>
+        <w:tc>
+          <w:tcPr>
+            <w:tcW w:type="dxa" w:w="2664"/>
+          </w:tcPr>
+          <w:p>
+            <w:r>
+              <w:rPr>
+                <w:sz w:val="16"/>
+              </w:rPr>
+              <w:t>−4.30% [−12.45,+0.20]</w:t>
+            </w:r>
+          </w:p>
+        </w:tc>
+        <w:tc>
+          <w:tcPr>
+            <w:tcW w:type="dxa" w:w="792"/>
+          </w:tcPr>
+          <w:p>
+            <w:r>
+              <w:rPr>
+                <w:sz w:val="16"/>
+              </w:rPr>
+              <w:t>4/10</w:t>
+            </w:r>
+          </w:p>
+        </w:tc>
+        <w:tc>
+          <w:tcPr>
+            <w:tcW w:type="dxa" w:w="936"/>
+          </w:tcPr>
+          <w:p>
+            <w:r>
+              <w:rPr>
+                <w:sz w:val="16"/>
+              </w:rPr>
+              <w:t>3/10</w:t>
+            </w:r>
+          </w:p>
+        </w:tc>
+        <w:tc>
+          <w:tcPr>
+            <w:tcW w:type="dxa" w:w="936"/>
+          </w:tcPr>
+          <w:p>
+            <w:r>
+              <w:rPr>
+                <w:sz w:val="16"/>
+              </w:rPr>
+              <w:t>9.36%</w:t>
+            </w:r>
+          </w:p>
+        </w:tc>
+        <w:tc>
+          <w:tcPr>
+            <w:tcW w:type="dxa" w:w="936"/>
+          </w:tcPr>
+          <w:p>
+            <w:r>
+              <w:rPr>
+                <w:sz w:val="16"/>
+              </w:rPr>
+              <w:t>15.07%</w:t>
+            </w:r>
+          </w:p>
+        </w:tc>
+      </w:tr>
+      <w:tr>
+        <w:tc>
+          <w:tcPr>
+            <w:tcW w:type="dxa" w:w="1224"/>
+          </w:tcPr>
+          <w:p>
+            <w:r>
+              <w:rPr>
+                <w:sz w:val="16"/>
+              </w:rPr>
+              <w:t>a–d→e–h</w:t>
+            </w:r>
+          </w:p>
+        </w:tc>
+        <w:tc>
+          <w:tcPr>
+            <w:tcW w:type="dxa" w:w="1224"/>
+          </w:tcPr>
+          <w:p>
+            <w:r>
+              <w:rPr>
+                <w:sz w:val="16"/>
+              </w:rPr>
+              <w:t>Global spatial</w:t>
+            </w:r>
+          </w:p>
+        </w:tc>
+        <w:tc>
+          <w:tcPr>
+            <w:tcW w:type="dxa" w:w="2664"/>
+          </w:tcPr>
+          <w:p>
+            <w:r>
+              <w:rPr>
+                <w:sz w:val="16"/>
+              </w:rPr>
+              <w:t>+0.90% [+0.34,+1.42]</w:t>
+            </w:r>
+          </w:p>
+        </w:tc>
+        <w:tc>
+          <w:tcPr>
+            <w:tcW w:type="dxa" w:w="792"/>
+          </w:tcPr>
+          <w:p>
+            <w:r>
+              <w:rPr>
+                <w:sz w:val="16"/>
+              </w:rPr>
+              <w:t>8/10</w:t>
+            </w:r>
+          </w:p>
+        </w:tc>
+        <w:tc>
+          <w:tcPr>
+            <w:tcW w:type="dxa" w:w="936"/>
+          </w:tcPr>
+          <w:p>
+            <w:r>
+              <w:rPr>
+                <w:sz w:val="16"/>
+              </w:rPr>
+              <w:t>10/10</w:t>
+            </w:r>
+          </w:p>
+        </w:tc>
+        <w:tc>
+          <w:tcPr>
+            <w:tcW w:type="dxa" w:w="936"/>
+          </w:tcPr>
+          <w:p>
+            <w:r>
+              <w:rPr>
+                <w:sz w:val="16"/>
+              </w:rPr>
+              <w:t>16.42%</w:t>
+            </w:r>
+          </w:p>
+        </w:tc>
+        <w:tc>
+          <w:tcPr>
+            <w:tcW w:type="dxa" w:w="936"/>
+          </w:tcPr>
+          <w:p>
+            <w:r>
+              <w:rPr>
+                <w:sz w:val="16"/>
+              </w:rPr>
+              <w:t>18.57%</w:t>
+            </w:r>
+          </w:p>
+        </w:tc>
+      </w:tr>
+      <w:tr>
+        <w:tc>
+          <w:tcPr>
+            <w:tcW w:type="dxa" w:w="1224"/>
+          </w:tcPr>
+          <w:p>
+            <w:r>
+              <w:rPr>
+                <w:sz w:val="16"/>
+              </w:rPr>
+              <w:t>a–d→e–h</w:t>
+            </w:r>
+          </w:p>
+        </w:tc>
+        <w:tc>
+          <w:tcPr>
+            <w:tcW w:type="dxa" w:w="1224"/>
+          </w:tcPr>
+          <w:p>
+            <w:r>
+              <w:rPr>
+                <w:sz w:val="16"/>
+              </w:rPr>
+              <w:t>Global joint</w:t>
+            </w:r>
+          </w:p>
+        </w:tc>
+        <w:tc>
+          <w:tcPr>
+            <w:tcW w:type="dxa" w:w="2664"/>
+          </w:tcPr>
+          <w:p>
+            <w:r>
+              <w:rPr>
+                <w:sz w:val="16"/>
+              </w:rPr>
+              <w:t>+0.17% [−1.00,+1.19]</w:t>
+            </w:r>
+          </w:p>
+        </w:tc>
+        <w:tc>
+          <w:tcPr>
+            <w:tcW w:type="dxa" w:w="792"/>
+          </w:tcPr>
+          <w:p>
+            <w:r>
+              <w:rPr>
+                <w:sz w:val="16"/>
+              </w:rPr>
+              <w:t>6/10</w:t>
+            </w:r>
+          </w:p>
+        </w:tc>
+        <w:tc>
+          <w:tcPr>
+            <w:tcW w:type="dxa" w:w="936"/>
+          </w:tcPr>
+          <w:p>
+            <w:r>
+              <w:rPr>
+                <w:sz w:val="16"/>
+              </w:rPr>
+              <w:t>2/10</w:t>
+            </w:r>
+          </w:p>
+        </w:tc>
+        <w:tc>
+          <w:tcPr>
+            <w:tcW w:type="dxa" w:w="936"/>
+          </w:tcPr>
+          <w:p>
+            <w:r>
+              <w:rPr>
+                <w:sz w:val="16"/>
+              </w:rPr>
+              <w:t>17.38%</w:t>
+            </w:r>
+          </w:p>
+        </w:tc>
+        <w:tc>
+          <w:tcPr>
+            <w:tcW w:type="dxa" w:w="936"/>
+          </w:tcPr>
+          <w:p>
+            <w:r>
+              <w:rPr>
+                <w:sz w:val="16"/>
+              </w:rPr>
+              <w:t>20.84%</w:t>
+            </w:r>
+          </w:p>
+        </w:tc>
+      </w:tr>
+      <w:tr>
+        <w:tc>
+          <w:tcPr>
+            <w:tcW w:type="dxa" w:w="1224"/>
+          </w:tcPr>
+          <w:p>
+            <w:r>
+              <w:rPr>
+                <w:sz w:val="16"/>
+              </w:rPr>
+              <w:t>e–h→a–d</w:t>
+            </w:r>
+          </w:p>
+        </w:tc>
+        <w:tc>
+          <w:tcPr>
+            <w:tcW w:type="dxa" w:w="1224"/>
+          </w:tcPr>
+          <w:p>
+            <w:r>
+              <w:rPr>
+                <w:sz w:val="16"/>
+              </w:rPr>
+              <w:t>US spatial</w:t>
+            </w:r>
+          </w:p>
+        </w:tc>
+        <w:tc>
+          <w:tcPr>
+            <w:tcW w:type="dxa" w:w="2664"/>
+          </w:tcPr>
+          <w:p>
+            <w:r>
+              <w:rPr>
+                <w:sz w:val="16"/>
+              </w:rPr>
+              <w:t>+0.07% [−0.27,+0.42]</w:t>
+            </w:r>
+          </w:p>
+        </w:tc>
+        <w:tc>
+          <w:tcPr>
+            <w:tcW w:type="dxa" w:w="792"/>
+          </w:tcPr>
+          <w:p>
+            <w:r>
+              <w:rPr>
+                <w:sz w:val="16"/>
+              </w:rPr>
+              <w:t>5/10</w:t>
+            </w:r>
+          </w:p>
+        </w:tc>
+        <w:tc>
+          <w:tcPr>
+            <w:tcW w:type="dxa" w:w="936"/>
+          </w:tcPr>
+          <w:p>
+            <w:r>
+              <w:rPr>
+                <w:sz w:val="16"/>
+              </w:rPr>
+              <w:t>10/10</w:t>
+            </w:r>
+          </w:p>
+        </w:tc>
+        <w:tc>
+          <w:tcPr>
+            <w:tcW w:type="dxa" w:w="936"/>
+          </w:tcPr>
+          <w:p>
+            <w:r>
+              <w:rPr>
+                <w:sz w:val="16"/>
+              </w:rPr>
+              <w:t>7.24%</w:t>
+            </w:r>
+          </w:p>
+        </w:tc>
+        <w:tc>
+          <w:tcPr>
+            <w:tcW w:type="dxa" w:w="936"/>
+          </w:tcPr>
+          <w:p>
+            <w:r>
+              <w:rPr>
+                <w:sz w:val="16"/>
+              </w:rPr>
+              <w:t>7.74%</w:t>
+            </w:r>
+          </w:p>
+        </w:tc>
+      </w:tr>
+      <w:tr>
+        <w:tc>
+          <w:tcPr>
+            <w:tcW w:type="dxa" w:w="1224"/>
+          </w:tcPr>
+          <w:p>
+            <w:r>
+              <w:rPr>
+                <w:sz w:val="16"/>
+              </w:rPr>
+              <w:t>e–h→a–d</w:t>
+            </w:r>
+          </w:p>
+        </w:tc>
+        <w:tc>
+          <w:tcPr>
+            <w:tcW w:type="dxa" w:w="1224"/>
+          </w:tcPr>
+          <w:p>
+            <w:r>
+              <w:rPr>
+                <w:sz w:val="16"/>
+              </w:rPr>
+              <w:t>US joint</w:t>
+            </w:r>
+          </w:p>
+        </w:tc>
+        <w:tc>
+          <w:tcPr>
+            <w:tcW w:type="dxa" w:w="2664"/>
+          </w:tcPr>
+          <w:p>
+            <w:r>
+              <w:rPr>
+                <w:sz w:val="16"/>
+              </w:rPr>
+              <w:t>+0.04% [−0.59,+0.71]</w:t>
+            </w:r>
+          </w:p>
+        </w:tc>
+        <w:tc>
+          <w:tcPr>
+            <w:tcW w:type="dxa" w:w="792"/>
+          </w:tcPr>
+          <w:p>
+            <w:r>
+              <w:rPr>
+                <w:sz w:val="16"/>
+              </w:rPr>
+              <w:t>4/10</w:t>
+            </w:r>
+          </w:p>
+        </w:tc>
+        <w:tc>
+          <w:tcPr>
+            <w:tcW w:type="dxa" w:w="936"/>
+          </w:tcPr>
+          <w:p>
+            <w:r>
+              <w:rPr>
+                <w:sz w:val="16"/>
+              </w:rPr>
+              <w:t>2/10</w:t>
+            </w:r>
+          </w:p>
+        </w:tc>
+        <w:tc>
+          <w:tcPr>
+            <w:tcW w:type="dxa" w:w="936"/>
+          </w:tcPr>
+          <w:p>
+            <w:r>
+              <w:rPr>
+                <w:sz w:val="16"/>
+              </w:rPr>
+              <w:t>7.95%</w:t>
+            </w:r>
+          </w:p>
+        </w:tc>
+        <w:tc>
+          <w:tcPr>
+            <w:tcW w:type="dxa" w:w="936"/>
+          </w:tcPr>
+          <w:p>
+            <w:r>
+              <w:rPr>
+                <w:sz w:val="16"/>
+              </w:rPr>
+              <w:t>8.60%</w:t>
+            </w:r>
+          </w:p>
+        </w:tc>
+      </w:tr>
+      <w:tr>
+        <w:tc>
+          <w:tcPr>
+            <w:tcW w:type="dxa" w:w="1224"/>
+          </w:tcPr>
+          <w:p>
+            <w:r>
+              <w:rPr>
+                <w:sz w:val="16"/>
+              </w:rPr>
+              <w:t>e–h→a–d</w:t>
+            </w:r>
+          </w:p>
+        </w:tc>
+        <w:tc>
+          <w:tcPr>
+            <w:tcW w:type="dxa" w:w="1224"/>
+          </w:tcPr>
+          <w:p>
+            <w:r>
+              <w:rPr>
+                <w:sz w:val="16"/>
+              </w:rPr>
+              <w:t>Global spatial</w:t>
+            </w:r>
+          </w:p>
+        </w:tc>
+        <w:tc>
+          <w:tcPr>
+            <w:tcW w:type="dxa" w:w="2664"/>
+          </w:tcPr>
+          <w:p>
+            <w:r>
+              <w:rPr>
+                <w:sz w:val="16"/>
+              </w:rPr>
+              <w:t>+1.19% [+0.81,+1.58]</w:t>
+            </w:r>
+          </w:p>
+        </w:tc>
+        <w:tc>
+          <w:tcPr>
+            <w:tcW w:type="dxa" w:w="792"/>
+          </w:tcPr>
+          <w:p>
+            <w:r>
+              <w:rPr>
+                <w:sz w:val="16"/>
+              </w:rPr>
+              <w:t>10/10</w:t>
+            </w:r>
+          </w:p>
+        </w:tc>
+        <w:tc>
+          <w:tcPr>
+            <w:tcW w:type="dxa" w:w="936"/>
+          </w:tcPr>
+          <w:p>
+            <w:r>
+              <w:rPr>
+                <w:sz w:val="16"/>
+              </w:rPr>
+              <w:t>10/10</w:t>
+            </w:r>
+          </w:p>
+        </w:tc>
+        <w:tc>
+          <w:tcPr>
+            <w:tcW w:type="dxa" w:w="936"/>
+          </w:tcPr>
+          <w:p>
+            <w:r>
+              <w:rPr>
+                <w:sz w:val="16"/>
+              </w:rPr>
+              <w:t>15.75%</w:t>
+            </w:r>
+          </w:p>
+        </w:tc>
+        <w:tc>
+          <w:tcPr>
+            <w:tcW w:type="dxa" w:w="936"/>
+          </w:tcPr>
+          <w:p>
+            <w:r>
+              <w:rPr>
+                <w:sz w:val="16"/>
+              </w:rPr>
+              <w:t>17.29%</w:t>
+            </w:r>
+          </w:p>
+        </w:tc>
+      </w:tr>
+      <w:tr>
+        <w:tc>
+          <w:tcPr>
+            <w:tcW w:type="dxa" w:w="1224"/>
+          </w:tcPr>
+          <w:p>
+            <w:r>
+              <w:rPr>
+                <w:sz w:val="16"/>
+              </w:rPr>
+              <w:t>e–h→a–d</w:t>
+            </w:r>
+          </w:p>
+        </w:tc>
+        <w:tc>
+          <w:tcPr>
+            <w:tcW w:type="dxa" w:w="1224"/>
+          </w:tcPr>
+          <w:p>
+            <w:r>
+              <w:rPr>
+                <w:sz w:val="16"/>
+              </w:rPr>
+              <w:t>Global joint</w:t>
+            </w:r>
+          </w:p>
+        </w:tc>
+        <w:tc>
+          <w:tcPr>
+            <w:tcW w:type="dxa" w:w="2664"/>
+          </w:tcPr>
+          <w:p>
+            <w:r>
+              <w:rPr>
+                <w:sz w:val="16"/>
+              </w:rPr>
+              <w:t>+1.38% [+0.82,+1.87]</w:t>
+            </w:r>
+          </w:p>
+        </w:tc>
+        <w:tc>
+          <w:tcPr>
+            <w:tcW w:type="dxa" w:w="792"/>
+          </w:tcPr>
+          <w:p>
+            <w:r>
+              <w:rPr>
+                <w:sz w:val="16"/>
+              </w:rPr>
+              <w:t>9/10</w:t>
+            </w:r>
+          </w:p>
+        </w:tc>
+        <w:tc>
+          <w:tcPr>
+            <w:tcW w:type="dxa" w:w="936"/>
+          </w:tcPr>
+          <w:p>
+            <w:r>
+              <w:rPr>
+                <w:sz w:val="16"/>
+              </w:rPr>
+              <w:t>2/10</w:t>
+            </w:r>
+          </w:p>
+        </w:tc>
+        <w:tc>
+          <w:tcPr>
+            <w:tcW w:type="dxa" w:w="936"/>
+          </w:tcPr>
+          <w:p>
+            <w:r>
+              <w:rPr>
+                <w:sz w:val="16"/>
+              </w:rPr>
+              <w:t>16.26%</w:t>
+            </w:r>
+          </w:p>
+        </w:tc>
+        <w:tc>
+          <w:tcPr>
+            <w:tcW w:type="dxa" w:w="936"/>
+          </w:tcPr>
+          <w:p>
+            <w:r>
+              <w:rPr>
+                <w:sz w:val="16"/>
+              </w:rPr>
+              <w:t>17.77%</w:t>
+            </w:r>
+          </w:p>
+        </w:tc>
+      </w:tr>
+    </w:tbl>
+    <w:p>
+      <w:pPr>
+        <w:spacing w:after="40"/>
+      </w:pPr>
+    </w:p>
+    <w:p>
+      <w:pPr>
+        <w:jc w:val="center"/>
+      </w:pPr>
+      <w:r>
+        <w:drawing>
+          <wp:inline xmlns:a="http://schemas.openxmlformats.org/drawingml/2006/main" xmlns:pic="http://schemas.openxmlformats.org/drawingml/2006/picture">
+            <wp:extent cx="6035040" cy="4001739"/>
+            <wp:docPr id="9" name="Picture 9"/>
+            <wp:cNvGraphicFramePr>
+              <a:graphicFrameLocks noChangeAspect="1"/>
+            </wp:cNvGraphicFramePr>
+            <a:graphic>
+              <a:graphicData uri="http://schemas.openxmlformats.org/drawingml/2006/picture">
+                <pic:pic>
+                  <pic:nvPicPr>
+                    <pic:cNvPr id="0" name="held_out_savings.png"/>
+                    <pic:cNvPicPr/>
+                  </pic:nvPicPr>
+                  <pic:blipFill>
+                    <a:blip r:embed="rId17"/>
+                    <a:stretch>
+                      <a:fillRect/>
+                    </a:stretch>
+                  </pic:blipFill>
+                  <pic:spPr>
+                    <a:xfrm>
+                      <a:off x="0" y="0"/>
+                      <a:ext cx="6035040" cy="4001739"/>
+                    </a:xfrm>
+                    <a:prstGeom prst="rect"/>
+                  </pic:spPr>
+                </pic:pic>
+              </a:graphicData>
+            </a:graphic>
+          </wp:inline>
+        </w:drawing>
+      </w:r>
+    </w:p>
+    <w:p>
+      <w:pPr>
+        <w:spacing w:after="120"/>
+        <w:jc w:val="center"/>
+      </w:pPr>
+      <w:r>
+        <w:rPr>
+          <w:sz w:val="16"/>
+        </w:rPr>
+        <w:t>Fig. 9. Held-out seed savings, means, and frozen 95% optimizer-bootstrap intervals. Only Global spatial is positive in both folds.</w:t>
+      </w:r>
+    </w:p>
+    <w:p>
+      <w:pPr>
+        <w:spacing w:after="40"/>
+      </w:pPr>
+      <w:r>
+        <w:rPr>
+          <w:b/>
+          <w:i/>
+          <w:sz w:val="20"/>
+        </w:rPr>
+        <w:t>A. The only robust learned success: Global spatial</w:t>
       </w:r>
     </w:p>
     <w:p>
@@ -4726,7 +6199,291 @@
           <w:i w:val="0"/>
           <w:sz w:val="19"/>
         </w:rPr>
-        <w:t>The active thesis experiment now begins with a reproducible real energy model rather than a mixture of synthetic regional inputs. One May-2025 CAISO net-demand/solar series and one NP15 day-ahead price series are shifted together across four US and four global local-time slots. The 8,928-step calendar preserves negative prices, aligns the average trough near noon and the average peak near 20:00 PDT, and yields price/net-demand correlation of approximately 0.895. Continuous boundary handling keeps real chronology: Singapore's slightly higher monthly mean comes from substituting 15 real June boundary hours, not extra duration or a regional premium. Equal 100 MW unit-capacity proxies and observed current batch arrivals now pass the preflight. The corrected QP gate shows 8.0–17.4% joint headroom but only 0.6–2.3% incremental temporal value. α=0.015 makes grid stress about 18% of energy cost; the standardized demand charge remains secondary. The mixed/synthetic v1 campaigns remain archived; no learned-policy claim will be promoted until the frozen v2 out-of-fold campaign is trained and evaluated.</w:t>
+        <w:t>Global spatial PPO saves 0.90% and 1.19% on the two held-out folds, with complete service and positive optimizer-bootstrap intervals. Wider n=10 Student-t intervals remain positive: [0.24,1.55]% and [0.71,1.66]%. The effect is real within this frozen optimizer-seed experiment but small and optimistic because routing is unrestricted. PPO captures only 5.47% and 7.55% of available QP savings.</w:t>
+      </w:r>
+    </w:p>
+    <w:p>
+      <w:pPr>
+        <w:spacing w:after="40"/>
+      </w:pPr>
+      <w:r>
+        <w:rPr>
+          <w:b/>
+          <w:i/>
+          <w:sz w:val="20"/>
+        </w:rPr>
+        <w:t>B. US spatial savings are not established</w:t>
+      </w:r>
+    </w:p>
+    <w:p>
+      <w:pPr>
+        <w:spacing w:after="60"/>
+      </w:pPr>
+      <w:r>
+        <w:rPr>
+          <w:b w:val="0"/>
+          <w:i w:val="0"/>
+          <w:sz w:val="19"/>
+        </w:rPr>
+        <w:t>US a–d→e–h averages −0.29% [−0.76,+0.15] and its PPO mean also loses to Round Robin. The reverse fold averages +0.07% [−0.27,+0.42]. Thus US spatial is consistent with a small loss in one direction and indistinguishable from zero in the other.</w:t>
+      </w:r>
+    </w:p>
+    <w:p>
+      <w:pPr>
+        <w:spacing w:after="40"/>
+      </w:pPr>
+      <w:r>
+        <w:rPr>
+          <w:b/>
+          <w:i/>
+          <w:sz w:val="20"/>
+        </w:rPr>
+        <w:t>C. Joint batch control fails the frozen criterion</w:t>
+      </w:r>
+    </w:p>
+    <w:p>
+      <w:pPr>
+        <w:spacing w:after="60"/>
+      </w:pPr>
+      <w:r>
+        <w:rPr>
+          <w:b w:val="0"/>
+          <w:i w:val="0"/>
+          <w:sz w:val="19"/>
+        </w:rPr>
+        <w:t>Joint PPO does not reliably improve over separately trained spatial PPO. It is worse in both US folds and Global a–d→e–h, and only 0.19% better in the remaining Global fold. This is not a clean estimate of pure temporal value because completion fails in 31/40 batch seeds. Only 9/40 seeds (2 configs × 2 folds × 10) meet the 99.99% floor; no joint configuration reaches 4/10 feasible seeds in a fold.</w:t>
+      </w:r>
+    </w:p>
+    <w:p>
+      <w:pPr>
+        <w:spacing w:after="60"/>
+      </w:pPr>
+      <w:r>
+        <w:rPr>
+          <w:b w:val="0"/>
+          <w:i w:val="0"/>
+          <w:sz w:val="19"/>
+        </w:rPr>
+        <w:t>All 80 policies complete 100% of service. Global joint e–h→a–d seed 103 expires 0.889 normalized units. US joint a–d→e–h seed 101 leaves the largest terminal pool (7.690 units) and accumulates $2.289M of transient service-backlog cost, producing the −39.77% outlier. The QP proves temporal opportunity exists; PPO does not capture it reliably.</w:t>
+      </w:r>
+    </w:p>
+    <w:p>
+      <w:pPr>
+        <w:jc w:val="center"/>
+      </w:pPr>
+      <w:r>
+        <w:drawing>
+          <wp:inline xmlns:a="http://schemas.openxmlformats.org/drawingml/2006/main" xmlns:pic="http://schemas.openxmlformats.org/drawingml/2006/picture">
+            <wp:extent cx="6035040" cy="2336767"/>
+            <wp:docPr id="10" name="Picture 10"/>
+            <wp:cNvGraphicFramePr>
+              <a:graphicFrameLocks noChangeAspect="1"/>
+            </wp:cNvGraphicFramePr>
+            <a:graphic>
+              <a:graphicData uri="http://schemas.openxmlformats.org/drawingml/2006/picture">
+                <pic:pic>
+                  <pic:nvPicPr>
+                    <pic:cNvPr id="0" name="qp_capture.png"/>
+                    <pic:cNvPicPr/>
+                  </pic:nvPicPr>
+                  <pic:blipFill>
+                    <a:blip r:embed="rId18"/>
+                    <a:stretch>
+                      <a:fillRect/>
+                    </a:stretch>
+                  </pic:blipFill>
+                  <pic:spPr>
+                    <a:xfrm>
+                      <a:off x="0" y="0"/>
+                      <a:ext cx="6035040" cy="2336767"/>
+                    </a:xfrm>
+                    <a:prstGeom prst="rect"/>
+                  </pic:spPr>
+                </pic:pic>
+              </a:graphicData>
+            </a:graphic>
+          </wp:inline>
+        </w:drawing>
+      </w:r>
+    </w:p>
+    <w:p>
+      <w:pPr>
+        <w:spacing w:after="120"/>
+        <w:jc w:val="center"/>
+      </w:pPr>
+      <w:r>
+        <w:rPr>
+          <w:sz w:val="16"/>
+        </w:rPr>
+        <w:t>Fig. 10. Clairvoyant opportunity versus learned held-out savings. Large QP headroom does not translate into comparable PPO gains.</w:t>
+      </w:r>
+    </w:p>
+    <w:p>
+      <w:pPr>
+        <w:spacing w:after="40"/>
+      </w:pPr>
+      <w:r>
+        <w:rPr>
+          <w:b/>
+          <w:i/>
+          <w:sz w:val="20"/>
+        </w:rPr>
+        <w:t>D. Secondary billing and physical-grid effects</w:t>
+      </w:r>
+    </w:p>
+    <w:p>
+      <w:pPr>
+        <w:spacing w:after="60"/>
+      </w:pPr>
+      <w:r>
+        <w:rPr>
+          <w:b w:val="0"/>
+          <w:i w:val="0"/>
+          <w:sz w:val="19"/>
+        </w:rPr>
+        <w:t>Spatial PPO lowers the standardized secondary demand charge by 1.4–3.0% across folds. Joint PPO raises it by 5.3–8.1%, showing that unstable temporal control can reduce the primary objective while worsening a site peak tariff. Ramp rate is not optimized: joint PPO worsens the rare maximum three-hour ramp across all sites in every fold by +1.09 to +3.05 MW, although typical p95 three-hour ramps improve. Spatial ramp effects are small and mixed.</w:t>
+      </w:r>
+    </w:p>
+    <w:p>
+      <w:pPr>
+        <w:jc w:val="center"/>
+      </w:pPr>
+      <w:r>
+        <w:drawing>
+          <wp:inline xmlns:a="http://schemas.openxmlformats.org/drawingml/2006/main" xmlns:pic="http://schemas.openxmlformats.org/drawingml/2006/picture">
+            <wp:extent cx="6035040" cy="4270394"/>
+            <wp:docPr id="11" name="Picture 11"/>
+            <wp:cNvGraphicFramePr>
+              <a:graphicFrameLocks noChangeAspect="1"/>
+            </wp:cNvGraphicFramePr>
+            <a:graphic>
+              <a:graphicData uri="http://schemas.openxmlformats.org/drawingml/2006/picture">
+                <pic:pic>
+                  <pic:nvPicPr>
+                    <pic:cNvPr id="0" name="secondary_effects.png"/>
+                    <pic:cNvPicPr/>
+                  </pic:nvPicPr>
+                  <pic:blipFill>
+                    <a:blip r:embed="rId19"/>
+                    <a:stretch>
+                      <a:fillRect/>
+                    </a:stretch>
+                  </pic:blipFill>
+                  <pic:spPr>
+                    <a:xfrm>
+                      <a:off x="0" y="0"/>
+                      <a:ext cx="6035040" cy="4270394"/>
+                    </a:xfrm>
+                    <a:prstGeom prst="rect"/>
+                  </pic:spPr>
+                </pic:pic>
+              </a:graphicData>
+            </a:graphic>
+          </wp:inline>
+        </w:drawing>
+      </w:r>
+    </w:p>
+    <w:p>
+      <w:pPr>
+        <w:spacing w:after="120"/>
+        <w:jc w:val="center"/>
+      </w:pPr>
+      <w:r>
+        <w:rPr>
+          <w:sz w:val="16"/>
+        </w:rPr>
+        <w:t>Fig. 11. Secondary demand-charge and physical ramp effects versus held-out Status Quo. Negative values indicate improvement.</w:t>
+      </w:r>
+    </w:p>
+    <w:p>
+      <w:pPr>
+        <w:spacing w:after="40"/>
+      </w:pPr>
+      <w:r>
+        <w:rPr>
+          <w:b/>
+          <w:i/>
+          <w:sz w:val="20"/>
+        </w:rPr>
+        <w:t>E. Empirical conclusion and claim boundary</w:t>
+      </w:r>
+    </w:p>
+    <w:p>
+      <w:pPr>
+        <w:spacing w:after="60"/>
+      </w:pPr>
+      <w:r>
+        <w:rPr>
+          <w:b w:val="0"/>
+          <w:i w:val="0"/>
+          <w:sz w:val="19"/>
+        </w:rPr>
+        <w:t>The frozen campaign supports a narrow conclusion: one real CAISO archetype contains substantial optimistic spatial opportunity, and PPO captures a small reproducible part only in the Global spatial setting. It does not establish US savings or reliable joint spatio-temporal optimization. Claims are limited to optimizer-seed variability, one Google workload month, one CAISO energy month, equal 100 MW proxies, unrestricted routing, and the constructed Φ metric. This negative headline result is scientifically useful: it identifies batch-safe constrained control and stronger spatial policy optimization as the next algorithmic problems.</w:t>
+      </w:r>
+    </w:p>
+    <w:p>
+      <w:pPr>
+        <w:sectPr>
+          <w:type w:val="continuous"/>
+          <w:pgSz w:w="12240" w:h="15840"/>
+          <w:pgMar w:top="1080" w:right="1080" w:bottom="1080" w:left="1080" w:header="720" w:footer="720" w:gutter="0"/>
+          <w:cols w:space="240" w:num="1"/>
+          <w:docGrid w:linePitch="360"/>
+        </w:sectPr>
+      </w:pPr>
+    </w:p>
+    <w:p>
+      <w:pPr>
+        <w:spacing w:after="80"/>
+        <w:jc w:val="center"/>
+      </w:pPr>
+      <w:r>
+        <w:rPr>
+          <w:b/>
+          <w:i w:val="0"/>
+          <w:sz w:val="21"/>
+        </w:rPr>
+        <w:t>VII. FURTHER TOPICS OF CONSIDERATION</w:t>
+      </w:r>
+    </w:p>
+    <w:p>
+      <w:pPr>
+        <w:spacing w:after="60"/>
+      </w:pPr>
+      <w:r>
+        <w:rPr>
+          <w:b w:val="0"/>
+          <w:i w:val="0"/>
+          <w:sz w:val="19"/>
+        </w:rPr>
+        <w:t>(1) Batch-safe constrained control is first priority: enforce terminal completion/deadline feasibility during policy optimization rather than accepting a penalty-mediated 31/40 seed failure rate. (2) Improve spatial policy optimization, especially for Global where PPO captures only 5.47–7.55% of QP savings, and diagnose the asymmetric US transfer. (3) Add ramp-aware training or constraints because joint PPO worsens rare maximum three-hour ramps, while preserving the observed p95 improvement. (4) Add the secondary demand charge to a true multi-objective/Pareto study because joint PPO raises the reference bill 5.3–8.1%. (5) Bound Global routing with latency, residency, network capacity, and movement costs. (6) Add a causal receding-horizon MPC comparator. (7) Test CAISO five-minute RTM, other energy months/years, and other workload traces. (8) Add carbon intensity, storage, and demand-response participation only after the core control problem is stable.</w:t>
+      </w:r>
+    </w:p>
+    <w:p>
+      <w:pPr>
+        <w:spacing w:after="80"/>
+        <w:jc w:val="center"/>
+      </w:pPr>
+      <w:r>
+        <w:rPr>
+          <w:b/>
+          <w:i w:val="0"/>
+          <w:sz w:val="21"/>
+        </w:rPr>
+        <w:t>VIII. CONCLUSION</w:t>
+      </w:r>
+    </w:p>
+    <w:p>
+      <w:pPr>
+        <w:spacing w:after="60"/>
+      </w:pPr>
+      <w:r>
+        <w:rPr>
+          <w:b w:val="0"/>
+          <w:i w:val="0"/>
+          <w:sz w:val="19"/>
+        </w:rPr>
+        <w:t>This thesis builds a reproducible chain from measured Google service/batch usage and PowerData2019 calibration to one real May-2025 CAISO energy archetype, equal 100 MW proxy DCs, a joint PPO controller, and a frozen two-fold held-out evaluation. The system exposes substantial clairvoyant spatial headroom (7.2–16.4%) and modest incremental temporal headroom (0.6–2.3%). Learned performance is much narrower. Global spatial PPO saves 0.90% and 1.19% on the two held-out folds with positive optimizer CIs and complete service, but captures only 5.47–7.55% of QP savings. US spatial does not establish savings. Joint batch PPO fails the frozen headline: only 9/40 seeds meet the completion floor, gains are fold-dependent, and rare maximum ramps and the secondary demand-charge reference worsen. The defensible contribution is therefore the real, audited experimental system; the modest optimistic Global spatial result; and the negative evidence that unconstrained PPO does not yet solve reliable joint spatio-temporal shaping. The next step is not a stronger claim but safer batch control and better capture of demonstrable spatial opportunity.</w:t>
       </w:r>
     </w:p>
     <w:p>

</xml_diff>

<commit_message>
v4 with improved safety
</commit_message>
<xml_diff>
--- a/thesis_paper.docx
+++ b/thesis_paper.docx
@@ -55,7 +55,7 @@
           <w:i/>
           <w:sz w:val="16"/>
         </w:rPr>
-        <w:t>Master's Thesis Draft — frozen energy-model v2 campaign: 80 PPO models, two symmetric held-out workload folds, and 10 optimizer seeds/configuration. The broad joint-shaping headline criterion failed; v1 remains historical. A post-hoc exploratory v3 recovery study (Sec. VII) partially repairs a v2 state-observability defect and re-screens PPO under a stricter safety-first gate; it still fails, reinforcing rather than reversing the frozen v2 conclusion.</w:t>
+        <w:t>Master's Thesis Draft — frozen energy-model v2 campaign: 80 PPO models, two symmetric held-out workload folds, and 10 optimizer seeds/configuration. The broad joint-shaping headline criterion failed; v1 remains historical. A post-hoc exploratory v3 recovery study (Sec. VII) partially repairs a v2 state-observability defect and re-screens PPO under a stricter safety-first gate; it still fails, reinforcing rather than reversing the frozen v2 conclusion. A completed v4 hard-safety study (Sec. VIII) then adds a non-MPC one-step feasibility projector — 36 newly trained models plus an archived-policy replay — that gives every evaluated seed exact completion with zero infeasibility certificates, while honestly separating the deterministic safety guarantee from the learned, projector-mediated economics.</w:t>
       </w:r>
     </w:p>
     <w:p>
@@ -68,7 +68,7 @@
           <w:i w:val="0"/>
           <w:sz w:val="18"/>
         </w:rPr>
-        <w:t>Abstract — Hyperscale data centers are now grid-scale electrical loads whose consumption coincides with regional net-demand peaks (the “duck curve”). We study whether a reinforcement-learning agent can route workload across geographically distributed data centers — spatially (where) and temporally (when, for deferrable batch work) — to minimize electricity cost while reducing the fleet's contribution to grid stress. The active experiment combines Google ClusterData 2019 workload shapes and PowerData2019-calibrated power models with one co-timestamped, real May-2025 CAISO archetype: native five-minute net demand and solar plus NP15 day-ahead LMP. Price and net demand are shifted together by local wall time across four US slots and four global slots, preserving negative prices and signed net demand over a complete 8,928-step (744-hour) experiment. Measured workload shapes map to equal 100 MW/unit-capacity proxies, and current batch arrivals are observed before same-step release. Routing is unrestricted and therefore represents an optimistic upper bound, not a deployment claim. The corrected clairvoyant-QP gate finds 8.0–17.4% joint headroom, of which only 0.6–2.3% is incremental temporal value. We then train 80 PPO models under a frozen two-fold a–d/e–h protocol with 10 seeds/configuration and no test-fold selection. Global spatial PPO is the only robust learned success, saving 0.90% and 1.19% on the two held-out folds; both optimizer-bootstrap CIs and wider t-interval sensitivities remain positive. US spatial savings are not established (−0.29% and +0.07%). Joint batch control fails the frozen headline: only 9/40 batch seeds meet the 99.99% completion floor, and joint PPO does not reliably improve over separately trained spatial PPO. Spatial PPO lowers the secondary demand-charge reference, whereas joint PPO raises it and worsens rare maximum three-hour ramps. Thus the evidence supports a small optimistic Global spatial effect, not reliable joint spatio-temporal optimization. A post-hoc exploratory v3 study adds episode progress and deadline buckets and re-screens PPO across a GAE/KL/learning-rate/idle-subtraction/potential/normalization sweep and a three-point budget curve (151,552–1,003,520 steps) under a stricter safety-first gate requiring all ten seeds feasible and a positive optimizer-bootstrap interval. It still fails: the safety-first-selected US configuration is 1/10 feasible with a CI crossing zero, and the Global configuration is 1/10 feasible despite a positive CI, so unconstrained PPO remains unsuitable as a trustworthy joint controller under this model.</w:t>
+        <w:t>Abstract — Hyperscale data centers are now grid-scale electrical loads whose consumption coincides with regional net-demand peaks (the “duck curve”). We study whether a reinforcement-learning agent can route workload across geographically distributed data centers — spatially (where) and temporally (when, for deferrable batch work) — to minimize electricity cost while reducing the fleet's contribution to grid stress. The active experiment combines Google ClusterData 2019 workload shapes and PowerData2019-calibrated power models with one co-timestamped, real May-2025 CAISO archetype: native five-minute net demand and solar plus NP15 day-ahead LMP. Price and net demand are shifted together by local wall time across four US slots and four global slots, preserving negative prices and signed net demand over a complete 8,928-step (744-hour) experiment. Measured workload shapes map to equal 100 MW/unit-capacity proxies, and current batch arrivals are observed before same-step release. Routing is unrestricted and therefore represents an optimistic upper bound, not a deployment claim. The corrected clairvoyant-QP gate finds 8.0–17.4% joint headroom, of which only 0.6–2.3% is incremental temporal value. We then train 80 PPO models under a frozen two-fold a–d/e–h protocol with 10 seeds/configuration and no test-fold selection. Global spatial PPO is the only robust learned success, saving 0.90% and 1.19% on the two held-out folds; both optimizer-bootstrap CIs and wider t-interval sensitivities remain positive. US spatial savings are not established (−0.29% and +0.07%). Joint batch control fails the frozen headline: only 9/40 batch seeds meet the 99.99% completion floor, and joint PPO does not reliably improve over separately trained spatial PPO. Spatial PPO lowers the secondary demand-charge reference, whereas joint PPO raises it and worsens rare maximum three-hour ramps. Thus the evidence supports a small optimistic Global spatial effect, not reliable joint spatio-temporal optimization. A post-hoc exploratory v3 study adds episode progress and deadline buckets and re-screens PPO across a GAE/KL/learning-rate/idle-subtraction/potential/normalization sweep and a three-point budget curve (151,552–1,003,520 steps) under a stricter safety-first gate requiring all ten seeds feasible and a positive optimizer-bootstrap interval. It still fails: the safety-first-selected US configuration is 1/10 feasible with a CI crossing zero, and the Global configuration is 1/10 feasible despite a positive CI, so unconstrained PPO remains unsuitable as a trustworthy joint controller under this model. A completed v4 hard-safety study (Sec. VIII) then replaces the shaped, sigmoid-capped drain decoder with a non-MPC one-step Euclidean feasibility projector — cumulative exact earliest-deadline-first admission, exact transport conservation, and exact 0–100% drain endpoints under a frozen, train-only-derived capacity bound with a proven no-leakage property — and trains 36 new PPO+projector models (plus a no-retraining replay of the archived v3 weights). Every evaluated seed, across replay, the staged a–d gate, and descriptive e–h transfer, reaches exact completion with zero expiry and zero infeasibility certificates. US remains economically indistinguishable from Status Quo (−0.246% a–d, −0.149% e–h) while the projector rarely intervenes (≤0.6% of steps); Global is unambiguously positive (+3.262% a–d, +3.611% e–h, every seed and CI positive) but the projector materially alters roughly one step in five (18.8–20.2%), so that gain is attributed to the composed PPO+projector system rather than to unconstrained PPO alone.</w:t>
       </w:r>
     </w:p>
     <w:p>
@@ -96,6 +96,7 @@
     </w:p>
     <w:p>
       <w:pPr>
+        <w:keepNext/>
         <w:spacing w:after="80"/>
         <w:jc w:val="center"/>
       </w:pPr>
@@ -144,11 +145,12 @@
           <w:i w:val="0"/>
           <w:sz w:val="19"/>
         </w:rPr>
-        <w:t>Contributions. (C1) A reproducible Gymnasium environment for multi-data-center grid-aware load shaping at cell-aggregate granularity, grounded in Google ClusterData 2019 [1] and PowerData2019 [2]. (C2) Ground-truth measured per-tier demand decomposition (SLO service vs. no-SLO batch) of four trace cells, with the finding that resource requests overestimate the deferrable usage share by 3–5×. (C3) A real, reproducible May-2025 CAISO duck-curve/price archetype whose paired signals are shifted by IANA local wall time across US and global slots. (C4) A no-training QP gate that sizes the opportunity before policy selection and shows that spatial diversity dominates temporal flexibility. (C5) A provenance-locked 80-model held-out campaign showing a robust but small Global spatial effect and a negative result for reliable joint batch control. (C6) A preserved audit trail of the retired mixed/synthetic model and the simulator corrections that prevented invalid results from being promoted. (C7) A post-hoc exploratory v3 state-repair and budget-scaling study (Sec. VII) showing the v2 joint failure survives an augmented state representation and a 2× larger training budget, so it is not merely an observability artifact.</w:t>
+        <w:t>Contributions. (C1) A reproducible Gymnasium environment for multi-data-center grid-aware load shaping at cell-aggregate granularity, grounded in Google ClusterData 2019 [1] and PowerData2019 [2]. (C2) Ground-truth measured per-tier demand decomposition (SLO service vs. no-SLO batch) of four trace cells, with the finding that resource requests overestimate the deferrable usage share by 3–5×. (C3) A real, reproducible May-2025 CAISO duck-curve/price archetype whose paired signals are shifted by IANA local wall time across US and global slots. (C4) A no-training QP gate that sizes the opportunity before policy selection and shows that spatial diversity dominates temporal flexibility. (C5) A provenance-locked 80-model held-out campaign showing a robust but small Global spatial effect and a negative result for reliable joint batch control. (C6) A preserved audit trail of the retired mixed/synthetic model and the simulator corrections that prevented invalid results from being promoted. (C7) A post-hoc exploratory v3 state-repair and budget-scaling study (Sec. VII) showing the v2 joint failure survives an augmented state representation and a 2× larger training budget, so it is not merely an observability artifact. (C8) A completed v4 hard-safety study (Sec. VIII): a non-MPC one-step feasibility projector with a frozen, train-only, no-leakage capacity envelope, exact transport and exact drain endpoints, a ten-test smoke suite, and a staged replay/short/medium/full/e–h gate protocol across 36 newly trained models that achieves zero completion failures fleet-wide while making explicit that Global's positive economic result — unlike US's null one — is jointly attributable to the PPO+projector system rather than to the learned policy alone.</w:t>
       </w:r>
     </w:p>
     <w:p>
       <w:pPr>
+        <w:keepNext/>
         <w:spacing w:after="80"/>
         <w:jc w:val="center"/>
       </w:pPr>
@@ -176,6 +178,7 @@
     </w:p>
     <w:p>
       <w:pPr>
+        <w:keepNext/>
         <w:spacing w:after="40"/>
       </w:pPr>
       <w:r>
@@ -215,6 +218,7 @@
     </w:p>
     <w:p>
       <w:pPr>
+        <w:keepNext/>
         <w:spacing w:after="40"/>
       </w:pPr>
       <w:r>
@@ -241,6 +245,7 @@
     </w:p>
     <w:p>
       <w:pPr>
+        <w:keepNext/>
         <w:spacing w:after="40"/>
       </w:pPr>
       <w:r>
@@ -267,6 +272,7 @@
     </w:p>
     <w:p>
       <w:pPr>
+        <w:keepNext/>
         <w:spacing w:after="40"/>
       </w:pPr>
       <w:r>
@@ -306,6 +312,7 @@
     </w:p>
     <w:p>
       <w:pPr>
+        <w:keepNext/>
         <w:spacing w:after="40"/>
       </w:pPr>
       <w:r>
@@ -332,6 +339,7 @@
     </w:p>
     <w:p>
       <w:pPr>
+        <w:keepNext/>
         <w:spacing w:after="80"/>
         <w:jc w:val="center"/>
       </w:pPr>
@@ -359,6 +367,7 @@
     </w:p>
     <w:p>
       <w:pPr>
+        <w:keepNext/>
         <w:spacing w:after="40"/>
       </w:pPr>
       <w:r>
@@ -619,6 +628,7 @@
     </w:p>
     <w:p>
       <w:pPr>
+        <w:keepNext/>
         <w:spacing w:after="40"/>
       </w:pPr>
       <w:r>
@@ -710,6 +720,7 @@
     </w:p>
     <w:p>
       <w:pPr>
+        <w:keepNext/>
         <w:spacing w:after="40"/>
       </w:pPr>
       <w:r>
@@ -801,6 +812,7 @@
     </w:p>
     <w:p>
       <w:pPr>
+        <w:keepNext/>
         <w:spacing w:after="40"/>
       </w:pPr>
       <w:r>
@@ -1414,6 +1426,7 @@
     </w:p>
     <w:p>
       <w:pPr>
+        <w:keepNext/>
         <w:spacing w:after="40"/>
       </w:pPr>
       <w:r>
@@ -1505,6 +1518,7 @@
     </w:p>
     <w:p>
       <w:pPr>
+        <w:keepNext/>
         <w:spacing w:after="80"/>
         <w:jc w:val="center"/>
       </w:pPr>
@@ -1519,6 +1533,7 @@
     </w:p>
     <w:p>
       <w:pPr>
+        <w:keepNext/>
         <w:spacing w:after="40"/>
       </w:pPr>
       <w:r>
@@ -1545,6 +1560,7 @@
     </w:p>
     <w:p>
       <w:pPr>
+        <w:keepNext/>
         <w:spacing w:after="40"/>
       </w:pPr>
       <w:r>
@@ -1991,6 +2007,7 @@
     </w:p>
     <w:p>
       <w:pPr>
+        <w:keepNext/>
         <w:spacing w:after="40"/>
       </w:pPr>
       <w:r>
@@ -2437,6 +2454,7 @@
     </w:p>
     <w:p>
       <w:pPr>
+        <w:keepNext/>
         <w:spacing w:after="40"/>
       </w:pPr>
       <w:r>
@@ -2463,6 +2481,7 @@
     </w:p>
     <w:p>
       <w:pPr>
+        <w:keepNext/>
         <w:spacing w:after="40"/>
       </w:pPr>
       <w:r>
@@ -2502,6 +2521,7 @@
     </w:p>
     <w:p>
       <w:pPr>
+        <w:keepNext/>
         <w:spacing w:after="40"/>
       </w:pPr>
       <w:r>
@@ -2541,6 +2561,7 @@
     </w:p>
     <w:p>
       <w:pPr>
+        <w:keepNext/>
         <w:spacing w:after="40"/>
       </w:pPr>
       <w:r>
@@ -3338,6 +3359,7 @@
     </w:p>
     <w:p>
       <w:pPr>
+        <w:keepNext/>
         <w:spacing w:after="40"/>
       </w:pPr>
       <w:r>
@@ -3856,6 +3878,7 @@
     </w:p>
     <w:p>
       <w:pPr>
+        <w:keepNext/>
         <w:spacing w:after="40"/>
       </w:pPr>
       <w:r>
@@ -3946,6 +3969,7 @@
     </w:p>
     <w:p>
       <w:pPr>
+        <w:keepNext/>
         <w:spacing w:after="40"/>
       </w:pPr>
       <w:r>
@@ -4396,6 +4420,7 @@
     </w:p>
     <w:p>
       <w:pPr>
+        <w:keepNext/>
         <w:spacing w:after="40"/>
       </w:pPr>
       <w:r>
@@ -4422,6 +4447,7 @@
     </w:p>
     <w:p>
       <w:pPr>
+        <w:keepNext/>
         <w:spacing w:after="40"/>
       </w:pPr>
       <w:r>
@@ -4588,6 +4614,7 @@
     </w:p>
     <w:p>
       <w:pPr>
+        <w:keepNext/>
         <w:spacing w:after="40"/>
       </w:pPr>
       <w:r>
@@ -4614,6 +4641,7 @@
     </w:p>
     <w:p>
       <w:pPr>
+        <w:keepNext/>
         <w:spacing w:after="40"/>
       </w:pPr>
       <w:r>
@@ -4640,6 +4668,7 @@
     </w:p>
     <w:p>
       <w:pPr>
+        <w:keepNext/>
         <w:spacing w:after="40"/>
       </w:pPr>
       <w:r>
@@ -4677,6 +4706,7 @@
     </w:p>
     <w:p>
       <w:pPr>
+        <w:keepNext/>
         <w:spacing w:after="80"/>
         <w:jc w:val="center"/>
       </w:pPr>
@@ -4755,6 +4785,7 @@
     </w:p>
     <w:p>
       <w:pPr>
+        <w:keepNext/>
         <w:spacing w:after="40"/>
       </w:pPr>
       <w:r>
@@ -4781,6 +4812,7 @@
     </w:p>
     <w:p>
       <w:pPr>
+        <w:keepNext/>
         <w:spacing w:after="40"/>
       </w:pPr>
       <w:r>
@@ -4807,6 +4839,7 @@
     </w:p>
     <w:p>
       <w:pPr>
+        <w:keepNext/>
         <w:spacing w:after="40"/>
       </w:pPr>
       <w:r>
@@ -4833,6 +4866,7 @@
     </w:p>
     <w:p>
       <w:pPr>
+        <w:keepNext/>
         <w:spacing w:after="40"/>
       </w:pPr>
       <w:r>
@@ -5197,6 +5231,7 @@
     </w:p>
     <w:p>
       <w:pPr>
+        <w:keepNext/>
         <w:spacing w:after="40"/>
       </w:pPr>
       <w:r>
@@ -5223,6 +5258,7 @@
     </w:p>
     <w:p>
       <w:pPr>
+        <w:keepNext/>
         <w:spacing w:after="80"/>
         <w:jc w:val="center"/>
       </w:pPr>
@@ -6178,6 +6214,7 @@
     </w:p>
     <w:p>
       <w:pPr>
+        <w:keepNext/>
         <w:spacing w:after="40"/>
       </w:pPr>
       <w:r>
@@ -6204,6 +6241,7 @@
     </w:p>
     <w:p>
       <w:pPr>
+        <w:keepNext/>
         <w:spacing w:after="40"/>
       </w:pPr>
       <w:r>
@@ -6230,6 +6268,7 @@
     </w:p>
     <w:p>
       <w:pPr>
+        <w:keepNext/>
         <w:spacing w:after="40"/>
       </w:pPr>
       <w:r>
@@ -6333,6 +6372,7 @@
     </w:p>
     <w:p>
       <w:pPr>
+        <w:keepNext/>
         <w:spacing w:after="40"/>
       </w:pPr>
       <w:r>
@@ -6410,6 +6450,7 @@
     </w:p>
     <w:p>
       <w:pPr>
+        <w:keepNext/>
         <w:spacing w:after="40"/>
       </w:pPr>
       <w:r>
@@ -6436,6 +6477,7 @@
     </w:p>
     <w:p>
       <w:pPr>
+        <w:keepNext/>
         <w:spacing w:after="80"/>
         <w:jc w:val="center"/>
       </w:pPr>
@@ -6463,6 +6505,7 @@
     </w:p>
     <w:p>
       <w:pPr>
+        <w:keepNext/>
         <w:spacing w:after="40"/>
       </w:pPr>
       <w:r>
@@ -6489,6 +6532,7 @@
     </w:p>
     <w:p>
       <w:pPr>
+        <w:keepNext/>
         <w:spacing w:after="40"/>
       </w:pPr>
       <w:r>
@@ -6515,6 +6559,7 @@
     </w:p>
     <w:p>
       <w:pPr>
+        <w:keepNext/>
         <w:spacing w:after="40"/>
       </w:pPr>
       <w:r>
@@ -9406,6 +9451,7 @@
     </w:p>
     <w:p>
       <w:pPr>
+        <w:keepNext/>
         <w:spacing w:after="40"/>
       </w:pPr>
       <w:r>
@@ -10123,6 +10169,7 @@
     </w:p>
     <w:p>
       <w:pPr>
+        <w:keepNext/>
         <w:spacing w:after="40"/>
       </w:pPr>
       <w:r>
@@ -10509,6 +10556,7 @@
     </w:p>
     <w:p>
       <w:pPr>
+        <w:keepNext/>
         <w:spacing w:after="40"/>
       </w:pPr>
       <w:r>
@@ -10826,6 +10874,7 @@
     </w:p>
     <w:p>
       <w:pPr>
+        <w:keepNext/>
         <w:spacing w:after="40"/>
       </w:pPr>
       <w:r>
@@ -11357,6 +11406,7 @@
     </w:p>
     <w:p>
       <w:pPr>
+        <w:keepNext/>
         <w:spacing w:after="40"/>
       </w:pPr>
       <w:r>
@@ -11383,6 +11433,2724 @@
     </w:p>
     <w:p>
       <w:pPr>
+        <w:keepNext/>
+        <w:spacing w:after="80"/>
+        <w:jc w:val="center"/>
+      </w:pPr>
+      <w:r>
+        <w:rPr>
+          <w:b/>
+          <w:i w:val="0"/>
+          <w:sz w:val="21"/>
+        </w:rPr>
+        <w:t>VIII. COMPLETED V4 HARD-SAFETY STUDY: A NON-MPC ONE-STEP FEASIBILITY PROJECTOR</w:t>
+      </w:r>
+    </w:p>
+    <w:p>
+      <w:pPr>
+        <w:spacing w:after="60"/>
+      </w:pPr>
+      <w:r>
+        <w:rPr>
+          <w:b w:val="0"/>
+          <w:i w:val="0"/>
+          <w:sz w:val="19"/>
+        </w:rPr>
+        <w:t>Status — COMPLETED, PROTOCOL-FROZEN (env/protocols/v4_safety.yaml, parent protocol ppo-reward-sweep-v3, parent commit a989465). This section answers the Sec. VII-G/-H call for a hard, non-MPC joint feasibility/action-projection layer by replacing the sigmoid-decoded, penalty-shaped drain head with a deterministic one-step Euclidean projector that gives every evaluated episode exact service/batch completion and zero expiry under the frozen causal envelope; infeasible states fail closed with certificates rather than degrading silently. These properties come from construction, not reward learning. It reuses the frozen v3 selected configurations unchanged (US R3_P1, Global R0_P3, Sec. VII-C/-E) and trains 36 new models across a staged short/medium/full protocol, plus replays the archived (frozen) v3 policy weights through the projector without any retraining as a separate diagnostic. It explicitly excludes model-predictive control, spatial-only training, and temporal-only training (identical exclusions to v2/v3), and cells e–h remain descriptive-only because they were already exposed by v2/v3 (fresh_confirmatory_data_available: false).</w:t>
+      </w:r>
+    </w:p>
+    <w:p>
+      <w:pPr>
+        <w:keepNext/>
+        <w:spacing w:after="40"/>
+      </w:pPr>
+      <w:r>
+        <w:rPr>
+          <w:b/>
+          <w:i/>
+          <w:sz w:val="20"/>
+        </w:rPr>
+        <w:t>A. From soft shaping to hard projection</w:t>
+      </w:r>
+    </w:p>
+    <w:p>
+      <w:pPr>
+        <w:spacing w:after="60"/>
+      </w:pPr>
+      <w:r>
+        <w:rPr>
+          <w:b w:val="0"/>
+          <w:i w:val="0"/>
+          <w:sz w:val="19"/>
+        </w:rPr>
+        <w:t>Sec. VII-G showed every prior safety property — service completion, batch completion, zero expiry, bounded backlog — was a SOFT, reward-shaped penalty that even heavy shaping left 9/10 or more v3 seeds per region capable of violating, and that the sigmoid drain head's ±3-logit bound caps reachable drain at sigmoid(3)=95.257% with no finite bound reaching exact full drain. V4 does not retrain that decoder or widen its bound; it inserts a projector between the policy's raw decoded action and the environment transition, so every applied action is the nearest feasible point to what PPO requested, with EXACT 0–100% reachable endpoints and hard, checkable completion guarantees that hold on every step, not merely in expectation across seeds.</w:t>
+      </w:r>
+    </w:p>
+    <w:p>
+      <w:pPr>
+        <w:keepNext/>
+        <w:spacing w:after="40"/>
+      </w:pPr>
+      <w:r>
+        <w:rPr>
+          <w:b/>
+          <w:i/>
+          <w:sz w:val="20"/>
+        </w:rPr>
+        <w:t>B. Ten hard-constraint requirements</w:t>
+      </w:r>
+    </w:p>
+    <w:p>
+      <w:pPr>
+        <w:spacing w:after="60"/>
+      </w:pPr>
+      <w:r>
+        <w:rPr>
+          <w:b w:val="0"/>
+          <w:i w:val="0"/>
+          <w:sz w:val="19"/>
+        </w:rPr>
+        <w:t>The projector and its surrounding protocol enforce ten requirements, each with its own fail-closed certificate or measured invariant (Table XII). None of the ten is a reward term; all ten are algebraic properties of the one-step projection or of the frozen protocol around it, verified by the smoke suite (Sec. VIII-H) and by every evaluation record.</w:t>
+      </w:r>
+    </w:p>
+    <w:p>
+      <w:pPr>
+        <w:jc w:val="center"/>
+      </w:pPr>
+      <w:r>
+        <w:rPr>
+          <w:b/>
+          <w:sz w:val="16"/>
+        </w:rPr>
+        <w:t>TABLE XII. THE TEN V4 HARD-CONSTRAINT REQUIREMENTS</w:t>
+      </w:r>
+    </w:p>
+    <w:tbl>
+      <w:tblPr>
+        <w:tblStyle w:val="LightGrid-Accent1"/>
+        <w:tblW w:type="auto" w:w="0"/>
+        <w:tblLook w:firstColumn="1" w:firstRow="1" w:lastColumn="0" w:lastRow="0" w:noHBand="0" w:noVBand="1" w:val="04A0"/>
+      </w:tblPr>
+      <w:tblGrid>
+        <w:gridCol w:w="3360"/>
+        <w:gridCol w:w="3360"/>
+        <w:gridCol w:w="3360"/>
+      </w:tblGrid>
+      <w:tr>
+        <w:tc>
+          <w:tcPr>
+            <w:tcW w:type="dxa" w:w="360"/>
+          </w:tcPr>
+          <w:p>
+            <w:r>
+              <w:rPr>
+                <w:b/>
+                <w:sz w:val="16"/>
+              </w:rPr>
+              <w:t>#</w:t>
+            </w:r>
+          </w:p>
+        </w:tc>
+        <w:tc>
+          <w:tcPr>
+            <w:tcW w:type="dxa" w:w="3672"/>
+          </w:tcPr>
+          <w:p>
+            <w:r>
+              <w:rPr>
+                <w:b/>
+                <w:sz w:val="16"/>
+              </w:rPr>
+              <w:t>Requirement</w:t>
+            </w:r>
+          </w:p>
+        </w:tc>
+        <w:tc>
+          <w:tcPr>
+            <w:tcW w:type="dxa" w:w="3456"/>
+          </w:tcPr>
+          <w:p>
+            <w:r>
+              <w:rPr>
+                <w:b/>
+                <w:sz w:val="16"/>
+              </w:rPr>
+              <w:t>Enforcement / certificate</w:t>
+            </w:r>
+          </w:p>
+        </w:tc>
+      </w:tr>
+      <w:tr>
+        <w:tc>
+          <w:tcPr>
+            <w:tcW w:type="dxa" w:w="360"/>
+          </w:tcPr>
+          <w:p>
+            <w:r>
+              <w:rPr>
+                <w:sz w:val="16"/>
+              </w:rPr>
+              <w:t>1</w:t>
+            </w:r>
+          </w:p>
+        </w:tc>
+        <w:tc>
+          <w:tcPr>
+            <w:tcW w:type="dxa" w:w="3672"/>
+          </w:tcPr>
+          <w:p>
+            <w:r>
+              <w:rPr>
+                <w:sz w:val="16"/>
+              </w:rPr>
+              <w:t>Advertise only actionable pool work with deadline_step &gt; t</w:t>
+            </w:r>
+          </w:p>
+        </w:tc>
+        <w:tc>
+          <w:tcPr>
+            <w:tcW w:type="dxa" w:w="3456"/>
+          </w:tcPr>
+          <w:p>
+            <w:r>
+              <w:rPr>
+                <w:sz w:val="16"/>
+              </w:rPr>
+              <w:t>actionable_* pool features; due-now carryover fails closed</w:t>
+            </w:r>
+          </w:p>
+        </w:tc>
+      </w:tr>
+      <w:tr>
+        <w:tc>
+          <w:tcPr>
+            <w:tcW w:type="dxa" w:w="360"/>
+          </w:tcPr>
+          <w:p>
+            <w:r>
+              <w:rPr>
+                <w:sz w:val="16"/>
+              </w:rPr>
+              <w:t>2</w:t>
+            </w:r>
+          </w:p>
+        </w:tc>
+        <w:tc>
+          <w:tcPr>
+            <w:tcW w:type="dxa" w:w="3672"/>
+          </w:tcPr>
+          <w:p>
+            <w:r>
+              <w:rPr>
+                <w:sz w:val="16"/>
+              </w:rPr>
+              <w:t>Cumulative deadline feasibility, including episode end, under a frozen train-only 2.25/1.00/4.00 envelope</w:t>
+            </w:r>
+          </w:p>
+        </w:tc>
+        <w:tc>
+          <w:tcPr>
+            <w:tcW w:type="dxa" w:w="3456"/>
+          </w:tcPr>
+          <w:p>
+            <w:r>
+              <w:rPr>
+                <w:sz w:val="16"/>
+              </w:rPr>
+              <w:t>nested EDF prefixes; 0.75 guaranteed carried-work capacity</w:t>
+            </w:r>
+          </w:p>
+        </w:tc>
+      </w:tr>
+      <w:tr>
+        <w:tc>
+          <w:tcPr>
+            <w:tcW w:type="dxa" w:w="360"/>
+          </w:tcPr>
+          <w:p>
+            <w:r>
+              <w:rPr>
+                <w:sz w:val="16"/>
+              </w:rPr>
+              <w:t>3</w:t>
+            </w:r>
+          </w:p>
+        </w:tc>
+        <w:tc>
+          <w:tcPr>
+            <w:tcW w:type="dxa" w:w="3672"/>
+          </w:tcPr>
+          <w:p>
+            <w:r>
+              <w:rPr>
+                <w:sz w:val="16"/>
+              </w:rPr>
+              <w:t>Zero service backlog from a clean state whenever current service is physically schedulable</w:t>
+            </w:r>
+          </w:p>
+        </w:tc>
+        <w:tc>
+          <w:tcPr>
+            <w:tcW w:type="dxa" w:w="3456"/>
+          </w:tcPr>
+          <w:p>
+            <w:r>
+              <w:rPr>
+                <w:sz w:val="16"/>
+              </w:rPr>
+              <w:t>service-first capped simplex; local pre-backlog certificate</w:t>
+            </w:r>
+          </w:p>
+        </w:tc>
+      </w:tr>
+      <w:tr>
+        <w:tc>
+          <w:tcPr>
+            <w:tcW w:type="dxa" w:w="360"/>
+          </w:tcPr>
+          <w:p>
+            <w:r>
+              <w:rPr>
+                <w:sz w:val="16"/>
+              </w:rPr>
+              <w:t>4</w:t>
+            </w:r>
+          </w:p>
+        </w:tc>
+        <w:tc>
+          <w:tcPr>
+            <w:tcW w:type="dxa" w:w="3672"/>
+          </w:tcPr>
+          <w:p>
+            <w:r>
+              <w:rPr>
+                <w:sz w:val="16"/>
+              </w:rPr>
+              <w:t>Every origin drain equals destination placement and execution</w:t>
+            </w:r>
+          </w:p>
+        </w:tc>
+        <w:tc>
+          <w:tcPr>
+            <w:tcW w:type="dxa" w:w="3456"/>
+          </w:tcPr>
+          <w:p>
+            <w:r>
+              <w:rPr>
+                <w:sz w:val="16"/>
+              </w:rPr>
+              <w:t>exact_transport row/column sums; no proportional serve_ratio</w:t>
+            </w:r>
+          </w:p>
+        </w:tc>
+      </w:tr>
+      <w:tr>
+        <w:tc>
+          <w:tcPr>
+            <w:tcW w:type="dxa" w:w="360"/>
+          </w:tcPr>
+          <w:p>
+            <w:r>
+              <w:rPr>
+                <w:sz w:val="16"/>
+              </w:rPr>
+              <w:t>5</w:t>
+            </w:r>
+          </w:p>
+        </w:tc>
+        <w:tc>
+          <w:tcPr>
+            <w:tcW w:type="dxa" w:w="3672"/>
+          </w:tcPr>
+          <w:p>
+            <w:r>
+              <w:rPr>
+                <w:sz w:val="16"/>
+              </w:rPr>
+              <w:t>Applied drain can reach exact 0% or 100%</w:t>
+            </w:r>
+          </w:p>
+        </w:tc>
+        <w:tc>
+          <w:tcPr>
+            <w:tcW w:type="dxa" w:w="3456"/>
+          </w:tcPr>
+          <w:p>
+            <w:r>
+              <w:rPr>
+                <w:sz w:val="16"/>
+              </w:rPr>
+              <w:t>post-decode physical-amount projection; endpoint counters</w:t>
+            </w:r>
+          </w:p>
+        </w:tc>
+      </w:tr>
+      <w:tr>
+        <w:tc>
+          <w:tcPr>
+            <w:tcW w:type="dxa" w:w="360"/>
+          </w:tcPr>
+          <w:p>
+            <w:r>
+              <w:rPr>
+                <w:sz w:val="16"/>
+              </w:rPr>
+              <w:t>6</w:t>
+            </w:r>
+          </w:p>
+        </w:tc>
+        <w:tc>
+          <w:tcPr>
+            <w:tcW w:type="dxa" w:w="3672"/>
+          </w:tcPr>
+          <w:p>
+            <w:r>
+              <w:rPr>
+                <w:sz w:val="16"/>
+              </w:rPr>
+              <w:t>Fail closed on envelope, capacity, deadline, grid, or ramp infeasibility</w:t>
+            </w:r>
+          </w:p>
+        </w:tc>
+        <w:tc>
+          <w:tcPr>
+            <w:tcW w:type="dxa" w:w="3456"/>
+          </w:tcPr>
+          <w:p>
+            <w:r>
+              <w:rPr>
+                <w:sz w:val="16"/>
+              </w:rPr>
+              <w:t>structured SafetyInfeasibleError certificate</w:t>
+            </w:r>
+          </w:p>
+        </w:tc>
+      </w:tr>
+      <w:tr>
+        <w:tc>
+          <w:tcPr>
+            <w:tcW w:type="dxa" w:w="360"/>
+          </w:tcPr>
+          <w:p>
+            <w:r>
+              <w:rPr>
+                <w:sz w:val="16"/>
+              </w:rPr>
+              <w:t>7</w:t>
+            </w:r>
+          </w:p>
+        </w:tc>
+        <w:tc>
+          <w:tcPr>
+            <w:tcW w:type="dxa" w:w="3672"/>
+          </w:tcPr>
+          <w:p>
+            <w:r>
+              <w:rPr>
+                <w:sz w:val="16"/>
+              </w:rPr>
+              <w:t>Use the nearest safe action to preserve PPO preferences</w:t>
+            </w:r>
+          </w:p>
+        </w:tc>
+        <w:tc>
+          <w:tcPr>
+            <w:tcW w:type="dxa" w:w="3456"/>
+          </w:tcPr>
+          <w:p>
+            <w:r>
+              <w:rPr>
+                <w:sz w:val="16"/>
+              </w:rPr>
+              <w:t>Euclidean capped-simplex/box projection; L2 distance logged</w:t>
+            </w:r>
+          </w:p>
+        </w:tc>
+      </w:tr>
+      <w:tr>
+        <w:tc>
+          <w:tcPr>
+            <w:tcW w:type="dxa" w:w="360"/>
+          </w:tcPr>
+          <w:p>
+            <w:r>
+              <w:rPr>
+                <w:sz w:val="16"/>
+              </w:rPr>
+              <w:t>8</w:t>
+            </w:r>
+          </w:p>
+        </w:tc>
+        <w:tc>
+          <w:tcPr>
+            <w:tcW w:type="dxa" w:w="3672"/>
+          </w:tcPr>
+          <w:p>
+            <w:r>
+              <w:rPr>
+                <w:sz w:val="16"/>
+              </w:rPr>
+              <w:t>Train with the projector active and persist all safety telemetry</w:t>
+            </w:r>
+          </w:p>
+        </w:tc>
+        <w:tc>
+          <w:tcPr>
+            <w:tcW w:type="dxa" w:w="3456"/>
+          </w:tcPr>
+          <w:p>
+            <w:r>
+              <w:rPr>
+                <w:sz w:val="16"/>
+              </w:rPr>
+              <w:t>intervention, distance, binding horizon, slack, endpoints, certificates</w:t>
+            </w:r>
+          </w:p>
+        </w:tc>
+      </w:tr>
+      <w:tr>
+        <w:tc>
+          <w:tcPr>
+            <w:tcW w:type="dxa" w:w="360"/>
+          </w:tcPr>
+          <w:p>
+            <w:r>
+              <w:rPr>
+                <w:sz w:val="16"/>
+              </w:rPr>
+              <w:t>9</w:t>
+            </w:r>
+          </w:p>
+        </w:tc>
+        <w:tc>
+          <w:tcPr>
+            <w:tcW w:type="dxa" w:w="3672"/>
+          </w:tcPr>
+          <w:p>
+            <w:r>
+              <w:rPr>
+                <w:sz w:val="16"/>
+              </w:rPr>
+              <w:t>Keep negative-demand flushing optional and after mandatory work</w:t>
+            </w:r>
+          </w:p>
+        </w:tc>
+        <w:tc>
+          <w:tcPr>
+            <w:tcW w:type="dxa" w:w="3456"/>
+          </w:tcPr>
+          <w:p>
+            <w:r>
+              <w:rPr>
+                <w:sz w:val="16"/>
+              </w:rPr>
+              <w:t>replay-only ablation; disabled in primary training</w:t>
+            </w:r>
+          </w:p>
+        </w:tc>
+      </w:tr>
+      <w:tr>
+        <w:tc>
+          <w:tcPr>
+            <w:tcW w:type="dxa" w:w="360"/>
+          </w:tcPr>
+          <w:p>
+            <w:r>
+              <w:rPr>
+                <w:sz w:val="16"/>
+              </w:rPr>
+              <w:t>10</w:t>
+            </w:r>
+          </w:p>
+        </w:tc>
+        <w:tc>
+          <w:tcPr>
+            <w:tcW w:type="dxa" w:w="3672"/>
+          </w:tcPr>
+          <w:p>
+            <w:r>
+              <w:rPr>
+                <w:sz w:val="16"/>
+              </w:rPr>
+              <w:t>Implement optional grid/ramp caps but disable them primary</w:t>
+            </w:r>
+          </w:p>
+        </w:tc>
+        <w:tc>
+          <w:tcPr>
+            <w:tcW w:type="dxa" w:w="3456"/>
+          </w:tcPr>
+          <w:p>
+            <w:r>
+              <w:rPr>
+                <w:sz w:val="16"/>
+              </w:rPr>
+              <w:t>max_grid_mw/max_upward_ramp_mw tested; protocol values null</w:t>
+            </w:r>
+          </w:p>
+        </w:tc>
+      </w:tr>
+    </w:tbl>
+    <w:p>
+      <w:pPr>
+        <w:spacing w:after="40"/>
+      </w:pPr>
+    </w:p>
+    <w:p>
+      <w:pPr>
+        <w:keepNext/>
+        <w:spacing w:after="40"/>
+      </w:pPr>
+      <w:r>
+        <w:rPr>
+          <w:b/>
+          <w:i/>
+          <w:sz w:val="20"/>
+        </w:rPr>
+        <w:t>C. Non-MPC one-step projector: architecture and math</w:t>
+      </w:r>
+    </w:p>
+    <w:p>
+      <w:pPr>
+        <w:spacing w:after="60"/>
+      </w:pPr>
+      <w:r>
+        <w:rPr>
+          <w:b w:val="0"/>
+          <w:i w:val="0"/>
+          <w:sz w:val="19"/>
+        </w:rPr>
+        <w:t>Let N=4 sites and let the policy's raw 3N-dimensional action decode, exactly as in Sec. III-C, into a service-share preference s_pref = softmax(a[0:N]), a per-origin drain preference d_raw = sigmoid(a[N:2N]), and a destination-share preference b_pref = softmax(a[2N:3N]). Desired (unconstrained) targets are s̃ = s_pref·S_t (S_t = total service demand, an environment quantity, not a policy choice) and g̃_i = d_raw_i·Q_i,t (Q_i,t = origin i's pool total). The projector then applies four closed-form Euclidean projections, once per step, using only the CURRENT step's state:</w:t>
+      </w:r>
+    </w:p>
+    <w:p>
+      <w:pPr>
+        <w:spacing w:after="80"/>
+        <w:jc w:val="center"/>
+      </w:pPr>
+      <w:r>
+        <w:rPr>
+          <w:i/>
+          <w:sz w:val="19"/>
+        </w:rPr>
+        <w:t>s_t = argmin_s ‖s−s̃‖² s.t. Σs_i=S_t, 0≤s_i≤c_i,t        (11)</w:t>
+      </w:r>
+    </w:p>
+    <w:p>
+      <w:pPr>
+        <w:spacing w:after="60"/>
+      </w:pPr>
+      <w:r>
+        <w:rPr>
+          <w:b w:val="0"/>
+          <w:i w:val="0"/>
+          <w:sz w:val="19"/>
+        </w:rPr>
+        <w:t>solved by bisection on a shared water-filling shift (capped-simplex projection, project_capped_simplex), giving residual site capacity r_t = c_t − s_t for batch.</w:t>
+      </w:r>
+    </w:p>
+    <w:p>
+      <w:pPr>
+        <w:spacing w:after="80"/>
+        <w:jc w:val="center"/>
+      </w:pPr>
+      <w:r>
+        <w:rPr>
+          <w:i/>
+          <w:sz w:val="19"/>
+        </w:rPr>
+        <w:t>m = cumulative-EDF floor: ∀ deadline δ, D_δ ≤ (δ−t−1)·ĝ + protected_δ        (12)</w:t>
+      </w:r>
+    </w:p>
+    <w:p>
+      <w:pPr>
+        <w:spacing w:after="60"/>
+      </w:pPr>
+      <w:r>
+        <w:rPr>
+          <w:b w:val="0"/>
+          <w:i w:val="0"/>
+          <w:sz w:val="19"/>
+        </w:rPr>
+        <w:t>where D_δ is pool mass due by δ (aggregated per origin) and ĝ=0.75 is the frozen guaranteed future per-step drain capacity (requirement 2). Any positive deficit at a given δ is admitted NOW as the minimal-ℓ²-distance reallocation of the policy's own drain preference among only the origins carrying that deadline's mass — never an arbitrary or origin-blind top-up — yielding a per-origin mandatory floor m with Σm_i equal to the unavoidable batch that must move this step.</w:t>
+      </w:r>
+    </w:p>
+    <w:p>
+      <w:pPr>
+        <w:spacing w:after="80"/>
+        <w:jc w:val="center"/>
+      </w:pPr>
+      <w:r>
+        <w:rPr>
+          <w:i/>
+          <w:sz w:val="19"/>
+        </w:rPr>
+        <w:t>g_t = argmin_g ‖g−g̃‖² s.t. Σg_i=g*, m_i≤g_i≤Q_i,t        (13)</w:t>
+      </w:r>
+    </w:p>
+    <w:p>
+      <w:pPr>
+        <w:spacing w:after="60"/>
+      </w:pPr>
+      <w:r>
+        <w:rPr>
+          <w:b w:val="0"/>
+          <w:i w:val="0"/>
+          <w:sz w:val="19"/>
+        </w:rPr>
+        <w:t>where g* is itself the total-batch amount clipped into [Σm, min(ΣQ,Σr_t)] (never below the EDF floor, never above residual capacity or remaining pool) — a box-constrained projection with a permitted sum interval (project_box_sum_range), built from the same capped-simplex primitive after subtracting the floor.</w:t>
+      </w:r>
+    </w:p>
+    <w:p>
+      <w:pPr>
+        <w:spacing w:after="80"/>
+        <w:jc w:val="center"/>
+      </w:pPr>
+      <w:r>
+        <w:rPr>
+          <w:i/>
+          <w:sz w:val="19"/>
+        </w:rPr>
+        <w:t>b_t = argmin_b ‖b−b_pref·g_t‖² s.t. Σb_j=g_t, 0≤b_j≤r_t,j        (14)</w:t>
+      </w:r>
+    </w:p>
+    <w:p>
+      <w:pPr>
+        <w:spacing w:after="60"/>
+      </w:pPr>
+      <w:r>
+        <w:rPr>
+          <w:b w:val="0"/>
+          <w:i w:val="0"/>
+          <w:sz w:val="19"/>
+        </w:rPr>
+        <w:t>gives the destination allocation, and a deterministic greedy northwest-corner-style match (exact_transport) builds a bipartite flow F∈ℝ^{N×N}_{≥0} with ΣⱼF_ij=g_{t,i} and ΣᵢF_ij=b_{t,j} exactly (≤1e-8, requirement 4) — an EXACT transport, not an approximate one. Steps 11–14 are a single deterministic, closed-form map from (raw PPO action, current state) to a feasible action, evaluated once per step with no lookahead, no rollout, and no model of future dynamics beyond the frozen scalar ĝ. That is precisely why this is NOT model-predictive control: MPC re-solves a multi-step optimization over a receding horizon using a forward dynamics model; the v4 projector performs one non-anticipative projection per step using only the current state and a pre-registered constant, and MPC remains structurally excluded from this protocol exactly as in v2/v3.</w:t>
+      </w:r>
+    </w:p>
+    <w:p>
+      <w:pPr>
+        <w:keepNext/>
+        <w:spacing w:after="40"/>
+      </w:pPr>
+      <w:r>
+        <w:rPr>
+          <w:b/>
+          <w:i/>
+          <w:sz w:val="20"/>
+        </w:rPr>
+        <w:t>D. Train-only envelopes and no future-trace leakage</w:t>
+      </w:r>
+    </w:p>
+    <w:p>
+      <w:pPr>
+        <w:spacing w:after="60"/>
+      </w:pPr>
+      <w:r>
+        <w:rPr>
+          <w:b w:val="0"/>
+          <w:i w:val="0"/>
+          <w:sz w:val="19"/>
+        </w:rPr>
+        <w:t>The three envelope constants (service 2.25, batch arrival 1.00, future fleet capacity 4.00) are rounded upward from the maximum total service (2.130388) and batch arrival (0.831723) observed ONLY across development cells a–d (envelope_id ad-rounded-envelope-v1, envelope_scope a-d-development-only) and are frozen into the protocol snapshot before any replay or training job runs (Table VII protocol.json, Sec. VIII-G preflight). They never use a realized future step's value: the preflight envelope_scan re-derives and hard-asserts these maxima against the live a–d scenarios before every campaign, and a dedicated smoke test (test_no_future_trace_leakage) reconstructs an identical current state with a different future trace and asserts the projection is bit-identical — the projector is a pure function of the current step, never of anything downstream of it.</w:t>
+      </w:r>
+    </w:p>
+    <w:p>
+      <w:pPr>
+        <w:keepNext/>
+        <w:spacing w:after="40"/>
+      </w:pPr>
+      <w:r>
+        <w:rPr>
+          <w:b/>
+          <w:i/>
+          <w:sz w:val="20"/>
+        </w:rPr>
+        <w:t>E. Clean-state guarantee and the local-backlog caveat</w:t>
+      </w:r>
+    </w:p>
+    <w:p>
+      <w:pPr>
+        <w:spacing w:after="60"/>
+      </w:pPr>
+      <w:r>
+        <w:rPr>
+          <w:b w:val="0"/>
+          <w:i w:val="0"/>
+          <w:sz w:val="19"/>
+        </w:rPr>
+        <w:t>The zero-service-backlog guarantee is a CLEAN-STATE guarantee: it holds from a reset with no pre-existing local backlog, and the environment fails closed — raising a preexisting_local_service_backlog certificate, not silently absorbing the work — if any site carries nonzero local backlog when a step is attempted (test_preexisting_backlog_fails_closed). This is a documented scope boundary, not a claim that backlog can never physically arise: it says the hard guarantee applies once the controller is engaged from a clean state, and any accumulated local backlog must be surfaced as an explicit certificate rather than pooled into the projector's accounting.</w:t>
+      </w:r>
+    </w:p>
+    <w:p>
+      <w:pPr>
+        <w:keepNext/>
+        <w:spacing w:after="40"/>
+      </w:pPr>
+      <w:r>
+        <w:rPr>
+          <w:b/>
+          <w:i/>
+          <w:sz w:val="20"/>
+        </w:rPr>
+        <w:t>F. Exact flows, endpoints, and optional extensions</w:t>
+      </w:r>
+    </w:p>
+    <w:p>
+      <w:pPr>
+        <w:spacing w:after="60"/>
+      </w:pPr>
+      <w:r>
+        <w:rPr>
+          <w:b w:val="0"/>
+          <w:i w:val="0"/>
+          <w:sz w:val="19"/>
+        </w:rPr>
+        <w:t>Every applied transport is an EXACT flow (requirement 4) and every drain decision reaches an EXACT 0% or 100% endpoint when the cumulative-EDF floor or the residual-capacity ceiling binds (requirement 5), closing the sigmoid-reachability gap of Sec. VII-G. Two extensions are wired into the SafetyConfig but are OPTIONAL and off by default in every trained v4 model: a negative-net-demand flush (negative_demand_flush) that widens the minimum drain floor toward destinations currently at negative net demand, and per-site power/ramp caps (max_grid_mw, max_upward_ramp_mw) that would further clip the residual-capacity feasible set. Neither is used in the primary training or evaluation mode (primary_negative_demand_flush: false, primary_power_caps/primary_ramp_caps: null); the flush is exercised only as a replay-time ablation on the already-frozen v3 policy weights (Sec. VIII-I), never during any of the 36 newly trained v4 models, and the power/ramp caps are exercised only by the smoke suite (test_optional_grid_and_ramp_caps).</w:t>
+      </w:r>
+    </w:p>
+    <w:p>
+      <w:pPr>
+        <w:keepNext/>
+        <w:spacing w:after="40"/>
+      </w:pPr>
+      <w:r>
+        <w:rPr>
+          <w:b/>
+          <w:i/>
+          <w:sz w:val="20"/>
+        </w:rPr>
+        <w:t>G. Staged protocol, gates, and thirty-six trained models</w:t>
+      </w:r>
+    </w:p>
+    <w:p>
+      <w:pPr>
+        <w:jc w:val="center"/>
+      </w:pPr>
+      <w:r>
+        <w:rPr>
+          <w:b/>
+          <w:sz w:val="16"/>
+        </w:rPr>
+        <w:t>TABLE XIII. STAGED V4 PROTOCOL (36 NEWLY TRAINED MODELS: 6+10+20)</w:t>
+      </w:r>
+    </w:p>
+    <w:tbl>
+      <w:tblPr>
+        <w:tblStyle w:val="LightGrid-Accent1"/>
+        <w:tblW w:type="auto" w:w="0"/>
+        <w:tblLook w:firstColumn="1" w:firstRow="1" w:lastColumn="0" w:lastRow="0" w:noHBand="0" w:noVBand="1" w:val="04A0"/>
+      </w:tblPr>
+      <w:tblGrid>
+        <w:gridCol w:w="3360"/>
+        <w:gridCol w:w="3360"/>
+        <w:gridCol w:w="3360"/>
+      </w:tblGrid>
+      <w:tr>
+        <w:tc>
+          <w:tcPr>
+            <w:tcW w:type="dxa" w:w="864"/>
+          </w:tcPr>
+          <w:p>
+            <w:r>
+              <w:rPr>
+                <w:b/>
+                <w:sz w:val="16"/>
+              </w:rPr>
+              <w:t>Phase</w:t>
+            </w:r>
+          </w:p>
+        </w:tc>
+        <w:tc>
+          <w:tcPr>
+            <w:tcW w:type="dxa" w:w="4896"/>
+          </w:tcPr>
+          <w:p>
+            <w:r>
+              <w:rPr>
+                <w:b/>
+                <w:sz w:val="16"/>
+              </w:rPr>
+              <w:t>What it does</w:t>
+            </w:r>
+          </w:p>
+        </w:tc>
+        <w:tc>
+          <w:tcPr>
+            <w:tcW w:type="dxa" w:w="1728"/>
+          </w:tcPr>
+          <w:p>
+            <w:r>
+              <w:rPr>
+                <w:b/>
+                <w:sz w:val="16"/>
+              </w:rPr>
+              <w:t>Jobs / models</w:t>
+            </w:r>
+          </w:p>
+        </w:tc>
+      </w:tr>
+      <w:tr>
+        <w:tc>
+          <w:tcPr>
+            <w:tcW w:type="dxa" w:w="864"/>
+          </w:tcPr>
+          <w:p>
+            <w:r>
+              <w:rPr>
+                <w:sz w:val="16"/>
+              </w:rPr>
+              <w:t>preflight</w:t>
+            </w:r>
+          </w:p>
+        </w:tc>
+        <w:tc>
+          <w:tcPr>
+            <w:tcW w:type="dxa" w:w="4896"/>
+          </w:tcPr>
+          <w:p>
+            <w:r>
+              <w:rPr>
+                <w:sz w:val="16"/>
+              </w:rPr>
+              <w:t>Validates config, hashes sources/data, re-derives and asserts the a–d envelope bound, runs all smoke tests</w:t>
+            </w:r>
+          </w:p>
+        </w:tc>
+        <w:tc>
+          <w:tcPr>
+            <w:tcW w:type="dxa" w:w="1728"/>
+          </w:tcPr>
+          <w:p>
+            <w:r>
+              <w:rPr>
+                <w:sz w:val="16"/>
+              </w:rPr>
+              <w:t>0</w:t>
+            </w:r>
+          </w:p>
+        </w:tc>
+      </w:tr>
+      <w:tr>
+        <w:tc>
+          <w:tcPr>
+            <w:tcW w:type="dxa" w:w="864"/>
+          </w:tcPr>
+          <w:p>
+            <w:r>
+              <w:rPr>
+                <w:sz w:val="16"/>
+              </w:rPr>
+              <w:t>replay</w:t>
+            </w:r>
+          </w:p>
+        </w:tc>
+        <w:tc>
+          <w:tcPr>
+            <w:tcW w:type="dxa" w:w="4896"/>
+          </w:tcPr>
+          <w:p>
+            <w:r>
+              <w:rPr>
+                <w:sz w:val="16"/>
+              </w:rPr>
+              <w:t>Replays the FROZEN archived v3 policy weights (10 seeds/region, R3_P1 US / R0_P3 Global) through the v4 projector at eval time only, in both safety_only and safety_plus_negative_demand_flush modes — no retraining</w:t>
+            </w:r>
+          </w:p>
+        </w:tc>
+        <w:tc>
+          <w:tcPr>
+            <w:tcW w:type="dxa" w:w="1728"/>
+          </w:tcPr>
+          <w:p>
+            <w:r>
+              <w:rPr>
+                <w:sz w:val="16"/>
+              </w:rPr>
+              <w:t>0 (20 archived models reused × 2 modes)</w:t>
+            </w:r>
+          </w:p>
+        </w:tc>
+      </w:tr>
+      <w:tr>
+        <w:tc>
+          <w:tcPr>
+            <w:tcW w:type="dxa" w:w="864"/>
+          </w:tcPr>
+          <w:p>
+            <w:r>
+              <w:rPr>
+                <w:sz w:val="16"/>
+              </w:rPr>
+              <w:t>short</w:t>
+            </w:r>
+          </w:p>
+        </w:tc>
+        <w:tc>
+          <w:tcPr>
+            <w:tcW w:type="dxa" w:w="4896"/>
+          </w:tcPr>
+          <w:p>
+            <w:r>
+              <w:rPr>
+                <w:sz w:val="16"/>
+              </w:rPr>
+              <w:t>Trains fresh PPO+projector models at the short budget (151,552 steps), 3 seeds/region</w:t>
+            </w:r>
+          </w:p>
+        </w:tc>
+        <w:tc>
+          <w:tcPr>
+            <w:tcW w:type="dxa" w:w="1728"/>
+          </w:tcPr>
+          <w:p>
+            <w:r>
+              <w:rPr>
+                <w:sz w:val="16"/>
+              </w:rPr>
+              <w:t>6</w:t>
+            </w:r>
+          </w:p>
+        </w:tc>
+      </w:tr>
+      <w:tr>
+        <w:tc>
+          <w:tcPr>
+            <w:tcW w:type="dxa" w:w="864"/>
+          </w:tcPr>
+          <w:p>
+            <w:r>
+              <w:rPr>
+                <w:sz w:val="16"/>
+              </w:rPr>
+              <w:t>medium</w:t>
+            </w:r>
+          </w:p>
+        </w:tc>
+        <w:tc>
+          <w:tcPr>
+            <w:tcW w:type="dxa" w:w="4896"/>
+          </w:tcPr>
+          <w:p>
+            <w:r>
+              <w:rPr>
+                <w:sz w:val="16"/>
+              </w:rPr>
+              <w:t>Gated on the short promotion gate; trains at 301,056 steps, 5 seeds/region</w:t>
+            </w:r>
+          </w:p>
+        </w:tc>
+        <w:tc>
+          <w:tcPr>
+            <w:tcW w:type="dxa" w:w="1728"/>
+          </w:tcPr>
+          <w:p>
+            <w:r>
+              <w:rPr>
+                <w:sz w:val="16"/>
+              </w:rPr>
+              <w:t>10</w:t>
+            </w:r>
+          </w:p>
+        </w:tc>
+      </w:tr>
+      <w:tr>
+        <w:tc>
+          <w:tcPr>
+            <w:tcW w:type="dxa" w:w="864"/>
+          </w:tcPr>
+          <w:p>
+            <w:r>
+              <w:rPr>
+                <w:sz w:val="16"/>
+              </w:rPr>
+              <w:t>full</w:t>
+            </w:r>
+          </w:p>
+        </w:tc>
+        <w:tc>
+          <w:tcPr>
+            <w:tcW w:type="dxa" w:w="4896"/>
+          </w:tcPr>
+          <w:p>
+            <w:r>
+              <w:rPr>
+                <w:sz w:val="16"/>
+              </w:rPr>
+              <w:t>Gated on the medium gate; trains at each region's selected final budget (US 151,552 / Global 1,003,520), 10 seeds/region</w:t>
+            </w:r>
+          </w:p>
+        </w:tc>
+        <w:tc>
+          <w:tcPr>
+            <w:tcW w:type="dxa" w:w="1728"/>
+          </w:tcPr>
+          <w:p>
+            <w:r>
+              <w:rPr>
+                <w:sz w:val="16"/>
+              </w:rPr>
+              <w:t>20</w:t>
+            </w:r>
+          </w:p>
+        </w:tc>
+      </w:tr>
+      <w:tr>
+        <w:tc>
+          <w:tcPr>
+            <w:tcW w:type="dxa" w:w="864"/>
+          </w:tcPr>
+          <w:p>
+            <w:r>
+              <w:rPr>
+                <w:sz w:val="16"/>
+              </w:rPr>
+              <w:t>final</w:t>
+            </w:r>
+          </w:p>
+        </w:tc>
+        <w:tc>
+          <w:tcPr>
+            <w:tcW w:type="dxa" w:w="4896"/>
+          </w:tcPr>
+          <w:p>
+            <w:r>
+              <w:rPr>
+                <w:sz w:val="16"/>
+              </w:rPr>
+              <w:t>Gated on the full gate; re-evaluates the 20 full-stage models on cells e–h (descriptive transfer, no retraining)</w:t>
+            </w:r>
+          </w:p>
+        </w:tc>
+        <w:tc>
+          <w:tcPr>
+            <w:tcW w:type="dxa" w:w="1728"/>
+          </w:tcPr>
+          <w:p>
+            <w:r>
+              <w:rPr>
+                <w:sz w:val="16"/>
+              </w:rPr>
+              <w:t>0</w:t>
+            </w:r>
+          </w:p>
+        </w:tc>
+      </w:tr>
+    </w:tbl>
+    <w:p>
+      <w:pPr>
+        <w:spacing w:after="40"/>
+      </w:pPr>
+    </w:p>
+    <w:p>
+      <w:pPr>
+        <w:spacing w:after="60"/>
+      </w:pPr>
+      <w:r>
+        <w:rPr>
+          <w:b w:val="0"/>
+          <w:i w:val="0"/>
+          <w:sz w:val="19"/>
+        </w:rPr>
+        <w:t>Each of short/medium/full enforces the SAME promotion gate (Table XIV) on ALL seeds run at that stage before the next stage may start (ensure_gate_passed): service completion exactly 1 (within 1e-9), batch completion exactly 1 (within 1e-9), zero total expired, terminal batch pool and terminal service backlog ≤1e-8, zero safety-infeasibility certificates, and maximum transport-conservation error ≤1e-8 — the same seven checks spanning requirements 2–6 above, now asserted per seed rather than only in aggregate. A region's stage only passes if EVERY seed clears every check; because these are hard, constructed guarantees rather than shaped penalties, every one of the 36 trained-and-evaluated short/medium/full seed×region combinations passes on the first attempt.</w:t>
+      </w:r>
+    </w:p>
+    <w:p>
+      <w:pPr>
+        <w:keepNext/>
+        <w:spacing w:after="40"/>
+      </w:pPr>
+      <w:r>
+        <w:rPr>
+          <w:b/>
+          <w:i/>
+          <w:sz w:val="20"/>
+        </w:rPr>
+        <w:t>H. Ten-test smoke suite</w:t>
+      </w:r>
+    </w:p>
+    <w:p>
+      <w:pPr>
+        <w:spacing w:after="60"/>
+      </w:pPr>
+      <w:r>
+        <w:rPr>
+          <w:b w:val="0"/>
+          <w:i w:val="0"/>
+          <w:sz w:val="19"/>
+        </w:rPr>
+        <w:t>scripts/smoke_test_safety_v4.py numerically exercises exactly the ten requirements of Table XII before any training job is allowed to start (preflight, Table XIII): projection primitives conserve sum/box bounds; deadline semantics and actionable-state truncation are exact; a deliberately wrong policy origin is overridden to the mandatory EDF origin with exact 0/100% endpoints; service-capacity and pre-action-deadline-miss certificates fail closed; pre-existing local backlog fails closed; reconstructing an identical current state with a different future trace gives a bit-identical projection (no leakage); the negative-demand flush is confirmed optional (behavior differs only when explicitly enabled); 250 randomized adversarial projections all satisfy every conservation, bound, and cumulative-slack invariant on ≥200/250 feasible draws; optional power/ramp caps are respected and reject an infeasible cap below unavoidable idle draw; and a full-episode all-hold (-3 logit) policy still reaches exact completion with zero expiry and sub-1e-8 transport error on both US and Global scenarios. All ten pass for every configuration used in this section.</w:t>
+      </w:r>
+    </w:p>
+    <w:p>
+      <w:pPr>
+        <w:keepNext/>
+        <w:spacing w:after="40"/>
+      </w:pPr>
+      <w:r>
+        <w:rPr>
+          <w:b/>
+          <w:i/>
+          <w:sz w:val="20"/>
+        </w:rPr>
+        <w:t>I. Replay of the archived v3 policies under the v4 projector</w:t>
+      </w:r>
+    </w:p>
+    <w:p>
+      <w:pPr>
+        <w:spacing w:after="60"/>
+      </w:pPr>
+      <w:r>
+        <w:rPr>
+          <w:b w:val="0"/>
+          <w:i w:val="0"/>
+          <w:sz w:val="19"/>
+        </w:rPr>
+        <w:t>Before training anything new, the FROZEN v3-selected policy weights (US R3_P1, Global R0_P3, Sec. VII-C/-E) are replayed — unmodified, no additional training — through the v4 projector on the same 10 selected v3 seeds (201–210), in both the primary safety_only mode and the negative-demand-flush ablation mode, purely as a diagnostic of what the projector alone contributes to an already-trained policy.</w:t>
+      </w:r>
+    </w:p>
+    <w:p>
+      <w:pPr>
+        <w:jc w:val="center"/>
+      </w:pPr>
+      <w:r>
+        <w:rPr>
+          <w:b/>
+          <w:sz w:val="16"/>
+        </w:rPr>
+        <w:t>TABLE XV. REPLAY OF ARCHIVED (FROZEN) v3 POLICIES UNDER THE V4 PROJECTOR, 10 SEEDS (201–210), a–d CELLS (DIAGNOSTIC, NOT A GATE)</w:t>
+      </w:r>
+    </w:p>
+    <w:tbl>
+      <w:tblPr>
+        <w:tblStyle w:val="LightGrid-Accent1"/>
+        <w:tblW w:type="auto" w:w="0"/>
+        <w:tblLook w:firstColumn="1" w:firstRow="1" w:lastColumn="0" w:lastRow="0" w:noHBand="0" w:noVBand="1" w:val="04A0"/>
+      </w:tblPr>
+      <w:tblGrid>
+        <w:gridCol w:w="1680"/>
+        <w:gridCol w:w="1680"/>
+        <w:gridCol w:w="1680"/>
+        <w:gridCol w:w="1680"/>
+        <w:gridCol w:w="1680"/>
+        <w:gridCol w:w="1680"/>
+      </w:tblGrid>
+      <w:tr>
+        <w:tc>
+          <w:tcPr>
+            <w:tcW w:type="dxa" w:w="792"/>
+          </w:tcPr>
+          <w:p>
+            <w:r>
+              <w:rPr>
+                <w:b/>
+                <w:sz w:val="16"/>
+              </w:rPr>
+              <w:t>Region</w:t>
+            </w:r>
+          </w:p>
+        </w:tc>
+        <w:tc>
+          <w:tcPr>
+            <w:tcW w:type="dxa" w:w="1656"/>
+          </w:tcPr>
+          <w:p>
+            <w:r>
+              <w:rPr>
+                <w:b/>
+                <w:sz w:val="16"/>
+              </w:rPr>
+              <w:t>Mode</w:t>
+            </w:r>
+          </w:p>
+        </w:tc>
+        <w:tc>
+          <w:tcPr>
+            <w:tcW w:type="dxa" w:w="936"/>
+          </w:tcPr>
+          <w:p>
+            <w:r>
+              <w:rPr>
+                <w:b/>
+                <w:sz w:val="16"/>
+              </w:rPr>
+              <w:t>Mean sav.</w:t>
+            </w:r>
+          </w:p>
+        </w:tc>
+        <w:tc>
+          <w:tcPr>
+            <w:tcW w:type="dxa" w:w="936"/>
+          </w:tcPr>
+          <w:p>
+            <w:r>
+              <w:rPr>
+                <w:b/>
+                <w:sz w:val="16"/>
+              </w:rPr>
+              <w:t>Worst sav.</w:t>
+            </w:r>
+          </w:p>
+        </w:tc>
+        <w:tc>
+          <w:tcPr>
+            <w:tcW w:type="dxa" w:w="2232"/>
+          </w:tcPr>
+          <w:p>
+            <w:r>
+              <w:rPr>
+                <w:b/>
+                <w:sz w:val="16"/>
+              </w:rPr>
+              <w:t>Optimizer 95% CI (USD)</w:t>
+            </w:r>
+          </w:p>
+        </w:tc>
+        <w:tc>
+          <w:tcPr>
+            <w:tcW w:type="dxa" w:w="1224"/>
+          </w:tcPr>
+          <w:p>
+            <w:r>
+              <w:rPr>
+                <w:b/>
+                <w:sz w:val="16"/>
+              </w:rPr>
+              <w:t>Mean interv. rate</w:t>
+            </w:r>
+          </w:p>
+        </w:tc>
+      </w:tr>
+      <w:tr>
+        <w:tc>
+          <w:tcPr>
+            <w:tcW w:type="dxa" w:w="792"/>
+          </w:tcPr>
+          <w:p>
+            <w:r>
+              <w:rPr>
+                <w:sz w:val="16"/>
+              </w:rPr>
+              <w:t>US</w:t>
+            </w:r>
+          </w:p>
+        </w:tc>
+        <w:tc>
+          <w:tcPr>
+            <w:tcW w:type="dxa" w:w="1656"/>
+          </w:tcPr>
+          <w:p>
+            <w:r>
+              <w:rPr>
+                <w:sz w:val="16"/>
+              </w:rPr>
+              <w:t>safety_only</w:t>
+            </w:r>
+          </w:p>
+        </w:tc>
+        <w:tc>
+          <w:tcPr>
+            <w:tcW w:type="dxa" w:w="936"/>
+          </w:tcPr>
+          <w:p>
+            <w:r>
+              <w:rPr>
+                <w:sz w:val="16"/>
+              </w:rPr>
+              <w:t>+0.057%</w:t>
+            </w:r>
+          </w:p>
+        </w:tc>
+        <w:tc>
+          <w:tcPr>
+            <w:tcW w:type="dxa" w:w="936"/>
+          </w:tcPr>
+          <w:p>
+            <w:r>
+              <w:rPr>
+                <w:sz w:val="16"/>
+              </w:rPr>
+              <w:t>−1.049%</w:t>
+            </w:r>
+          </w:p>
+        </w:tc>
+        <w:tc>
+          <w:tcPr>
+            <w:tcW w:type="dxa" w:w="2232"/>
+          </w:tcPr>
+          <w:p>
+            <w:r>
+              <w:rPr>
+                <w:sz w:val="16"/>
+              </w:rPr>
+              <w:t>[−21,771.99, +28,697.55]</w:t>
+            </w:r>
+          </w:p>
+        </w:tc>
+        <w:tc>
+          <w:tcPr>
+            <w:tcW w:type="dxa" w:w="1224"/>
+          </w:tcPr>
+          <w:p>
+            <w:r>
+              <w:rPr>
+                <w:sz w:val="16"/>
+              </w:rPr>
+              <w:t>0.011%</w:t>
+            </w:r>
+          </w:p>
+        </w:tc>
+      </w:tr>
+      <w:tr>
+        <w:tc>
+          <w:tcPr>
+            <w:tcW w:type="dxa" w:w="792"/>
+          </w:tcPr>
+          <w:p>
+            <w:r>
+              <w:rPr>
+                <w:sz w:val="16"/>
+              </w:rPr>
+              <w:t>US</w:t>
+            </w:r>
+          </w:p>
+        </w:tc>
+        <w:tc>
+          <w:tcPr>
+            <w:tcW w:type="dxa" w:w="1656"/>
+          </w:tcPr>
+          <w:p>
+            <w:r>
+              <w:rPr>
+                <w:sz w:val="16"/>
+              </w:rPr>
+              <w:t>+flush (ablation)</w:t>
+            </w:r>
+          </w:p>
+        </w:tc>
+        <w:tc>
+          <w:tcPr>
+            <w:tcW w:type="dxa" w:w="936"/>
+          </w:tcPr>
+          <w:p>
+            <w:r>
+              <w:rPr>
+                <w:sz w:val="16"/>
+              </w:rPr>
+              <w:t>+0.002%</w:t>
+            </w:r>
+          </w:p>
+        </w:tc>
+        <w:tc>
+          <w:tcPr>
+            <w:tcW w:type="dxa" w:w="936"/>
+          </w:tcPr>
+          <w:p>
+            <w:r>
+              <w:rPr>
+                <w:sz w:val="16"/>
+              </w:rPr>
+              <w:t>−1.067%</w:t>
+            </w:r>
+          </w:p>
+        </w:tc>
+        <w:tc>
+          <w:tcPr>
+            <w:tcW w:type="dxa" w:w="2232"/>
+          </w:tcPr>
+          <w:p>
+            <w:r>
+              <w:rPr>
+                <w:sz w:val="16"/>
+              </w:rPr>
+              <w:t>[−25,141.42, +25,021.96]</w:t>
+            </w:r>
+          </w:p>
+        </w:tc>
+        <w:tc>
+          <w:tcPr>
+            <w:tcW w:type="dxa" w:w="1224"/>
+          </w:tcPr>
+          <w:p>
+            <w:r>
+              <w:rPr>
+                <w:sz w:val="16"/>
+              </w:rPr>
+              <w:t>23.902%</w:t>
+            </w:r>
+          </w:p>
+        </w:tc>
+      </w:tr>
+      <w:tr>
+        <w:tc>
+          <w:tcPr>
+            <w:tcW w:type="dxa" w:w="792"/>
+          </w:tcPr>
+          <w:p>
+            <w:r>
+              <w:rPr>
+                <w:sz w:val="16"/>
+              </w:rPr>
+              <w:t>Global</w:t>
+            </w:r>
+          </w:p>
+        </w:tc>
+        <w:tc>
+          <w:tcPr>
+            <w:tcW w:type="dxa" w:w="1656"/>
+          </w:tcPr>
+          <w:p>
+            <w:r>
+              <w:rPr>
+                <w:sz w:val="16"/>
+              </w:rPr>
+              <w:t>safety_only</w:t>
+            </w:r>
+          </w:p>
+        </w:tc>
+        <w:tc>
+          <w:tcPr>
+            <w:tcW w:type="dxa" w:w="936"/>
+          </w:tcPr>
+          <w:p>
+            <w:r>
+              <w:rPr>
+                <w:sz w:val="16"/>
+              </w:rPr>
+              <w:t>+2.041%</w:t>
+            </w:r>
+          </w:p>
+        </w:tc>
+        <w:tc>
+          <w:tcPr>
+            <w:tcW w:type="dxa" w:w="936"/>
+          </w:tcPr>
+          <w:p>
+            <w:r>
+              <w:rPr>
+                <w:sz w:val="16"/>
+              </w:rPr>
+              <w:t>+1.016%</w:t>
+            </w:r>
+          </w:p>
+        </w:tc>
+        <w:tc>
+          <w:tcPr>
+            <w:tcW w:type="dxa" w:w="2232"/>
+          </w:tcPr>
+          <w:p>
+            <w:r>
+              <w:rPr>
+                <w:sz w:val="16"/>
+              </w:rPr>
+              <w:t>[+103,992.80, +167,976.56]</w:t>
+            </w:r>
+          </w:p>
+        </w:tc>
+        <w:tc>
+          <w:tcPr>
+            <w:tcW w:type="dxa" w:w="1224"/>
+          </w:tcPr>
+          <w:p>
+            <w:r>
+              <w:rPr>
+                <w:sz w:val="16"/>
+              </w:rPr>
+              <w:t>0.473%</w:t>
+            </w:r>
+          </w:p>
+        </w:tc>
+      </w:tr>
+      <w:tr>
+        <w:tc>
+          <w:tcPr>
+            <w:tcW w:type="dxa" w:w="792"/>
+          </w:tcPr>
+          <w:p>
+            <w:r>
+              <w:rPr>
+                <w:sz w:val="16"/>
+              </w:rPr>
+              <w:t>Global</w:t>
+            </w:r>
+          </w:p>
+        </w:tc>
+        <w:tc>
+          <w:tcPr>
+            <w:tcW w:type="dxa" w:w="1656"/>
+          </w:tcPr>
+          <w:p>
+            <w:r>
+              <w:rPr>
+                <w:sz w:val="16"/>
+              </w:rPr>
+              <w:t>+flush (ablation)</w:t>
+            </w:r>
+          </w:p>
+        </w:tc>
+        <w:tc>
+          <w:tcPr>
+            <w:tcW w:type="dxa" w:w="936"/>
+          </w:tcPr>
+          <w:p>
+            <w:r>
+              <w:rPr>
+                <w:sz w:val="16"/>
+              </w:rPr>
+              <w:t>+1.257%</w:t>
+            </w:r>
+          </w:p>
+        </w:tc>
+        <w:tc>
+          <w:tcPr>
+            <w:tcW w:type="dxa" w:w="936"/>
+          </w:tcPr>
+          <w:p>
+            <w:r>
+              <w:rPr>
+                <w:sz w:val="16"/>
+              </w:rPr>
+              <w:t>+0.146%</w:t>
+            </w:r>
+          </w:p>
+        </w:tc>
+        <w:tc>
+          <w:tcPr>
+            <w:tcW w:type="dxa" w:w="2232"/>
+          </w:tcPr>
+          <w:p>
+            <w:r>
+              <w:rPr>
+                <w:sz w:val="16"/>
+              </w:rPr>
+              <w:t>[+50,314.19, +111,332.53]</w:t>
+            </w:r>
+          </w:p>
+        </w:tc>
+        <w:tc>
+          <w:tcPr>
+            <w:tcW w:type="dxa" w:w="1224"/>
+          </w:tcPr>
+          <w:p>
+            <w:r>
+              <w:rPr>
+                <w:sz w:val="16"/>
+              </w:rPr>
+              <w:t>48.516%</w:t>
+            </w:r>
+          </w:p>
+        </w:tc>
+      </w:tr>
+    </w:tbl>
+    <w:p>
+      <w:pPr>
+        <w:spacing w:after="40"/>
+      </w:pPr>
+    </w:p>
+    <w:p>
+      <w:pPr>
+        <w:spacing w:after="60"/>
+      </w:pPr>
+      <w:r>
+        <w:rPr>
+          <w:b w:val="0"/>
+          <w:i w:val="0"/>
+          <w:sz w:val="19"/>
+        </w:rPr>
+        <w:t>Every replayed seed in both modes reaches exact service/batch completion with zero expiry and zero infeasibility certificates — the ten requirements hold even for a policy that never saw the projector during training, because they are constructed, not learned. Turning on the optional negative-demand-flush ablation lowers absolute mean cost (US $6.564M→$6.552M; Global $6.464M→$6.302M), but the flush-enabled Status Quo also benefits, so PPO's relative savings against its mode-matched baseline fall (US +0.057%→+0.002%; Global +2.041%→+1.257%). Intervention rises from 0.011%→23.902% (US) and 0.473%→48.516% (Global), making flush a dominant economic heuristic rather than a minimal safety shield. It is retained only as a diagnostic and never used for a primary number.</w:t>
+      </w:r>
+    </w:p>
+    <w:p>
+      <w:pPr>
+        <w:keepNext/>
+        <w:spacing w:after="40"/>
+      </w:pPr>
+      <w:r>
+        <w:rPr>
+          <w:b/>
+          <w:i/>
+          <w:sz w:val="20"/>
+        </w:rPr>
+        <w:t>J. Staged and final a–d results for the 36 freshly trained models</w:t>
+      </w:r>
+    </w:p>
+    <w:p>
+      <w:pPr>
+        <w:jc w:val="center"/>
+      </w:pPr>
+      <w:r>
+        <w:rPr>
+          <w:b/>
+          <w:sz w:val="16"/>
+        </w:rPr>
+        <w:t>TABLE XVI. STAGED a–d PROMOTION GATE, ALL SEEDS SAFE AT EVERY STAGE</w:t>
+      </w:r>
+    </w:p>
+    <w:tbl>
+      <w:tblPr>
+        <w:tblStyle w:val="LightGrid-Accent1"/>
+        <w:tblW w:type="auto" w:w="0"/>
+        <w:tblLook w:firstColumn="1" w:firstRow="1" w:lastColumn="0" w:lastRow="0" w:noHBand="0" w:noVBand="1" w:val="04A0"/>
+      </w:tblPr>
+      <w:tblGrid>
+        <w:gridCol w:w="1440"/>
+        <w:gridCol w:w="1440"/>
+        <w:gridCol w:w="1440"/>
+        <w:gridCol w:w="1440"/>
+        <w:gridCol w:w="1440"/>
+        <w:gridCol w:w="1440"/>
+        <w:gridCol w:w="1440"/>
+      </w:tblGrid>
+      <w:tr>
+        <w:tc>
+          <w:tcPr>
+            <w:tcW w:type="dxa" w:w="864"/>
+          </w:tcPr>
+          <w:p>
+            <w:r>
+              <w:rPr>
+                <w:b/>
+                <w:sz w:val="16"/>
+              </w:rPr>
+              <w:t>Stage</w:t>
+            </w:r>
+          </w:p>
+        </w:tc>
+        <w:tc>
+          <w:tcPr>
+            <w:tcW w:type="dxa" w:w="936"/>
+          </w:tcPr>
+          <w:p>
+            <w:r>
+              <w:rPr>
+                <w:b/>
+                <w:sz w:val="16"/>
+              </w:rPr>
+              <w:t>Region</w:t>
+            </w:r>
+          </w:p>
+        </w:tc>
+        <w:tc>
+          <w:tcPr>
+            <w:tcW w:type="dxa" w:w="720"/>
+          </w:tcPr>
+          <w:p>
+            <w:r>
+              <w:rPr>
+                <w:b/>
+                <w:sz w:val="16"/>
+              </w:rPr>
+              <w:t>Seeds</w:t>
+            </w:r>
+          </w:p>
+        </w:tc>
+        <w:tc>
+          <w:tcPr>
+            <w:tcW w:type="dxa" w:w="720"/>
+          </w:tcPr>
+          <w:p>
+            <w:r>
+              <w:rPr>
+                <w:b/>
+                <w:sz w:val="16"/>
+              </w:rPr>
+              <w:t>Safe</w:t>
+            </w:r>
+          </w:p>
+        </w:tc>
+        <w:tc>
+          <w:tcPr>
+            <w:tcW w:type="dxa" w:w="1008"/>
+          </w:tcPr>
+          <w:p>
+            <w:r>
+              <w:rPr>
+                <w:b/>
+                <w:sz w:val="16"/>
+              </w:rPr>
+              <w:t>Mean sav.</w:t>
+            </w:r>
+          </w:p>
+        </w:tc>
+        <w:tc>
+          <w:tcPr>
+            <w:tcW w:type="dxa" w:w="1008"/>
+          </w:tcPr>
+          <w:p>
+            <w:r>
+              <w:rPr>
+                <w:b/>
+                <w:sz w:val="16"/>
+              </w:rPr>
+              <w:t>Worst sav.</w:t>
+            </w:r>
+          </w:p>
+        </w:tc>
+        <w:tc>
+          <w:tcPr>
+            <w:tcW w:type="dxa" w:w="1080"/>
+          </w:tcPr>
+          <w:p>
+            <w:r>
+              <w:rPr>
+                <w:b/>
+                <w:sz w:val="16"/>
+              </w:rPr>
+              <w:t>Interv. rate</w:t>
+            </w:r>
+          </w:p>
+        </w:tc>
+      </w:tr>
+      <w:tr>
+        <w:tc>
+          <w:tcPr>
+            <w:tcW w:type="dxa" w:w="864"/>
+          </w:tcPr>
+          <w:p>
+            <w:r>
+              <w:rPr>
+                <w:sz w:val="16"/>
+              </w:rPr>
+              <w:t>Short</w:t>
+            </w:r>
+          </w:p>
+        </w:tc>
+        <w:tc>
+          <w:tcPr>
+            <w:tcW w:type="dxa" w:w="936"/>
+          </w:tcPr>
+          <w:p>
+            <w:r>
+              <w:rPr>
+                <w:sz w:val="16"/>
+              </w:rPr>
+              <w:t>US</w:t>
+            </w:r>
+          </w:p>
+        </w:tc>
+        <w:tc>
+          <w:tcPr>
+            <w:tcW w:type="dxa" w:w="720"/>
+          </w:tcPr>
+          <w:p>
+            <w:r>
+              <w:rPr>
+                <w:sz w:val="16"/>
+              </w:rPr>
+              <w:t>3</w:t>
+            </w:r>
+          </w:p>
+        </w:tc>
+        <w:tc>
+          <w:tcPr>
+            <w:tcW w:type="dxa" w:w="720"/>
+          </w:tcPr>
+          <w:p>
+            <w:r>
+              <w:rPr>
+                <w:sz w:val="16"/>
+              </w:rPr>
+              <w:t>3/3</w:t>
+            </w:r>
+          </w:p>
+        </w:tc>
+        <w:tc>
+          <w:tcPr>
+            <w:tcW w:type="dxa" w:w="1008"/>
+          </w:tcPr>
+          <w:p>
+            <w:r>
+              <w:rPr>
+                <w:sz w:val="16"/>
+              </w:rPr>
+              <w:t>−0.024%</w:t>
+            </w:r>
+          </w:p>
+        </w:tc>
+        <w:tc>
+          <w:tcPr>
+            <w:tcW w:type="dxa" w:w="1008"/>
+          </w:tcPr>
+          <w:p>
+            <w:r>
+              <w:rPr>
+                <w:sz w:val="16"/>
+              </w:rPr>
+              <w:t>−1.182%</w:t>
+            </w:r>
+          </w:p>
+        </w:tc>
+        <w:tc>
+          <w:tcPr>
+            <w:tcW w:type="dxa" w:w="1080"/>
+          </w:tcPr>
+          <w:p>
+            <w:r>
+              <w:rPr>
+                <w:sz w:val="16"/>
+              </w:rPr>
+              <w:t>0.011%</w:t>
+            </w:r>
+          </w:p>
+        </w:tc>
+      </w:tr>
+      <w:tr>
+        <w:tc>
+          <w:tcPr>
+            <w:tcW w:type="dxa" w:w="864"/>
+          </w:tcPr>
+          <w:p>
+            <w:r>
+              <w:rPr>
+                <w:sz w:val="16"/>
+              </w:rPr>
+              <w:t>Short</w:t>
+            </w:r>
+          </w:p>
+        </w:tc>
+        <w:tc>
+          <w:tcPr>
+            <w:tcW w:type="dxa" w:w="936"/>
+          </w:tcPr>
+          <w:p>
+            <w:r>
+              <w:rPr>
+                <w:sz w:val="16"/>
+              </w:rPr>
+              <w:t>Global</w:t>
+            </w:r>
+          </w:p>
+        </w:tc>
+        <w:tc>
+          <w:tcPr>
+            <w:tcW w:type="dxa" w:w="720"/>
+          </w:tcPr>
+          <w:p>
+            <w:r>
+              <w:rPr>
+                <w:sz w:val="16"/>
+              </w:rPr>
+              <w:t>3</w:t>
+            </w:r>
+          </w:p>
+        </w:tc>
+        <w:tc>
+          <w:tcPr>
+            <w:tcW w:type="dxa" w:w="720"/>
+          </w:tcPr>
+          <w:p>
+            <w:r>
+              <w:rPr>
+                <w:sz w:val="16"/>
+              </w:rPr>
+              <w:t>3/3</w:t>
+            </w:r>
+          </w:p>
+        </w:tc>
+        <w:tc>
+          <w:tcPr>
+            <w:tcW w:type="dxa" w:w="1008"/>
+          </w:tcPr>
+          <w:p>
+            <w:r>
+              <w:rPr>
+                <w:sz w:val="16"/>
+              </w:rPr>
+              <w:t>+2.209%</w:t>
+            </w:r>
+          </w:p>
+        </w:tc>
+        <w:tc>
+          <w:tcPr>
+            <w:tcW w:type="dxa" w:w="1008"/>
+          </w:tcPr>
+          <w:p>
+            <w:r>
+              <w:rPr>
+                <w:sz w:val="16"/>
+              </w:rPr>
+              <w:t>+1.234%</w:t>
+            </w:r>
+          </w:p>
+        </w:tc>
+        <w:tc>
+          <w:tcPr>
+            <w:tcW w:type="dxa" w:w="1080"/>
+          </w:tcPr>
+          <w:p>
+            <w:r>
+              <w:rPr>
+                <w:sz w:val="16"/>
+              </w:rPr>
+              <w:t>5.376%</w:t>
+            </w:r>
+          </w:p>
+        </w:tc>
+      </w:tr>
+      <w:tr>
+        <w:tc>
+          <w:tcPr>
+            <w:tcW w:type="dxa" w:w="864"/>
+          </w:tcPr>
+          <w:p>
+            <w:r>
+              <w:rPr>
+                <w:sz w:val="16"/>
+              </w:rPr>
+              <w:t>Medium</w:t>
+            </w:r>
+          </w:p>
+        </w:tc>
+        <w:tc>
+          <w:tcPr>
+            <w:tcW w:type="dxa" w:w="936"/>
+          </w:tcPr>
+          <w:p>
+            <w:r>
+              <w:rPr>
+                <w:sz w:val="16"/>
+              </w:rPr>
+              <w:t>US</w:t>
+            </w:r>
+          </w:p>
+        </w:tc>
+        <w:tc>
+          <w:tcPr>
+            <w:tcW w:type="dxa" w:w="720"/>
+          </w:tcPr>
+          <w:p>
+            <w:r>
+              <w:rPr>
+                <w:sz w:val="16"/>
+              </w:rPr>
+              <w:t>5</w:t>
+            </w:r>
+          </w:p>
+        </w:tc>
+        <w:tc>
+          <w:tcPr>
+            <w:tcW w:type="dxa" w:w="720"/>
+          </w:tcPr>
+          <w:p>
+            <w:r>
+              <w:rPr>
+                <w:sz w:val="16"/>
+              </w:rPr>
+              <w:t>5/5</w:t>
+            </w:r>
+          </w:p>
+        </w:tc>
+        <w:tc>
+          <w:tcPr>
+            <w:tcW w:type="dxa" w:w="1008"/>
+          </w:tcPr>
+          <w:p>
+            <w:r>
+              <w:rPr>
+                <w:sz w:val="16"/>
+              </w:rPr>
+              <w:t>−0.105%</w:t>
+            </w:r>
+          </w:p>
+        </w:tc>
+        <w:tc>
+          <w:tcPr>
+            <w:tcW w:type="dxa" w:w="1008"/>
+          </w:tcPr>
+          <w:p>
+            <w:r>
+              <w:rPr>
+                <w:sz w:val="16"/>
+              </w:rPr>
+              <w:t>−0.477%</w:t>
+            </w:r>
+          </w:p>
+        </w:tc>
+        <w:tc>
+          <w:tcPr>
+            <w:tcW w:type="dxa" w:w="1080"/>
+          </w:tcPr>
+          <w:p>
+            <w:r>
+              <w:rPr>
+                <w:sz w:val="16"/>
+              </w:rPr>
+              <w:t>2.052%</w:t>
+            </w:r>
+          </w:p>
+        </w:tc>
+      </w:tr>
+      <w:tr>
+        <w:tc>
+          <w:tcPr>
+            <w:tcW w:type="dxa" w:w="864"/>
+          </w:tcPr>
+          <w:p>
+            <w:r>
+              <w:rPr>
+                <w:sz w:val="16"/>
+              </w:rPr>
+              <w:t>Medium</w:t>
+            </w:r>
+          </w:p>
+        </w:tc>
+        <w:tc>
+          <w:tcPr>
+            <w:tcW w:type="dxa" w:w="936"/>
+          </w:tcPr>
+          <w:p>
+            <w:r>
+              <w:rPr>
+                <w:sz w:val="16"/>
+              </w:rPr>
+              <w:t>Global</w:t>
+            </w:r>
+          </w:p>
+        </w:tc>
+        <w:tc>
+          <w:tcPr>
+            <w:tcW w:type="dxa" w:w="720"/>
+          </w:tcPr>
+          <w:p>
+            <w:r>
+              <w:rPr>
+                <w:sz w:val="16"/>
+              </w:rPr>
+              <w:t>5</w:t>
+            </w:r>
+          </w:p>
+        </w:tc>
+        <w:tc>
+          <w:tcPr>
+            <w:tcW w:type="dxa" w:w="720"/>
+          </w:tcPr>
+          <w:p>
+            <w:r>
+              <w:rPr>
+                <w:sz w:val="16"/>
+              </w:rPr>
+              <w:t>5/5</w:t>
+            </w:r>
+          </w:p>
+        </w:tc>
+        <w:tc>
+          <w:tcPr>
+            <w:tcW w:type="dxa" w:w="1008"/>
+          </w:tcPr>
+          <w:p>
+            <w:r>
+              <w:rPr>
+                <w:sz w:val="16"/>
+              </w:rPr>
+              <w:t>+1.557%</w:t>
+            </w:r>
+          </w:p>
+        </w:tc>
+        <w:tc>
+          <w:tcPr>
+            <w:tcW w:type="dxa" w:w="1008"/>
+          </w:tcPr>
+          <w:p>
+            <w:r>
+              <w:rPr>
+                <w:sz w:val="16"/>
+              </w:rPr>
+              <w:t>−1.408%</w:t>
+            </w:r>
+          </w:p>
+        </w:tc>
+        <w:tc>
+          <w:tcPr>
+            <w:tcW w:type="dxa" w:w="1080"/>
+          </w:tcPr>
+          <w:p>
+            <w:r>
+              <w:rPr>
+                <w:sz w:val="16"/>
+              </w:rPr>
+              <w:t>1.270%</w:t>
+            </w:r>
+          </w:p>
+        </w:tc>
+      </w:tr>
+      <w:tr>
+        <w:tc>
+          <w:tcPr>
+            <w:tcW w:type="dxa" w:w="864"/>
+          </w:tcPr>
+          <w:p>
+            <w:r>
+              <w:rPr>
+                <w:sz w:val="16"/>
+              </w:rPr>
+              <w:t>Full</w:t>
+            </w:r>
+          </w:p>
+        </w:tc>
+        <w:tc>
+          <w:tcPr>
+            <w:tcW w:type="dxa" w:w="936"/>
+          </w:tcPr>
+          <w:p>
+            <w:r>
+              <w:rPr>
+                <w:sz w:val="16"/>
+              </w:rPr>
+              <w:t>US</w:t>
+            </w:r>
+          </w:p>
+        </w:tc>
+        <w:tc>
+          <w:tcPr>
+            <w:tcW w:type="dxa" w:w="720"/>
+          </w:tcPr>
+          <w:p>
+            <w:r>
+              <w:rPr>
+                <w:sz w:val="16"/>
+              </w:rPr>
+              <w:t>10</w:t>
+            </w:r>
+          </w:p>
+        </w:tc>
+        <w:tc>
+          <w:tcPr>
+            <w:tcW w:type="dxa" w:w="720"/>
+          </w:tcPr>
+          <w:p>
+            <w:r>
+              <w:rPr>
+                <w:sz w:val="16"/>
+              </w:rPr>
+              <w:t>10/10</w:t>
+            </w:r>
+          </w:p>
+        </w:tc>
+        <w:tc>
+          <w:tcPr>
+            <w:tcW w:type="dxa" w:w="1008"/>
+          </w:tcPr>
+          <w:p>
+            <w:r>
+              <w:rPr>
+                <w:sz w:val="16"/>
+              </w:rPr>
+              <w:t>−0.246%</w:t>
+            </w:r>
+          </w:p>
+        </w:tc>
+        <w:tc>
+          <w:tcPr>
+            <w:tcW w:type="dxa" w:w="1008"/>
+          </w:tcPr>
+          <w:p>
+            <w:r>
+              <w:rPr>
+                <w:sz w:val="16"/>
+              </w:rPr>
+              <w:t>−1.413%</w:t>
+            </w:r>
+          </w:p>
+        </w:tc>
+        <w:tc>
+          <w:tcPr>
+            <w:tcW w:type="dxa" w:w="1080"/>
+          </w:tcPr>
+          <w:p>
+            <w:r>
+              <w:rPr>
+                <w:sz w:val="16"/>
+              </w:rPr>
+              <w:t>0.021%</w:t>
+            </w:r>
+          </w:p>
+        </w:tc>
+      </w:tr>
+      <w:tr>
+        <w:tc>
+          <w:tcPr>
+            <w:tcW w:type="dxa" w:w="864"/>
+          </w:tcPr>
+          <w:p>
+            <w:r>
+              <w:rPr>
+                <w:sz w:val="16"/>
+              </w:rPr>
+              <w:t>Full</w:t>
+            </w:r>
+          </w:p>
+        </w:tc>
+        <w:tc>
+          <w:tcPr>
+            <w:tcW w:type="dxa" w:w="936"/>
+          </w:tcPr>
+          <w:p>
+            <w:r>
+              <w:rPr>
+                <w:sz w:val="16"/>
+              </w:rPr>
+              <w:t>Global</w:t>
+            </w:r>
+          </w:p>
+        </w:tc>
+        <w:tc>
+          <w:tcPr>
+            <w:tcW w:type="dxa" w:w="720"/>
+          </w:tcPr>
+          <w:p>
+            <w:r>
+              <w:rPr>
+                <w:sz w:val="16"/>
+              </w:rPr>
+              <w:t>10</w:t>
+            </w:r>
+          </w:p>
+        </w:tc>
+        <w:tc>
+          <w:tcPr>
+            <w:tcW w:type="dxa" w:w="720"/>
+          </w:tcPr>
+          <w:p>
+            <w:r>
+              <w:rPr>
+                <w:sz w:val="16"/>
+              </w:rPr>
+              <w:t>10/10</w:t>
+            </w:r>
+          </w:p>
+        </w:tc>
+        <w:tc>
+          <w:tcPr>
+            <w:tcW w:type="dxa" w:w="1008"/>
+          </w:tcPr>
+          <w:p>
+            <w:r>
+              <w:rPr>
+                <w:sz w:val="16"/>
+              </w:rPr>
+              <w:t>+3.262%</w:t>
+            </w:r>
+          </w:p>
+        </w:tc>
+        <w:tc>
+          <w:tcPr>
+            <w:tcW w:type="dxa" w:w="1008"/>
+          </w:tcPr>
+          <w:p>
+            <w:r>
+              <w:rPr>
+                <w:sz w:val="16"/>
+              </w:rPr>
+              <w:t>+0.857%</w:t>
+            </w:r>
+          </w:p>
+        </w:tc>
+        <w:tc>
+          <w:tcPr>
+            <w:tcW w:type="dxa" w:w="1080"/>
+          </w:tcPr>
+          <w:p>
+            <w:r>
+              <w:rPr>
+                <w:sz w:val="16"/>
+              </w:rPr>
+              <w:t>18.786%</w:t>
+            </w:r>
+          </w:p>
+        </w:tc>
+      </w:tr>
+    </w:tbl>
+    <w:p>
+      <w:pPr>
+        <w:spacing w:after="40"/>
+      </w:pPr>
+    </w:p>
+    <w:p>
+      <w:pPr>
+        <w:spacing w:after="60"/>
+      </w:pPr>
+      <w:r>
+        <w:rPr>
+          <w:b w:val="0"/>
+          <w:i w:val="0"/>
+          <w:sz w:val="19"/>
+        </w:rPr>
+        <w:t>All 36 short/medium/full seed×region combinations are safe (Sec. VIII-G): service and batch completion are exactly 1, expiry is exactly 0, and zero infeasibility certificates are raised, on every single seed — not merely on a lexicographically selected subset as in Sec. VII. At the final full-budget a–d evaluation (10 seeds, 301–310), US is economically indistinguishable from Status Quo (mean −0.246%, optimizer-bootstrap 95% CI [−$44,444.54, +$11,040.73], crossing zero) at a mean safety-intervention rate of only 0.021% of steps — the projector is a rare backstop that almost never overrides US's own preferences. Global is unambiguously positive: mean +3.262% with EVERY one of the 10 seed-level improvements positive and a 95% CI strictly above zero ([+$160,775.24, +$267,540.82]) — diagnostically also above the archived-v3-replay comparator ([+$18,047.17, +$142,269.02], Sec. VIII-I) — but at a mean intervention rate of 18.786%, i.e., roughly one step in five has its action materially altered by the projector (Sec. VIII-L).</w:t>
+      </w:r>
+    </w:p>
+    <w:p>
+      <w:pPr>
+        <w:keepNext/>
+        <w:spacing w:after="40"/>
+      </w:pPr>
+      <w:r>
+        <w:rPr>
+          <w:b/>
+          <w:i/>
+          <w:sz w:val="20"/>
+        </w:rPr>
+        <w:t>K. Descriptive e–h transfer (non-confirmatory)</w:t>
+      </w:r>
+    </w:p>
+    <w:p>
+      <w:pPr>
+        <w:spacing w:after="60"/>
+      </w:pPr>
+      <w:r>
+        <w:rPr>
+          <w:b w:val="0"/>
+          <w:i w:val="0"/>
+          <w:sz w:val="19"/>
+        </w:rPr>
+        <w:t>Cells e–h were already exposed during the frozen v2/v3 campaigns (Sec. V-E, Sec. VII-F), so evaluating the same 20 full-stage v4 models there — no retraining — is a one-time descriptive check, not fresh confirmatory data and not headline-eligible (final_results.json: headline_eligible= false), exactly as for v3's Table X.</w:t>
+      </w:r>
+    </w:p>
+    <w:p>
+      <w:pPr>
+        <w:jc w:val="center"/>
+      </w:pPr>
+      <w:r>
+        <w:rPr>
+          <w:b/>
+          <w:sz w:val="16"/>
+        </w:rPr>
+        <w:t>TABLE XVII. DESCRIPTIVE e–h TRANSFER OF THE 20 a–d FULL-STAGE MODELS, 10 SEEDS (NON-CONFIRMATORY)</w:t>
+      </w:r>
+    </w:p>
+    <w:tbl>
+      <w:tblPr>
+        <w:tblStyle w:val="LightGrid-Accent1"/>
+        <w:tblW w:type="auto" w:w="0"/>
+        <w:tblLook w:firstColumn="1" w:firstRow="1" w:lastColumn="0" w:lastRow="0" w:noHBand="0" w:noVBand="1" w:val="04A0"/>
+      </w:tblPr>
+      <w:tblGrid>
+        <w:gridCol w:w="1680"/>
+        <w:gridCol w:w="1680"/>
+        <w:gridCol w:w="1680"/>
+        <w:gridCol w:w="1680"/>
+        <w:gridCol w:w="1680"/>
+        <w:gridCol w:w="1680"/>
+      </w:tblGrid>
+      <w:tr>
+        <w:tc>
+          <w:tcPr>
+            <w:tcW w:type="dxa" w:w="792"/>
+          </w:tcPr>
+          <w:p>
+            <w:r>
+              <w:rPr>
+                <w:b/>
+                <w:sz w:val="16"/>
+              </w:rPr>
+              <w:t>Region</w:t>
+            </w:r>
+          </w:p>
+        </w:tc>
+        <w:tc>
+          <w:tcPr>
+            <w:tcW w:type="dxa" w:w="720"/>
+          </w:tcPr>
+          <w:p>
+            <w:r>
+              <w:rPr>
+                <w:b/>
+                <w:sz w:val="16"/>
+              </w:rPr>
+              <w:t>Seeds</w:t>
+            </w:r>
+          </w:p>
+        </w:tc>
+        <w:tc>
+          <w:tcPr>
+            <w:tcW w:type="dxa" w:w="720"/>
+          </w:tcPr>
+          <w:p>
+            <w:r>
+              <w:rPr>
+                <w:b/>
+                <w:sz w:val="16"/>
+              </w:rPr>
+              <w:t>Safe</w:t>
+            </w:r>
+          </w:p>
+        </w:tc>
+        <w:tc>
+          <w:tcPr>
+            <w:tcW w:type="dxa" w:w="1080"/>
+          </w:tcPr>
+          <w:p>
+            <w:r>
+              <w:rPr>
+                <w:b/>
+                <w:sz w:val="16"/>
+              </w:rPr>
+              <w:t>Mean sav.</w:t>
+            </w:r>
+          </w:p>
+        </w:tc>
+        <w:tc>
+          <w:tcPr>
+            <w:tcW w:type="dxa" w:w="1080"/>
+          </w:tcPr>
+          <w:p>
+            <w:r>
+              <w:rPr>
+                <w:b/>
+                <w:sz w:val="16"/>
+              </w:rPr>
+              <w:t>Worst sav.</w:t>
+            </w:r>
+          </w:p>
+        </w:tc>
+        <w:tc>
+          <w:tcPr>
+            <w:tcW w:type="dxa" w:w="1080"/>
+          </w:tcPr>
+          <w:p>
+            <w:r>
+              <w:rPr>
+                <w:b/>
+                <w:sz w:val="16"/>
+              </w:rPr>
+              <w:t>Interv. rate</w:t>
+            </w:r>
+          </w:p>
+        </w:tc>
+      </w:tr>
+      <w:tr>
+        <w:tc>
+          <w:tcPr>
+            <w:tcW w:type="dxa" w:w="792"/>
+          </w:tcPr>
+          <w:p>
+            <w:r>
+              <w:rPr>
+                <w:sz w:val="16"/>
+              </w:rPr>
+              <w:t>US</w:t>
+            </w:r>
+          </w:p>
+        </w:tc>
+        <w:tc>
+          <w:tcPr>
+            <w:tcW w:type="dxa" w:w="720"/>
+          </w:tcPr>
+          <w:p>
+            <w:r>
+              <w:rPr>
+                <w:sz w:val="16"/>
+              </w:rPr>
+              <w:t>10</w:t>
+            </w:r>
+          </w:p>
+        </w:tc>
+        <w:tc>
+          <w:tcPr>
+            <w:tcW w:type="dxa" w:w="720"/>
+          </w:tcPr>
+          <w:p>
+            <w:r>
+              <w:rPr>
+                <w:sz w:val="16"/>
+              </w:rPr>
+              <w:t>10/10</w:t>
+            </w:r>
+          </w:p>
+        </w:tc>
+        <w:tc>
+          <w:tcPr>
+            <w:tcW w:type="dxa" w:w="1080"/>
+          </w:tcPr>
+          <w:p>
+            <w:r>
+              <w:rPr>
+                <w:sz w:val="16"/>
+              </w:rPr>
+              <w:t>−0.149%</w:t>
+            </w:r>
+          </w:p>
+        </w:tc>
+        <w:tc>
+          <w:tcPr>
+            <w:tcW w:type="dxa" w:w="1080"/>
+          </w:tcPr>
+          <w:p>
+            <w:r>
+              <w:rPr>
+                <w:sz w:val="16"/>
+              </w:rPr>
+              <w:t>−1.763%</w:t>
+            </w:r>
+          </w:p>
+        </w:tc>
+        <w:tc>
+          <w:tcPr>
+            <w:tcW w:type="dxa" w:w="1080"/>
+          </w:tcPr>
+          <w:p>
+            <w:r>
+              <w:rPr>
+                <w:sz w:val="16"/>
+              </w:rPr>
+              <w:t>0.580%</w:t>
+            </w:r>
+          </w:p>
+        </w:tc>
+      </w:tr>
+      <w:tr>
+        <w:tc>
+          <w:tcPr>
+            <w:tcW w:type="dxa" w:w="792"/>
+          </w:tcPr>
+          <w:p>
+            <w:r>
+              <w:rPr>
+                <w:sz w:val="16"/>
+              </w:rPr>
+              <w:t>Global</w:t>
+            </w:r>
+          </w:p>
+        </w:tc>
+        <w:tc>
+          <w:tcPr>
+            <w:tcW w:type="dxa" w:w="720"/>
+          </w:tcPr>
+          <w:p>
+            <w:r>
+              <w:rPr>
+                <w:sz w:val="16"/>
+              </w:rPr>
+              <w:t>10</w:t>
+            </w:r>
+          </w:p>
+        </w:tc>
+        <w:tc>
+          <w:tcPr>
+            <w:tcW w:type="dxa" w:w="720"/>
+          </w:tcPr>
+          <w:p>
+            <w:r>
+              <w:rPr>
+                <w:sz w:val="16"/>
+              </w:rPr>
+              <w:t>10/10</w:t>
+            </w:r>
+          </w:p>
+        </w:tc>
+        <w:tc>
+          <w:tcPr>
+            <w:tcW w:type="dxa" w:w="1080"/>
+          </w:tcPr>
+          <w:p>
+            <w:r>
+              <w:rPr>
+                <w:sz w:val="16"/>
+              </w:rPr>
+              <w:t>+3.611%</w:t>
+            </w:r>
+          </w:p>
+        </w:tc>
+        <w:tc>
+          <w:tcPr>
+            <w:tcW w:type="dxa" w:w="1080"/>
+          </w:tcPr>
+          <w:p>
+            <w:r>
+              <w:rPr>
+                <w:sz w:val="16"/>
+              </w:rPr>
+              <w:t>+0.510%</w:t>
+            </w:r>
+          </w:p>
+        </w:tc>
+        <w:tc>
+          <w:tcPr>
+            <w:tcW w:type="dxa" w:w="1080"/>
+          </w:tcPr>
+          <w:p>
+            <w:r>
+              <w:rPr>
+                <w:sz w:val="16"/>
+              </w:rPr>
+              <w:t>20.170%</w:t>
+            </w:r>
+          </w:p>
+        </w:tc>
+      </w:tr>
+    </w:tbl>
+    <w:p>
+      <w:pPr>
+        <w:spacing w:after="40"/>
+      </w:pPr>
+    </w:p>
+    <w:p>
+      <w:pPr>
+        <w:spacing w:after="60"/>
+      </w:pPr>
+      <w:r>
+        <w:rPr>
+          <w:b w:val="0"/>
+          <w:i w:val="0"/>
+          <w:sz w:val="19"/>
+        </w:rPr>
+        <w:t>All 20 evaluated seeds remain safe on e–h — service/batch completion exactly 1, zero expiry, zero infeasibility certificates on every seed in both regions — because the ten requirements of Table XII are properties of the projector and the frozen envelope, not of the scenario being evaluated, so they transfer unconditionally. The economic numbers (US −0.149%, Global +3.611%) move only modestly from their a–d full-stage counterparts (−0.246%, +3.262%) and Global's intervention rate rises slightly (18.786%→20.170%); because e–h is not fresh data, this is reported for completeness only and cannot itself confirm or extend the a–d result.</w:t>
+      </w:r>
+    </w:p>
+    <w:p>
+      <w:pPr>
+        <w:keepNext/>
+        <w:spacing w:after="40"/>
+      </w:pPr>
+      <w:r>
+        <w:rPr>
+          <w:b/>
+          <w:i/>
+          <w:sz w:val="20"/>
+        </w:rPr>
+        <w:t>L. Interpretation: the Global result belongs to PPO+projector jointly</w:t>
+      </w:r>
+    </w:p>
+    <w:p>
+      <w:pPr>
+        <w:spacing w:after="60"/>
+      </w:pPr>
+      <w:r>
+        <w:rPr>
+          <w:b w:val="0"/>
+          <w:i w:val="0"/>
+          <w:sz w:val="19"/>
+        </w:rPr>
+        <w:t>Safety is deterministic; economics is learned — and how much of the economics is attributable to the learned policy alone depends on how often the projector must overrule it. US's mean intervention rate is 0.021% (full a–d) / 0.580% (e–h) — on the order of 1 in 5,000 to 1 in 170 steps — so the US result is, to a close approximation, still a statement about the frozen PPO R3_P1 policy's own preferences, with the projector acting as a rare backstop. Global's mean intervention rate is 18.786% (full a–d) / 20.170% (e–h) — roughly one step in five — so a material fraction of Global's applied actions are NOT what the PPO network proposed; they are the projector's nearest-feasible correction to it. The reported Global economic gain (+3.262% / +3.611%, both CIs or all ten seeds strictly positive) is therefore a property of the COMPOSED system — the trained PPO R0_P3 network together with the one-step projector — and cannot be attributed to either part alone: it is not evidence that unconstrained PPO would itself achieve these savings (Sec. VI/VII showed it does not, safely), nor is it evidence that the projector alone, driving a policy-agnostic desired action, would recover this gain (the projector has no preference of its own; requirement 5's minimal-ℓ²-distance reallocation and every other projection step start from the policy's OWN preference and move it the minimum necessary distance). What IS attributable to the projector alone, on any policy whatsoever, is the safety guarantee itself: Table XV shows the same ten requirements hold identically on the untouched archived v3 weights that never saw a projector during training, and Sec. VIII-H's randomized/adversarial and all-hold-policy smoke tests show they hold for policy-agnostic and even pathological actions. No part of this section makes an MPC claim of any kind; MPC remains structurally excluded from the v4 protocol exactly as from v2/v3.</w:t>
+      </w:r>
+    </w:p>
+    <w:p>
+      <w:pPr>
+        <w:keepNext/>
+        <w:spacing w:after="40"/>
+      </w:pPr>
+      <w:r>
+        <w:rPr>
+          <w:b/>
+          <w:i/>
+          <w:sz w:val="20"/>
+        </w:rPr>
+        <w:t>M. Conclusion of the hard-safety study</w:t>
+      </w:r>
+    </w:p>
+    <w:p>
+      <w:pPr>
+        <w:spacing w:after="60"/>
+      </w:pPr>
+      <w:r>
+        <w:rPr>
+          <w:b w:val="0"/>
+          <w:i w:val="0"/>
+          <w:sz w:val="19"/>
+        </w:rPr>
+        <w:t>A non-MPC, one-step Euclidean feasibility projector — cumulative exact EDF admission, exact transport conservation, exact 0–100% drain endpoints, and a frozen a–d-only future-capacity bound with a proven no-leakage property — replaces the Sec. VII-G sigmoid-reachability gap with a hard, constructed guarantee that holds on every one of the 36 newly trained short/medium/full seed×region combinations, on all 20 descriptively transferred e–h seeds, and on the untouched archived v3 policy weights under replay: zero completion failures, zero expiry, and zero infeasibility certificates throughout. This finally answers Sec. VII-H's call for safety-constrained action projection rather than a larger sweep of the same unconstrained policy class. Economically, US remains statistically indistinguishable from Status Quo while rarely invoking the projector (0.021%–0.580% of steps); Global is unambiguously positive (+3.262% a–d, +3.611% e–h, every seed and CI positive) but with the projector materially co-authoring roughly one step in five (18.786%–20.170%), so that gain is correctly attributed to the composed PPO+projector system, not to PPO in isolation. The defensible new contribution is therefore a hard safety guarantee obtained without retraining away the underlying joint-control difficulty, plus honest attribution of which economic results are — and are not — evidence about the learned policy on its own.</w:t>
+      </w:r>
+    </w:p>
+    <w:p>
+      <w:pPr>
         <w:sectPr>
           <w:type w:val="continuous"/>
           <w:pgSz w:w="12240" w:h="15840"/>
@@ -11394,6 +14162,7 @@
     </w:p>
     <w:p>
       <w:pPr>
+        <w:keepNext/>
         <w:spacing w:after="80"/>
         <w:jc w:val="center"/>
       </w:pPr>
@@ -11403,7 +14172,7 @@
           <w:i w:val="0"/>
           <w:sz w:val="21"/>
         </w:rPr>
-        <w:t>VIII. FURTHER TOPICS OF CONSIDERATION</w:t>
+        <w:t>IX. FURTHER TOPICS OF CONSIDERATION</w:t>
       </w:r>
     </w:p>
     <w:p>
@@ -11416,11 +14185,12 @@
           <w:i w:val="0"/>
           <w:sz w:val="19"/>
         </w:rPr>
-        <w:t>(1) Batch-safe constrained control is first priority, and Sec. VII shows it cannot be reached by more optimizer sweeping or more compute alone: enforce terminal completion/deadline feasibility with a non-MPC joint feasibility/action-projection layer that maps every learned action onto the nearest feasible one with EXACT 0–100% drain reachability, rather than relying on a sigmoid decode whose ±3 logit bound caps reachable drain at 95.257% and whose open-interval range cannot reach exact full drain at any finite bound (Sec. VII-G) or on a penalty-mediated floor that Sec. VI and Sec. VII both show can still fail on the majority of seeds. (2) Improve spatial policy optimization, especially for Global where PPO captures only 5.47–7.55% of QP savings, and diagnose the asymmetric US transfer. (3) Add ramp-aware training or constraints because joint PPO worsens rare maximum three-hour ramps, while preserving the observed p95 improvement. (4) Add the secondary demand charge to a true multi-objective/Pareto study because joint PPO raises the reference bill 5.3–8.1%. (5) Bound Global routing with latency, residency, network capacity, and movement costs. (6) Add a causal receding-horizon MPC comparator — excluded from both the v2 and v3 protocols to date and not claimed anywhere in this thesis. (7) Test CAISO five-minute RTM, other energy months/years, and other workload traces. (8) Add carbon intensity, storage, and demand-response participation only after the core control problem is stable.</w:t>
+        <w:t>(1) Sec. VIII delivers batch-safe constrained control — a non-MPC one-step feasibility projector with exact 0–100% drain reachability and zero completion failures across all 36 newly trained and 20 replayed models — so that specific prior priority is now closed; the open question it leaves behind is reducing Global's 18.786–20.170% mean safety-intervention rate, i.e., training the policy itself to need the projector's correction less often rather than only guaranteeing safety when it does intervene. (2) Collect FRESH e–h (or a genuinely new region/month) confirmatory data for the projected controller, since the current e–h numbers (Sec. VIII-K) remain descriptive only because those cells were already exposed by v2/v3. (3) Improve spatial policy optimization, especially for Global where unconstrained PPO captures only 5.47–7.55% of QP savings, and diagnose the asymmetric US transfer. (4) Add ramp-aware training or constraints because joint PPO worsens rare maximum three-hour ramps, while preserving the observed p95 improvement; the v4 projector's optional max_upward_ramp_mw cap (Sec. VIII-F, Table XII item 10) is validated by smoke test but not yet exercised in a trained model. (5) Add the secondary demand charge to a true multi-objective/Pareto study because joint PPO raises the reference bill 5.3–8.1%. (6) Bound Global routing with latency, residency, network capacity, and movement costs. (7) Add a causal receding-horizon MPC comparator — excluded from the v2, v3, AND v4 protocols to date and not claimed anywhere in this thesis. (8) Test CAISO five-minute RTM, other energy months/years, and other workload traces. (9) Add carbon intensity, storage, and demand-response participation only after the core control problem is stable.</w:t>
       </w:r>
     </w:p>
     <w:p>
       <w:pPr>
+        <w:keepNext/>
         <w:spacing w:after="80"/>
         <w:jc w:val="center"/>
       </w:pPr>
@@ -11430,7 +14200,7 @@
           <w:i w:val="0"/>
           <w:sz w:val="21"/>
         </w:rPr>
-        <w:t>IX. CONCLUSION</w:t>
+        <w:t>X. CONCLUSION</w:t>
       </w:r>
     </w:p>
     <w:p>
@@ -11443,11 +14213,12 @@
           <w:i w:val="0"/>
           <w:sz w:val="19"/>
         </w:rPr>
-        <w:t>This thesis builds a reproducible chain from measured Google service/batch usage and PowerData2019 calibration to one real May-2025 CAISO energy archetype, equal 100 MW proxy DCs, a joint PPO controller, and a frozen two-fold held-out evaluation. The system exposes substantial clairvoyant spatial headroom (7.2–16.4%) and modest incremental temporal headroom (0.6–2.3%). Learned performance is much narrower. Global spatial PPO saves 0.90% and 1.19% on the two held-out folds with positive optimizer CIs and complete service, but captures only 5.47–7.55% of QP savings. US spatial does not establish savings. Joint batch PPO fails the frozen headline: only 9/40 seeds meet the completion floor, gains are fold-dependent, and rare maximum ramps and the secondary demand-charge reference worsen. A post-hoc exploratory v3 study (Sec. VII) adds the missing episode/deadline context, but a post-run boundary audit shows the state repair remains incomplete; it re-screens optimizer and reward-weight hyperparameters and trains at up to 2× the frozen budget under a stricter pre-registered safety-first gate; it still fails — the recovered US configuration is economically indistinguishable from Status Quo and the recovered Global configuration is only 1/10-seed safe despite a real positive economic effect — so the joint failure is not an artifact of the omitted state or of training budget. The defensible contribution is therefore the real, audited experimental system; the modest optimistic Global spatial result; and the negative evidence, now twice obtained under two different state representations and training budgets, that unconstrained PPO does not solve reliable joint spatio-temporal shaping. The next step is not a stronger claim but safer batch control via action projection and better capture of demonstrable spatial opportunity.</w:t>
+        <w:t>This thesis builds a reproducible chain from measured Google service/batch usage and PowerData2019 calibration to one real May-2025 CAISO energy archetype, equal 100 MW proxy DCs, a joint PPO controller, and a frozen two-fold held-out evaluation. The system exposes substantial clairvoyant spatial headroom (7.2–16.4%) and modest incremental temporal headroom (0.6–2.3%). Learned performance is much narrower. Global spatial PPO saves 0.90% and 1.19% on the two held-out folds with positive optimizer CIs and complete service, but captures only 5.47–7.55% of QP savings. US spatial does not establish savings. Joint batch PPO fails the frozen headline: only 9/40 seeds meet the completion floor, gains are fold-dependent, and rare maximum ramps and the secondary demand-charge reference worsen. A post-hoc exploratory v3 study (Sec. VII) adds the missing episode/deadline context, but a post-run boundary audit shows the state repair remains incomplete; it re-screens optimizer and reward-weight hyperparameters and trains at up to 2× the frozen budget under a stricter pre-registered safety-first gate; it still fails — the recovered US configuration is economically indistinguishable from Status Quo and the recovered Global configuration is only 1/10-seed safe despite a real positive economic effect — so the joint failure is not an artifact of the omitted state or of training budget. A completed v4 hard-safety study (Sec. VIII) then replaces the shaped, sigmoid-capped drain decoder with a non-MPC one-step feasibility projector — cumulative exact EDF admission, exact transport conservation, exact 0–100% drain endpoints, and a frozen, no-leakage a–d-only capacity bound — and trains 36 new PPO+projector models plus replays the archived v3 weights under it: every one of the 36 newly trained, 20 replayed, and 20 descriptively transferred e–h seeds reaches exact service/batch completion with zero expiry and zero infeasibility certificates. US remains economically indistinguishable from Status Quo (−0.246% a–d, −0.149% e–h, CIs crossing zero) while rarely invoking the projector (0.021–0.580% of steps); Global is unambiguously positive (+3.262% a–d, +3.611% e–h, every seed and CI positive) but with the projector materially co-authoring roughly one step in five (18.786–20.170%), so that gain is honestly attributed to the composed PPO+projector system rather than to unconstrained PPO, which Sec. VI/VII already showed cannot achieve it safely on its own. The defensible contribution is therefore the real, audited experimental system; the modest optimistic Global spatial result; the negative evidence, twice obtained under two different state representations and training budgets, that unconstrained PPO does not solve reliable joint spatio-temporal shaping; and a hard, constructed safety guarantee — obtained without an MPC comparator and without retraining away the underlying difficulty — that finally closes the reachability and completion gaps documented in Sec. VII while making explicit which of its economic gains are, and are not, evidence about the learned policy in isolation. The next step is not a stronger claim but fresh confirmatory transfer data and a policy that needs the projector's correction less often.</w:t>
       </w:r>
     </w:p>
     <w:p>
       <w:pPr>
+        <w:keepNext/>
         <w:spacing w:after="80"/>
         <w:jc w:val="center"/>
       </w:pPr>

</xml_diff>

<commit_message>
Publish reviewed V4R thesis artifacts
Co-authored-by: Copilot App <223556219+Copilot@users.noreply.github.com>
</commit_message>
<xml_diff>
--- a/thesis_paper.docx
+++ b/thesis_paper.docx
@@ -169,7 +169,7 @@
         <w:rPr>
           <w:rFonts w:ascii="Arial" w:cs="Arial" w:eastAsia="Arial" w:hAnsi="Arial"/>
         </w:rPr>
-        <w:t xml:space="preserve">Geo-distributed computing can alter grid-facing demand by routing work among electricity markets and scheduling deferrable work before forecast ramps. This thesis asks whether a controller whose learned preferences originate entirely in reward-only reinforcement learning can reduce a fleet's incremental contribution to physical 1 h and 3 h net-load ramps while preserving exact workload service and a day-ahead energy-cost constraint. The study uses a common hourly UTC panel from September 2025 through April 2026 for six independently observed US markets: CAISO NP15, ERCOT North, NYISO Zone J, MISO Minnesota Hub, SPP North Hub, and ISO New England NEMA. September-January is training, February is validation, and March-April is sealed test. PJM DOM / Northern Virginia was not evaluated because the required credential was unavailable.</w:t>
+        <w:t xml:space="preserve">Geo-distributed computing can alter grid-facing demand by routing work among electricity markets and scheduling deferrable work before forecast ramps. This thesis asks whether a controller whose learned preferences originate entirely in reward-only reinforcement learning can reduce a fleet's incremental contribution to physical 1 h and 3 h net-load ramps while preserving exact workload service and a day-ahead energy-cost constraint. The study uses a common hourly UTC panel from September 2025 through April 2026 for six separately sourced market/balancing-authority series: CAISO NP15, ERCOT North, NYISO Zone J, MISO Minnesota Hub, SPP North Hub, and ISO New England NEMA. These are fixed market cases, not statistically independent samples or facility-level grids; hub/zonal price and physical-stress geographies can differ. September-January is training, February is validation, and March-April is sealed test. PJM DOM / Northern Virginia was not evaluated because the required credential was unavailable.</w:t>
       </w:r>
     </w:p>
     <w:p>
@@ -227,7 +227,7 @@
         <w:rPr>
           <w:rFonts w:ascii="Arial" w:cs="Arial" w:eastAsia="Arial" w:hAnsi="Arial"/>
         </w:rPr>
-        <w:t xml:space="preserve">Prior geo-distributed scheduling work often minimizes electricity price, emissions, or renewable mismatch by moving workload to favorable places and times. Those objectives are useful, but an immediate price signal does not directly identify whether controllable demand anticipates a future physical ramp. A scheduler may save money while amplifying a balancing-area net-load change, or it may counter a ramp without lowering a wholesale settlement proxy. This thesis therefore separates a physical ramp estimand from a wholesale day-ahead LMP cost constraint.</w:t>
+        <w:t xml:space="preserve">Prior geo-distributed scheduling work often minimizes electricity price, emissions, or renewable mismatch by moving workload to favorable places and times. Those objectives are useful, but an immediate price signal does not directly identify whether controllable demand anticipates a future physical ramp. A scheduler may save money while amplifying a balancing-area net-load change, or it may attenuate ramp magnitude without lowering a wholesale settlement proxy. This thesis therefore separates a physical ramp estimand from a wholesale day-ahead LMP cost constraint.</w:t>
       </w:r>
     </w:p>
     <w:p>
@@ -238,7 +238,7 @@
         <w:rPr>
           <w:rFonts w:ascii="Arial" w:cs="Arial" w:eastAsia="Arial" w:hAnsi="Arial"/>
         </w:rPr>
-        <w:t xml:space="preserve">The data-center contribution is evaluated against the native market trajectory, not against zero load. For market \(m\), time \(t\), and horizon \(h\), the question is whether adding modeled data-center power makes the squared, market-normalized net-load change larger or smaller than it would have been under native demand. Negative incremental impact means counter-ramping; positive impact means amplification.</w:t>
+        <w:t xml:space="preserve">The data-center contribution is evaluated against the native market trajectory, not against zero load. For market \(m\), time \(t\), and horizon \(h\), the question is whether adding modeled data-center power makes the squared, market-normalized net-load change larger or smaller than it would have been under native demand. Negative incremental impact means the modeled data-center load reduced squared normalized ramp magnitude; it does not by itself prove opposite-direction action or delivery of a balancing service. Positive impact means amplification.</w:t>
       </w:r>
     </w:p>
     <w:p>
@@ -340,7 +340,7 @@
         <w:rPr>
           <w:rFonts w:ascii="Arial" w:cs="Arial" w:eastAsia="Arial" w:hAnsi="Arial"/>
         </w:rPr>
-        <w:t xml:space="preserve">an independently sourced six-market hourly panel with explicit geography,</w:t>
+        <w:t xml:space="preserve">six separately sourced market/BA series with explicit price-versus-physical</w:t>
       </w:r>
     </w:p>
     <w:p>
@@ -351,7 +351,7 @@
         <w:rPr>
           <w:rFonts w:ascii="Arial" w:cs="Arial" w:eastAsia="Arial" w:hAnsi="Arial"/>
         </w:rPr>
-        <w:t xml:space="preserve">licensing, missing-data, and causal-forecast contracts;</w:t>
+        <w:t xml:space="preserve">geography, licensing, missing-data, and causal-forecast contracts;</w:t>
       </w:r>
     </w:p>
     <w:p>
@@ -1231,7 +1231,7 @@
                 <w:sz w:val="18"/>
                 <w:szCs w:val="18"/>
               </w:rPr>
-              <w:t xml:space="preserve">lost binaries prevented trustworthy evaluation</w:t>
+              <w:t xml:space="preserve">N/A: lost binaries prevented trustworthy evaluation</w:t>
             </w:r>
           </w:p>
         </w:tc>
@@ -1263,7 +1263,7 @@
                 <w:sz w:val="18"/>
                 <w:szCs w:val="18"/>
               </w:rPr>
-              <w:t xml:space="preserve">blocked and explicitly unevaluated</w:t>
+              <w:t xml:space="preserve">blocked and explicitly not evaluated</w:t>
             </w:r>
           </w:p>
         </w:tc>
@@ -1729,7 +1729,7 @@
                 <w:sz w:val="18"/>
                 <w:szCs w:val="18"/>
               </w:rPr>
-              <w:t xml:space="preserve">CAISO system</w:t>
+              <w:t xml:space="preserve">CAISO BA gross demand and renewables via EIA-930 fallback</w:t>
             </w:r>
           </w:p>
         </w:tc>
@@ -1859,7 +1859,7 @@
                 <w:sz w:val="18"/>
                 <w:szCs w:val="18"/>
               </w:rPr>
-              <w:t xml:space="preserve">ERCOT system</w:t>
+              <w:t xml:space="preserve">ERCOT native load plus hourly wind/solar</w:t>
             </w:r>
           </w:p>
         </w:tc>
@@ -2119,7 +2119,7 @@
                 <w:sz w:val="18"/>
                 <w:szCs w:val="18"/>
               </w:rPr>
-              <w:t xml:space="preserve">MISO system</w:t>
+              <w:t xml:space="preserve">MISO BA gross demand and renewables via EIA-930 fallback</w:t>
             </w:r>
           </w:p>
         </w:tc>
@@ -2249,7 +2249,7 @@
                 <w:sz w:val="18"/>
                 <w:szCs w:val="18"/>
               </w:rPr>
-              <w:t xml:space="preserve">SPP balancing authority</w:t>
+              <w:t xml:space="preserve">SPP BA gross demand and renewables via EIA-930 fallback</w:t>
             </w:r>
           </w:p>
         </w:tc>
@@ -2379,7 +2379,7 @@
                 <w:sz w:val="18"/>
                 <w:szCs w:val="18"/>
               </w:rPr>
-              <w:t xml:space="preserve">ISO New England balancing authority</w:t>
+              <w:t xml:space="preserve">ISO-NE BA gross demand and renewables via EIA-930 fallback</w:t>
             </w:r>
           </w:p>
         </w:tc>
@@ -2492,7 +2492,7 @@
         <w:rPr>
           <w:rFonts w:ascii="Arial" w:cs="Arial" w:eastAsia="Arial" w:hAnsi="Arial"/>
         </w:rPr>
-        <w:t xml:space="preserve">These are independent market series, not wall-time shifts of one CAISO trace. They are nevertheless fixed cases rather than random draws from all US grids. The market-level physical geography is not a facility feeder, utility territory, or local reliability zone. PJM DOM / Northern Virginia was not evaluated and has no result in any aggregate.</w:t>
+        <w:t xml:space="preserve">These are separately sourced market/BA series, not wall-time shifts of one CAISO trace. They are fixed cases rather than statistically independent or iid draws from all US grids. Their wholesale price products are hub/zonal series, while physical stress can be balancing-authority or system scale; neither represents a facility feeder, utility territory, or local reliability zone. PJM DOM / Northern Virginia was not evaluated and has no result in any aggregate.</w:t>
       </w:r>
     </w:p>
     <w:p>
@@ -2515,7 +2515,7 @@
         <w:rPr>
           <w:rFonts w:ascii="Arial" w:cs="Arial" w:eastAsia="Arial" w:hAnsi="Arial"/>
         </w:rPr>
-        <w:t xml:space="preserve">Day-ahead price comes from operator products at the stated hub or zone. Physical demand and renewable components use operator products where complete and defensible; documented same-balancing-authority EIA bulk fallback is used only where the operator historical physical tuple is unavailable. Each source descriptor records product, geography, cadence, units, timezone, revision status, authentication, retrieval query/time, raw hash, quality flags, and redistribution policy. Restricted raw/native/panel files remain local and ignored where licensing prohibits redistribution; permissible manifests, hashes, and derived evidence are committed.</w:t>
+        <w:t xml:space="preserve">Day-ahead price comes from operator products at the stated hub or zone. Physical demand and renewable components use operator products where complete and defensible. ERCOT and NYISO use the selected operator physical products; CAISO, MISO, SPP, and ISO-NE use a documented same-balancing-authority EIA bulk fallback because complete, timestamp-defensible operator history was unavailable. In particular, CAISO Today's Outlook lacked an authoritative UTC field and SPP GenMix365 had 67 incomplete five-minute hours, which could not be interpolated. Each source descriptor records product, geography, cadence, units, timezone, revision status, authentication, retrieval query/time, raw hash, quality flags, and redistribution policy. Restricted raw/native/panel files remain local and ignored where licensing prohibits redistribution; permissible manifests, hashes, and derived evidence are committed.</w:t>
       </w:r>
     </w:p>
     <w:p>
@@ -3384,7 +3384,7 @@
           <w:b/>
           <w:bCs/>
         </w:rPr>
-        <w:t xml:space="preserve">Canonical evidence SHA-256:</w:t>
+        <w:t xml:space="preserve">Provenance hash contract:</w:t>
       </w:r>
       <w:r>
         <w:rPr>
@@ -3399,7 +3399,7 @@
           <w:szCs w:val="20"/>
           <w:shd w:fill="EEF1F4" w:val="clear"/>
         </w:rPr>
-        <w:t xml:space="preserve">b1742a2e753d9a899be256667c80679cbfcf2da4cf6056a6b471d42e66ee7b30</w:t>
+        <w:t xml:space="preserve">dc-energy-provenance-sha256-v2</w:t>
       </w:r>
     </w:p>
     <w:p>
@@ -3412,7 +3412,7 @@
           <w:b/>
           <w:bCs/>
         </w:rPr>
-        <w:t xml:space="preserve">Generated claim-ledger SHA-256:</w:t>
+        <w:t xml:space="preserve">Canonical JSON representation:</w:t>
       </w:r>
       <w:r>
         <w:rPr>
@@ -3427,7 +3427,63 @@
           <w:szCs w:val="20"/>
           <w:shd w:fill="EEF1F4" w:val="clear"/>
         </w:rPr>
-        <w:t xml:space="preserve">a69ccfb212fbb1fccf5a8979b15f7b6d29b01054b6263a23549da7bd11ade75c</w:t>
+        <w:t xml:space="preserve">canonical-json-utf8-sort-compact-v1</w:t>
+      </w:r>
+    </w:p>
+    <w:p>
+      <w:pPr>
+        <w:spacing w:after="120" w:line="276"/>
+      </w:pPr>
+      <w:r>
+        <w:rPr>
+          <w:rFonts w:ascii="Arial" w:cs="Arial" w:eastAsia="Arial" w:hAnsi="Arial"/>
+          <w:b/>
+          <w:bCs/>
+        </w:rPr>
+        <w:t xml:space="preserve">Canonical evidence SHA-256 under that representation:</w:t>
+      </w:r>
+      <w:r>
+        <w:rPr>
+          <w:rFonts w:ascii="Arial" w:cs="Arial" w:eastAsia="Arial" w:hAnsi="Arial"/>
+        </w:rPr>
+        <w:t xml:space="preserve"> </w:t>
+      </w:r>
+      <w:r>
+        <w:rPr>
+          <w:rFonts w:ascii="Courier New" w:cs="Courier New" w:eastAsia="Courier New" w:hAnsi="Courier New"/>
+          <w:sz w:val="20"/>
+          <w:szCs w:val="20"/>
+          <w:shd w:fill="EEF1F4" w:val="clear"/>
+        </w:rPr>
+        <w:t xml:space="preserve">f642bd5868abdd9f7cda2a6fffb228250f3570fd0c6d440085da68c976892d9b</w:t>
+      </w:r>
+    </w:p>
+    <w:p>
+      <w:pPr>
+        <w:spacing w:after="120" w:line="276"/>
+      </w:pPr>
+      <w:r>
+        <w:rPr>
+          <w:rFonts w:ascii="Arial" w:cs="Arial" w:eastAsia="Arial" w:hAnsi="Arial"/>
+          <w:b/>
+          <w:bCs/>
+        </w:rPr>
+        <w:t xml:space="preserve">Generated claim-ledger SHA-256:</w:t>
+      </w:r>
+      <w:r>
+        <w:rPr>
+          <w:rFonts w:ascii="Arial" w:cs="Arial" w:eastAsia="Arial" w:hAnsi="Arial"/>
+        </w:rPr>
+        <w:t xml:space="preserve"> </w:t>
+      </w:r>
+      <w:r>
+        <w:rPr>
+          <w:rFonts w:ascii="Courier New" w:cs="Courier New" w:eastAsia="Courier New" w:hAnsi="Courier New"/>
+          <w:sz w:val="20"/>
+          <w:szCs w:val="20"/>
+          <w:shd w:fill="EEF1F4" w:val="clear"/>
+        </w:rPr>
+        <w:t xml:space="preserve">1344baf957612527171274af84591c7271644407bcceee38036d66503c5f94e1</w:t>
       </w:r>
     </w:p>
     <w:p>
@@ -4431,7 +4487,7 @@
                 <w:sz w:val="18"/>
                 <w:szCs w:val="18"/>
               </w:rPr>
-              <w:t xml:space="preserve">Test direction</w:t>
+              <w:t xml:space="preserve">Test interpretation</w:t>
             </w:r>
           </w:p>
         </w:tc>
@@ -4561,7 +4617,7 @@
                 <w:sz w:val="18"/>
                 <w:szCs w:val="18"/>
               </w:rPr>
-              <w:t xml:space="preserve">counter-ramp</w:t>
+              <w:t xml:space="preserve">reduced modeled data-center contribution to squared normalized grid ramps</w:t>
             </w:r>
           </w:p>
         </w:tc>
@@ -4691,7 +4747,7 @@
                 <w:sz w:val="18"/>
                 <w:szCs w:val="18"/>
               </w:rPr>
-              <w:t xml:space="preserve">counter-ramp</w:t>
+              <w:t xml:space="preserve">reduced modeled data-center contribution to squared normalized grid ramps</w:t>
             </w:r>
           </w:p>
         </w:tc>
@@ -4821,7 +4877,7 @@
                 <w:sz w:val="18"/>
                 <w:szCs w:val="18"/>
               </w:rPr>
-              <w:t xml:space="preserve">counter-ramp</w:t>
+              <w:t xml:space="preserve">reduced modeled data-center contribution to squared normalized grid ramps</w:t>
             </w:r>
           </w:p>
         </w:tc>
@@ -4951,7 +5007,7 @@
                 <w:sz w:val="18"/>
                 <w:szCs w:val="18"/>
               </w:rPr>
-              <w:t xml:space="preserve">counter-ramp</w:t>
+              <w:t xml:space="preserve">reduced modeled data-center contribution to squared normalized grid ramps</w:t>
             </w:r>
           </w:p>
         </w:tc>
@@ -5081,7 +5137,7 @@
                 <w:sz w:val="18"/>
                 <w:szCs w:val="18"/>
               </w:rPr>
-              <w:t xml:space="preserve">counter-ramp</w:t>
+              <w:t xml:space="preserve">reduced modeled data-center contribution to squared normalized grid ramps</w:t>
             </w:r>
           </w:p>
         </w:tc>
@@ -5211,7 +5267,7 @@
                 <w:sz w:val="18"/>
                 <w:szCs w:val="18"/>
               </w:rPr>
-              <w:t xml:space="preserve">counter-ramp</w:t>
+              <w:t xml:space="preserve">reduced modeled data-center contribution to squared normalized grid ramps</w:t>
             </w:r>
           </w:p>
         </w:tc>
@@ -7344,7 +7400,7 @@
         <w:rPr>
           <w:rFonts w:ascii="Arial" w:cs="Arial" w:eastAsia="Arial" w:hAnsi="Arial"/>
         </w:rPr>
-        <w:t xml:space="preserve">The controller is price-taking: data-center action does not change LMP, unit commitment, reserves, or network constraints. This is most plausible for the 600 MW primary case. The 1 GW-total case is a bounded sensitivity, while larger penetration overrides are stress tests.</w:t>
+        <w:t xml:space="preserve">The controller is price-taking: data-center action does not change LMP, unit commitment, reserves, or network constraints. This is most plausible for the 600 MW primary case. The 1 GW-total case is a price-taking scale sensitivity, not evidence that price or network response would remain exogenous at that penetration; larger penetration overrides are stress tests.</w:t>
       </w:r>
     </w:p>
     <w:p>
@@ -7469,13 +7525,13 @@
           <w:szCs w:val="20"/>
           <w:shd w:fill="EEF1F4" w:val="clear"/>
         </w:rPr>
-        <w:t xml:space="preserve">output/ramp_rl_v6/recovered_v4r/canonical_evidence.json</w:t>
-      </w:r>
-      <w:r>
-        <w:rPr>
-          <w:rFonts w:ascii="Arial" w:cs="Arial" w:eastAsia="Arial" w:hAnsi="Arial"/>
-        </w:rPr>
-        <w:t xml:space="preserve">. Recovery binding, source freeze, validation/test decisions, single-open records, embedded raw results, and post-selection robustness records reside beside it. The generated claim ledger and CSV tables are under </w:t>
+        <w:t xml:space="preserve">output/ramp_rl_v6/recovered_v4r_resealed_v2/canonical_evidence.json</w:t>
+      </w:r>
+      <w:r>
+        <w:rPr>
+          <w:rFonts w:ascii="Arial" w:cs="Arial" w:eastAsia="Arial" w:hAnsi="Arial"/>
+        </w:rPr>
+        <w:t xml:space="preserve">. Its hash contract is </w:t>
       </w:r>
       <w:r>
         <w:rPr>
@@ -7484,13 +7540,69 @@
           <w:szCs w:val="20"/>
           <w:shd w:fill="EEF1F4" w:val="clear"/>
         </w:rPr>
-        <w:t xml:space="preserve">output/ramp_rl_v6/recovered_v4r/thesis/</w:t>
+        <w:t xml:space="preserve">dc-energy-provenance-sha256-v2</w:t>
+      </w:r>
+      <w:r>
+        <w:rPr>
+          <w:rFonts w:ascii="Arial" w:cs="Arial" w:eastAsia="Arial" w:hAnsi="Arial"/>
+        </w:rPr>
+        <w:t xml:space="preserve">. JSON evidence identities use </w:t>
+      </w:r>
+      <w:r>
+        <w:rPr>
+          <w:rFonts w:ascii="Courier New" w:cs="Courier New" w:eastAsia="Courier New" w:hAnsi="Courier New"/>
+          <w:sz w:val="20"/>
+          <w:szCs w:val="20"/>
+          <w:shd w:fill="EEF1F4" w:val="clear"/>
+        </w:rPr>
+        <w:t xml:space="preserve">canonical-json-utf8-sort-compact-v1</w:t>
+      </w:r>
+      <w:r>
+        <w:rPr>
+          <w:rFonts w:ascii="Arial" w:cs="Arial" w:eastAsia="Arial" w:hAnsi="Arial"/>
+        </w:rPr>
+        <w:t xml:space="preserve">; tracked non-JSON source text uses Git-blob bytes at an explicit commit and path, never platform-dependent working-tree bytes. Binary and model-container identities use raw bytes. Recovery binding, source freeze, validation/test chains, single-open records, and post-selection robustness chains reside beside it. The generated claim ledger and CSV tables are under </w:t>
+      </w:r>
+      <w:r>
+        <w:rPr>
+          <w:rFonts w:ascii="Courier New" w:cs="Courier New" w:eastAsia="Courier New" w:hAnsi="Courier New"/>
+          <w:sz w:val="20"/>
+          <w:szCs w:val="20"/>
+          <w:shd w:fill="EEF1F4" w:val="clear"/>
+        </w:rPr>
+        <w:t xml:space="preserve">output/ramp_rl_v6/recovered_v4r_resealed_v2/thesis/</w:t>
       </w:r>
       <w:r>
         <w:rPr>
           <w:rFonts w:ascii="Arial" w:cs="Arial" w:eastAsia="Arial" w:hAnsi="Arial"/>
         </w:rPr>
         <w:t xml:space="preserve">.</w:t>
+      </w:r>
+    </w:p>
+    <w:p>
+      <w:pPr>
+        <w:spacing w:after="120" w:line="276"/>
+      </w:pPr>
+      <w:r>
+        <w:rPr>
+          <w:rFonts w:ascii="Arial" w:cs="Arial" w:eastAsia="Arial" w:hAnsi="Arial"/>
+        </w:rPr>
+        <w:t xml:space="preserve">The reseal has </w:t>
+      </w:r>
+      <w:r>
+        <w:rPr>
+          <w:rFonts w:ascii="Courier New" w:cs="Courier New" w:eastAsia="Courier New" w:hAnsi="Courier New"/>
+          <w:sz w:val="20"/>
+          <w:szCs w:val="20"/>
+          <w:shd w:fill="EEF1F4" w:val="clear"/>
+        </w:rPr>
+        <w:t xml:space="preserve">provenance-hash-chain-only</w:t>
+      </w:r>
+      <w:r>
+        <w:rPr>
+          <w:rFonts w:ascii="Arial" w:cs="Arial" w:eastAsia="Arial" w:hAnsi="Arial"/>
+        </w:rPr>
+        <w:t xml:space="preserve"> supersession scope. It supersedes only platform-dependent checkout hashes in the original evidence chain; the protocol, chronology, controller, trained models, data, forecasts, numerical metrics, strict decisions, and sealed-test opening are unchanged. The original evidence remains append-only historical provenance rather than the publication hash authority.</w:t>
       </w:r>
     </w:p>
     <w:p>
@@ -7575,7 +7687,7 @@
           <w:sz w:val="17"/>
           <w:szCs w:val="17"/>
         </w:rPr>
-        <w:t xml:space="preserve">  output\ramp_rl_v6\recovered_v4r\canonical_evidence.json `</w:t>
+        <w:t xml:space="preserve">  output\ramp_rl_v6\recovered_v4r_resealed_v2\canonical_evidence.json `</w:t>
       </w:r>
     </w:p>
     <w:p>
@@ -7593,7 +7705,7 @@
           <w:sz w:val="17"/>
           <w:szCs w:val="17"/>
         </w:rPr>
-        <w:t xml:space="preserve">  --output output\ramp_rl_v6\recovered_v4r\thesis</w:t>
+        <w:t xml:space="preserve">  --output output\ramp_rl_v6\recovered_v4r_resealed_v2\thesis</w:t>
       </w:r>
     </w:p>
     <w:p>
@@ -7683,7 +7795,7 @@
           <w:sz w:val="17"/>
           <w:szCs w:val="17"/>
         </w:rPr>
-        <w:t xml:space="preserve">  --results output\ramp_rl_v6\recovered_v4r\canonical_evidence.json `</w:t>
+        <w:t xml:space="preserve">  --results output\ramp_rl_v6\recovered_v4r_resealed_v2\canonical_evidence.json `</w:t>
       </w:r>
     </w:p>
     <w:p>
@@ -7773,7 +7885,7 @@
           <w:sz w:val="17"/>
           <w:szCs w:val="17"/>
         </w:rPr>
-        <w:t xml:space="preserve">  --results output\ramp_rl_v6\recovered_v4r\canonical_evidence.json</w:t>
+        <w:t xml:space="preserve">  --results output\ramp_rl_v6\recovered_v4r_resealed_v2\canonical_evidence.json</w:t>
       </w:r>
     </w:p>
     <w:p>
@@ -7930,7 +8042,7 @@
         <w:rPr>
           <w:rFonts w:ascii="Arial" w:cs="Arial" w:eastAsia="Arial" w:hAnsi="Arial"/>
         </w:rPr>
-        <w:t xml:space="preserve">The result supports a narrow conclusion: under the frozen six-market, price-taking simulator and fixed 2025-2026 panel, pure-RL-origin preferences with constraint-only decoding can anticipate and counter measured market-scale ramps. It does not establish feeder relief, endogenous market effects, retail savings, universal US-grid generalization, or future-year performance.</w:t>
+        <w:t xml:space="preserve">The result supports a narrow conclusion: under the frozen six-market, price-taking simulator and fixed 2025-2026 panel, pure-RL-origin preferences with constraint-only decoding reduced the modeled data-center contribution to squared normalized grid ramps. It does not establish opposite-direction action, balancing-service delivery, feeder relief, endogenous market effects, retail savings, universal US-grid generalization, or future-year performance.</w:t>
       </w:r>
     </w:p>
     <w:p>

</xml_diff>

<commit_message>
Bind V4R metric replay recovery
Track the full deterministic checkpoint equivalence audit, bind new container identities to the post-hoc replay, and keep the original sealed result immutable.

Co-authored-by: Copilot App <223556219+Copilot@users.noreply.github.com>
</commit_message>
<xml_diff>
--- a/thesis_paper.docx
+++ b/thesis_paper.docx
@@ -10541,7 +10541,7 @@
         <w:rPr>
           <w:rFonts w:ascii="Arial" w:cs="Arial" w:eastAsia="Arial" w:hAnsi="Arial"/>
         </w:rPr>
-        <w:t xml:space="preserve">10.4 Recompute corrected telemetry with local frozen binaries</w:t>
+        <w:t xml:space="preserve">10.4 Reconstruct checkpoints and recompute telemetry</w:t>
       </w:r>
     </w:p>
     <w:p>
@@ -10552,7 +10552,22 @@
         <w:rPr>
           <w:rFonts w:ascii="Arial" w:cs="Arial" w:eastAsia="Arial" w:hAnsi="Arial"/>
         </w:rPr>
-        <w:t xml:space="preserve">Raw recovered model containers may be absent from a fresh clone because they are large ignored artifacts. If the exact protocol-bound binaries are staged at their declared paths, rerun:</w:t>
+        <w:t xml:space="preserve">Raw recovered containers may be absent from a fresh clone because they are large ignored artifacts. Recovery must use the frozen historical V3 source and must not evaluate validation or test. The equivalence verifier is bound to stable recovery commit </w:t>
+      </w:r>
+      <w:r>
+        <w:rPr>
+          <w:rFonts w:ascii="Courier New" w:cs="Courier New" w:eastAsia="Courier New" w:hAnsi="Courier New"/>
+          <w:sz w:val="20"/>
+          <w:szCs w:val="20"/>
+          <w:shd w:fill="EEF1F4" w:val="clear"/>
+        </w:rPr>
+        <w:t xml:space="preserve">d1d4828c32bada1ba1e852d0479c37bb71164561</w:t>
+      </w:r>
+      <w:r>
+        <w:rPr>
+          <w:rFonts w:ascii="Arial" w:cs="Arial" w:eastAsia="Arial" w:hAnsi="Arial"/>
+        </w:rPr>
+        <w:t xml:space="preserve">. The committed procedure is:</w:t>
       </w:r>
     </w:p>
     <w:p>
@@ -10585,7 +10600,7 @@
           <w:sz w:val="17"/>
           <w:szCs w:val="17"/>
         </w:rPr>
-        <w:t xml:space="preserve">python scripts\recompute_v4r_posthoc_metrics.py recompute `</w:t>
+        <w:t xml:space="preserve">git worktree add ..\dc-energy-v3-metric-recovery dede685</w:t>
       </w:r>
     </w:p>
     <w:p>
@@ -10603,117 +10618,7 @@
           <w:sz w:val="17"/>
           <w:szCs w:val="17"/>
         </w:rPr>
-        <w:t xml:space="preserve">  --recomputed-at-utc 2026-08-10T02:55:50Z</w:t>
-      </w:r>
-    </w:p>
-    <w:p>
-      <w:pPr>
-        <w:spacing w:after="120"/>
-      </w:pPr>
-    </w:p>
-    <w:p>
-      <w:pPr>
-        <w:spacing w:after="120" w:line="276"/>
-      </w:pPr>
-      <w:r>
-        <w:rPr>
-          <w:rFonts w:ascii="Arial" w:cs="Arial" w:eastAsia="Arial" w:hAnsi="Arial"/>
-        </w:rPr>
-        <w:t xml:space="preserve">The replay fails if a model, normalizer, protocol, panel, forecast, or source hash differs. It verifies that the primary objective, cost, safety, behavior, and ensemble action-chain identities equal the immutable result before writing corrected telemetry. It performs no learning.</w:t>
-      </w:r>
-    </w:p>
-    <w:p>
-      <w:pPr>
-        <w:spacing w:after="120" w:line="276"/>
-      </w:pPr>
-      <w:r>
-        <w:rPr>
-          <w:rFonts w:ascii="Arial" w:cs="Arial" w:eastAsia="Arial" w:hAnsi="Arial"/>
-        </w:rPr>
-        <w:t xml:space="preserve">If the ignored containers are unavailable, reproduce the checkpoints from the frozen historical V3 source and pass their </w:t>
-      </w:r>
-      <w:r>
-        <w:rPr>
-          <w:rFonts w:ascii="Courier New" w:cs="Courier New" w:eastAsia="Courier New" w:hAnsi="Courier New"/>
-          <w:sz w:val="20"/>
-          <w:szCs w:val="20"/>
-          <w:shd w:fill="EEF1F4" w:val="clear"/>
-        </w:rPr>
-        <w:t xml:space="preserve">&lt;seed&gt;/model.zip</w:t>
-      </w:r>
-      <w:r>
-        <w:rPr>
-          <w:rFonts w:ascii="Arial" w:cs="Arial" w:eastAsia="Arial" w:hAnsi="Arial"/>
-        </w:rPr>
-        <w:t xml:space="preserve"> and </w:t>
-      </w:r>
-      <w:r>
-        <w:rPr>
-          <w:rFonts w:ascii="Courier New" w:cs="Courier New" w:eastAsia="Courier New" w:hAnsi="Courier New"/>
-          <w:sz w:val="20"/>
-          <w:szCs w:val="20"/>
-          <w:shd w:fill="EEF1F4" w:val="clear"/>
-        </w:rPr>
-        <w:t xml:space="preserve">vecnormalize.pkl</w:t>
-      </w:r>
-      <w:r>
-        <w:rPr>
-          <w:rFonts w:ascii="Arial" w:cs="Arial" w:eastAsia="Arial" w:hAnsi="Arial"/>
-        </w:rPr>
-        <w:t xml:space="preserve"> root with </w:t>
-      </w:r>
-      <w:r>
-        <w:rPr>
-          <w:rFonts w:ascii="Courier New" w:cs="Courier New" w:eastAsia="Courier New" w:hAnsi="Courier New"/>
-          <w:sz w:val="20"/>
-          <w:szCs w:val="20"/>
-          <w:shd w:fill="EEF1F4" w:val="clear"/>
-        </w:rPr>
-        <w:t xml:space="preserve">--recovered-binary-root</w:t>
-      </w:r>
-      <w:r>
-        <w:rPr>
-          <w:rFonts w:ascii="Arial" w:cs="Arial" w:eastAsia="Arial" w:hAnsi="Arial"/>
-        </w:rPr>
-        <w:t xml:space="preserve">. The loader still requires exact policy, critic, and normalizer identities. The resulting wrapper explicitly records that deterministic reconstruction training occurred, that outer container hashes differ, and that the replay is not fresh generalization evidence.</w:t>
-      </w:r>
-    </w:p>
-    <w:p>
-      <w:pPr>
-        <w:spacing w:after="120" w:line="276"/>
-      </w:pPr>
-      <w:r>
-        <w:rPr>
-          <w:rFonts w:ascii="Arial" w:cs="Arial" w:eastAsia="Arial" w:hAnsi="Arial"/>
-        </w:rPr>
-        <w:t xml:space="preserve">Reconstruction can reproduce internal tensors, normalizers, actions, and metrics exactly while producing a different outer ZIP hash because SB3 stores runtime/ZIP metadata. Therefore the committed wrapper hash is verified rather than promised as the byte identity of every later reconstruction.</w:t>
-      </w:r>
-    </w:p>
-    <w:p>
-      <w:pPr>
-        <w:pStyle w:val="Heading2"/>
-        <w:keepNext/>
-      </w:pPr>
-      <w:r>
-        <w:rPr>
-          <w:rFonts w:ascii="Arial" w:cs="Arial" w:eastAsia="Arial" w:hAnsi="Arial"/>
-        </w:rPr>
-        <w:t xml:space="preserve">10.5 Rebuild tables, figures, Markdown, and DOCX</w:t>
-      </w:r>
-    </w:p>
-    <w:p>
-      <w:pPr>
-        <w:spacing w:after="0" w:before="100"/>
-      </w:pPr>
-      <w:r>
-        <w:rPr>
-          <w:rFonts w:ascii="Courier New" w:cs="Courier New" w:eastAsia="Courier New" w:hAnsi="Courier New"/>
-          <w:b/>
-          <w:bCs/>
-          <w:sz w:val="17"/>
-          <w:szCs w:val="17"/>
-        </w:rPr>
-        <w:t xml:space="preserve">powershell</w:t>
+        <w:t xml:space="preserve">Push-Location ..\dc-energy-v3-metric-recovery</w:t>
       </w:r>
     </w:p>
     <w:p>
@@ -10731,7 +10636,7 @@
           <w:sz w:val="17"/>
           <w:szCs w:val="17"/>
         </w:rPr>
-        <w:t xml:space="preserve">python scripts\build_ramp_rl_thesis_results.py --corrected</w:t>
+        <w:t xml:space="preserve"> </w:t>
       </w:r>
     </w:p>
     <w:p>
@@ -10749,7 +10654,7 @@
           <w:sz w:val="17"/>
           <w:szCs w:val="17"/>
         </w:rPr>
-        <w:t xml:space="preserve">python scripts\build_ramp_thesis_figures.py</w:t>
+        <w:t xml:space="preserve">$env:OMP_NUM_THREADS = "1"</w:t>
       </w:r>
     </w:p>
     <w:p>
@@ -10767,7 +10672,7 @@
           <w:sz w:val="17"/>
           <w:szCs w:val="17"/>
         </w:rPr>
-        <w:t xml:space="preserve">python scripts\materialize_ramp_thesis.py --output thesis_paper.md</w:t>
+        <w:t xml:space="preserve">$env:MKL_NUM_THREADS = "1"</w:t>
       </w:r>
     </w:p>
     <w:p>
@@ -10785,7 +10690,7 @@
           <w:sz w:val="17"/>
           <w:szCs w:val="17"/>
         </w:rPr>
-        <w:t xml:space="preserve">python scripts\validate_ramp_thesis.py --source thesis_paper.md</w:t>
+        <w:t xml:space="preserve">$env:OPENBLAS_NUM_THREADS = "1"</w:t>
       </w:r>
     </w:p>
     <w:p>
@@ -10803,7 +10708,7 @@
           <w:sz w:val="17"/>
           <w:szCs w:val="17"/>
         </w:rPr>
-        <w:t xml:space="preserve">python scripts\build_final_thesis.py `</w:t>
+        <w:t xml:space="preserve">$env:NUMEXPR_NUM_THREADS = "1"</w:t>
       </w:r>
     </w:p>
     <w:p>
@@ -10821,7 +10726,7 @@
           <w:sz w:val="17"/>
           <w:szCs w:val="17"/>
         </w:rPr>
-        <w:t xml:space="preserve">  --source thesis_paper.md `</w:t>
+        <w:t xml:space="preserve"> </w:t>
       </w:r>
     </w:p>
     <w:p>
@@ -10839,6 +10744,759 @@
           <w:sz w:val="17"/>
           <w:szCs w:val="17"/>
         </w:rPr>
+        <w:t xml:space="preserve">$jobs = foreach ($seed in 2801..2805) {</w:t>
+      </w:r>
+    </w:p>
+    <w:p>
+      <w:pPr>
+        <w:pBdr>
+          <w:left w:val="single" w:color="7F8C8D" w:sz="8" w:space="8"/>
+        </w:pBdr>
+        <w:shd w:fill="F4F6F7" w:val="clear"/>
+        <w:spacing w:after="0"/>
+        <w:ind w:left="240" w:right="120"/>
+      </w:pPr>
+      <w:r>
+        <w:rPr>
+          <w:rFonts w:ascii="Courier New" w:cs="Courier New" w:eastAsia="Courier New" w:hAnsi="Courier New"/>
+          <w:sz w:val="17"/>
+          <w:szCs w:val="17"/>
+        </w:rPr>
+        <w:t xml:space="preserve">  $output = "models\ramp_rl_v6\recovery_v3_metric_replay\$seed"</w:t>
+      </w:r>
+    </w:p>
+    <w:p>
+      <w:pPr>
+        <w:pBdr>
+          <w:left w:val="single" w:color="7F8C8D" w:sz="8" w:space="8"/>
+        </w:pBdr>
+        <w:shd w:fill="F4F6F7" w:val="clear"/>
+        <w:spacing w:after="0"/>
+        <w:ind w:left="240" w:right="120"/>
+      </w:pPr>
+      <w:r>
+        <w:rPr>
+          <w:rFonts w:ascii="Courier New" w:cs="Courier New" w:eastAsia="Courier New" w:hAnsi="Courier New"/>
+          <w:sz w:val="17"/>
+          <w:szCs w:val="17"/>
+        </w:rPr>
+        <w:t xml:space="preserve">  Start-Process python `</w:t>
+      </w:r>
+    </w:p>
+    <w:p>
+      <w:pPr>
+        <w:pBdr>
+          <w:left w:val="single" w:color="7F8C8D" w:sz="8" w:space="8"/>
+        </w:pBdr>
+        <w:shd w:fill="F4F6F7" w:val="clear"/>
+        <w:spacing w:after="0"/>
+        <w:ind w:left="240" w:right="120"/>
+      </w:pPr>
+      <w:r>
+        <w:rPr>
+          <w:rFonts w:ascii="Courier New" w:cs="Courier New" w:eastAsia="Courier New" w:hAnsi="Courier New"/>
+          <w:sz w:val="17"/>
+          <w:szCs w:val="17"/>
+        </w:rPr>
+        <w:t xml:space="preserve">    -ArgumentList @(</w:t>
+      </w:r>
+    </w:p>
+    <w:p>
+      <w:pPr>
+        <w:pBdr>
+          <w:left w:val="single" w:color="7F8C8D" w:sz="8" w:space="8"/>
+        </w:pBdr>
+        <w:shd w:fill="F4F6F7" w:val="clear"/>
+        <w:spacing w:after="0"/>
+        <w:ind w:left="240" w:right="120"/>
+      </w:pPr>
+      <w:r>
+        <w:rPr>
+          <w:rFonts w:ascii="Courier New" w:cs="Courier New" w:eastAsia="Courier New" w:hAnsi="Courier New"/>
+          <w:sz w:val="17"/>
+          <w:szCs w:val="17"/>
+        </w:rPr>
+        <w:t xml:space="preserve">      "scripts\run_ramp_rl_v3.py", "train",</w:t>
+      </w:r>
+    </w:p>
+    <w:p>
+      <w:pPr>
+        <w:pBdr>
+          <w:left w:val="single" w:color="7F8C8D" w:sz="8" w:space="8"/>
+        </w:pBdr>
+        <w:shd w:fill="F4F6F7" w:val="clear"/>
+        <w:spacing w:after="0"/>
+        <w:ind w:left="240" w:right="120"/>
+      </w:pPr>
+      <w:r>
+        <w:rPr>
+          <w:rFonts w:ascii="Courier New" w:cs="Courier New" w:eastAsia="Courier New" w:hAnsi="Courier New"/>
+          <w:sz w:val="17"/>
+          <w:szCs w:val="17"/>
+        </w:rPr>
+        <w:t xml:space="preserve">      "--seed", "$seed", "--output", $output</w:t>
+      </w:r>
+    </w:p>
+    <w:p>
+      <w:pPr>
+        <w:pBdr>
+          <w:left w:val="single" w:color="7F8C8D" w:sz="8" w:space="8"/>
+        </w:pBdr>
+        <w:shd w:fill="F4F6F7" w:val="clear"/>
+        <w:spacing w:after="0"/>
+        <w:ind w:left="240" w:right="120"/>
+      </w:pPr>
+      <w:r>
+        <w:rPr>
+          <w:rFonts w:ascii="Courier New" w:cs="Courier New" w:eastAsia="Courier New" w:hAnsi="Courier New"/>
+          <w:sz w:val="17"/>
+          <w:szCs w:val="17"/>
+        </w:rPr>
+        <w:t xml:space="preserve">    ) `</w:t>
+      </w:r>
+    </w:p>
+    <w:p>
+      <w:pPr>
+        <w:pBdr>
+          <w:left w:val="single" w:color="7F8C8D" w:sz="8" w:space="8"/>
+        </w:pBdr>
+        <w:shd w:fill="F4F6F7" w:val="clear"/>
+        <w:spacing w:after="0"/>
+        <w:ind w:left="240" w:right="120"/>
+      </w:pPr>
+      <w:r>
+        <w:rPr>
+          <w:rFonts w:ascii="Courier New" w:cs="Courier New" w:eastAsia="Courier New" w:hAnsi="Courier New"/>
+          <w:sz w:val="17"/>
+          <w:szCs w:val="17"/>
+        </w:rPr>
+        <w:t xml:space="preserve">    -PassThru</w:t>
+      </w:r>
+    </w:p>
+    <w:p>
+      <w:pPr>
+        <w:pBdr>
+          <w:left w:val="single" w:color="7F8C8D" w:sz="8" w:space="8"/>
+        </w:pBdr>
+        <w:shd w:fill="F4F6F7" w:val="clear"/>
+        <w:spacing w:after="0"/>
+        <w:ind w:left="240" w:right="120"/>
+      </w:pPr>
+      <w:r>
+        <w:rPr>
+          <w:rFonts w:ascii="Courier New" w:cs="Courier New" w:eastAsia="Courier New" w:hAnsi="Courier New"/>
+          <w:sz w:val="17"/>
+          <w:szCs w:val="17"/>
+        </w:rPr>
+        <w:t xml:space="preserve">}</w:t>
+      </w:r>
+    </w:p>
+    <w:p>
+      <w:pPr>
+        <w:pBdr>
+          <w:left w:val="single" w:color="7F8C8D" w:sz="8" w:space="8"/>
+        </w:pBdr>
+        <w:shd w:fill="F4F6F7" w:val="clear"/>
+        <w:spacing w:after="0"/>
+        <w:ind w:left="240" w:right="120"/>
+      </w:pPr>
+      <w:r>
+        <w:rPr>
+          <w:rFonts w:ascii="Courier New" w:cs="Courier New" w:eastAsia="Courier New" w:hAnsi="Courier New"/>
+          <w:sz w:val="17"/>
+          <w:szCs w:val="17"/>
+        </w:rPr>
+        <w:t xml:space="preserve">$jobs | Wait-Process</w:t>
+      </w:r>
+    </w:p>
+    <w:p>
+      <w:pPr>
+        <w:pBdr>
+          <w:left w:val="single" w:color="7F8C8D" w:sz="8" w:space="8"/>
+        </w:pBdr>
+        <w:shd w:fill="F4F6F7" w:val="clear"/>
+        <w:spacing w:after="0"/>
+        <w:ind w:left="240" w:right="120"/>
+      </w:pPr>
+      <w:r>
+        <w:rPr>
+          <w:rFonts w:ascii="Courier New" w:cs="Courier New" w:eastAsia="Courier New" w:hAnsi="Courier New"/>
+          <w:sz w:val="17"/>
+          <w:szCs w:val="17"/>
+        </w:rPr>
+        <w:t xml:space="preserve"> </w:t>
+      </w:r>
+    </w:p>
+    <w:p>
+      <w:pPr>
+        <w:pBdr>
+          <w:left w:val="single" w:color="7F8C8D" w:sz="8" w:space="8"/>
+        </w:pBdr>
+        <w:shd w:fill="F4F6F7" w:val="clear"/>
+        <w:spacing w:after="0"/>
+        <w:ind w:left="240" w:right="120"/>
+      </w:pPr>
+      <w:r>
+        <w:rPr>
+          <w:rFonts w:ascii="Courier New" w:cs="Courier New" w:eastAsia="Courier New" w:hAnsi="Courier New"/>
+          <w:sz w:val="17"/>
+          <w:szCs w:val="17"/>
+        </w:rPr>
+        <w:t xml:space="preserve">python scripts\recover_ramp_rl_v3.py `</w:t>
+      </w:r>
+    </w:p>
+    <w:p>
+      <w:pPr>
+        <w:pBdr>
+          <w:left w:val="single" w:color="7F8C8D" w:sz="8" w:space="8"/>
+        </w:pBdr>
+        <w:shd w:fill="F4F6F7" w:val="clear"/>
+        <w:spacing w:after="0"/>
+        <w:ind w:left="240" w:right="120"/>
+      </w:pPr>
+      <w:r>
+        <w:rPr>
+          <w:rFonts w:ascii="Courier New" w:cs="Courier New" w:eastAsia="Courier New" w:hAnsi="Courier New"/>
+          <w:sz w:val="17"/>
+          <w:szCs w:val="17"/>
+        </w:rPr>
+        <w:t xml:space="preserve">  --recovery-root models\ramp_rl_v6\recovery_v3_metric_replay `</w:t>
+      </w:r>
+    </w:p>
+    <w:p>
+      <w:pPr>
+        <w:pBdr>
+          <w:left w:val="single" w:color="7F8C8D" w:sz="8" w:space="8"/>
+        </w:pBdr>
+        <w:shd w:fill="F4F6F7" w:val="clear"/>
+        <w:spacing w:after="0"/>
+        <w:ind w:left="240" w:right="120"/>
+      </w:pPr>
+      <w:r>
+        <w:rPr>
+          <w:rFonts w:ascii="Courier New" w:cs="Courier New" w:eastAsia="Courier New" w:hAnsi="Courier New"/>
+          <w:sz w:val="17"/>
+          <w:szCs w:val="17"/>
+        </w:rPr>
+        <w:t xml:space="preserve">  --manifest metric_replay_recovery_verification_raw.json `</w:t>
+      </w:r>
+    </w:p>
+    <w:p>
+      <w:pPr>
+        <w:pBdr>
+          <w:left w:val="single" w:color="7F8C8D" w:sz="8" w:space="8"/>
+        </w:pBdr>
+        <w:shd w:fill="F4F6F7" w:val="clear"/>
+        <w:spacing w:after="0"/>
+        <w:ind w:left="240" w:right="120"/>
+      </w:pPr>
+      <w:r>
+        <w:rPr>
+          <w:rFonts w:ascii="Courier New" w:cs="Courier New" w:eastAsia="Courier New" w:hAnsi="Courier New"/>
+          <w:sz w:val="17"/>
+          <w:szCs w:val="17"/>
+        </w:rPr>
+        <w:t xml:space="preserve">  --allow-model-container-difference</w:t>
+      </w:r>
+    </w:p>
+    <w:p>
+      <w:pPr>
+        <w:pBdr>
+          <w:left w:val="single" w:color="7F8C8D" w:sz="8" w:space="8"/>
+        </w:pBdr>
+        <w:shd w:fill="F4F6F7" w:val="clear"/>
+        <w:spacing w:after="0"/>
+        <w:ind w:left="240" w:right="120"/>
+      </w:pPr>
+      <w:r>
+        <w:rPr>
+          <w:rFonts w:ascii="Courier New" w:cs="Courier New" w:eastAsia="Courier New" w:hAnsi="Courier New"/>
+          <w:sz w:val="17"/>
+          <w:szCs w:val="17"/>
+        </w:rPr>
+        <w:t xml:space="preserve">Pop-Location</w:t>
+      </w:r>
+    </w:p>
+    <w:p>
+      <w:pPr>
+        <w:pBdr>
+          <w:left w:val="single" w:color="7F8C8D" w:sz="8" w:space="8"/>
+        </w:pBdr>
+        <w:shd w:fill="F4F6F7" w:val="clear"/>
+        <w:spacing w:after="0"/>
+        <w:ind w:left="240" w:right="120"/>
+      </w:pPr>
+      <w:r>
+        <w:rPr>
+          <w:rFonts w:ascii="Courier New" w:cs="Courier New" w:eastAsia="Courier New" w:hAnsi="Courier New"/>
+          <w:sz w:val="17"/>
+          <w:szCs w:val="17"/>
+        </w:rPr>
+        <w:t xml:space="preserve"> </w:t>
+      </w:r>
+    </w:p>
+    <w:p>
+      <w:pPr>
+        <w:pBdr>
+          <w:left w:val="single" w:color="7F8C8D" w:sz="8" w:space="8"/>
+        </w:pBdr>
+        <w:shd w:fill="F4F6F7" w:val="clear"/>
+        <w:spacing w:after="0"/>
+        <w:ind w:left="240" w:right="120"/>
+      </w:pPr>
+      <w:r>
+        <w:rPr>
+          <w:rFonts w:ascii="Courier New" w:cs="Courier New" w:eastAsia="Courier New" w:hAnsi="Courier New"/>
+          <w:sz w:val="17"/>
+          <w:szCs w:val="17"/>
+        </w:rPr>
+        <w:t xml:space="preserve">Copy-Item `</w:t>
+      </w:r>
+    </w:p>
+    <w:p>
+      <w:pPr>
+        <w:pBdr>
+          <w:left w:val="single" w:color="7F8C8D" w:sz="8" w:space="8"/>
+        </w:pBdr>
+        <w:shd w:fill="F4F6F7" w:val="clear"/>
+        <w:spacing w:after="0"/>
+        <w:ind w:left="240" w:right="120"/>
+      </w:pPr>
+      <w:r>
+        <w:rPr>
+          <w:rFonts w:ascii="Courier New" w:cs="Courier New" w:eastAsia="Courier New" w:hAnsi="Courier New"/>
+          <w:sz w:val="17"/>
+          <w:szCs w:val="17"/>
+        </w:rPr>
+        <w:t xml:space="preserve">  ..\dc-energy-v3-metric-recovery\models\ramp_rl_v6\recovery_v3_metric_replay `</w:t>
+      </w:r>
+    </w:p>
+    <w:p>
+      <w:pPr>
+        <w:pBdr>
+          <w:left w:val="single" w:color="7F8C8D" w:sz="8" w:space="8"/>
+        </w:pBdr>
+        <w:shd w:fill="F4F6F7" w:val="clear"/>
+        <w:spacing w:after="0"/>
+        <w:ind w:left="240" w:right="120"/>
+      </w:pPr>
+      <w:r>
+        <w:rPr>
+          <w:rFonts w:ascii="Courier New" w:cs="Courier New" w:eastAsia="Courier New" w:hAnsi="Courier New"/>
+          <w:sz w:val="17"/>
+          <w:szCs w:val="17"/>
+        </w:rPr>
+        <w:t xml:space="preserve">  models\ramp_rl_v6\recovery_v3_metric_replay `</w:t>
+      </w:r>
+    </w:p>
+    <w:p>
+      <w:pPr>
+        <w:pBdr>
+          <w:left w:val="single" w:color="7F8C8D" w:sz="8" w:space="8"/>
+        </w:pBdr>
+        <w:shd w:fill="F4F6F7" w:val="clear"/>
+        <w:spacing w:after="0"/>
+        <w:ind w:left="240" w:right="120"/>
+      </w:pPr>
+      <w:r>
+        <w:rPr>
+          <w:rFonts w:ascii="Courier New" w:cs="Courier New" w:eastAsia="Courier New" w:hAnsi="Courier New"/>
+          <w:sz w:val="17"/>
+          <w:szCs w:val="17"/>
+        </w:rPr>
+        <w:t xml:space="preserve">  -Recurse</w:t>
+      </w:r>
+    </w:p>
+    <w:p>
+      <w:pPr>
+        <w:pBdr>
+          <w:left w:val="single" w:color="7F8C8D" w:sz="8" w:space="8"/>
+        </w:pBdr>
+        <w:shd w:fill="F4F6F7" w:val="clear"/>
+        <w:spacing w:after="0"/>
+        <w:ind w:left="240" w:right="120"/>
+      </w:pPr>
+      <w:r>
+        <w:rPr>
+          <w:rFonts w:ascii="Courier New" w:cs="Courier New" w:eastAsia="Courier New" w:hAnsi="Courier New"/>
+          <w:sz w:val="17"/>
+          <w:szCs w:val="17"/>
+        </w:rPr>
+        <w:t xml:space="preserve"> </w:t>
+      </w:r>
+    </w:p>
+    <w:p>
+      <w:pPr>
+        <w:pBdr>
+          <w:left w:val="single" w:color="7F8C8D" w:sz="8" w:space="8"/>
+        </w:pBdr>
+        <w:shd w:fill="F4F6F7" w:val="clear"/>
+        <w:spacing w:after="0"/>
+        <w:ind w:left="240" w:right="120"/>
+      </w:pPr>
+      <w:r>
+        <w:rPr>
+          <w:rFonts w:ascii="Courier New" w:cs="Courier New" w:eastAsia="Courier New" w:hAnsi="Courier New"/>
+          <w:sz w:val="17"/>
+          <w:szCs w:val="17"/>
+        </w:rPr>
+        <w:t xml:space="preserve">python scripts\bind_v4r_metric_replay_recovery.py bind `</w:t>
+      </w:r>
+    </w:p>
+    <w:p>
+      <w:pPr>
+        <w:pBdr>
+          <w:left w:val="single" w:color="7F8C8D" w:sz="8" w:space="8"/>
+        </w:pBdr>
+        <w:shd w:fill="F4F6F7" w:val="clear"/>
+        <w:spacing w:after="0"/>
+        <w:ind w:left="240" w:right="120"/>
+      </w:pPr>
+      <w:r>
+        <w:rPr>
+          <w:rFonts w:ascii="Courier New" w:cs="Courier New" w:eastAsia="Courier New" w:hAnsi="Courier New"/>
+          <w:sz w:val="17"/>
+          <w:szCs w:val="17"/>
+        </w:rPr>
+        <w:t xml:space="preserve">  --raw-verification `</w:t>
+      </w:r>
+    </w:p>
+    <w:p>
+      <w:pPr>
+        <w:pBdr>
+          <w:left w:val="single" w:color="7F8C8D" w:sz="8" w:space="8"/>
+        </w:pBdr>
+        <w:shd w:fill="F4F6F7" w:val="clear"/>
+        <w:spacing w:after="0"/>
+        <w:ind w:left="240" w:right="120"/>
+      </w:pPr>
+      <w:r>
+        <w:rPr>
+          <w:rFonts w:ascii="Courier New" w:cs="Courier New" w:eastAsia="Courier New" w:hAnsi="Courier New"/>
+          <w:sz w:val="17"/>
+          <w:szCs w:val="17"/>
+        </w:rPr>
+        <w:t xml:space="preserve">    ..\dc-energy-v3-metric-recovery\metric_replay_recovery_verification_raw.json `</w:t>
+      </w:r>
+    </w:p>
+    <w:p>
+      <w:pPr>
+        <w:pBdr>
+          <w:left w:val="single" w:color="7F8C8D" w:sz="8" w:space="8"/>
+        </w:pBdr>
+        <w:shd w:fill="F4F6F7" w:val="clear"/>
+        <w:spacing w:after="0"/>
+        <w:ind w:left="240" w:right="120"/>
+      </w:pPr>
+      <w:r>
+        <w:rPr>
+          <w:rFonts w:ascii="Courier New" w:cs="Courier New" w:eastAsia="Courier New" w:hAnsi="Courier New"/>
+          <w:sz w:val="17"/>
+          <w:szCs w:val="17"/>
+        </w:rPr>
+        <w:t xml:space="preserve">  --recovery-root models\ramp_rl_v6\recovery_v3_metric_replay</w:t>
+      </w:r>
+    </w:p>
+    <w:p>
+      <w:pPr>
+        <w:pBdr>
+          <w:left w:val="single" w:color="7F8C8D" w:sz="8" w:space="8"/>
+        </w:pBdr>
+        <w:shd w:fill="F4F6F7" w:val="clear"/>
+        <w:spacing w:after="0"/>
+        <w:ind w:left="240" w:right="120"/>
+      </w:pPr>
+      <w:r>
+        <w:rPr>
+          <w:rFonts w:ascii="Courier New" w:cs="Courier New" w:eastAsia="Courier New" w:hAnsi="Courier New"/>
+          <w:sz w:val="17"/>
+          <w:szCs w:val="17"/>
+        </w:rPr>
+        <w:t xml:space="preserve"> </w:t>
+      </w:r>
+    </w:p>
+    <w:p>
+      <w:pPr>
+        <w:pBdr>
+          <w:left w:val="single" w:color="7F8C8D" w:sz="8" w:space="8"/>
+        </w:pBdr>
+        <w:shd w:fill="F4F6F7" w:val="clear"/>
+        <w:spacing w:after="0"/>
+        <w:ind w:left="240" w:right="120"/>
+      </w:pPr>
+      <w:r>
+        <w:rPr>
+          <w:rFonts w:ascii="Courier New" w:cs="Courier New" w:eastAsia="Courier New" w:hAnsi="Courier New"/>
+          <w:sz w:val="17"/>
+          <w:szCs w:val="17"/>
+        </w:rPr>
+        <w:t xml:space="preserve">python scripts\recompute_v4r_posthoc_metrics.py recompute `</w:t>
+      </w:r>
+    </w:p>
+    <w:p>
+      <w:pPr>
+        <w:pBdr>
+          <w:left w:val="single" w:color="7F8C8D" w:sz="8" w:space="8"/>
+        </w:pBdr>
+        <w:shd w:fill="F4F6F7" w:val="clear"/>
+        <w:spacing w:after="0"/>
+        <w:ind w:left="240" w:right="120"/>
+      </w:pPr>
+      <w:r>
+        <w:rPr>
+          <w:rFonts w:ascii="Courier New" w:cs="Courier New" w:eastAsia="Courier New" w:hAnsi="Courier New"/>
+          <w:sz w:val="17"/>
+          <w:szCs w:val="17"/>
+        </w:rPr>
+        <w:t xml:space="preserve">  --recomputed-at-utc &lt;explicit-UTC-timestamp&gt; `</w:t>
+      </w:r>
+    </w:p>
+    <w:p>
+      <w:pPr>
+        <w:pBdr>
+          <w:left w:val="single" w:color="7F8C8D" w:sz="8" w:space="8"/>
+        </w:pBdr>
+        <w:shd w:fill="F4F6F7" w:val="clear"/>
+        <w:spacing w:after="0"/>
+        <w:ind w:left="240" w:right="120"/>
+      </w:pPr>
+      <w:r>
+        <w:rPr>
+          <w:rFonts w:ascii="Courier New" w:cs="Courier New" w:eastAsia="Courier New" w:hAnsi="Courier New"/>
+          <w:sz w:val="17"/>
+          <w:szCs w:val="17"/>
+        </w:rPr>
+        <w:t xml:space="preserve">  --recovered-binary-root models\ramp_rl_v6\recovery_v3_metric_replay `</w:t>
+      </w:r>
+    </w:p>
+    <w:p>
+      <w:pPr>
+        <w:pBdr>
+          <w:left w:val="single" w:color="7F8C8D" w:sz="8" w:space="8"/>
+        </w:pBdr>
+        <w:shd w:fill="F4F6F7" w:val="clear"/>
+        <w:spacing w:after="0"/>
+        <w:ind w:left="240" w:right="120"/>
+      </w:pPr>
+      <w:r>
+        <w:rPr>
+          <w:rFonts w:ascii="Courier New" w:cs="Courier New" w:eastAsia="Courier New" w:hAnsi="Courier New"/>
+          <w:sz w:val="17"/>
+          <w:szCs w:val="17"/>
+        </w:rPr>
+        <w:t xml:space="preserve">  --recovery-manifest `</w:t>
+      </w:r>
+    </w:p>
+    <w:p>
+      <w:pPr>
+        <w:pBdr>
+          <w:left w:val="single" w:color="7F8C8D" w:sz="8" w:space="8"/>
+        </w:pBdr>
+        <w:shd w:fill="F4F6F7" w:val="clear"/>
+        <w:spacing w:after="0"/>
+        <w:ind w:left="240" w:right="120"/>
+      </w:pPr>
+      <w:r>
+        <w:rPr>
+          <w:rFonts w:ascii="Courier New" w:cs="Courier New" w:eastAsia="Courier New" w:hAnsi="Courier New"/>
+          <w:sz w:val="17"/>
+          <w:szCs w:val="17"/>
+        </w:rPr>
+        <w:t xml:space="preserve">    output\ramp_rl_v6\recovered_v4r_posthoc_metrics_v1\metric_replay_recovery_manifest.json</w:t>
+      </w:r>
+    </w:p>
+    <w:p>
+      <w:pPr>
+        <w:spacing w:after="120"/>
+      </w:pPr>
+    </w:p>
+    <w:p>
+      <w:pPr>
+        <w:spacing w:after="120" w:line="276"/>
+      </w:pPr>
+      <w:r>
+        <w:rPr>
+          <w:rFonts w:ascii="Arial" w:cs="Arial" w:eastAsia="Arial" w:hAnsi="Arial"/>
+        </w:rPr>
+        <w:t xml:space="preserve">The stable verifier compares initial and final actor/critic hashes, interactions, updates, normalizer bytes, pure-RL assertions, replay provenance, training-window sources, forecasts, factory identity, and job identity against the frozen manifests. It permits only outer </w:t>
+      </w:r>
+      <w:r>
+        <w:rPr>
+          <w:rFonts w:ascii="Courier New" w:cs="Courier New" w:eastAsia="Courier New" w:hAnsi="Courier New"/>
+          <w:sz w:val="20"/>
+          <w:szCs w:val="20"/>
+          <w:shd w:fill="EEF1F4" w:val="clear"/>
+        </w:rPr>
+        <w:t xml:space="preserve">model.zip</w:t>
+      </w:r>
+      <w:r>
+        <w:rPr>
+          <w:rFonts w:ascii="Arial" w:cs="Arial" w:eastAsia="Arial" w:hAnsi="Arial"/>
+        </w:rPr>
+        <w:t xml:space="preserve"> metadata differences. The tracked recovery manifest records the new container hashes and proves that only training split data was observed. The metric replay then verifies that primary objective, cost, safety, behavior, and ensemble action-chain identities equal the immutable result before writing corrected telemetry.</w:t>
+      </w:r>
+    </w:p>
+    <w:p>
+      <w:pPr>
+        <w:spacing w:after="120" w:line="276"/>
+      </w:pPr>
+      <w:r>
+        <w:rPr>
+          <w:rFonts w:ascii="Arial" w:cs="Arial" w:eastAsia="Arial" w:hAnsi="Arial"/>
+        </w:rPr>
+        <w:t xml:space="preserve">Checkpoint reconstruction executes the already frozen training computation after unblinding; the metric replay itself performs no learning. Neither is fresh generalization evidence: the reconstruction and March-April replay are not fresh generalization evidence. Reconstruction can reproduce tensors, normalizers, actions, and metrics exactly while producing a different outer ZIP hash because SB3 stores runtime and ZIP timestamps.</w:t>
+      </w:r>
+    </w:p>
+    <w:p>
+      <w:pPr>
+        <w:pStyle w:val="Heading2"/>
+        <w:keepNext/>
+      </w:pPr>
+      <w:r>
+        <w:rPr>
+          <w:rFonts w:ascii="Arial" w:cs="Arial" w:eastAsia="Arial" w:hAnsi="Arial"/>
+        </w:rPr>
+        <w:t xml:space="preserve">10.5 Rebuild tables, figures, Markdown, and DOCX</w:t>
+      </w:r>
+    </w:p>
+    <w:p>
+      <w:pPr>
+        <w:spacing w:after="0" w:before="100"/>
+      </w:pPr>
+      <w:r>
+        <w:rPr>
+          <w:rFonts w:ascii="Courier New" w:cs="Courier New" w:eastAsia="Courier New" w:hAnsi="Courier New"/>
+          <w:b/>
+          <w:bCs/>
+          <w:sz w:val="17"/>
+          <w:szCs w:val="17"/>
+        </w:rPr>
+        <w:t xml:space="preserve">powershell</w:t>
+      </w:r>
+    </w:p>
+    <w:p>
+      <w:pPr>
+        <w:pBdr>
+          <w:left w:val="single" w:color="7F8C8D" w:sz="8" w:space="8"/>
+        </w:pBdr>
+        <w:shd w:fill="F4F6F7" w:val="clear"/>
+        <w:spacing w:after="0"/>
+        <w:ind w:left="240" w:right="120"/>
+      </w:pPr>
+      <w:r>
+        <w:rPr>
+          <w:rFonts w:ascii="Courier New" w:cs="Courier New" w:eastAsia="Courier New" w:hAnsi="Courier New"/>
+          <w:sz w:val="17"/>
+          <w:szCs w:val="17"/>
+        </w:rPr>
+        <w:t xml:space="preserve">python scripts\build_ramp_rl_thesis_results.py --corrected</w:t>
+      </w:r>
+    </w:p>
+    <w:p>
+      <w:pPr>
+        <w:pBdr>
+          <w:left w:val="single" w:color="7F8C8D" w:sz="8" w:space="8"/>
+        </w:pBdr>
+        <w:shd w:fill="F4F6F7" w:val="clear"/>
+        <w:spacing w:after="0"/>
+        <w:ind w:left="240" w:right="120"/>
+      </w:pPr>
+      <w:r>
+        <w:rPr>
+          <w:rFonts w:ascii="Courier New" w:cs="Courier New" w:eastAsia="Courier New" w:hAnsi="Courier New"/>
+          <w:sz w:val="17"/>
+          <w:szCs w:val="17"/>
+        </w:rPr>
+        <w:t xml:space="preserve">python scripts\build_ramp_thesis_figures.py</w:t>
+      </w:r>
+    </w:p>
+    <w:p>
+      <w:pPr>
+        <w:pBdr>
+          <w:left w:val="single" w:color="7F8C8D" w:sz="8" w:space="8"/>
+        </w:pBdr>
+        <w:shd w:fill="F4F6F7" w:val="clear"/>
+        <w:spacing w:after="0"/>
+        <w:ind w:left="240" w:right="120"/>
+      </w:pPr>
+      <w:r>
+        <w:rPr>
+          <w:rFonts w:ascii="Courier New" w:cs="Courier New" w:eastAsia="Courier New" w:hAnsi="Courier New"/>
+          <w:sz w:val="17"/>
+          <w:szCs w:val="17"/>
+        </w:rPr>
+        <w:t xml:space="preserve">python scripts\materialize_ramp_thesis.py --output thesis_paper.md</w:t>
+      </w:r>
+    </w:p>
+    <w:p>
+      <w:pPr>
+        <w:pBdr>
+          <w:left w:val="single" w:color="7F8C8D" w:sz="8" w:space="8"/>
+        </w:pBdr>
+        <w:shd w:fill="F4F6F7" w:val="clear"/>
+        <w:spacing w:after="0"/>
+        <w:ind w:left="240" w:right="120"/>
+      </w:pPr>
+      <w:r>
+        <w:rPr>
+          <w:rFonts w:ascii="Courier New" w:cs="Courier New" w:eastAsia="Courier New" w:hAnsi="Courier New"/>
+          <w:sz w:val="17"/>
+          <w:szCs w:val="17"/>
+        </w:rPr>
+        <w:t xml:space="preserve">python scripts\validate_ramp_thesis.py --source thesis_paper.md</w:t>
+      </w:r>
+    </w:p>
+    <w:p>
+      <w:pPr>
+        <w:pBdr>
+          <w:left w:val="single" w:color="7F8C8D" w:sz="8" w:space="8"/>
+        </w:pBdr>
+        <w:shd w:fill="F4F6F7" w:val="clear"/>
+        <w:spacing w:after="0"/>
+        <w:ind w:left="240" w:right="120"/>
+      </w:pPr>
+      <w:r>
+        <w:rPr>
+          <w:rFonts w:ascii="Courier New" w:cs="Courier New" w:eastAsia="Courier New" w:hAnsi="Courier New"/>
+          <w:sz w:val="17"/>
+          <w:szCs w:val="17"/>
+        </w:rPr>
+        <w:t xml:space="preserve">python scripts\build_final_thesis.py `</w:t>
+      </w:r>
+    </w:p>
+    <w:p>
+      <w:pPr>
+        <w:pBdr>
+          <w:left w:val="single" w:color="7F8C8D" w:sz="8" w:space="8"/>
+        </w:pBdr>
+        <w:shd w:fill="F4F6F7" w:val="clear"/>
+        <w:spacing w:after="0"/>
+        <w:ind w:left="240" w:right="120"/>
+      </w:pPr>
+      <w:r>
+        <w:rPr>
+          <w:rFonts w:ascii="Courier New" w:cs="Courier New" w:eastAsia="Courier New" w:hAnsi="Courier New"/>
+          <w:sz w:val="17"/>
+          <w:szCs w:val="17"/>
+        </w:rPr>
+        <w:t xml:space="preserve">  --source thesis_paper.md `</w:t>
+      </w:r>
+    </w:p>
+    <w:p>
+      <w:pPr>
+        <w:pBdr>
+          <w:left w:val="single" w:color="7F8C8D" w:sz="8" w:space="8"/>
+        </w:pBdr>
+        <w:shd w:fill="F4F6F7" w:val="clear"/>
+        <w:spacing w:after="0"/>
+        <w:ind w:left="240" w:right="120"/>
+      </w:pPr>
+      <w:r>
+        <w:rPr>
+          <w:rFonts w:ascii="Courier New" w:cs="Courier New" w:eastAsia="Courier New" w:hAnsi="Courier New"/>
+          <w:sz w:val="17"/>
+          <w:szCs w:val="17"/>
+        </w:rPr>
         <w:t xml:space="preserve">  --output thesis_paper.docx</w:t>
       </w:r>
     </w:p>
@@ -11212,7 +11870,7 @@
           <w:b/>
           <w:bCs/>
         </w:rPr>
-        <w:t xml:space="preserve">Authoritative post-hoc correction SHA-256:</w:t>
+        <w:t xml:space="preserve">Metric-replay checkpoint recovery SHA-256:</w:t>
       </w:r>
       <w:r>
         <w:rPr>
@@ -11227,7 +11885,35 @@
           <w:szCs w:val="20"/>
           <w:shd w:fill="EEF1F4" w:val="clear"/>
         </w:rPr>
-        <w:t xml:space="preserve">bd1e8a242ec93e389c9e7b9e13ae7f19b60a9445716206b6527938ffe639f842</w:t>
+        <w:t xml:space="preserve">26e9c77a1d932ff7edb66fe8b7d55b6f769a2e2029a49c95411b62465b14f064</w:t>
+      </w:r>
+    </w:p>
+    <w:p>
+      <w:pPr>
+        <w:spacing w:after="120" w:line="276"/>
+      </w:pPr>
+      <w:r>
+        <w:rPr>
+          <w:rFonts w:ascii="Arial" w:cs="Arial" w:eastAsia="Arial" w:hAnsi="Arial"/>
+          <w:b/>
+          <w:bCs/>
+        </w:rPr>
+        <w:t xml:space="preserve">Authoritative post-hoc correction SHA-256:</w:t>
+      </w:r>
+      <w:r>
+        <w:rPr>
+          <w:rFonts w:ascii="Arial" w:cs="Arial" w:eastAsia="Arial" w:hAnsi="Arial"/>
+        </w:rPr>
+        <w:t xml:space="preserve"> </w:t>
+      </w:r>
+      <w:r>
+        <w:rPr>
+          <w:rFonts w:ascii="Courier New" w:cs="Courier New" w:eastAsia="Courier New" w:hAnsi="Courier New"/>
+          <w:sz w:val="20"/>
+          <w:szCs w:val="20"/>
+          <w:shd w:fill="EEF1F4" w:val="clear"/>
+        </w:rPr>
+        <w:t xml:space="preserve">42bbcf4c4cd2cca58cfce0e07319d5280145e0fac948a7fe66d2a6582e379d4b</w:t>
       </w:r>
     </w:p>
     <w:p>
@@ -18946,6 +19632,71 @@
                 <w:shd w:fill="EEF1F4" w:val="clear"/>
               </w:rPr>
               <w:t xml:space="preserve">output/ramp_rl_v6/recovered_v4r_resealed_v2/canonical_evidence.json</w:t>
+            </w:r>
+          </w:p>
+        </w:tc>
+      </w:tr>
+      <w:tr>
+        <w:tc>
+          <w:tcPr>
+            <w:tcW w:type="dxa" w:w="4680"/>
+            <w:tcBorders>
+              <w:top w:val="single" w:color="C9D2DC" w:sz="1"/>
+              <w:left w:val="single" w:color="C9D2DC" w:sz="1"/>
+              <w:bottom w:val="single" w:color="C9D2DC" w:sz="1"/>
+              <w:right w:val="single" w:color="C9D2DC" w:sz="1"/>
+            </w:tcBorders>
+            <w:tcMar>
+              <w:top w:type="dxa" w:w="80"/>
+              <w:left w:type="dxa" w:w="120"/>
+              <w:bottom w:type="dxa" w:w="80"/>
+              <w:right w:type="dxa" w:w="120"/>
+            </w:tcMar>
+          </w:tcPr>
+          <w:p>
+            <w:pPr>
+              <w:spacing w:after="0"/>
+            </w:pPr>
+            <w:r>
+              <w:rPr>
+                <w:rFonts w:ascii="Arial" w:cs="Arial" w:eastAsia="Arial" w:hAnsi="Arial"/>
+                <w:b w:val="false"/>
+                <w:bCs w:val="false"/>
+                <w:sz w:val="18"/>
+                <w:szCs w:val="18"/>
+              </w:rPr>
+              <w:t xml:space="preserve">Metric-replay recovery verification</w:t>
+            </w:r>
+          </w:p>
+        </w:tc>
+        <w:tc>
+          <w:tcPr>
+            <w:tcW w:type="dxa" w:w="4680"/>
+            <w:tcBorders>
+              <w:top w:val="single" w:color="C9D2DC" w:sz="1"/>
+              <w:left w:val="single" w:color="C9D2DC" w:sz="1"/>
+              <w:bottom w:val="single" w:color="C9D2DC" w:sz="1"/>
+              <w:right w:val="single" w:color="C9D2DC" w:sz="1"/>
+            </w:tcBorders>
+            <w:tcMar>
+              <w:top w:type="dxa" w:w="80"/>
+              <w:left w:type="dxa" w:w="120"/>
+              <w:bottom w:type="dxa" w:w="80"/>
+              <w:right w:type="dxa" w:w="120"/>
+            </w:tcMar>
+          </w:tcPr>
+          <w:p>
+            <w:pPr>
+              <w:spacing w:after="0"/>
+            </w:pPr>
+            <w:r>
+              <w:rPr>
+                <w:rFonts w:ascii="Courier New" w:cs="Courier New" w:eastAsia="Courier New" w:hAnsi="Courier New"/>
+                <w:sz w:val="18"/>
+                <w:szCs w:val="18"/>
+                <w:shd w:fill="EEF1F4" w:val="clear"/>
+              </w:rPr>
+              <w:t xml:space="preserve">output/ramp_rl_v6/recovered_v4r_posthoc_metrics_v1/metric_replay_recovery_manifest.json</w:t>
             </w:r>
           </w:p>
         </w:tc>

</xml_diff>

<commit_message>
Clarify V4R erratum boundaries
Withdraw invalid original physical extrema and literal-zero decoder telemetry, distinguish trace-derived status-quo diagnostics from equivalence-bound replay, and label March-April replay as non-sealed post-hoc evidence.

Co-authored-by: Copilot App <223556219+Copilot@users.noreply.github.com>
</commit_message>
<xml_diff>
--- a/thesis_paper.docx
+++ b/thesis_paper.docx
@@ -2213,6 +2213,28 @@
         <w:rPr>
           <w:rFonts w:ascii="Arial" w:cs="Arial" w:eastAsia="Arial" w:hAnsi="Arial"/>
         </w:rPr>
+        <w:t xml:space="preserve">The original sealed physical p95/max values are therefore withdrawn. Correct absolute per-market horizon extrema are unavailable from the original sealed traces because those traces retain only signed cross-market means. The original literal-zero decoder field is also withdrawn: it is unmeasured placeholder telemetry, not evidence that the requested and projected allocations were identical.</w:t>
+      </w:r>
+    </w:p>
+    <w:p>
+      <w:pPr>
+        <w:spacing w:after="120" w:line="276"/>
+      </w:pPr>
+      <w:r>
+        <w:rPr>
+          <w:rFonts w:ascii="Arial" w:cs="Arial" w:eastAsia="Arial" w:hAnsi="Arial"/>
+        </w:rPr>
+        <w:t xml:space="preserve">In short, valid absolute physical extrema are unavailable from the original sealed traces.</w:t>
+      </w:r>
+    </w:p>
+    <w:p>
+      <w:pPr>
+        <w:spacing w:after="120" w:line="276"/>
+      </w:pPr>
+      <w:r>
+        <w:rPr>
+          <w:rFonts w:ascii="Arial" w:cs="Arial" w:eastAsia="Arial" w:hAnsi="Arial"/>
+        </w:rPr>
         <w:t xml:space="preserve">The correction replays the frozen policy with unchanged dynamics and action execution. It pools absolute adjusted ramp magnitudes at the market-timestep level, computes decoder adjustment in comparable decoded work coordinates, and adds explicit status-quo deltas. It reproduces decision- relevant objective, cost, safety, behavior, and action-chain identities. It is post-hoc descriptive evidence, not a fresh test.</w:t>
       </w:r>
     </w:p>
@@ -9751,7 +9773,7 @@
         <w:rPr>
           <w:rFonts w:ascii="Arial" w:cs="Arial" w:eastAsia="Arial" w:hAnsi="Arial"/>
         </w:rPr>
-        <w:t xml:space="preserve">9.2 Corrected physical p95 and maximum</w:t>
+        <w:t xml:space="preserve">9.2 Post-hoc replay physical p95 and maximum</w:t>
       </w:r>
     </w:p>
     <w:p>
@@ -9762,7 +9784,7 @@
         <w:rPr>
           <w:rFonts w:ascii="Arial" w:cs="Arial" w:eastAsia="Arial" w:hAnsi="Arial"/>
         </w:rPr>
-        <w:t xml:space="preserve">Physical summaries use </w:t>
+        <w:t xml:space="preserve">No valid absolute physical p95 or maximum is available from the original sealed traces. In the separate equivalence-bound post-hoc replay, physical summaries use </w:t>
       </w:r>
       <w:r>
         <w:rPr>
@@ -9777,7 +9799,7 @@
         <w:rPr>
           <w:rFonts w:ascii="Arial" w:cs="Arial" w:eastAsia="Arial" w:hAnsi="Arial"/>
         </w:rPr>
-        <w:t xml:space="preserve">, not a signed cross-market average. For each split and horizon, the evaluator pools every scored market-timestep magnitude with equal weight, then computes p95 and maximum. There are six market values per scored timestep. Upward and downward ramps enter with equal magnitude, so cross-market sign cancellation is impossible.</w:t>
+        <w:t xml:space="preserve">, not a signed cross-market average. For each window set and horizon, the evaluator pools every scored market-timestep magnitude with equal weight, then computes p95 and maximum. There are six market values per scored timestep. Upward and downward ramps enter with equal magnitude, so cross-market sign cancellation is impossible.</w:t>
       </w:r>
     </w:p>
     <w:p>
@@ -13724,7 +13746,7 @@
                 <w:sz w:val="17"/>
                 <w:szCs w:val="17"/>
               </w:rPr>
-              <w:t xml:space="preserve">Evaluated market</w:t>
+              <w:t xml:space="preserve">Trace-derived March-April market</w:t>
             </w:r>
           </w:p>
         </w:tc>
@@ -14847,7 +14869,7 @@
         <w:rPr>
           <w:rFonts w:ascii="Arial" w:cs="Arial" w:eastAsia="Arial" w:hAnsi="Arial"/>
         </w:rPr>
-        <w:t xml:space="preserve">Overall policy-minus-status-quo mean: -1.36142003824e-05. Markets better: 5/6 (83.3%). Every market outperforms status quo: false.</w:t>
+        <w:t xml:space="preserve">Source: persisted original policy/status-quo episode arrays; no policy replay is required. Overall policy-minus-status-quo mean: -1.36142003824e-05. Markets better: 5/6 (83.3%). Every market outperforms status quo: false.</w:t>
       </w:r>
     </w:p>
     <w:p>
@@ -14860,7 +14882,7 @@
           <wp:inline distT="0" distB="0" distL="0" distR="0">
             <wp:extent cx="6191250" cy="2676525"/>
             <wp:effectExtent t="0" r="0" b="0" l="0"/>
-            <wp:docPr id="6" name="Figure 6. Separate sealed-test views of policy native-grid-relative impact and policy-minus-status-quo impact; five of six markets favor policy and MISO is the exception." descr="Figure 6. Separate sealed-test views of policy native-grid-relative impact and policy-minus-status-quo impact; five of six markets favor policy and MISO is the exception." title="Figure 6. Separate sealed-test views of policy native-grid-relative impact and policy-minus-status-quo impact; five of six markets favor policy and MISO is the exception."/>
+            <wp:docPr id="6" name="Figure 6. Persisted March-April policy native-relative impacts and trace-derived policy-minus-status-quo deltas; five of six markets favor policy and MISO is the exception." descr="Figure 6. Persisted March-April policy native-relative impacts and trace-derived policy-minus-status-quo deltas; five of six markets favor policy and MISO is the exception." title="Figure 6. Persisted March-April policy native-relative impacts and trace-derived policy-minus-status-quo deltas; five of six markets favor policy and MISO is the exception."/>
             <wp:cNvGraphicFramePr>
               <a:graphicFrameLocks xmlns:a="http://schemas.openxmlformats.org/drawingml/2006/main" noChangeAspect="1"/>
             </wp:cNvGraphicFramePr>
@@ -14909,7 +14931,7 @@
           <w:sz w:val="18"/>
           <w:szCs w:val="18"/>
         </w:rPr>
-        <w:t xml:space="preserve">Figure 6. Separate sealed-test views of policy native-grid-relative impact and policy-minus-status-quo impact; five of six markets favor policy and MISO is the exception.</w:t>
+        <w:t xml:space="preserve">Figure 6. Persisted March-April policy native-relative impacts and trace-derived policy-minus-status-quo deltas; five of six markets favor policy and MISO is the exception.</w:t>
       </w:r>
     </w:p>
     <w:p>
@@ -14921,6 +14943,17 @@
           <w:rFonts w:ascii="Arial" w:cs="Arial" w:eastAsia="Arial" w:hAnsi="Arial"/>
         </w:rPr>
         <w:t xml:space="preserve">Policy outperforms status quo in five of six markets. MISO is worse: policy is about -5.65e-07 relative to native, while status quo is about -1.14e-06; because more negative is better, the baseline reduces the squared ramp more in MISO. The overall macro policy-minus-status-quo effect nevertheless strongly favors policy.</w:t>
+      </w:r>
+    </w:p>
+    <w:p>
+      <w:pPr>
+        <w:spacing w:after="120" w:line="276"/>
+      </w:pPr>
+      <w:r>
+        <w:rPr>
+          <w:rFonts w:ascii="Arial" w:cs="Arial" w:eastAsia="Arial" w:hAnsi="Arial"/>
+        </w:rPr>
+        <w:t xml:space="preserve">This comparator erratum requires no policy replay. It is derived directly from the persisted original policy and status-quo episode arrays. It is a post-hoc diagnostic of the original March-April evaluation, not a rewritten preregistered gate and not a new sealed test.</w:t>
       </w:r>
     </w:p>
     <w:p>
@@ -15547,7 +15580,7 @@
         <w:rPr>
           <w:rFonts w:ascii="Arial" w:cs="Arial" w:eastAsia="Arial" w:hAnsi="Arial"/>
         </w:rPr>
-        <w:t xml:space="preserve">11.6 Physical adjusted-ramp magnitudes</w:t>
+        <w:t xml:space="preserve">11.6 Post-hoc replay physical adjusted-ramp magnitudes</w:t>
       </w:r>
     </w:p>
     <w:tbl>
@@ -15602,7 +15635,7 @@
                 <w:sz w:val="17"/>
                 <w:szCs w:val="17"/>
               </w:rPr>
-              <w:t xml:space="preserve">Split</w:t>
+              <w:t xml:space="preserve">Post-hoc replay window</w:t>
             </w:r>
           </w:p>
         </w:tc>
@@ -15768,7 +15801,7 @@
                 <w:sz w:val="17"/>
                 <w:szCs w:val="17"/>
               </w:rPr>
-              <w:t xml:space="preserve">Validation</w:t>
+              <w:t xml:space="preserve">February validation windows</w:t>
             </w:r>
           </w:p>
         </w:tc>
@@ -15930,7 +15963,7 @@
                 <w:sz w:val="17"/>
                 <w:szCs w:val="17"/>
               </w:rPr>
-              <w:t xml:space="preserve">Sealed test</w:t>
+              <w:t xml:space="preserve">March-April original test windows (not a sealed test)</w:t>
             </w:r>
           </w:p>
         </w:tc>
@@ -16079,7 +16112,7 @@
           <wp:inline distT="0" distB="0" distL="0" distR="0">
             <wp:extent cx="6191250" cy="3067050"/>
             <wp:effectExtent t="0" r="0" b="0" l="0"/>
-            <wp:docPr id="8" name="Figure 8. Corrected absolute adjusted 1 h and 3 h p95 and maximum values pool all market-timestep magnitudes without signed cancellation." descr="Figure 8. Corrected absolute adjusted 1 h and 3 h p95 and maximum values pool all market-timestep magnitudes without signed cancellation." title="Figure 8. Corrected absolute adjusted 1 h and 3 h p95 and maximum values pool all market-timestep magnitudes without signed cancellation."/>
+            <wp:docPr id="8" name="Figure 8. Equivalence-bound post-hoc replay of absolute adjusted 1 h and 3 h p95 and maximum values; the original sealed traces cannot supply these metrics." descr="Figure 8. Equivalence-bound post-hoc replay of absolute adjusted 1 h and 3 h p95 and maximum values; the original sealed traces cannot supply these metrics." title="Figure 8. Equivalence-bound post-hoc replay of absolute adjusted 1 h and 3 h p95 and maximum values; the original sealed traces cannot supply these metrics."/>
             <wp:cNvGraphicFramePr>
               <a:graphicFrameLocks xmlns:a="http://schemas.openxmlformats.org/drawingml/2006/main" noChangeAspect="1"/>
             </wp:cNvGraphicFramePr>
@@ -16128,7 +16161,7 @@
           <w:sz w:val="18"/>
           <w:szCs w:val="18"/>
         </w:rPr>
-        <w:t xml:space="preserve">Figure 8. Corrected absolute adjusted 1 h and 3 h p95 and maximum values pool all market-timestep magnitudes without signed cancellation.</w:t>
+        <w:t xml:space="preserve">Figure 8. Equivalence-bound post-hoc replay of absolute adjusted 1 h and 3 h p95 and maximum values; the original sealed traces cannot supply these metrics.</w:t>
       </w:r>
     </w:p>
     <w:p>
@@ -16139,7 +16172,7 @@
         <w:rPr>
           <w:rFonts w:ascii="Arial" w:cs="Arial" w:eastAsia="Arial" w:hAnsi="Arial"/>
         </w:rPr>
-        <w:t xml:space="preserve">These are post-hoc corrected physical summaries. They describe the magnitude of adjusted market-normalized ramps, not incremental improvement and not a new generalization result.</w:t>
+        <w:t xml:space="preserve">The original sealed physical extrema are invalid and unavailable. The displayed values come only from the equivalence-bound replay of the February and March-April windows. The March-April row is not a sealed test. These values describe adjusted market-normalized ramp magnitude, not incremental improvement and not a new generalization result.</w:t>
       </w:r>
     </w:p>
     <w:p>
@@ -16151,7 +16184,7 @@
         <w:rPr>
           <w:rFonts w:ascii="Arial" w:cs="Arial" w:eastAsia="Arial" w:hAnsi="Arial"/>
         </w:rPr>
-        <w:t xml:space="preserve">11.7 Decoder adjustment and emergency path</w:t>
+        <w:t xml:space="preserve">11.7 Post-hoc replay decoder adjustment and emergency path</w:t>
       </w:r>
     </w:p>
     <w:tbl>
@@ -16208,7 +16241,7 @@
                 <w:sz w:val="16"/>
                 <w:szCs w:val="16"/>
               </w:rPr>
-              <w:t xml:space="preserve">Split</w:t>
+              <w:t xml:space="preserve">Post-hoc replay window</w:t>
             </w:r>
           </w:p>
         </w:tc>
@@ -16440,7 +16473,7 @@
                 <w:sz w:val="16"/>
                 <w:szCs w:val="16"/>
               </w:rPr>
-              <w:t xml:space="preserve">Validation</w:t>
+              <w:t xml:space="preserve">February validation windows</w:t>
             </w:r>
           </w:p>
         </w:tc>
@@ -16666,7 +16699,7 @@
                 <w:sz w:val="16"/>
                 <w:szCs w:val="16"/>
               </w:rPr>
-              <w:t xml:space="preserve">Sealed test</w:t>
+              <w:t xml:space="preserve">March-April original test windows (not a sealed test)</w:t>
             </w:r>
           </w:p>
         </w:tc>
@@ -16890,7 +16923,7 @@
           <wp:inline distT="0" distB="0" distL="0" distR="0">
             <wp:extent cx="6191250" cy="2581275"/>
             <wp:effectExtent t="0" r="0" b="0" l="0"/>
-            <wp:docPr id="9" name="Figure 9. Distribution of ordinary decoder adjustment in decoded work-allocation coordinates, shown separately from the zero emergency fallback rate." descr="Figure 9. Distribution of ordinary decoder adjustment in decoded work-allocation coordinates, shown separately from the zero emergency fallback rate." title="Figure 9. Distribution of ordinary decoder adjustment in decoded work-allocation coordinates, shown separately from the zero emergency fallback rate."/>
+            <wp:docPr id="9" name="Figure 9. Equivalence-bound post-hoc replay distribution of ordinary decoder adjustment in decoded work-allocation coordinates, shown separately from emergency fallback." descr="Figure 9. Equivalence-bound post-hoc replay distribution of ordinary decoder adjustment in decoded work-allocation coordinates, shown separately from emergency fallback." title="Figure 9. Equivalence-bound post-hoc replay distribution of ordinary decoder adjustment in decoded work-allocation coordinates, shown separately from emergency fallback."/>
             <wp:cNvGraphicFramePr>
               <a:graphicFrameLocks xmlns:a="http://schemas.openxmlformats.org/drawingml/2006/main" noChangeAspect="1"/>
             </wp:cNvGraphicFramePr>
@@ -16939,7 +16972,7 @@
           <w:sz w:val="18"/>
           <w:szCs w:val="18"/>
         </w:rPr>
-        <w:t xml:space="preserve">Figure 9. Distribution of ordinary decoder adjustment in decoded work-allocation coordinates, shown separately from the zero emergency fallback rate.</w:t>
+        <w:t xml:space="preserve">Figure 9. Equivalence-bound post-hoc replay distribution of ordinary decoder adjustment in decoded work-allocation coordinates, shown separately from emergency fallback.</w:t>
       </w:r>
     </w:p>
     <w:p>
@@ -16950,7 +16983,7 @@
         <w:rPr>
           <w:rFonts w:ascii="Arial" w:cs="Arial" w:eastAsia="Arial" w:hAnsi="Arial"/>
         </w:rPr>
-        <w:t xml:space="preserve">Positive adjustment is ordinary constraint projection. It shows how often and how much the unconstrained decoded request differs from executed work. It does not imply a safety failure. Emergency fallback is a separate mechanism and remained zero.</w:t>
+        <w:t xml:space="preserve">The original literal-zero decoder field is invalid placeholder telemetry and cannot support a sealed-evaluation distribution. The displayed distribution is measured only by equivalence-bound post-hoc replay; its March-April row is not a sealed test. Positive adjustment is ordinary constraint projection. It shows how often and how much the unconstrained decoded request differs from executed work and does not imply a safety failure. Emergency fallback is a separate mechanism and remained zero.</w:t>
       </w:r>
     </w:p>
     <w:p>
@@ -19002,7 +19035,7 @@
         <w:rPr>
           <w:rFonts w:ascii="Arial" w:cs="Arial" w:eastAsia="Arial" w:hAnsi="Arial"/>
         </w:rPr>
-        <w:t xml:space="preserve">The later correction improves rather than enlarges the claim. Physical p95 and maximum now use absolute per-market per-timestep magnitudes, decoder adjustment is real and unit-defined, and native versus status-quo baselines are explicit. The immutable sealed result remains untouched and the replay is not presented as new test evidence.</w:t>
+        <w:t xml:space="preserve">The later erratum improves rather than enlarges the claim. It withdraws the invalid original physical extrema and literal-zero decoder field. Separate equivalence-bound replay uses absolute per-market per-timestep magnitudes and a real, unit-defined decoder norm, while native versus status-quo baselines are explicit. The immutable sealed primary result remains untouched. No replay is presented as a sealed test or as new generalization evidence.</w:t>
       </w:r>
     </w:p>
     <w:p>

</xml_diff>

<commit_message>
Add exact V4R study dimensions
Document verified market-hour and factory-window counts, primary workload deadline horizons, observation size, and ensemble decision count in the examiner-facing thesis.

Co-authored-by: Copilot App <223556219+Copilot@users.noreply.github.com>
</commit_message>
<xml_diff>
--- a/thesis_paper.docx
+++ b/thesis_paper.docx
@@ -2714,6 +2714,17 @@
         <w:rPr>
           <w:rFonts w:ascii="Arial" w:cs="Arial" w:eastAsia="Arial" w:hAnsi="Arial"/>
         </w:rPr>
+        <w:t xml:space="preserve">The common index contains 5,808 timestamps per market and 34,848 market-hours across six markets. After the causal forecast warm-up, the frozen factory manifest exposes 114 training daily windows, 28 validation daily windows, and 60 original test daily windows.</w:t>
+      </w:r>
+    </w:p>
+    <w:p>
+      <w:pPr>
+        <w:spacing w:after="120" w:line="276"/>
+      </w:pPr>
+      <w:r>
+        <w:rPr>
+          <w:rFonts w:ascii="Arial" w:cs="Arial" w:eastAsia="Arial" w:hAnsi="Arial"/>
+        </w:rPr>
         <w:t xml:space="preserve">Each market must cover the exact common index. Duplicate timestamps, missing hours, mixed interval conventions, or an incomplete source product fail closed. The builder does not shorten the period or drop a market to make the intersection pass.</w:t>
       </w:r>
     </w:p>
@@ -6645,6 +6656,17 @@
           <w:rFonts w:ascii="Arial" w:cs="Arial" w:eastAsia="Arial" w:hAnsi="Arial"/>
         </w:rPr>
         <w:t xml:space="preserve">Every hourly batch arrival receives that experimental horizon. Global EDF drains the earliest deadlines first. These deadlines are not Borg SLOs, customer commitments, or production queue policies.</w:t>
+      </w:r>
+    </w:p>
+    <w:p>
+      <w:pPr>
+        <w:spacing w:after="120" w:line="276"/>
+      </w:pPr>
+      <w:r>
+        <w:rPr>
+          <w:rFonts w:ascii="Arial" w:cs="Arial" w:eastAsia="Arial" w:hAnsi="Arial"/>
+        </w:rPr>
+        <w:t xml:space="preserve">For primary cells a-f, the resulting horizons are respectively 2, 1, 2, 3, 4, and 3 hours. Those values are derived from the committed per-cell duration files; they are experimental flexibility assumptions rather than measured service guarantees.</w:t>
       </w:r>
     </w:p>
     <w:p>
@@ -7124,7 +7146,7 @@
         <w:rPr>
           <w:rFonts w:ascii="Arial" w:cs="Arial" w:eastAsia="Arial" w:hAnsi="Arial"/>
         </w:rPr>
-        <w:t xml:space="preserve">For every market, the observation contains:</w:t>
+        <w:t xml:space="preserve">The six-site observation contains 186 scalar values. For every market, it contains:</w:t>
       </w:r>
     </w:p>
     <w:p>
@@ -8135,6 +8157,17 @@
           <w:rFonts w:ascii="Arial" w:cs="Arial" w:eastAsia="Arial" w:hAnsi="Arial"/>
         </w:rPr>
         <w:t xml:space="preserve">The evaluator records member invocation counts and hashes the observation and action chains. A repeatability probe requires exact action equality for the same raw observation.</w:t>
+      </w:r>
+    </w:p>
+    <w:p>
+      <w:pPr>
+        <w:spacing w:after="120" w:line="276"/>
+      </w:pPr>
+      <w:r>
+        <w:rPr>
+          <w:rFonts w:ascii="Arial" w:cs="Arial" w:eastAsia="Arial" w:hAnsi="Arial"/>
+        </w:rPr>
+        <w:t xml:space="preserve">The original March-April controller audit records 1,620 ensemble decisions: 27 decisions in each of 60 daily episodes. Every member was invoked exactly once per decision.</w:t>
       </w:r>
     </w:p>
     <w:p>

</xml_diff>

<commit_message>
Fix V3 recovery verification instructions
Separate frozen dede685 checkpoint training from d1d4828 equivalence verification, including the required live_v3 manifests and correctly routed checkpoint/raw-evidence paths.

Co-authored-by: Copilot App <223556219+Copilot@users.noreply.github.com>
</commit_message>
<xml_diff>
--- a/thesis_paper.docx
+++ b/thesis_paper.docx
@@ -10655,7 +10655,7 @@
           <w:sz w:val="17"/>
           <w:szCs w:val="17"/>
         </w:rPr>
-        <w:t xml:space="preserve">git worktree add ..\dc-energy-v3-metric-recovery dede685</w:t>
+        <w:t xml:space="preserve">$repoRoot = (Resolve-Path ".").Path</w:t>
       </w:r>
     </w:p>
     <w:p>
@@ -10673,7 +10673,7 @@
           <w:sz w:val="17"/>
           <w:szCs w:val="17"/>
         </w:rPr>
-        <w:t xml:space="preserve">Push-Location ..\dc-energy-v3-metric-recovery</w:t>
+        <w:t xml:space="preserve">$worktreeParent = Split-Path $repoRoot -Parent</w:t>
       </w:r>
     </w:p>
     <w:p>
@@ -10691,7 +10691,7 @@
           <w:sz w:val="17"/>
           <w:szCs w:val="17"/>
         </w:rPr>
-        <w:t xml:space="preserve"> </w:t>
+        <w:t xml:space="preserve">$trainingRoot = Join-Path $worktreeParent "dc-energy-v3-metric-training"</w:t>
       </w:r>
     </w:p>
     <w:p>
@@ -10709,7 +10709,7 @@
           <w:sz w:val="17"/>
           <w:szCs w:val="17"/>
         </w:rPr>
-        <w:t xml:space="preserve">$env:OMP_NUM_THREADS = "1"</w:t>
+        <w:t xml:space="preserve">$verifierRoot = Join-Path $worktreeParent "dc-energy-v3-metric-verifier"</w:t>
       </w:r>
     </w:p>
     <w:p>
@@ -10727,7 +10727,7 @@
           <w:sz w:val="17"/>
           <w:szCs w:val="17"/>
         </w:rPr>
-        <w:t xml:space="preserve">$env:MKL_NUM_THREADS = "1"</w:t>
+        <w:t xml:space="preserve">$relativeCheckpoints = "models\ramp_rl_v6\recovery_v3_metric_replay"</w:t>
       </w:r>
     </w:p>
     <w:p>
@@ -10745,7 +10745,7 @@
           <w:sz w:val="17"/>
           <w:szCs w:val="17"/>
         </w:rPr>
-        <w:t xml:space="preserve">$env:OPENBLAS_NUM_THREADS = "1"</w:t>
+        <w:t xml:space="preserve">$trainingCheckpoints = Join-Path $trainingRoot $relativeCheckpoints</w:t>
       </w:r>
     </w:p>
     <w:p>
@@ -10763,7 +10763,7 @@
           <w:sz w:val="17"/>
           <w:szCs w:val="17"/>
         </w:rPr>
-        <w:t xml:space="preserve">$env:NUMEXPR_NUM_THREADS = "1"</w:t>
+        <w:t xml:space="preserve">$verifierCheckpoints = Join-Path $verifierRoot $relativeCheckpoints</w:t>
       </w:r>
     </w:p>
     <w:p>
@@ -10781,7 +10781,7 @@
           <w:sz w:val="17"/>
           <w:szCs w:val="17"/>
         </w:rPr>
-        <w:t xml:space="preserve"> </w:t>
+        <w:t xml:space="preserve">$localCheckpoints = Join-Path $repoRoot $relativeCheckpoints</w:t>
       </w:r>
     </w:p>
     <w:p>
@@ -10799,7 +10799,7 @@
           <w:sz w:val="17"/>
           <w:szCs w:val="17"/>
         </w:rPr>
-        <w:t xml:space="preserve">$jobs = foreach ($seed in 2801..2805) {</w:t>
+        <w:t xml:space="preserve">$rawVerification = Join-Path `</w:t>
       </w:r>
     </w:p>
     <w:p>
@@ -10817,7 +10817,7 @@
           <w:sz w:val="17"/>
           <w:szCs w:val="17"/>
         </w:rPr>
-        <w:t xml:space="preserve">  $output = "models\ramp_rl_v6\recovery_v3_metric_replay\$seed"</w:t>
+        <w:t xml:space="preserve">  $verifierRoot "metric_replay_recovery_verification_raw.json"</w:t>
       </w:r>
     </w:p>
     <w:p>
@@ -10835,7 +10835,7 @@
           <w:sz w:val="17"/>
           <w:szCs w:val="17"/>
         </w:rPr>
-        <w:t xml:space="preserve">  Start-Process python `</w:t>
+        <w:t xml:space="preserve">$recomputedAt = (Get-Date).ToUniversalTime().ToString(</w:t>
       </w:r>
     </w:p>
     <w:p>
@@ -10853,7 +10853,7 @@
           <w:sz w:val="17"/>
           <w:szCs w:val="17"/>
         </w:rPr>
-        <w:t xml:space="preserve">    -ArgumentList @(</w:t>
+        <w:t xml:space="preserve">  "yyyy-MM-ddTHH:mm:ssZ"</w:t>
       </w:r>
     </w:p>
     <w:p>
@@ -10871,7 +10871,7 @@
           <w:sz w:val="17"/>
           <w:szCs w:val="17"/>
         </w:rPr>
-        <w:t xml:space="preserve">      "scripts\run_ramp_rl_v3.py", "train",</w:t>
+        <w:t xml:space="preserve">)</w:t>
       </w:r>
     </w:p>
     <w:p>
@@ -10889,7 +10889,7 @@
           <w:sz w:val="17"/>
           <w:szCs w:val="17"/>
         </w:rPr>
-        <w:t xml:space="preserve">      "--seed", "$seed", "--output", $output</w:t>
+        <w:t xml:space="preserve"> </w:t>
       </w:r>
     </w:p>
     <w:p>
@@ -10907,7 +10907,7 @@
           <w:sz w:val="17"/>
           <w:szCs w:val="17"/>
         </w:rPr>
-        <w:t xml:space="preserve">    ) `</w:t>
+        <w:t xml:space="preserve">if (Test-Path $trainingRoot) { throw "Training worktree already exists" }</w:t>
       </w:r>
     </w:p>
     <w:p>
@@ -10925,7 +10925,7 @@
           <w:sz w:val="17"/>
           <w:szCs w:val="17"/>
         </w:rPr>
-        <w:t xml:space="preserve">    -PassThru</w:t>
+        <w:t xml:space="preserve">if (Test-Path $verifierRoot) { throw "Verifier worktree already exists" }</w:t>
       </w:r>
     </w:p>
     <w:p>
@@ -10943,7 +10943,7 @@
           <w:sz w:val="17"/>
           <w:szCs w:val="17"/>
         </w:rPr>
-        <w:t xml:space="preserve">}</w:t>
+        <w:t xml:space="preserve">if (Test-Path $localCheckpoints) { throw "Local checkpoint root already exists" }</w:t>
       </w:r>
     </w:p>
     <w:p>
@@ -10961,7 +10961,7 @@
           <w:sz w:val="17"/>
           <w:szCs w:val="17"/>
         </w:rPr>
-        <w:t xml:space="preserve">$jobs | Wait-Process</w:t>
+        <w:t xml:space="preserve"> </w:t>
       </w:r>
     </w:p>
     <w:p>
@@ -10979,7 +10979,7 @@
           <w:sz w:val="17"/>
           <w:szCs w:val="17"/>
         </w:rPr>
-        <w:t xml:space="preserve"> </w:t>
+        <w:t xml:space="preserve"># Train only from the frozen historical execution source.</w:t>
       </w:r>
     </w:p>
     <w:p>
@@ -10997,7 +10997,7 @@
           <w:sz w:val="17"/>
           <w:szCs w:val="17"/>
         </w:rPr>
-        <w:t xml:space="preserve">python scripts\recover_ramp_rl_v3.py `</w:t>
+        <w:t xml:space="preserve">git worktree add $trainingRoot dede685</w:t>
       </w:r>
     </w:p>
     <w:p>
@@ -11015,7 +11015,7 @@
           <w:sz w:val="17"/>
           <w:szCs w:val="17"/>
         </w:rPr>
-        <w:t xml:space="preserve">  --recovery-root models\ramp_rl_v6\recovery_v3_metric_replay `</w:t>
+        <w:t xml:space="preserve">Push-Location $trainingRoot</w:t>
       </w:r>
     </w:p>
     <w:p>
@@ -11033,7 +11033,7 @@
           <w:sz w:val="17"/>
           <w:szCs w:val="17"/>
         </w:rPr>
-        <w:t xml:space="preserve">  --manifest metric_replay_recovery_verification_raw.json `</w:t>
+        <w:t xml:space="preserve"> </w:t>
       </w:r>
     </w:p>
     <w:p>
@@ -11051,7 +11051,7 @@
           <w:sz w:val="17"/>
           <w:szCs w:val="17"/>
         </w:rPr>
-        <w:t xml:space="preserve">  --allow-model-container-difference</w:t>
+        <w:t xml:space="preserve">$env:OMP_NUM_THREADS = "1"</w:t>
       </w:r>
     </w:p>
     <w:p>
@@ -11069,7 +11069,7 @@
           <w:sz w:val="17"/>
           <w:szCs w:val="17"/>
         </w:rPr>
-        <w:t xml:space="preserve">Pop-Location</w:t>
+        <w:t xml:space="preserve">$env:MKL_NUM_THREADS = "1"</w:t>
       </w:r>
     </w:p>
     <w:p>
@@ -11087,7 +11087,7 @@
           <w:sz w:val="17"/>
           <w:szCs w:val="17"/>
         </w:rPr>
-        <w:t xml:space="preserve"> </w:t>
+        <w:t xml:space="preserve">$env:OPENBLAS_NUM_THREADS = "1"</w:t>
       </w:r>
     </w:p>
     <w:p>
@@ -11105,7 +11105,7 @@
           <w:sz w:val="17"/>
           <w:szCs w:val="17"/>
         </w:rPr>
-        <w:t xml:space="preserve">Copy-Item `</w:t>
+        <w:t xml:space="preserve">$env:NUMEXPR_NUM_THREADS = "1"</w:t>
       </w:r>
     </w:p>
     <w:p>
@@ -11123,7 +11123,7 @@
           <w:sz w:val="17"/>
           <w:szCs w:val="17"/>
         </w:rPr>
-        <w:t xml:space="preserve">  ..\dc-energy-v3-metric-recovery\models\ramp_rl_v6\recovery_v3_metric_replay `</w:t>
+        <w:t xml:space="preserve"> </w:t>
       </w:r>
     </w:p>
     <w:p>
@@ -11141,7 +11141,7 @@
           <w:sz w:val="17"/>
           <w:szCs w:val="17"/>
         </w:rPr>
-        <w:t xml:space="preserve">  models\ramp_rl_v6\recovery_v3_metric_replay `</w:t>
+        <w:t xml:space="preserve">$jobs = foreach ($seed in 2801..2805) {</w:t>
       </w:r>
     </w:p>
     <w:p>
@@ -11159,7 +11159,7 @@
           <w:sz w:val="17"/>
           <w:szCs w:val="17"/>
         </w:rPr>
-        <w:t xml:space="preserve">  -Recurse</w:t>
+        <w:t xml:space="preserve">  $output = "models\ramp_rl_v6\recovery_v3_metric_replay\$seed"</w:t>
       </w:r>
     </w:p>
     <w:p>
@@ -11177,7 +11177,7 @@
           <w:sz w:val="17"/>
           <w:szCs w:val="17"/>
         </w:rPr>
-        <w:t xml:space="preserve"> </w:t>
+        <w:t xml:space="preserve">  Start-Process python `</w:t>
       </w:r>
     </w:p>
     <w:p>
@@ -11195,7 +11195,7 @@
           <w:sz w:val="17"/>
           <w:szCs w:val="17"/>
         </w:rPr>
-        <w:t xml:space="preserve">python scripts\bind_v4r_metric_replay_recovery.py bind `</w:t>
+        <w:t xml:space="preserve">    -ArgumentList @(</w:t>
       </w:r>
     </w:p>
     <w:p>
@@ -11213,7 +11213,7 @@
           <w:sz w:val="17"/>
           <w:szCs w:val="17"/>
         </w:rPr>
-        <w:t xml:space="preserve">  --raw-verification `</w:t>
+        <w:t xml:space="preserve">      "scripts\run_ramp_rl_v3.py", "train",</w:t>
       </w:r>
     </w:p>
     <w:p>
@@ -11231,7 +11231,7 @@
           <w:sz w:val="17"/>
           <w:szCs w:val="17"/>
         </w:rPr>
-        <w:t xml:space="preserve">    ..\dc-energy-v3-metric-recovery\metric_replay_recovery_verification_raw.json `</w:t>
+        <w:t xml:space="preserve">      "--seed", "$seed", "--output", $output</w:t>
       </w:r>
     </w:p>
     <w:p>
@@ -11249,7 +11249,7 @@
           <w:sz w:val="17"/>
           <w:szCs w:val="17"/>
         </w:rPr>
-        <w:t xml:space="preserve">  --recovery-root models\ramp_rl_v6\recovery_v3_metric_replay</w:t>
+        <w:t xml:space="preserve">    ) `</w:t>
       </w:r>
     </w:p>
     <w:p>
@@ -11267,7 +11267,7 @@
           <w:sz w:val="17"/>
           <w:szCs w:val="17"/>
         </w:rPr>
-        <w:t xml:space="preserve"> </w:t>
+        <w:t xml:space="preserve">    -PassThru</w:t>
       </w:r>
     </w:p>
     <w:p>
@@ -11285,7 +11285,7 @@
           <w:sz w:val="17"/>
           <w:szCs w:val="17"/>
         </w:rPr>
-        <w:t xml:space="preserve">python scripts\recompute_v4r_posthoc_metrics.py recompute `</w:t>
+        <w:t xml:space="preserve">}</w:t>
       </w:r>
     </w:p>
     <w:p>
@@ -11303,7 +11303,7 @@
           <w:sz w:val="17"/>
           <w:szCs w:val="17"/>
         </w:rPr>
-        <w:t xml:space="preserve">  --recomputed-at-utc &lt;explicit-UTC-timestamp&gt; `</w:t>
+        <w:t xml:space="preserve">$jobs | Wait-Process</w:t>
       </w:r>
     </w:p>
     <w:p>
@@ -11321,7 +11321,7 @@
           <w:sz w:val="17"/>
           <w:szCs w:val="17"/>
         </w:rPr>
-        <w:t xml:space="preserve">  --recovered-binary-root models\ramp_rl_v6\recovery_v3_metric_replay `</w:t>
+        <w:t xml:space="preserve">if ($jobs | Where-Object { $_.ExitCode -ne 0 }) {</w:t>
       </w:r>
     </w:p>
     <w:p>
@@ -11339,7 +11339,7 @@
           <w:sz w:val="17"/>
           <w:szCs w:val="17"/>
         </w:rPr>
-        <w:t xml:space="preserve">  --recovery-manifest `</w:t>
+        <w:t xml:space="preserve">  throw "At least one checkpoint reconstruction failed"</w:t>
       </w:r>
     </w:p>
     <w:p>
@@ -11357,6 +11357,618 @@
           <w:sz w:val="17"/>
           <w:szCs w:val="17"/>
         </w:rPr>
+        <w:t xml:space="preserve">}</w:t>
+      </w:r>
+    </w:p>
+    <w:p>
+      <w:pPr>
+        <w:pBdr>
+          <w:left w:val="single" w:color="7F8C8D" w:sz="8" w:space="8"/>
+        </w:pBdr>
+        <w:shd w:fill="F4F6F7" w:val="clear"/>
+        <w:spacing w:after="0"/>
+        <w:ind w:left="240" w:right="120"/>
+      </w:pPr>
+      <w:r>
+        <w:rPr>
+          <w:rFonts w:ascii="Courier New" w:cs="Courier New" w:eastAsia="Courier New" w:hAnsi="Courier New"/>
+          <w:sz w:val="17"/>
+          <w:szCs w:val="17"/>
+        </w:rPr>
+        <w:t xml:space="preserve">Pop-Location</w:t>
+      </w:r>
+    </w:p>
+    <w:p>
+      <w:pPr>
+        <w:pBdr>
+          <w:left w:val="single" w:color="7F8C8D" w:sz="8" w:space="8"/>
+        </w:pBdr>
+        <w:shd w:fill="F4F6F7" w:val="clear"/>
+        <w:spacing w:after="0"/>
+        <w:ind w:left="240" w:right="120"/>
+      </w:pPr>
+      <w:r>
+        <w:rPr>
+          <w:rFonts w:ascii="Courier New" w:cs="Courier New" w:eastAsia="Courier New" w:hAnsi="Courier New"/>
+          <w:sz w:val="17"/>
+          <w:szCs w:val="17"/>
+        </w:rPr>
+        <w:t xml:space="preserve"> </w:t>
+      </w:r>
+    </w:p>
+    <w:p>
+      <w:pPr>
+        <w:pBdr>
+          <w:left w:val="single" w:color="7F8C8D" w:sz="8" w:space="8"/>
+        </w:pBdr>
+        <w:shd w:fill="F4F6F7" w:val="clear"/>
+        <w:spacing w:after="0"/>
+        <w:ind w:left="240" w:right="120"/>
+      </w:pPr>
+      <w:r>
+        <w:rPr>
+          <w:rFonts w:ascii="Courier New" w:cs="Courier New" w:eastAsia="Courier New" w:hAnsi="Courier New"/>
+          <w:sz w:val="17"/>
+          <w:szCs w:val="17"/>
+        </w:rPr>
+        <w:t xml:space="preserve"># Verify only from the stable recovery-tooling/evidence context. The verifier</w:t>
+      </w:r>
+    </w:p>
+    <w:p>
+      <w:pPr>
+        <w:pBdr>
+          <w:left w:val="single" w:color="7F8C8D" w:sz="8" w:space="8"/>
+        </w:pBdr>
+        <w:shd w:fill="F4F6F7" w:val="clear"/>
+        <w:spacing w:after="0"/>
+        <w:ind w:left="240" w:right="120"/>
+      </w:pPr>
+      <w:r>
+        <w:rPr>
+          <w:rFonts w:ascii="Courier New" w:cs="Courier New" w:eastAsia="Courier New" w:hAnsi="Courier New"/>
+          <w:sz w:val="17"/>
+          <w:szCs w:val="17"/>
+        </w:rPr>
+        <w:t xml:space="preserve"># and original live_v3 manifests are not present at dede685.</w:t>
+      </w:r>
+    </w:p>
+    <w:p>
+      <w:pPr>
+        <w:pBdr>
+          <w:left w:val="single" w:color="7F8C8D" w:sz="8" w:space="8"/>
+        </w:pBdr>
+        <w:shd w:fill="F4F6F7" w:val="clear"/>
+        <w:spacing w:after="0"/>
+        <w:ind w:left="240" w:right="120"/>
+      </w:pPr>
+      <w:r>
+        <w:rPr>
+          <w:rFonts w:ascii="Courier New" w:cs="Courier New" w:eastAsia="Courier New" w:hAnsi="Courier New"/>
+          <w:sz w:val="17"/>
+          <w:szCs w:val="17"/>
+        </w:rPr>
+        <w:t xml:space="preserve">git worktree add `</w:t>
+      </w:r>
+    </w:p>
+    <w:p>
+      <w:pPr>
+        <w:pBdr>
+          <w:left w:val="single" w:color="7F8C8D" w:sz="8" w:space="8"/>
+        </w:pBdr>
+        <w:shd w:fill="F4F6F7" w:val="clear"/>
+        <w:spacing w:after="0"/>
+        <w:ind w:left="240" w:right="120"/>
+      </w:pPr>
+      <w:r>
+        <w:rPr>
+          <w:rFonts w:ascii="Courier New" w:cs="Courier New" w:eastAsia="Courier New" w:hAnsi="Courier New"/>
+          <w:sz w:val="17"/>
+          <w:szCs w:val="17"/>
+        </w:rPr>
+        <w:t xml:space="preserve">  $verifierRoot d1d4828c32bada1ba1e852d0479c37bb71164561</w:t>
+      </w:r>
+    </w:p>
+    <w:p>
+      <w:pPr>
+        <w:pBdr>
+          <w:left w:val="single" w:color="7F8C8D" w:sz="8" w:space="8"/>
+        </w:pBdr>
+        <w:shd w:fill="F4F6F7" w:val="clear"/>
+        <w:spacing w:after="0"/>
+        <w:ind w:left="240" w:right="120"/>
+      </w:pPr>
+      <w:r>
+        <w:rPr>
+          <w:rFonts w:ascii="Courier New" w:cs="Courier New" w:eastAsia="Courier New" w:hAnsi="Courier New"/>
+          <w:sz w:val="17"/>
+          <w:szCs w:val="17"/>
+        </w:rPr>
+        <w:t xml:space="preserve">New-Item -ItemType Directory -Force `</w:t>
+      </w:r>
+    </w:p>
+    <w:p>
+      <w:pPr>
+        <w:pBdr>
+          <w:left w:val="single" w:color="7F8C8D" w:sz="8" w:space="8"/>
+        </w:pBdr>
+        <w:shd w:fill="F4F6F7" w:val="clear"/>
+        <w:spacing w:after="0"/>
+        <w:ind w:left="240" w:right="120"/>
+      </w:pPr>
+      <w:r>
+        <w:rPr>
+          <w:rFonts w:ascii="Courier New" w:cs="Courier New" w:eastAsia="Courier New" w:hAnsi="Courier New"/>
+          <w:sz w:val="17"/>
+          <w:szCs w:val="17"/>
+        </w:rPr>
+        <w:t xml:space="preserve">  -Path (Split-Path $verifierCheckpoints -Parent) | Out-Null</w:t>
+      </w:r>
+    </w:p>
+    <w:p>
+      <w:pPr>
+        <w:pBdr>
+          <w:left w:val="single" w:color="7F8C8D" w:sz="8" w:space="8"/>
+        </w:pBdr>
+        <w:shd w:fill="F4F6F7" w:val="clear"/>
+        <w:spacing w:after="0"/>
+        <w:ind w:left="240" w:right="120"/>
+      </w:pPr>
+      <w:r>
+        <w:rPr>
+          <w:rFonts w:ascii="Courier New" w:cs="Courier New" w:eastAsia="Courier New" w:hAnsi="Courier New"/>
+          <w:sz w:val="17"/>
+          <w:szCs w:val="17"/>
+        </w:rPr>
+        <w:t xml:space="preserve">Copy-Item -LiteralPath $trainingCheckpoints `</w:t>
+      </w:r>
+    </w:p>
+    <w:p>
+      <w:pPr>
+        <w:pBdr>
+          <w:left w:val="single" w:color="7F8C8D" w:sz="8" w:space="8"/>
+        </w:pBdr>
+        <w:shd w:fill="F4F6F7" w:val="clear"/>
+        <w:spacing w:after="0"/>
+        <w:ind w:left="240" w:right="120"/>
+      </w:pPr>
+      <w:r>
+        <w:rPr>
+          <w:rFonts w:ascii="Courier New" w:cs="Courier New" w:eastAsia="Courier New" w:hAnsi="Courier New"/>
+          <w:sz w:val="17"/>
+          <w:szCs w:val="17"/>
+        </w:rPr>
+        <w:t xml:space="preserve">  -Destination $verifierCheckpoints -Recurse</w:t>
+      </w:r>
+    </w:p>
+    <w:p>
+      <w:pPr>
+        <w:pBdr>
+          <w:left w:val="single" w:color="7F8C8D" w:sz="8" w:space="8"/>
+        </w:pBdr>
+        <w:shd w:fill="F4F6F7" w:val="clear"/>
+        <w:spacing w:after="0"/>
+        <w:ind w:left="240" w:right="120"/>
+      </w:pPr>
+      <w:r>
+        <w:rPr>
+          <w:rFonts w:ascii="Courier New" w:cs="Courier New" w:eastAsia="Courier New" w:hAnsi="Courier New"/>
+          <w:sz w:val="17"/>
+          <w:szCs w:val="17"/>
+        </w:rPr>
+        <w:t xml:space="preserve"> </w:t>
+      </w:r>
+    </w:p>
+    <w:p>
+      <w:pPr>
+        <w:pBdr>
+          <w:left w:val="single" w:color="7F8C8D" w:sz="8" w:space="8"/>
+        </w:pBdr>
+        <w:shd w:fill="F4F6F7" w:val="clear"/>
+        <w:spacing w:after="0"/>
+        <w:ind w:left="240" w:right="120"/>
+      </w:pPr>
+      <w:r>
+        <w:rPr>
+          <w:rFonts w:ascii="Courier New" w:cs="Courier New" w:eastAsia="Courier New" w:hAnsi="Courier New"/>
+          <w:sz w:val="17"/>
+          <w:szCs w:val="17"/>
+        </w:rPr>
+        <w:t xml:space="preserve">Push-Location $verifierRoot</w:t>
+      </w:r>
+    </w:p>
+    <w:p>
+      <w:pPr>
+        <w:pBdr>
+          <w:left w:val="single" w:color="7F8C8D" w:sz="8" w:space="8"/>
+        </w:pBdr>
+        <w:shd w:fill="F4F6F7" w:val="clear"/>
+        <w:spacing w:after="0"/>
+        <w:ind w:left="240" w:right="120"/>
+      </w:pPr>
+      <w:r>
+        <w:rPr>
+          <w:rFonts w:ascii="Courier New" w:cs="Courier New" w:eastAsia="Courier New" w:hAnsi="Courier New"/>
+          <w:sz w:val="17"/>
+          <w:szCs w:val="17"/>
+        </w:rPr>
+        <w:t xml:space="preserve">python scripts\recover_ramp_rl_v3.py `</w:t>
+      </w:r>
+    </w:p>
+    <w:p>
+      <w:pPr>
+        <w:pBdr>
+          <w:left w:val="single" w:color="7F8C8D" w:sz="8" w:space="8"/>
+        </w:pBdr>
+        <w:shd w:fill="F4F6F7" w:val="clear"/>
+        <w:spacing w:after="0"/>
+        <w:ind w:left="240" w:right="120"/>
+      </w:pPr>
+      <w:r>
+        <w:rPr>
+          <w:rFonts w:ascii="Courier New" w:cs="Courier New" w:eastAsia="Courier New" w:hAnsi="Courier New"/>
+          <w:sz w:val="17"/>
+          <w:szCs w:val="17"/>
+        </w:rPr>
+        <w:t xml:space="preserve">  --recovery-root $verifierCheckpoints `</w:t>
+      </w:r>
+    </w:p>
+    <w:p>
+      <w:pPr>
+        <w:pBdr>
+          <w:left w:val="single" w:color="7F8C8D" w:sz="8" w:space="8"/>
+        </w:pBdr>
+        <w:shd w:fill="F4F6F7" w:val="clear"/>
+        <w:spacing w:after="0"/>
+        <w:ind w:left="240" w:right="120"/>
+      </w:pPr>
+      <w:r>
+        <w:rPr>
+          <w:rFonts w:ascii="Courier New" w:cs="Courier New" w:eastAsia="Courier New" w:hAnsi="Courier New"/>
+          <w:sz w:val="17"/>
+          <w:szCs w:val="17"/>
+        </w:rPr>
+        <w:t xml:space="preserve">  --manifest $rawVerification `</w:t>
+      </w:r>
+    </w:p>
+    <w:p>
+      <w:pPr>
+        <w:pBdr>
+          <w:left w:val="single" w:color="7F8C8D" w:sz="8" w:space="8"/>
+        </w:pBdr>
+        <w:shd w:fill="F4F6F7" w:val="clear"/>
+        <w:spacing w:after="0"/>
+        <w:ind w:left="240" w:right="120"/>
+      </w:pPr>
+      <w:r>
+        <w:rPr>
+          <w:rFonts w:ascii="Courier New" w:cs="Courier New" w:eastAsia="Courier New" w:hAnsi="Courier New"/>
+          <w:sz w:val="17"/>
+          <w:szCs w:val="17"/>
+        </w:rPr>
+        <w:t xml:space="preserve">  --allow-model-container-difference</w:t>
+      </w:r>
+    </w:p>
+    <w:p>
+      <w:pPr>
+        <w:pBdr>
+          <w:left w:val="single" w:color="7F8C8D" w:sz="8" w:space="8"/>
+        </w:pBdr>
+        <w:shd w:fill="F4F6F7" w:val="clear"/>
+        <w:spacing w:after="0"/>
+        <w:ind w:left="240" w:right="120"/>
+      </w:pPr>
+      <w:r>
+        <w:rPr>
+          <w:rFonts w:ascii="Courier New" w:cs="Courier New" w:eastAsia="Courier New" w:hAnsi="Courier New"/>
+          <w:sz w:val="17"/>
+          <w:szCs w:val="17"/>
+        </w:rPr>
+        <w:t xml:space="preserve">if ($LASTEXITCODE -ne 0) { throw "Equivalence verification failed" }</w:t>
+      </w:r>
+    </w:p>
+    <w:p>
+      <w:pPr>
+        <w:pBdr>
+          <w:left w:val="single" w:color="7F8C8D" w:sz="8" w:space="8"/>
+        </w:pBdr>
+        <w:shd w:fill="F4F6F7" w:val="clear"/>
+        <w:spacing w:after="0"/>
+        <w:ind w:left="240" w:right="120"/>
+      </w:pPr>
+      <w:r>
+        <w:rPr>
+          <w:rFonts w:ascii="Courier New" w:cs="Courier New" w:eastAsia="Courier New" w:hAnsi="Courier New"/>
+          <w:sz w:val="17"/>
+          <w:szCs w:val="17"/>
+        </w:rPr>
+        <w:t xml:space="preserve">Pop-Location</w:t>
+      </w:r>
+    </w:p>
+    <w:p>
+      <w:pPr>
+        <w:pBdr>
+          <w:left w:val="single" w:color="7F8C8D" w:sz="8" w:space="8"/>
+        </w:pBdr>
+        <w:shd w:fill="F4F6F7" w:val="clear"/>
+        <w:spacing w:after="0"/>
+        <w:ind w:left="240" w:right="120"/>
+      </w:pPr>
+      <w:r>
+        <w:rPr>
+          <w:rFonts w:ascii="Courier New" w:cs="Courier New" w:eastAsia="Courier New" w:hAnsi="Courier New"/>
+          <w:sz w:val="17"/>
+          <w:szCs w:val="17"/>
+        </w:rPr>
+        <w:t xml:space="preserve"> </w:t>
+      </w:r>
+    </w:p>
+    <w:p>
+      <w:pPr>
+        <w:pBdr>
+          <w:left w:val="single" w:color="7F8C8D" w:sz="8" w:space="8"/>
+        </w:pBdr>
+        <w:shd w:fill="F4F6F7" w:val="clear"/>
+        <w:spacing w:after="0"/>
+        <w:ind w:left="240" w:right="120"/>
+      </w:pPr>
+      <w:r>
+        <w:rPr>
+          <w:rFonts w:ascii="Courier New" w:cs="Courier New" w:eastAsia="Courier New" w:hAnsi="Courier New"/>
+          <w:sz w:val="17"/>
+          <w:szCs w:val="17"/>
+        </w:rPr>
+        <w:t xml:space="preserve"># Stage only the verified ignored binaries in the current publication worktree.</w:t>
+      </w:r>
+    </w:p>
+    <w:p>
+      <w:pPr>
+        <w:pBdr>
+          <w:left w:val="single" w:color="7F8C8D" w:sz="8" w:space="8"/>
+        </w:pBdr>
+        <w:shd w:fill="F4F6F7" w:val="clear"/>
+        <w:spacing w:after="0"/>
+        <w:ind w:left="240" w:right="120"/>
+      </w:pPr>
+      <w:r>
+        <w:rPr>
+          <w:rFonts w:ascii="Courier New" w:cs="Courier New" w:eastAsia="Courier New" w:hAnsi="Courier New"/>
+          <w:sz w:val="17"/>
+          <w:szCs w:val="17"/>
+        </w:rPr>
+        <w:t xml:space="preserve">New-Item -ItemType Directory -Force `</w:t>
+      </w:r>
+    </w:p>
+    <w:p>
+      <w:pPr>
+        <w:pBdr>
+          <w:left w:val="single" w:color="7F8C8D" w:sz="8" w:space="8"/>
+        </w:pBdr>
+        <w:shd w:fill="F4F6F7" w:val="clear"/>
+        <w:spacing w:after="0"/>
+        <w:ind w:left="240" w:right="120"/>
+      </w:pPr>
+      <w:r>
+        <w:rPr>
+          <w:rFonts w:ascii="Courier New" w:cs="Courier New" w:eastAsia="Courier New" w:hAnsi="Courier New"/>
+          <w:sz w:val="17"/>
+          <w:szCs w:val="17"/>
+        </w:rPr>
+        <w:t xml:space="preserve">  -Path (Split-Path $localCheckpoints -Parent) | Out-Null</w:t>
+      </w:r>
+    </w:p>
+    <w:p>
+      <w:pPr>
+        <w:pBdr>
+          <w:left w:val="single" w:color="7F8C8D" w:sz="8" w:space="8"/>
+        </w:pBdr>
+        <w:shd w:fill="F4F6F7" w:val="clear"/>
+        <w:spacing w:after="0"/>
+        <w:ind w:left="240" w:right="120"/>
+      </w:pPr>
+      <w:r>
+        <w:rPr>
+          <w:rFonts w:ascii="Courier New" w:cs="Courier New" w:eastAsia="Courier New" w:hAnsi="Courier New"/>
+          <w:sz w:val="17"/>
+          <w:szCs w:val="17"/>
+        </w:rPr>
+        <w:t xml:space="preserve">Copy-Item -LiteralPath $verifierCheckpoints `</w:t>
+      </w:r>
+    </w:p>
+    <w:p>
+      <w:pPr>
+        <w:pBdr>
+          <w:left w:val="single" w:color="7F8C8D" w:sz="8" w:space="8"/>
+        </w:pBdr>
+        <w:shd w:fill="F4F6F7" w:val="clear"/>
+        <w:spacing w:after="0"/>
+        <w:ind w:left="240" w:right="120"/>
+      </w:pPr>
+      <w:r>
+        <w:rPr>
+          <w:rFonts w:ascii="Courier New" w:cs="Courier New" w:eastAsia="Courier New" w:hAnsi="Courier New"/>
+          <w:sz w:val="17"/>
+          <w:szCs w:val="17"/>
+        </w:rPr>
+        <w:t xml:space="preserve">  -Destination $localCheckpoints -Recurse</w:t>
+      </w:r>
+    </w:p>
+    <w:p>
+      <w:pPr>
+        <w:pBdr>
+          <w:left w:val="single" w:color="7F8C8D" w:sz="8" w:space="8"/>
+        </w:pBdr>
+        <w:shd w:fill="F4F6F7" w:val="clear"/>
+        <w:spacing w:after="0"/>
+        <w:ind w:left="240" w:right="120"/>
+      </w:pPr>
+      <w:r>
+        <w:rPr>
+          <w:rFonts w:ascii="Courier New" w:cs="Courier New" w:eastAsia="Courier New" w:hAnsi="Courier New"/>
+          <w:sz w:val="17"/>
+          <w:szCs w:val="17"/>
+        </w:rPr>
+        <w:t xml:space="preserve"> </w:t>
+      </w:r>
+    </w:p>
+    <w:p>
+      <w:pPr>
+        <w:pBdr>
+          <w:left w:val="single" w:color="7F8C8D" w:sz="8" w:space="8"/>
+        </w:pBdr>
+        <w:shd w:fill="F4F6F7" w:val="clear"/>
+        <w:spacing w:after="0"/>
+        <w:ind w:left="240" w:right="120"/>
+      </w:pPr>
+      <w:r>
+        <w:rPr>
+          <w:rFonts w:ascii="Courier New" w:cs="Courier New" w:eastAsia="Courier New" w:hAnsi="Courier New"/>
+          <w:sz w:val="17"/>
+          <w:szCs w:val="17"/>
+        </w:rPr>
+        <w:t xml:space="preserve">python scripts\bind_v4r_metric_replay_recovery.py bind `</w:t>
+      </w:r>
+    </w:p>
+    <w:p>
+      <w:pPr>
+        <w:pBdr>
+          <w:left w:val="single" w:color="7F8C8D" w:sz="8" w:space="8"/>
+        </w:pBdr>
+        <w:shd w:fill="F4F6F7" w:val="clear"/>
+        <w:spacing w:after="0"/>
+        <w:ind w:left="240" w:right="120"/>
+      </w:pPr>
+      <w:r>
+        <w:rPr>
+          <w:rFonts w:ascii="Courier New" w:cs="Courier New" w:eastAsia="Courier New" w:hAnsi="Courier New"/>
+          <w:sz w:val="17"/>
+          <w:szCs w:val="17"/>
+        </w:rPr>
+        <w:t xml:space="preserve">  --raw-verification $rawVerification `</w:t>
+      </w:r>
+    </w:p>
+    <w:p>
+      <w:pPr>
+        <w:pBdr>
+          <w:left w:val="single" w:color="7F8C8D" w:sz="8" w:space="8"/>
+        </w:pBdr>
+        <w:shd w:fill="F4F6F7" w:val="clear"/>
+        <w:spacing w:after="0"/>
+        <w:ind w:left="240" w:right="120"/>
+      </w:pPr>
+      <w:r>
+        <w:rPr>
+          <w:rFonts w:ascii="Courier New" w:cs="Courier New" w:eastAsia="Courier New" w:hAnsi="Courier New"/>
+          <w:sz w:val="17"/>
+          <w:szCs w:val="17"/>
+        </w:rPr>
+        <w:t xml:space="preserve">  --recovery-root $localCheckpoints</w:t>
+      </w:r>
+    </w:p>
+    <w:p>
+      <w:pPr>
+        <w:pBdr>
+          <w:left w:val="single" w:color="7F8C8D" w:sz="8" w:space="8"/>
+        </w:pBdr>
+        <w:shd w:fill="F4F6F7" w:val="clear"/>
+        <w:spacing w:after="0"/>
+        <w:ind w:left="240" w:right="120"/>
+      </w:pPr>
+      <w:r>
+        <w:rPr>
+          <w:rFonts w:ascii="Courier New" w:cs="Courier New" w:eastAsia="Courier New" w:hAnsi="Courier New"/>
+          <w:sz w:val="17"/>
+          <w:szCs w:val="17"/>
+        </w:rPr>
+        <w:t xml:space="preserve"> </w:t>
+      </w:r>
+    </w:p>
+    <w:p>
+      <w:pPr>
+        <w:pBdr>
+          <w:left w:val="single" w:color="7F8C8D" w:sz="8" w:space="8"/>
+        </w:pBdr>
+        <w:shd w:fill="F4F6F7" w:val="clear"/>
+        <w:spacing w:after="0"/>
+        <w:ind w:left="240" w:right="120"/>
+      </w:pPr>
+      <w:r>
+        <w:rPr>
+          <w:rFonts w:ascii="Courier New" w:cs="Courier New" w:eastAsia="Courier New" w:hAnsi="Courier New"/>
+          <w:sz w:val="17"/>
+          <w:szCs w:val="17"/>
+        </w:rPr>
+        <w:t xml:space="preserve">python scripts\recompute_v4r_posthoc_metrics.py recompute `</w:t>
+      </w:r>
+    </w:p>
+    <w:p>
+      <w:pPr>
+        <w:pBdr>
+          <w:left w:val="single" w:color="7F8C8D" w:sz="8" w:space="8"/>
+        </w:pBdr>
+        <w:shd w:fill="F4F6F7" w:val="clear"/>
+        <w:spacing w:after="0"/>
+        <w:ind w:left="240" w:right="120"/>
+      </w:pPr>
+      <w:r>
+        <w:rPr>
+          <w:rFonts w:ascii="Courier New" w:cs="Courier New" w:eastAsia="Courier New" w:hAnsi="Courier New"/>
+          <w:sz w:val="17"/>
+          <w:szCs w:val="17"/>
+        </w:rPr>
+        <w:t xml:space="preserve">  --recomputed-at-utc $recomputedAt `</w:t>
+      </w:r>
+    </w:p>
+    <w:p>
+      <w:pPr>
+        <w:pBdr>
+          <w:left w:val="single" w:color="7F8C8D" w:sz="8" w:space="8"/>
+        </w:pBdr>
+        <w:shd w:fill="F4F6F7" w:val="clear"/>
+        <w:spacing w:after="0"/>
+        <w:ind w:left="240" w:right="120"/>
+      </w:pPr>
+      <w:r>
+        <w:rPr>
+          <w:rFonts w:ascii="Courier New" w:cs="Courier New" w:eastAsia="Courier New" w:hAnsi="Courier New"/>
+          <w:sz w:val="17"/>
+          <w:szCs w:val="17"/>
+        </w:rPr>
+        <w:t xml:space="preserve">  --recovered-binary-root $localCheckpoints `</w:t>
+      </w:r>
+    </w:p>
+    <w:p>
+      <w:pPr>
+        <w:pBdr>
+          <w:left w:val="single" w:color="7F8C8D" w:sz="8" w:space="8"/>
+        </w:pBdr>
+        <w:shd w:fill="F4F6F7" w:val="clear"/>
+        <w:spacing w:after="0"/>
+        <w:ind w:left="240" w:right="120"/>
+      </w:pPr>
+      <w:r>
+        <w:rPr>
+          <w:rFonts w:ascii="Courier New" w:cs="Courier New" w:eastAsia="Courier New" w:hAnsi="Courier New"/>
+          <w:sz w:val="17"/>
+          <w:szCs w:val="17"/>
+        </w:rPr>
+        <w:t xml:space="preserve">  --recovery-manifest `</w:t>
+      </w:r>
+    </w:p>
+    <w:p>
+      <w:pPr>
+        <w:pBdr>
+          <w:left w:val="single" w:color="7F8C8D" w:sz="8" w:space="8"/>
+        </w:pBdr>
+        <w:shd w:fill="F4F6F7" w:val="clear"/>
+        <w:spacing w:after="0"/>
+        <w:ind w:left="240" w:right="120"/>
+      </w:pPr>
+      <w:r>
+        <w:rPr>
+          <w:rFonts w:ascii="Courier New" w:cs="Courier New" w:eastAsia="Courier New" w:hAnsi="Courier New"/>
+          <w:sz w:val="17"/>
+          <w:szCs w:val="17"/>
+        </w:rPr>
         <w:t xml:space="preserve">    output\ramp_rl_v6\recovered_v4r_posthoc_metrics_v1\metric_replay_recovery_manifest.json</w:t>
       </w:r>
     </w:p>
@@ -11364,6 +11976,92 @@
       <w:pPr>
         <w:spacing w:after="120"/>
       </w:pPr>
+    </w:p>
+    <w:p>
+      <w:pPr>
+        <w:spacing w:after="120" w:line="276"/>
+      </w:pPr>
+      <w:r>
+        <w:rPr>
+          <w:rFonts w:ascii="Arial" w:cs="Arial" w:eastAsia="Arial" w:hAnsi="Arial"/>
+        </w:rPr>
+        <w:t xml:space="preserve">The </w:t>
+      </w:r>
+      <w:r>
+        <w:rPr>
+          <w:rFonts w:ascii="Courier New" w:cs="Courier New" w:eastAsia="Courier New" w:hAnsi="Courier New"/>
+          <w:sz w:val="20"/>
+          <w:szCs w:val="20"/>
+          <w:shd w:fill="EEF1F4" w:val="clear"/>
+        </w:rPr>
+        <w:t xml:space="preserve">dede685</w:t>
+      </w:r>
+      <w:r>
+        <w:rPr>
+          <w:rFonts w:ascii="Arial" w:cs="Arial" w:eastAsia="Arial" w:hAnsi="Arial"/>
+        </w:rPr>
+        <w:t xml:space="preserve"> worktree executes only </w:t>
+      </w:r>
+      <w:r>
+        <w:rPr>
+          <w:rFonts w:ascii="Courier New" w:cs="Courier New" w:eastAsia="Courier New" w:hAnsi="Courier New"/>
+          <w:sz w:val="20"/>
+          <w:szCs w:val="20"/>
+          <w:shd w:fill="EEF1F4" w:val="clear"/>
+        </w:rPr>
+        <w:t xml:space="preserve">run_ramp_rl_v3.py train</w:t>
+      </w:r>
+      <w:r>
+        <w:rPr>
+          <w:rFonts w:ascii="Arial" w:cs="Arial" w:eastAsia="Arial" w:hAnsi="Arial"/>
+        </w:rPr>
+        <w:t xml:space="preserve">. The separate </w:t>
+      </w:r>
+      <w:r>
+        <w:rPr>
+          <w:rFonts w:ascii="Courier New" w:cs="Courier New" w:eastAsia="Courier New" w:hAnsi="Courier New"/>
+          <w:sz w:val="20"/>
+          <w:szCs w:val="20"/>
+          <w:shd w:fill="EEF1F4" w:val="clear"/>
+        </w:rPr>
+        <w:t xml:space="preserve">d1d4828...</w:t>
+      </w:r>
+      <w:r>
+        <w:rPr>
+          <w:rFonts w:ascii="Arial" w:cs="Arial" w:eastAsia="Arial" w:hAnsi="Arial"/>
+        </w:rPr>
+        <w:t xml:space="preserve"> worktree supplies </w:t>
+      </w:r>
+      <w:r>
+        <w:rPr>
+          <w:rFonts w:ascii="Courier New" w:cs="Courier New" w:eastAsia="Courier New" w:hAnsi="Courier New"/>
+          <w:sz w:val="20"/>
+          <w:szCs w:val="20"/>
+          <w:shd w:fill="EEF1F4" w:val="clear"/>
+        </w:rPr>
+        <w:t xml:space="preserve">recover_ramp_rl_v3.py</w:t>
+      </w:r>
+      <w:r>
+        <w:rPr>
+          <w:rFonts w:ascii="Arial" w:cs="Arial" w:eastAsia="Arial" w:hAnsi="Arial"/>
+        </w:rPr>
+        <w:t xml:space="preserve">, the original live_v3 training manifests, source freeze, and recovery evidence needed by the full equivalence verifier. Copying only the verifier script into </w:t>
+      </w:r>
+      <w:r>
+        <w:rPr>
+          <w:rFonts w:ascii="Courier New" w:cs="Courier New" w:eastAsia="Courier New" w:hAnsi="Courier New"/>
+          <w:sz w:val="20"/>
+          <w:szCs w:val="20"/>
+          <w:shd w:fill="EEF1F4" w:val="clear"/>
+        </w:rPr>
+        <w:t xml:space="preserve">dede685</w:t>
+      </w:r>
+      <w:r>
+        <w:rPr>
+          <w:rFonts w:ascii="Arial" w:cs="Arial" w:eastAsia="Arial" w:hAnsi="Arial"/>
+        </w:rPr>
+        <w:t xml:space="preserve"> is insufficient and is not part of this procedure.</w:t>
+      </w:r>
     </w:p>
     <w:p>
       <w:pPr>

</xml_diff>